<commit_message>
Updating figures and manuscript v2
</commit_message>
<xml_diff>
--- a/Phil_Trans_MS_v2.docx
+++ b/Phil_Trans_MS_v2.docx
@@ -1,6 +1,6 @@
 
 <file path=word/document.xml><?xml version="1.0" encoding="utf-8"?>
-<w:document xmlns:wpc="http://schemas.microsoft.com/office/word/2010/wordprocessingCanvas" xmlns:cx="http://schemas.microsoft.com/office/drawing/2014/chartex" xmlns:cx1="http://schemas.microsoft.com/office/drawing/2015/9/8/chartex" xmlns:cx2="http://schemas.microsoft.com/office/drawing/2015/10/21/chartex" xmlns:cx3="http://schemas.microsoft.com/office/drawing/2016/5/9/chartex" xmlns:cx4="http://schemas.microsoft.com/office/drawing/2016/5/10/chartex" xmlns:cx5="http://schemas.microsoft.com/office/drawing/2016/5/11/chartex" xmlns:cx6="http://schemas.microsoft.com/office/drawing/2016/5/12/chartex" xmlns:cx7="http://schemas.microsoft.com/office/drawing/2016/5/13/chartex" xmlns:cx8="http://schemas.microsoft.com/office/drawing/2016/5/14/chartex" xmlns:mc="http://schemas.openxmlformats.org/markup-compatibility/2006" xmlns:aink="http://schemas.microsoft.com/office/drawing/2016/ink" xmlns:am3d="http://schemas.microsoft.com/office/drawing/2017/model3d" xmlns:o="urn:schemas-microsoft-com:office:office" xmlns:oel="http://schemas.microsoft.com/office/2019/extlst" xmlns:r="http://schemas.openxmlformats.org/officeDocument/2006/relationships" xmlns:m="http://schemas.openxmlformats.org/officeDocument/2006/math" xmlns:v="urn:schemas-microsoft-com:vml" xmlns:wp14="http://schemas.microsoft.com/office/word/2010/wordprocessingDrawing" xmlns:wp="http://schemas.openxmlformats.org/drawingml/2006/wordprocessingDrawing" xmlns:w10="urn:schemas-microsoft-com:office:word" xmlns:w="http://schemas.openxmlformats.org/wordprocessingml/2006/main" xmlns:w14="http://schemas.microsoft.com/office/word/2010/wordml" xmlns:w15="http://schemas.microsoft.com/office/word/2012/wordml" xmlns:w16cex="http://schemas.microsoft.com/office/word/2018/wordml/cex" xmlns:w16cid="http://schemas.microsoft.com/office/word/2016/wordml/cid" xmlns:w16="http://schemas.microsoft.com/office/word/2018/wordml" xmlns:w16du="http://schemas.microsoft.com/office/word/2023/wordml/word16du" xmlns:w16sdtdh="http://schemas.microsoft.com/office/word/2020/wordml/sdtdatahash" xmlns:w16se="http://schemas.microsoft.com/office/word/2015/wordml/symex" xmlns:wpg="http://schemas.microsoft.com/office/word/2010/wordprocessingGroup" xmlns:wpi="http://schemas.microsoft.com/office/word/2010/wordprocessingInk" xmlns:wne="http://schemas.microsoft.com/office/word/2006/wordml" xmlns:wps="http://schemas.microsoft.com/office/word/2010/wordprocessingShape" mc:Ignorable="w14 w15 w16se w16cid w16 w16cex w16sdtdh w16du wp14">
+<w:document xmlns:wpc="http://schemas.microsoft.com/office/word/2010/wordprocessingCanvas" xmlns:cx="http://schemas.microsoft.com/office/drawing/2014/chartex" xmlns:cx1="http://schemas.microsoft.com/office/drawing/2015/9/8/chartex" xmlns:cx2="http://schemas.microsoft.com/office/drawing/2015/10/21/chartex" xmlns:cx3="http://schemas.microsoft.com/office/drawing/2016/5/9/chartex" xmlns:cx4="http://schemas.microsoft.com/office/drawing/2016/5/10/chartex" xmlns:cx5="http://schemas.microsoft.com/office/drawing/2016/5/11/chartex" xmlns:cx6="http://schemas.microsoft.com/office/drawing/2016/5/12/chartex" xmlns:cx7="http://schemas.microsoft.com/office/drawing/2016/5/13/chartex" xmlns:cx8="http://schemas.microsoft.com/office/drawing/2016/5/14/chartex" xmlns:mc="http://schemas.openxmlformats.org/markup-compatibility/2006" xmlns:aink="http://schemas.microsoft.com/office/drawing/2016/ink" xmlns:am3d="http://schemas.microsoft.com/office/drawing/2017/model3d" xmlns:o="urn:schemas-microsoft-com:office:office" xmlns:oel="http://schemas.microsoft.com/office/2019/extlst" xmlns:r="http://schemas.openxmlformats.org/officeDocument/2006/relationships" xmlns:m="http://schemas.openxmlformats.org/officeDocument/2006/math" xmlns:v="urn:schemas-microsoft-com:vml" xmlns:wp14="http://schemas.microsoft.com/office/word/2010/wordprocessingDrawing" xmlns:wp="http://schemas.openxmlformats.org/drawingml/2006/wordprocessingDrawing" xmlns:w10="urn:schemas-microsoft-com:office:word" xmlns:w="http://schemas.openxmlformats.org/wordprocessingml/2006/main" xmlns:w14="http://schemas.microsoft.com/office/word/2010/wordml" xmlns:w15="http://schemas.microsoft.com/office/word/2012/wordml" xmlns:w16cex="http://schemas.microsoft.com/office/word/2018/wordml/cex" xmlns:w16cid="http://schemas.microsoft.com/office/word/2016/wordml/cid" xmlns:w16="http://schemas.microsoft.com/office/word/2018/wordml" xmlns:w16du="http://schemas.microsoft.com/office/word/2023/wordml/word16du" xmlns:w16sdtdh="http://schemas.microsoft.com/office/word/2020/wordml/sdtdatahash" xmlns:w16sdtfl="http://schemas.microsoft.com/office/word/2024/wordml/sdtformatlock" xmlns:w16se="http://schemas.microsoft.com/office/word/2015/wordml/symex" xmlns:wpg="http://schemas.microsoft.com/office/word/2010/wordprocessingGroup" xmlns:wpi="http://schemas.microsoft.com/office/word/2010/wordprocessingInk" xmlns:wne="http://schemas.microsoft.com/office/word/2006/wordml" xmlns:wps="http://schemas.microsoft.com/office/word/2010/wordprocessingShape" mc:Ignorable="w14 w15 w16se w16cid w16 w16cex w16sdtdh w16sdtfl w16du wp14">
   <w:body>
     <w:p>
       <w:pPr>
@@ -30,13 +30,8 @@
     </w:p>
     <w:p/>
     <w:p>
-      <w:proofErr w:type="gramStart"/>
-      <w:r>
-        <w:t>In particular, for</w:t>
-      </w:r>
-      <w:proofErr w:type="gramEnd"/>
-      <w:r>
-        <w:t xml:space="preserve"> parasite and pathogens of vertebrates that are cleared by the adaptive immune response, there is likely a high probability of recovery early in infection, when stochastic extinction of small parasite population is likely, followed by a period of time where the probability of recovery is low because the parasite has established b</w:t>
+      <w:r>
+        <w:t>In particular, for parasite and pathogens of vertebrates that are cleared by the adaptive immune response, there is likely a high probability of recovery early in infection, when stochastic extinction of small parasite population is likely, followed by a period of time where the probability of recovery is low because the parasite has established b</w:t>
       </w:r>
       <w:r>
         <w:t>ut</w:t>
@@ -45,15 +40,7 @@
         <w:t xml:space="preserve"> the adaptive immune response has not yet been activated. Whether infection probability increases or decreases from that timepoint depends on the interaction between the adaptive immune response and the parasite population. Assuming an appropriate immune response is </w:t>
       </w:r>
       <w:r>
-        <w:t xml:space="preserve">activated, the probability of recovery will increase with infection duration. On the other hand, if the parasite </w:t>
-      </w:r>
-      <w:proofErr w:type="gramStart"/>
-      <w:r>
-        <w:t>is able to</w:t>
-      </w:r>
-      <w:proofErr w:type="gramEnd"/>
-      <w:r>
-        <w:t xml:space="preserve"> successfully manipulate the immune response, either by misdirecting or suppressing it, the probability of recovery will actually decrease with infection duration.</w:t>
+        <w:t>activated, the probability of recovery will increase with infection duration. On the other hand, if the parasite is able to successfully manipulate the immune response, either by misdirecting or suppressing it, the probability of recovery will actually decrease with infection duration.</w:t>
       </w:r>
       <w:r>
         <w:t xml:space="preserve"> However, once</w:t>
@@ -80,58 +67,10 @@
     <w:p/>
     <w:p>
       <w:r>
-        <w:t xml:space="preserve">To understand how relaxing the assumption of a constant recovery rate affects both the epidemiological and evolutionary dynamics of infectious disease, we need tractable theory that is grounded in immunology. Here we extend an existing model of the within-host interaction between the immune system and parasites. This model incorporates key immunological </w:t>
-      </w:r>
-      <w:proofErr w:type="gramStart"/>
-      <w:r>
-        <w:t>feedbacks</w:t>
-      </w:r>
-      <w:proofErr w:type="gramEnd"/>
-      <w:r>
-        <w:t xml:space="preserve"> that drive helper T-cell polarization towards either a T-helper 1 or T-helper 2 response, appropriate for clearing intracellular or extracellular parasites, respectively. These </w:t>
-      </w:r>
-      <w:proofErr w:type="gramStart"/>
-      <w:r>
-        <w:t>feedbacks</w:t>
-      </w:r>
-      <w:proofErr w:type="gramEnd"/>
-      <w:r>
-        <w:t xml:space="preserve"> include self-activation, where activated T-helper cells producing </w:t>
-      </w:r>
-      <w:proofErr w:type="spellStart"/>
-      <w:r>
-        <w:t>signalling</w:t>
-      </w:r>
-      <w:proofErr w:type="spellEnd"/>
-      <w:r>
-        <w:t xml:space="preserve"> molecules that cause similar activation in naïve T-helper cells; cross-inhibition, where activated T-helper cells produce </w:t>
-      </w:r>
-      <w:proofErr w:type="spellStart"/>
-      <w:r>
-        <w:t>signalling</w:t>
-      </w:r>
-      <w:proofErr w:type="spellEnd"/>
-      <w:r>
-        <w:t xml:space="preserve"> molecules that prevent naïve T-helper cells from adopting the opposite phenotype (e.g., Th1 cells preventing the activation of Th2 cells); and parasite manipulation, where parasite produce </w:t>
-      </w:r>
-      <w:proofErr w:type="spellStart"/>
-      <w:r>
-        <w:t>signalling</w:t>
-      </w:r>
-      <w:proofErr w:type="spellEnd"/>
-      <w:r>
-        <w:t xml:space="preserve"> molecule mimics that in</w:t>
-      </w:r>
-      <w:r>
-        <w:t xml:space="preserve">duce the activation of an incorrect immune response. Operating together, these positive feedback loops cause the immune-parasite interaction to be </w:t>
-      </w:r>
-      <w:proofErr w:type="spellStart"/>
-      <w:r>
-        <w:t>multistable</w:t>
-      </w:r>
-      <w:proofErr w:type="spellEnd"/>
-      <w:r>
-        <w:t xml:space="preserve">, </w:t>
+        <w:t>To understand how relaxing the assumption of a constant recovery rate affects both the epidemiological and evolutionary dynamics of infectious disease, we need tractable theory that is grounded in immunology. Here we extend an existing model of the within-host interaction between the immune system and parasites. This model incorporates key immunological feedbacks that drive helper T-cell polarization towards either a T-helper 1 or T-helper 2 response, appropriate for clearing intracellular or extracellular parasites, respectively. These feedbacks include self-activation, where activated T-helper cells producing signalling molecules that cause similar activation in naïve T-helper cells; cross-inhibition, where activated T-helper cells produce signalling molecules that prevent naïve T-helper cells from adopting the opposite phenotype (e.g., Th1 cells preventing the activation of Th2 cells); and parasite manipulation, where parasite produce signalling molecule mimics that in</w:t>
+      </w:r>
+      <w:r>
+        <w:t xml:space="preserve">duce the activation of an incorrect immune response. Operating together, these positive feedback loops cause the immune-parasite interaction to be multistable, </w:t>
       </w:r>
       <w:r>
         <w:t>meaning</w:t>
@@ -140,15 +79,7 @@
         <w:t xml:space="preserve"> that multiple </w:t>
       </w:r>
       <w:r>
-        <w:t xml:space="preserve">equilibria, representing distinct immunological and parasitological outcomes, are simultaneously stable, including equilibria where the parasite is cleared by an appropriate immune response, and equilibria where the parasite infection becomes chronic due to an inappropriate immune response. Critically, which outcome is reached by the system depends on the state of the immune system upon infection and the size of the parasite dose. That is, within-host immune </w:t>
-      </w:r>
-      <w:proofErr w:type="gramStart"/>
-      <w:r>
-        <w:t>feedbacks</w:t>
-      </w:r>
-      <w:proofErr w:type="gramEnd"/>
-      <w:r>
-        <w:t xml:space="preserve"> and stochasticity convert a fixed recovery rate into a host immune-state dependent probability of recovery. Given that initial immune state likely varies tremendously among hosts due to differences in immune history, for example, due to differences in prior exposure to </w:t>
+        <w:t xml:space="preserve">equilibria, representing distinct immunological and parasitological outcomes, are simultaneously stable, including equilibria where the parasite is cleared by an appropriate immune response, and equilibria where the parasite infection becomes chronic due to an inappropriate immune response. Critically, which outcome is reached by the system depends on the state of the immune system upon infection and the size of the parasite dose. That is, within-host immune feedbacks and stochasticity convert a fixed recovery rate into a host immune-state dependent probability of recovery. Given that initial immune state likely varies tremendously among hosts due to differences in immune history, for example, due to differences in prior exposure to </w:t>
       </w:r>
       <w:r>
         <w:lastRenderedPageBreak/>
@@ -178,15 +109,7 @@
         <w:t xml:space="preserve"> epidemiological framework and simulate the model as a stochastic individual-based model via a Gillespie algorithm. </w:t>
       </w:r>
       <w:r>
-        <w:t xml:space="preserve">We consider the evolution of an extracellular parasite (e.g., a gastrointestinal helminth parasite) that would be cleared by a Th2 immune </w:t>
-      </w:r>
-      <w:proofErr w:type="gramStart"/>
-      <w:r>
-        <w:t>response, but</w:t>
-      </w:r>
-      <w:proofErr w:type="gramEnd"/>
-      <w:r>
-        <w:t xml:space="preserve"> can potentially manipulate the host into mounting a Th1 response. </w:t>
+        <w:t xml:space="preserve">We consider the evolution of an extracellular parasite (e.g., a gastrointestinal helminth parasite) that would be cleared by a Th2 immune response, but can potentially manipulate the host into mounting a Th1 response. </w:t>
       </w:r>
       <w:r>
         <w:t>Critically,</w:t>
@@ -198,15 +121,7 @@
         <w:t xml:space="preserve"> </w:t>
       </w:r>
       <w:r>
-        <w:t xml:space="preserve">each host’s immune state upon infection to be drawn from a probability distribution. This reflects heterogeneity in immune history among </w:t>
-      </w:r>
-      <w:proofErr w:type="gramStart"/>
-      <w:r>
-        <w:t>hosts, but</w:t>
-      </w:r>
-      <w:proofErr w:type="gramEnd"/>
-      <w:r>
-        <w:t xml:space="preserve"> creates distinct immune landscapes for the parasite. To vary the immune landscape the parasite is experiencing, we vary the probability distribution for the immune state, varying it from being Th1-biased to Th2-biased. At the same time, we allow parasite virulence to evolve on this landscape to understand how the immune landscape creates distinct epidemiological and evolutionary outcomes. We show that Th1-biased landscapes lead to high prevalence and the evolution of very low virulence as parasites evolve to maximize infection duration, whereas Th2-biased landscapes lead to low prevalence and the evolution of high virulence as parasites evolve to maximize parasite abundance and transmission. Finally, we use a simplified adaptive dynamics analysis to show that the key evolutionary driver of these differences is the probability of clearance. </w:t>
+        <w:t xml:space="preserve">each host’s immune state upon infection to be drawn from a probability distribution. This reflects heterogeneity in immune history among hosts, but creates distinct immune landscapes for the parasite. To vary the immune landscape the parasite is experiencing, we vary the probability distribution for the immune state, varying it from being Th1-biased to Th2-biased. At the same time, we allow parasite virulence to evolve on this landscape to understand how the immune landscape creates distinct epidemiological and evolutionary outcomes. We show that Th1-biased landscapes lead to high prevalence and the evolution of very low virulence as parasites evolve to maximize infection duration, whereas Th2-biased landscapes lead to low prevalence and the evolution of high virulence as parasites evolve to maximize parasite abundance and transmission. Finally, we use a simplified adaptive dynamics analysis to show that the key evolutionary driver of these differences is the probability of clearance. </w:t>
       </w:r>
       <w:r>
         <w:t xml:space="preserve">Taken together, these results suggest that host immunological heterogeneity and within-host </w:t>
@@ -310,15 +225,7 @@
         <w:commentReference w:id="2"/>
       </w:r>
       <w:r>
-        <w:t>and the adaptive immune system (</w:t>
-      </w:r>
-      <w:proofErr w:type="spellStart"/>
-      <w:r>
-        <w:t>Cressler</w:t>
-      </w:r>
-      <w:proofErr w:type="spellEnd"/>
-      <w:r>
-        <w:t xml:space="preserve"> et al. 2024) into a simple </w:t>
+        <w:t xml:space="preserve">and the adaptive immune system (Cressler et al. 2024) into a simple </w:t>
       </w:r>
       <w:r>
         <w:t>susceptible-infected</w:t>
@@ -362,30 +269,14 @@
       </w:ins>
       <w:ins w:id="11" w:author="Clay Cressler" w:date="2026-05-27T15:57:00Z" w16du:dateUtc="2026-05-27T20:57:00Z">
         <w:r>
-          <w:t xml:space="preserve"> parasites, as some hosts become chronically </w:t>
-        </w:r>
-        <w:proofErr w:type="gramStart"/>
-        <w:r>
-          <w:t>infected</w:t>
-        </w:r>
-        <w:proofErr w:type="gramEnd"/>
-        <w:r>
-          <w:t xml:space="preserve"> and recovery does not typically lead to long-lasting immunity. </w:t>
+          <w:t xml:space="preserve"> parasites, as some hosts become chronically infected and recovery does not typically lead to long-lasting immunity. </w:t>
         </w:r>
       </w:ins>
       <w:r>
         <w:t>We use a Gillespie algorithm to stochastically simulate coupled within-host and between-host dynamics</w:t>
       </w:r>
       <w:r>
-        <w:t xml:space="preserve">, leading to a stochastic, individual-based model with an underlying deterministic skeleton (DeLong and </w:t>
-      </w:r>
-      <w:proofErr w:type="spellStart"/>
-      <w:r>
-        <w:t>Cressler</w:t>
-      </w:r>
-      <w:proofErr w:type="spellEnd"/>
-      <w:r>
-        <w:t xml:space="preserve"> 2023)</w:t>
+        <w:t>, leading to a stochastic, individual-based model with an underlying deterministic skeleton (DeLong and Cressler 2023)</w:t>
       </w:r>
       <w:r>
         <w:t>.</w:t>
@@ -2585,15 +2476,7 @@
         <w:t xml:space="preserve">and analysis </w:t>
       </w:r>
       <w:r>
-        <w:t xml:space="preserve">of this model can be found in </w:t>
-      </w:r>
-      <w:proofErr w:type="spellStart"/>
-      <w:r>
-        <w:t>Cressler</w:t>
-      </w:r>
-      <w:proofErr w:type="spellEnd"/>
-      <w:r>
-        <w:t xml:space="preserve"> et al. 2024, but briefly, the model considers the interaction between subpopulations of helper T-cells (</w:t>
+        <w:t>of this model can be found in Cressler et al. 2024, but briefly, the model considers the interaction between subpopulations of helper T-cells (</w:t>
       </w:r>
       <w:r>
         <w:softHyphen/>
@@ -2690,15 +2573,7 @@
         </w:r>
       </w:del>
       <w:commentRangeEnd w:id="12"/>
-      <w:ins w:id="14" w:author="Clay Cressler" w:date="2026-05-27T15:58:00Z" w16du:dateUtc="2026-05-27T20:58:00Z">
-        <w:r>
-          <w:rPr>
-            <w:rFonts w:eastAsiaTheme="minorEastAsia"/>
-          </w:rPr>
-          <w:t xml:space="preserve">T-cell </w:t>
-        </w:r>
-      </w:ins>
-      <w:del w:id="15" w:author="Clay Cressler" w:date="2026-05-27T15:59:00Z" w16du:dateUtc="2026-05-27T20:59:00Z">
+      <w:del w:id="14" w:author="Clay Cressler" w:date="2026-05-27T15:59:00Z" w16du:dateUtc="2026-05-27T20:59:00Z">
         <w:r>
           <w:rPr>
             <w:rStyle w:val="CommentReference"/>
@@ -2709,6 +2584,14 @@
           <w:commentReference w:id="12"/>
         </w:r>
       </w:del>
+      <w:ins w:id="15" w:author="Clay Cressler" w:date="2026-05-27T15:58:00Z" w16du:dateUtc="2026-05-27T20:58:00Z">
+        <w:r>
+          <w:rPr>
+            <w:rFonts w:eastAsiaTheme="minorEastAsia"/>
+          </w:rPr>
+          <w:t xml:space="preserve">T-cell </w:t>
+        </w:r>
+      </w:ins>
       <w:r>
         <w:rPr>
           <w:rFonts w:eastAsiaTheme="minorEastAsia"/>
@@ -2971,21 +2854,7 @@
         <w:rPr>
           <w:rFonts w:eastAsiaTheme="minorEastAsia"/>
         </w:rPr>
-        <w:t xml:space="preserve">den Ham and de Boer 2008, </w:t>
-      </w:r>
-      <w:proofErr w:type="spellStart"/>
-      <w:r>
-        <w:rPr>
-          <w:rFonts w:eastAsiaTheme="minorEastAsia"/>
-        </w:rPr>
-        <w:t>Schrom</w:t>
-      </w:r>
-      <w:proofErr w:type="spellEnd"/>
-      <w:r>
-        <w:rPr>
-          <w:rFonts w:eastAsiaTheme="minorEastAsia"/>
-        </w:rPr>
-        <w:t xml:space="preserve"> et al. 2020). Parasite biomass increases through density-dependent growth at a maximum rate </w:t>
+        <w:t xml:space="preserve">den Ham and de Boer 2008, Schrom et al. 2020). Parasite biomass increases through density-dependent growth at a maximum rate </w:t>
       </w:r>
       <m:oMath>
         <m:r>
@@ -3135,23 +3004,75 @@
         <w:rPr>
           <w:rFonts w:eastAsiaTheme="minorEastAsia"/>
         </w:rPr>
-        <w:t xml:space="preserve">. The positive feedback loops created by self-activation, cross-inhibition, and the parasite’s ability to induce both Th1 and Th2 responses make the dynamics of this system multistable: the ultimate outcome of the interaction depends on both the parameters of the model and the initial starting conditions (Cressler et al. 2024). Table 1 gives the baseline parameters we use for this study. Note that these parameters are not derived for any </w:t>
-      </w:r>
-      <w:proofErr w:type="gramStart"/>
+        <w:t>. The positive feedback loops created by self-activation, cross-inhibition, and the parasite’s ability to induce both Th1 and Th2 responses make the dynamics of this system multistable: the ultimate outcome of the interaction depends on both the parameters of the model and the initial starting conditions</w:t>
+      </w:r>
+      <w:ins w:id="29" w:author="Clay Cressler [2]" w:date="2026-06-08T09:35:00Z" w16du:dateUtc="2026-06-08T14:35:00Z">
+        <w:r>
+          <w:rPr>
+            <w:rFonts w:eastAsiaTheme="minorEastAsia"/>
+          </w:rPr>
+          <w:t xml:space="preserve">. In particular, </w:t>
+        </w:r>
+      </w:ins>
+      <w:del w:id="30" w:author="Clay Cressler [2]" w:date="2026-06-08T09:35:00Z" w16du:dateUtc="2026-06-08T14:35:00Z">
+        <w:r>
+          <w:rPr>
+            <w:rFonts w:eastAsiaTheme="minorEastAsia"/>
+          </w:rPr>
+          <w:delText xml:space="preserve"> (</w:delText>
+        </w:r>
+      </w:del>
       <w:r>
         <w:rPr>
           <w:rFonts w:eastAsiaTheme="minorEastAsia"/>
         </w:rPr>
-        <w:t>particular system</w:t>
-      </w:r>
-      <w:proofErr w:type="gramEnd"/>
+        <w:t xml:space="preserve">Cressler et al. </w:t>
+      </w:r>
+      <w:ins w:id="31" w:author="Clay Cressler [2]" w:date="2026-06-08T09:35:00Z" w16du:dateUtc="2026-06-08T14:35:00Z">
+        <w:r>
+          <w:rPr>
+            <w:rFonts w:eastAsiaTheme="minorEastAsia"/>
+          </w:rPr>
+          <w:t>(</w:t>
+        </w:r>
+      </w:ins>
       <w:r>
         <w:rPr>
           <w:rFonts w:eastAsiaTheme="minorEastAsia"/>
         </w:rPr>
-        <w:t xml:space="preserve">, but rather were chosen because of the rich </w:t>
-      </w:r>
-      <w:del w:id="29" w:author="Andrea L. Graham" w:date="2026-05-21T13:05:00Z" w16du:dateUtc="2026-05-21T17:05:00Z">
+        <w:t>2024)</w:t>
+      </w:r>
+      <w:ins w:id="32" w:author="Clay Cressler [2]" w:date="2026-06-08T09:35:00Z" w16du:dateUtc="2026-06-08T14:35:00Z">
+        <w:r>
+          <w:rPr>
+            <w:rFonts w:eastAsiaTheme="minorEastAsia"/>
+          </w:rPr>
+          <w:t xml:space="preserve"> showed that</w:t>
+        </w:r>
+      </w:ins>
+      <w:ins w:id="33" w:author="Clay Cressler [2]" w:date="2026-06-08T09:36:00Z" w16du:dateUtc="2026-06-08T14:36:00Z">
+        <w:r>
+          <w:rPr>
+            <w:rFonts w:eastAsiaTheme="minorEastAsia"/>
+          </w:rPr>
+          <w:t xml:space="preserve"> acute infection, where the immune system polarizes towards a Th2 response and clears the infection quickly</w:t>
+        </w:r>
+      </w:ins>
+      <w:ins w:id="34" w:author="Clay Cressler [2]" w:date="2026-06-08T09:37:00Z" w16du:dateUtc="2026-06-08T14:37:00Z">
+        <w:r>
+          <w:rPr>
+            <w:rFonts w:eastAsiaTheme="minorEastAsia"/>
+          </w:rPr>
+          <w:t>, and chronic infection, where the immune system polarizes towards a Th1 response and the parasite cannot be cleared, were both stable outcomes of this model</w:t>
+        </w:r>
+      </w:ins>
+      <w:r>
+        <w:rPr>
+          <w:rFonts w:eastAsiaTheme="minorEastAsia"/>
+        </w:rPr>
+        <w:t xml:space="preserve">. Table 1 gives the baseline parameters we use for this study. Note that these parameters are not derived for any particular system, but rather were chosen because of the rich </w:t>
+      </w:r>
+      <w:del w:id="35" w:author="Andrea L. Graham" w:date="2026-05-21T13:05:00Z" w16du:dateUtc="2026-05-21T17:05:00Z">
         <w:r>
           <w:rPr>
             <w:rFonts w:eastAsiaTheme="minorEastAsia"/>
@@ -3159,7 +3080,7 @@
           <w:delText xml:space="preserve">but </w:delText>
         </w:r>
       </w:del>
-      <w:ins w:id="30" w:author="Andrea L. Graham" w:date="2026-05-21T13:05:00Z" w16du:dateUtc="2026-05-21T17:05:00Z">
+      <w:ins w:id="36" w:author="Andrea L. Graham" w:date="2026-05-21T13:05:00Z" w16du:dateUtc="2026-05-21T17:05:00Z">
         <w:r>
           <w:rPr>
             <w:rFonts w:eastAsiaTheme="minorEastAsia"/>
@@ -3177,7 +3098,7 @@
     <w:p>
       <w:pPr>
         <w:rPr>
-          <w:ins w:id="31" w:author="Clay Cressler" w:date="2026-05-27T16:26:00Z" w16du:dateUtc="2026-05-27T21:26:00Z"/>
+          <w:ins w:id="37" w:author="Clay Cressler" w:date="2026-05-27T16:26:00Z" w16du:dateUtc="2026-05-27T21:26:00Z"/>
           <w:rFonts w:eastAsiaTheme="minorEastAsia"/>
         </w:rPr>
       </w:pPr>
@@ -3185,7 +3106,7 @@
     <w:p>
       <w:pPr>
         <w:rPr>
-          <w:del w:id="32" w:author="Clay Cressler" w:date="2026-05-27T16:26:00Z" w16du:dateUtc="2026-05-27T21:26:00Z"/>
+          <w:del w:id="38" w:author="Clay Cressler" w:date="2026-05-27T16:26:00Z" w16du:dateUtc="2026-05-27T21:26:00Z"/>
           <w:rFonts w:eastAsiaTheme="minorEastAsia"/>
         </w:rPr>
       </w:pPr>
@@ -3202,14 +3123,14 @@
         </w:rPr>
         <w:t xml:space="preserve">The epidemiological </w:t>
       </w:r>
-      <w:commentRangeStart w:id="33"/>
+      <w:commentRangeStart w:id="39"/>
       <w:r>
         <w:rPr>
           <w:rFonts w:eastAsiaTheme="minorEastAsia"/>
         </w:rPr>
         <w:t>model</w:t>
       </w:r>
-      <w:commentRangeEnd w:id="33"/>
+      <w:commentRangeEnd w:id="39"/>
       <w:r>
         <w:rPr>
           <w:rStyle w:val="CommentReference"/>
@@ -3217,7 +3138,7 @@
           <w:sz w:val="24"/>
           <w:szCs w:val="24"/>
         </w:rPr>
-        <w:commentReference w:id="33"/>
+        <w:commentReference w:id="39"/>
       </w:r>
       <w:r>
         <w:rPr>
@@ -3372,7 +3293,7 @@
                   </m:dPr>
                   <m:e>
                     <m:r>
-                      <w:del w:id="34" w:author="Clay Cressler" w:date="2026-05-27T16:17:00Z" w16du:dateUtc="2026-05-27T21:17:00Z">
+                      <w:del w:id="40" w:author="Clay Cressler" w:date="2026-05-27T16:17:00Z" w16du:dateUtc="2026-05-27T21:17:00Z">
                         <w:rPr>
                           <w:rFonts w:ascii="Cambria Math" w:hAnsi="Cambria Math"/>
                         </w:rPr>
@@ -3391,13 +3312,7 @@
                   <w:rPr>
                     <w:rFonts w:ascii="Cambria Math" w:hAnsi="Cambria Math"/>
                   </w:rPr>
-                  <m:t>cSI</m:t>
-                </m:r>
-                <m:r>
-                  <w:rPr>
-                    <w:rFonts w:ascii="Cambria Math" w:hAnsi="Cambria Math"/>
-                  </w:rPr>
-                  <m:t>+</m:t>
+                  <m:t>cSI+</m:t>
                 </m:r>
                 <m:r>
                   <w:rPr>
@@ -3417,7 +3332,7 @@
                   </m:dPr>
                   <m:e>
                     <m:r>
-                      <w:del w:id="35" w:author="Clay Cressler" w:date="2026-05-27T16:18:00Z" w16du:dateUtc="2026-05-27T21:18:00Z">
+                      <w:del w:id="41" w:author="Clay Cressler" w:date="2026-05-27T16:18:00Z" w16du:dateUtc="2026-05-27T21:18:00Z">
                         <w:rPr>
                           <w:rFonts w:ascii="Cambria Math" w:eastAsiaTheme="minorEastAsia" w:hAnsi="Cambria Math"/>
                         </w:rPr>
@@ -3431,7 +3346,7 @@
                       <m:t>P</m:t>
                     </m:r>
                     <m:r>
-                      <w:del w:id="36" w:author="Clay Cressler" w:date="2026-05-27T16:18:00Z" w16du:dateUtc="2026-05-27T21:18:00Z">
+                      <w:del w:id="42" w:author="Clay Cressler" w:date="2026-05-27T16:18:00Z" w16du:dateUtc="2026-05-27T21:18:00Z">
                         <w:rPr>
                           <w:rFonts w:ascii="Cambria Math" w:eastAsiaTheme="minorEastAsia" w:hAnsi="Cambria Math"/>
                         </w:rPr>
@@ -3441,7 +3356,7 @@
                     <m:sSub>
                       <m:sSubPr>
                         <m:ctrlPr>
-                          <w:del w:id="37" w:author="Clay Cressler" w:date="2026-05-27T16:18:00Z" w16du:dateUtc="2026-05-27T21:18:00Z">
+                          <w:del w:id="43" w:author="Clay Cressler" w:date="2026-05-27T16:18:00Z" w16du:dateUtc="2026-05-27T21:18:00Z">
                             <w:rPr>
                               <w:rFonts w:ascii="Cambria Math" w:eastAsiaTheme="minorEastAsia" w:hAnsi="Cambria Math"/>
                               <w:i/>
@@ -3452,7 +3367,7 @@
                       </m:sSubPr>
                       <m:e>
                         <m:r>
-                          <w:del w:id="38" w:author="Clay Cressler" w:date="2026-05-27T16:18:00Z" w16du:dateUtc="2026-05-27T21:18:00Z">
+                          <w:del w:id="44" w:author="Clay Cressler" w:date="2026-05-27T16:18:00Z" w16du:dateUtc="2026-05-27T21:18:00Z">
                             <w:rPr>
                               <w:rFonts w:ascii="Cambria Math" w:eastAsiaTheme="minorEastAsia" w:hAnsi="Cambria Math"/>
                             </w:rPr>
@@ -3462,7 +3377,7 @@
                       </m:e>
                       <m:sub>
                         <m:r>
-                          <w:del w:id="39" w:author="Clay Cressler" w:date="2026-05-27T16:18:00Z" w16du:dateUtc="2026-05-27T21:18:00Z">
+                          <w:del w:id="45" w:author="Clay Cressler" w:date="2026-05-27T16:18:00Z" w16du:dateUtc="2026-05-27T21:18:00Z">
                             <w:rPr>
                               <w:rFonts w:ascii="Cambria Math" w:eastAsiaTheme="minorEastAsia" w:hAnsi="Cambria Math"/>
                             </w:rPr>
@@ -3472,7 +3387,7 @@
                       </m:sub>
                     </m:sSub>
                     <m:r>
-                      <w:del w:id="40" w:author="Clay Cressler" w:date="2026-05-27T16:18:00Z" w16du:dateUtc="2026-05-27T21:18:00Z">
+                      <w:del w:id="46" w:author="Clay Cressler" w:date="2026-05-27T16:18:00Z" w16du:dateUtc="2026-05-27T21:18:00Z">
                         <w:rPr>
                           <w:rFonts w:ascii="Cambria Math" w:eastAsiaTheme="minorEastAsia" w:hAnsi="Cambria Math"/>
                         </w:rPr>
@@ -3482,7 +3397,7 @@
                     <m:sSub>
                       <m:sSubPr>
                         <m:ctrlPr>
-                          <w:del w:id="41" w:author="Clay Cressler" w:date="2026-05-27T16:18:00Z" w16du:dateUtc="2026-05-27T21:18:00Z">
+                          <w:del w:id="47" w:author="Clay Cressler" w:date="2026-05-27T16:18:00Z" w16du:dateUtc="2026-05-27T21:18:00Z">
                             <w:rPr>
                               <w:rFonts w:ascii="Cambria Math" w:eastAsiaTheme="minorEastAsia" w:hAnsi="Cambria Math"/>
                               <w:i/>
@@ -3493,7 +3408,7 @@
                       </m:sSubPr>
                       <m:e>
                         <m:r>
-                          <w:del w:id="42" w:author="Clay Cressler" w:date="2026-05-27T16:18:00Z" w16du:dateUtc="2026-05-27T21:18:00Z">
+                          <w:del w:id="48" w:author="Clay Cressler" w:date="2026-05-27T16:18:00Z" w16du:dateUtc="2026-05-27T21:18:00Z">
                             <w:rPr>
                               <w:rFonts w:ascii="Cambria Math" w:eastAsiaTheme="minorEastAsia" w:hAnsi="Cambria Math"/>
                             </w:rPr>
@@ -3503,7 +3418,7 @@
                       </m:e>
                       <m:sub>
                         <m:r>
-                          <w:del w:id="43" w:author="Clay Cressler" w:date="2026-05-27T16:18:00Z" w16du:dateUtc="2026-05-27T21:18:00Z">
+                          <w:del w:id="49" w:author="Clay Cressler" w:date="2026-05-27T16:18:00Z" w16du:dateUtc="2026-05-27T21:18:00Z">
                             <w:rPr>
                               <w:rFonts w:ascii="Cambria Math" w:eastAsiaTheme="minorEastAsia" w:hAnsi="Cambria Math"/>
                             </w:rPr>
@@ -3627,7 +3542,7 @@
                   </m:dPr>
                   <m:e>
                     <m:r>
-                      <w:del w:id="44" w:author="Clay Cressler" w:date="2026-05-27T16:18:00Z" w16du:dateUtc="2026-05-27T21:18:00Z">
+                      <w:del w:id="50" w:author="Clay Cressler" w:date="2026-05-27T16:18:00Z" w16du:dateUtc="2026-05-27T21:18:00Z">
                         <w:rPr>
                           <w:rFonts w:ascii="Cambria Math" w:eastAsiaTheme="minorEastAsia" w:hAnsi="Cambria Math"/>
                         </w:rPr>
@@ -3641,7 +3556,7 @@
                       <m:t>P</m:t>
                     </m:r>
                     <m:r>
-                      <w:del w:id="45" w:author="Clay Cressler" w:date="2026-05-27T16:18:00Z" w16du:dateUtc="2026-05-27T21:18:00Z">
+                      <w:del w:id="51" w:author="Clay Cressler" w:date="2026-05-27T16:18:00Z" w16du:dateUtc="2026-05-27T21:18:00Z">
                         <w:rPr>
                           <w:rFonts w:ascii="Cambria Math" w:eastAsiaTheme="minorEastAsia" w:hAnsi="Cambria Math"/>
                         </w:rPr>
@@ -3651,7 +3566,7 @@
                     <m:sSub>
                       <m:sSubPr>
                         <m:ctrlPr>
-                          <w:del w:id="46" w:author="Clay Cressler" w:date="2026-05-27T16:18:00Z" w16du:dateUtc="2026-05-27T21:18:00Z">
+                          <w:del w:id="52" w:author="Clay Cressler" w:date="2026-05-27T16:18:00Z" w16du:dateUtc="2026-05-27T21:18:00Z">
                             <w:rPr>
                               <w:rFonts w:ascii="Cambria Math" w:eastAsiaTheme="minorEastAsia" w:hAnsi="Cambria Math"/>
                               <w:i/>
@@ -3662,7 +3577,7 @@
                       </m:sSubPr>
                       <m:e>
                         <m:r>
-                          <w:del w:id="47" w:author="Clay Cressler" w:date="2026-05-27T16:18:00Z" w16du:dateUtc="2026-05-27T21:18:00Z">
+                          <w:del w:id="53" w:author="Clay Cressler" w:date="2026-05-27T16:18:00Z" w16du:dateUtc="2026-05-27T21:18:00Z">
                             <w:rPr>
                               <w:rFonts w:ascii="Cambria Math" w:eastAsiaTheme="minorEastAsia" w:hAnsi="Cambria Math"/>
                             </w:rPr>
@@ -3672,7 +3587,7 @@
                       </m:e>
                       <m:sub>
                         <m:r>
-                          <w:del w:id="48" w:author="Clay Cressler" w:date="2026-05-27T16:18:00Z" w16du:dateUtc="2026-05-27T21:18:00Z">
+                          <w:del w:id="54" w:author="Clay Cressler" w:date="2026-05-27T16:18:00Z" w16du:dateUtc="2026-05-27T21:18:00Z">
                             <w:rPr>
                               <w:rFonts w:ascii="Cambria Math" w:eastAsiaTheme="minorEastAsia" w:hAnsi="Cambria Math"/>
                             </w:rPr>
@@ -3682,7 +3597,7 @@
                       </m:sub>
                     </m:sSub>
                     <m:r>
-                      <w:del w:id="49" w:author="Clay Cressler" w:date="2026-05-27T16:18:00Z" w16du:dateUtc="2026-05-27T21:18:00Z">
+                      <w:del w:id="55" w:author="Clay Cressler" w:date="2026-05-27T16:18:00Z" w16du:dateUtc="2026-05-27T21:18:00Z">
                         <w:rPr>
                           <w:rFonts w:ascii="Cambria Math" w:eastAsiaTheme="minorEastAsia" w:hAnsi="Cambria Math"/>
                         </w:rPr>
@@ -3692,7 +3607,7 @@
                     <m:sSub>
                       <m:sSubPr>
                         <m:ctrlPr>
-                          <w:del w:id="50" w:author="Clay Cressler" w:date="2026-05-27T16:18:00Z" w16du:dateUtc="2026-05-27T21:18:00Z">
+                          <w:del w:id="56" w:author="Clay Cressler" w:date="2026-05-27T16:18:00Z" w16du:dateUtc="2026-05-27T21:18:00Z">
                             <w:rPr>
                               <w:rFonts w:ascii="Cambria Math" w:eastAsiaTheme="minorEastAsia" w:hAnsi="Cambria Math"/>
                               <w:i/>
@@ -3703,7 +3618,7 @@
                       </m:sSubPr>
                       <m:e>
                         <m:r>
-                          <w:del w:id="51" w:author="Clay Cressler" w:date="2026-05-27T16:18:00Z" w16du:dateUtc="2026-05-27T21:18:00Z">
+                          <w:del w:id="57" w:author="Clay Cressler" w:date="2026-05-27T16:18:00Z" w16du:dateUtc="2026-05-27T21:18:00Z">
                             <w:rPr>
                               <w:rFonts w:ascii="Cambria Math" w:eastAsiaTheme="minorEastAsia" w:hAnsi="Cambria Math"/>
                             </w:rPr>
@@ -3713,7 +3628,7 @@
                       </m:e>
                       <m:sub>
                         <m:r>
-                          <w:del w:id="52" w:author="Clay Cressler" w:date="2026-05-27T16:18:00Z" w16du:dateUtc="2026-05-27T21:18:00Z">
+                          <w:del w:id="58" w:author="Clay Cressler" w:date="2026-05-27T16:18:00Z" w16du:dateUtc="2026-05-27T21:18:00Z">
                             <w:rPr>
                               <w:rFonts w:ascii="Cambria Math" w:eastAsiaTheme="minorEastAsia" w:hAnsi="Cambria Math"/>
                             </w:rPr>
@@ -3771,7 +3686,7 @@
     <w:p>
       <w:pPr>
         <w:rPr>
-          <w:del w:id="53" w:author="Clay Cressler" w:date="2026-05-27T16:01:00Z" w16du:dateUtc="2026-05-27T21:01:00Z"/>
+          <w:del w:id="59" w:author="Clay Cressler" w:date="2026-05-27T16:01:00Z" w16du:dateUtc="2026-05-27T21:01:00Z"/>
           <w:rFonts w:eastAsiaTheme="minorEastAsia"/>
         </w:rPr>
       </w:pPr>
@@ -3779,7 +3694,7 @@
     <w:p>
       <w:pPr>
         <w:rPr>
-          <w:del w:id="54" w:author="Clay Cressler" w:date="2026-05-27T16:01:00Z" w16du:dateUtc="2026-05-27T21:01:00Z"/>
+          <w:del w:id="60" w:author="Clay Cressler" w:date="2026-05-27T16:01:00Z" w16du:dateUtc="2026-05-27T21:01:00Z"/>
           <w:rFonts w:eastAsiaTheme="minorEastAsia"/>
           <w:iCs/>
         </w:rPr>
@@ -3788,7 +3703,7 @@
     <w:p>
       <w:pPr>
         <w:rPr>
-          <w:ins w:id="55" w:author="Clay Cressler" w:date="2026-05-27T16:40:00Z" w16du:dateUtc="2026-05-27T21:40:00Z"/>
+          <w:ins w:id="61" w:author="Clay Cressler" w:date="2026-05-27T16:40:00Z" w16du:dateUtc="2026-05-27T21:40:00Z"/>
           <w:rFonts w:eastAsiaTheme="minorEastAsia"/>
           <w:iCs/>
         </w:rPr>
@@ -3815,7 +3730,7 @@
         </w:rPr>
         <w:t xml:space="preserve">, but </w:t>
       </w:r>
-      <w:ins w:id="56" w:author="Clay Cressler" w:date="2026-05-27T16:16:00Z" w16du:dateUtc="2026-05-27T21:16:00Z">
+      <w:ins w:id="62" w:author="Clay Cressler" w:date="2026-05-27T16:16:00Z" w16du:dateUtc="2026-05-27T21:16:00Z">
         <w:r>
           <w:rPr>
             <w:rFonts w:eastAsiaTheme="minorEastAsia"/>
@@ -3824,7 +3739,7 @@
           <w:t>the</w:t>
         </w:r>
       </w:ins>
-      <w:ins w:id="57" w:author="Clay Cressler" w:date="2026-05-27T16:17:00Z" w16du:dateUtc="2026-05-27T21:17:00Z">
+      <w:ins w:id="63" w:author="Clay Cressler" w:date="2026-05-27T16:17:00Z" w16du:dateUtc="2026-05-27T21:17:00Z">
         <w:r>
           <w:rPr>
             <w:rFonts w:eastAsiaTheme="minorEastAsia"/>
@@ -3835,7 +3750,7 @@
       </w:ins>
       <m:oMath>
         <m:r>
-          <w:ins w:id="58" w:author="Clay Cressler" w:date="2026-05-27T16:17:00Z" w16du:dateUtc="2026-05-27T21:17:00Z">
+          <w:ins w:id="64" w:author="Clay Cressler" w:date="2026-05-27T16:17:00Z" w16du:dateUtc="2026-05-27T21:17:00Z">
             <w:rPr>
               <w:rFonts w:ascii="Cambria Math" w:eastAsiaTheme="minorEastAsia" w:hAnsi="Cambria Math"/>
             </w:rPr>
@@ -3843,7 +3758,7 @@
           </w:ins>
         </m:r>
       </m:oMath>
-      <w:ins w:id="59" w:author="Clay Cressler" w:date="2026-05-27T16:17:00Z" w16du:dateUtc="2026-05-27T21:17:00Z">
+      <w:ins w:id="65" w:author="Clay Cressler" w:date="2026-05-27T16:17:00Z" w16du:dateUtc="2026-05-27T21:17:00Z">
         <w:r>
           <w:rPr>
             <w:rFonts w:eastAsiaTheme="minorEastAsia"/>
@@ -3852,7 +3767,7 @@
           <w:t xml:space="preserve"> </w:t>
         </w:r>
       </w:ins>
-      <w:del w:id="60" w:author="Clay Cressler" w:date="2026-05-27T16:17:00Z" w16du:dateUtc="2026-05-27T21:17:00Z">
+      <w:del w:id="66" w:author="Clay Cressler" w:date="2026-05-27T16:17:00Z" w16du:dateUtc="2026-05-27T21:17:00Z">
         <w:r>
           <w:rPr>
             <w:rFonts w:eastAsiaTheme="minorEastAsia"/>
@@ -3868,7 +3783,7 @@
         </w:rPr>
         <w:t xml:space="preserve">depends on the parasite </w:t>
       </w:r>
-      <w:del w:id="61" w:author="Clay Cressler" w:date="2026-05-27T16:20:00Z" w16du:dateUtc="2026-05-27T21:20:00Z">
+      <w:del w:id="67" w:author="Clay Cressler" w:date="2026-05-27T16:20:00Z" w16du:dateUtc="2026-05-27T21:20:00Z">
         <w:r>
           <w:rPr>
             <w:rFonts w:eastAsiaTheme="minorEastAsia"/>
@@ -3877,20 +3792,13 @@
           <w:delText xml:space="preserve">burden </w:delText>
         </w:r>
       </w:del>
-      <w:ins w:id="62" w:author="Clay Cressler" w:date="2026-05-27T16:20:00Z" w16du:dateUtc="2026-05-27T21:20:00Z">
+      <w:ins w:id="68" w:author="Clay Cressler" w:date="2026-05-27T16:20:00Z" w16du:dateUtc="2026-05-27T21:20:00Z">
         <w:r>
           <w:rPr>
             <w:rFonts w:eastAsiaTheme="minorEastAsia"/>
             <w:iCs/>
           </w:rPr>
-          <w:t>biomass</w:t>
-        </w:r>
-        <w:r>
-          <w:rPr>
-            <w:rFonts w:eastAsiaTheme="minorEastAsia"/>
-            <w:iCs/>
-          </w:rPr>
-          <w:t xml:space="preserve"> </w:t>
+          <w:t xml:space="preserve">biomass </w:t>
         </w:r>
       </w:ins>
       <w:r>
@@ -3900,7 +3808,7 @@
         </w:rPr>
         <w:t>in the infected host</w:t>
       </w:r>
-      <w:ins w:id="63" w:author="Clay Cressler" w:date="2026-05-27T16:20:00Z" w16du:dateUtc="2026-05-27T21:20:00Z">
+      <w:ins w:id="69" w:author="Clay Cressler" w:date="2026-05-27T16:20:00Z" w16du:dateUtc="2026-05-27T21:20:00Z">
         <w:r>
           <w:rPr>
             <w:rFonts w:eastAsiaTheme="minorEastAsia"/>
@@ -3911,7 +3819,7 @@
       </w:ins>
       <m:oMath>
         <m:r>
-          <w:ins w:id="64" w:author="Clay Cressler" w:date="2026-05-27T16:20:00Z" w16du:dateUtc="2026-05-27T21:20:00Z">
+          <w:ins w:id="70" w:author="Clay Cressler" w:date="2026-05-27T16:20:00Z" w16du:dateUtc="2026-05-27T21:20:00Z">
             <w:rPr>
               <w:rFonts w:ascii="Cambria Math" w:eastAsiaTheme="minorEastAsia" w:hAnsi="Cambria Math"/>
             </w:rPr>
@@ -3919,7 +3827,7 @@
           </w:ins>
         </m:r>
       </m:oMath>
-      <w:ins w:id="65" w:author="Clay Cressler" w:date="2026-05-27T16:20:00Z" w16du:dateUtc="2026-05-27T21:20:00Z">
+      <w:ins w:id="71" w:author="Clay Cressler" w:date="2026-05-27T16:20:00Z" w16du:dateUtc="2026-05-27T21:20:00Z">
         <w:r>
           <w:rPr>
             <w:rFonts w:eastAsiaTheme="minorEastAsia"/>
@@ -3928,7 +3836,7 @@
           <w:t xml:space="preserve">, </w:t>
         </w:r>
       </w:ins>
-      <w:ins w:id="66" w:author="Clay Cressler" w:date="2026-05-27T16:18:00Z" w16du:dateUtc="2026-05-27T21:18:00Z">
+      <w:ins w:id="72" w:author="Clay Cressler" w:date="2026-05-27T16:18:00Z" w16du:dateUtc="2026-05-27T21:18:00Z">
         <w:r>
           <w:rPr>
             <w:rFonts w:eastAsiaTheme="minorEastAsia"/>
@@ -3944,38 +3852,29 @@
         </w:rPr>
         <w:t xml:space="preserve">. </w:t>
       </w:r>
-      <w:proofErr w:type="gramStart"/>
       <w:r>
         <w:rPr>
           <w:rFonts w:eastAsiaTheme="minorEastAsia"/>
           <w:iCs/>
         </w:rPr>
-        <w:t>In particular, in</w:t>
-      </w:r>
-      <w:proofErr w:type="gramEnd"/>
+        <w:t>In particular, in the IBM implementation of this model</w:t>
+      </w:r>
+      <w:commentRangeStart w:id="73"/>
       <w:r>
         <w:rPr>
           <w:rFonts w:eastAsiaTheme="minorEastAsia"/>
           <w:iCs/>
         </w:rPr>
-        <w:t xml:space="preserve"> the IBM implementation of this model</w:t>
-      </w:r>
-      <w:commentRangeStart w:id="67"/>
+        <w:t xml:space="preserve">, </w:t>
+      </w:r>
       <w:r>
         <w:rPr>
           <w:rFonts w:eastAsiaTheme="minorEastAsia"/>
           <w:iCs/>
         </w:rPr>
-        <w:t xml:space="preserve">, </w:t>
-      </w:r>
-      <w:r>
-        <w:rPr>
-          <w:rFonts w:eastAsiaTheme="minorEastAsia"/>
-          <w:iCs/>
-        </w:rPr>
         <w:t xml:space="preserve">the </w:t>
       </w:r>
-      <w:ins w:id="68" w:author="Clay Cressler" w:date="2026-05-27T16:19:00Z" w16du:dateUtc="2026-05-27T21:19:00Z">
+      <w:ins w:id="74" w:author="Clay Cressler" w:date="2026-05-27T16:19:00Z" w16du:dateUtc="2026-05-27T21:19:00Z">
         <w:r>
           <w:rPr>
             <w:rFonts w:eastAsiaTheme="minorEastAsia"/>
@@ -3984,7 +3883,7 @@
           <w:t xml:space="preserve">initial parasite biomass </w:t>
         </w:r>
       </w:ins>
-      <w:ins w:id="69" w:author="Clay Cressler" w:date="2026-05-27T16:22:00Z" w16du:dateUtc="2026-05-27T21:22:00Z">
+      <w:ins w:id="75" w:author="Clay Cressler" w:date="2026-05-27T16:22:00Z" w16du:dateUtc="2026-05-27T21:22:00Z">
         <w:r>
           <w:rPr>
             <w:rFonts w:eastAsiaTheme="minorEastAsia"/>
@@ -3993,7 +3892,7 @@
           <w:t xml:space="preserve">in the new host </w:t>
         </w:r>
       </w:ins>
-      <w:del w:id="70" w:author="Clay Cressler" w:date="2026-05-27T16:19:00Z" w16du:dateUtc="2026-05-27T21:19:00Z">
+      <w:del w:id="76" w:author="Clay Cressler" w:date="2026-05-27T16:19:00Z" w16du:dateUtc="2026-05-27T21:19:00Z">
         <w:r>
           <w:rPr>
             <w:rFonts w:eastAsiaTheme="minorEastAsia"/>
@@ -4002,7 +3901,7 @@
           <w:delText xml:space="preserve">infectious dose </w:delText>
         </w:r>
       </w:del>
-      <w:commentRangeEnd w:id="67"/>
+      <w:commentRangeEnd w:id="73"/>
       <w:r>
         <w:rPr>
           <w:rStyle w:val="CommentReference"/>
@@ -4011,7 +3910,7 @@
           <w:sz w:val="24"/>
           <w:szCs w:val="24"/>
         </w:rPr>
-        <w:commentReference w:id="67"/>
+        <w:commentReference w:id="73"/>
       </w:r>
       <w:r>
         <w:rPr>
@@ -4020,7 +3919,7 @@
         </w:rPr>
         <w:t>is drawn from a Poisson distribution</w:t>
       </w:r>
-      <w:ins w:id="71" w:author="Clay Cressler" w:date="2026-05-27T16:20:00Z" w16du:dateUtc="2026-05-27T21:20:00Z">
+      <w:ins w:id="77" w:author="Clay Cressler" w:date="2026-05-27T16:20:00Z" w16du:dateUtc="2026-05-27T21:20:00Z">
         <w:r>
           <w:rPr>
             <w:rFonts w:eastAsiaTheme="minorEastAsia"/>
@@ -4029,16 +3928,24 @@
           <w:t xml:space="preserve">. For simplicity, we assume that </w:t>
         </w:r>
       </w:ins>
-      <w:del w:id="72" w:author="Clay Cressler" w:date="2026-05-27T16:20:00Z" w16du:dateUtc="2026-05-27T21:20:00Z">
+      <w:del w:id="78" w:author="Clay Cressler" w:date="2026-05-27T16:20:00Z" w16du:dateUtc="2026-05-27T21:20:00Z">
         <w:r>
           <w:rPr>
             <w:rFonts w:eastAsiaTheme="minorEastAsia"/>
             <w:iCs/>
           </w:rPr>
-          <w:delText xml:space="preserve"> with </w:delText>
+          <w:delText xml:space="preserve"> </w:delText>
+        </w:r>
+        <w:r>
+          <w:rPr>
+            <w:rFonts w:eastAsiaTheme="minorEastAsia"/>
+            <w:iCs/>
+          </w:rPr>
+          <w:lastRenderedPageBreak/>
+          <w:delText xml:space="preserve">with </w:delText>
         </w:r>
       </w:del>
-      <w:ins w:id="73" w:author="Clay Cressler" w:date="2026-05-27T16:20:00Z" w16du:dateUtc="2026-05-27T21:20:00Z">
+      <w:ins w:id="79" w:author="Clay Cressler" w:date="2026-05-27T16:20:00Z" w16du:dateUtc="2026-05-27T21:20:00Z">
         <w:r>
           <w:rPr>
             <w:rFonts w:eastAsiaTheme="minorEastAsia"/>
@@ -4054,7 +3961,7 @@
         </w:rPr>
         <w:t>mean and variance</w:t>
       </w:r>
-      <w:ins w:id="74" w:author="Clay Cressler" w:date="2026-05-27T16:20:00Z" w16du:dateUtc="2026-05-27T21:20:00Z">
+      <w:ins w:id="80" w:author="Clay Cressler" w:date="2026-05-27T16:20:00Z" w16du:dateUtc="2026-05-27T21:20:00Z">
         <w:r>
           <w:rPr>
             <w:rFonts w:eastAsiaTheme="minorEastAsia"/>
@@ -4070,8 +3977,8 @@
         </w:rPr>
         <w:t xml:space="preserve"> </w:t>
       </w:r>
-      <w:commentRangeStart w:id="75"/>
-      <w:commentRangeStart w:id="76"/>
+      <w:commentRangeStart w:id="81"/>
+      <w:commentRangeStart w:id="82"/>
       <w:r>
         <w:rPr>
           <w:rFonts w:eastAsiaTheme="minorEastAsia"/>
@@ -4079,7 +3986,7 @@
         </w:rPr>
         <w:t xml:space="preserve">set to one-tenth of the infected host’s parasite </w:t>
       </w:r>
-      <w:del w:id="77" w:author="Clay Cressler" w:date="2026-05-27T16:20:00Z" w16du:dateUtc="2026-05-27T21:20:00Z">
+      <w:del w:id="83" w:author="Clay Cressler" w:date="2026-05-27T16:20:00Z" w16du:dateUtc="2026-05-27T21:20:00Z">
         <w:r>
           <w:rPr>
             <w:rFonts w:eastAsiaTheme="minorEastAsia"/>
@@ -4088,20 +3995,13 @@
           <w:delText xml:space="preserve">burden </w:delText>
         </w:r>
       </w:del>
-      <w:ins w:id="78" w:author="Clay Cressler" w:date="2026-05-27T16:20:00Z" w16du:dateUtc="2026-05-27T21:20:00Z">
+      <w:ins w:id="84" w:author="Clay Cressler" w:date="2026-05-27T16:20:00Z" w16du:dateUtc="2026-05-27T21:20:00Z">
         <w:r>
           <w:rPr>
             <w:rFonts w:eastAsiaTheme="minorEastAsia"/>
             <w:iCs/>
           </w:rPr>
-          <w:t>biomass</w:t>
-        </w:r>
-        <w:r>
-          <w:rPr>
-            <w:rFonts w:eastAsiaTheme="minorEastAsia"/>
-            <w:iCs/>
-          </w:rPr>
-          <w:t xml:space="preserve"> </w:t>
+          <w:t xml:space="preserve">biomass </w:t>
         </w:r>
       </w:ins>
       <w:r>
@@ -4111,7 +4011,7 @@
         </w:rPr>
         <w:t>at the time of infection</w:t>
       </w:r>
-      <w:commentRangeEnd w:id="75"/>
+      <w:commentRangeEnd w:id="81"/>
       <w:r>
         <w:rPr>
           <w:rStyle w:val="CommentReference"/>
@@ -4120,9 +4020,9 @@
           <w:sz w:val="24"/>
           <w:szCs w:val="24"/>
         </w:rPr>
-        <w:commentReference w:id="75"/>
-      </w:r>
-      <w:commentRangeEnd w:id="76"/>
+        <w:commentReference w:id="81"/>
+      </w:r>
+      <w:commentRangeEnd w:id="82"/>
       <w:r>
         <w:rPr>
           <w:rStyle w:val="CommentReference"/>
@@ -4131,7 +4031,7 @@
           <w:sz w:val="24"/>
           <w:szCs w:val="24"/>
         </w:rPr>
-        <w:commentReference w:id="76"/>
+        <w:commentReference w:id="82"/>
       </w:r>
       <w:r>
         <w:rPr>
@@ -4140,7 +4040,7 @@
         </w:rPr>
         <w:t xml:space="preserve">. If the drawn dose is equal to zero, then transmission fails. The </w:t>
       </w:r>
-      <w:commentRangeStart w:id="79"/>
+      <w:commentRangeStart w:id="85"/>
       <w:r>
         <w:rPr>
           <w:rFonts w:eastAsiaTheme="minorEastAsia"/>
@@ -4148,7 +4048,7 @@
         </w:rPr>
         <w:t>infection-induced mortality rate</w:t>
       </w:r>
-      <w:ins w:id="80" w:author="Clay Cressler" w:date="2026-05-27T16:23:00Z" w16du:dateUtc="2026-05-27T21:23:00Z">
+      <w:ins w:id="86" w:author="Clay Cressler" w:date="2026-05-27T16:23:00Z" w16du:dateUtc="2026-05-27T21:23:00Z">
         <w:r>
           <w:rPr>
             <w:rFonts w:eastAsiaTheme="minorEastAsia"/>
@@ -4159,7 +4059,7 @@
       </w:ins>
       <m:oMath>
         <m:r>
-          <w:ins w:id="81" w:author="Clay Cressler" w:date="2026-05-27T16:23:00Z" w16du:dateUtc="2026-05-27T21:23:00Z">
+          <w:ins w:id="87" w:author="Clay Cressler" w:date="2026-05-27T16:23:00Z" w16du:dateUtc="2026-05-27T21:23:00Z">
             <w:rPr>
               <w:rFonts w:ascii="Cambria Math" w:eastAsiaTheme="minorEastAsia" w:hAnsi="Cambria Math"/>
             </w:rPr>
@@ -4167,7 +4067,7 @@
           </w:ins>
         </m:r>
       </m:oMath>
-      <w:ins w:id="82" w:author="Clay Cressler" w:date="2026-05-27T16:23:00Z" w16du:dateUtc="2026-05-27T21:23:00Z">
+      <w:ins w:id="88" w:author="Clay Cressler" w:date="2026-05-27T16:23:00Z" w16du:dateUtc="2026-05-27T21:23:00Z">
         <w:r>
           <w:rPr>
             <w:rFonts w:eastAsiaTheme="minorEastAsia"/>
@@ -4176,7 +4076,7 @@
           <w:t xml:space="preserve">, varies among infected hosts; </w:t>
         </w:r>
       </w:ins>
-      <w:del w:id="83" w:author="Clay Cressler" w:date="2026-05-27T16:23:00Z" w16du:dateUtc="2026-05-27T21:23:00Z">
+      <w:del w:id="89" w:author="Clay Cressler" w:date="2026-05-27T16:23:00Z" w16du:dateUtc="2026-05-27T21:23:00Z">
         <w:r>
           <w:rPr>
             <w:rFonts w:eastAsiaTheme="minorEastAsia"/>
@@ -4184,7 +4084,7 @@
           </w:rPr>
           <w:delText xml:space="preserve"> </w:delText>
         </w:r>
-        <w:commentRangeEnd w:id="79"/>
+        <w:commentRangeEnd w:id="85"/>
         <w:r>
           <w:rPr>
             <w:rStyle w:val="CommentReference"/>
@@ -4193,7 +4093,7 @@
             <w:sz w:val="24"/>
             <w:szCs w:val="24"/>
           </w:rPr>
-          <w:commentReference w:id="79"/>
+          <w:commentReference w:id="85"/>
         </w:r>
         <w:r>
           <w:rPr>
@@ -4203,7 +4103,7 @@
           <w:delText>experienced by</w:delText>
         </w:r>
       </w:del>
-      <w:ins w:id="84" w:author="Clay Cressler" w:date="2026-05-27T16:23:00Z" w16du:dateUtc="2026-05-27T21:23:00Z">
+      <w:ins w:id="90" w:author="Clay Cressler" w:date="2026-05-27T16:23:00Z" w16du:dateUtc="2026-05-27T21:23:00Z">
         <w:r>
           <w:rPr>
             <w:rFonts w:eastAsiaTheme="minorEastAsia"/>
@@ -4234,7 +4134,7 @@
         </w:rPr>
         <w:t xml:space="preserve"> </w:t>
       </w:r>
-      <w:ins w:id="85" w:author="Clay Cressler" w:date="2026-05-27T16:23:00Z" w16du:dateUtc="2026-05-27T21:23:00Z">
+      <w:ins w:id="91" w:author="Clay Cressler" w:date="2026-05-27T16:23:00Z" w16du:dateUtc="2026-05-27T21:23:00Z">
         <w:r>
           <w:rPr>
             <w:rFonts w:eastAsiaTheme="minorEastAsia"/>
@@ -4397,7 +4297,7 @@
         </w:rPr>
         <w:t xml:space="preserve"> is its burden at </w:t>
       </w:r>
-      <w:commentRangeStart w:id="86"/>
+      <w:commentRangeStart w:id="92"/>
       <w:r>
         <w:rPr>
           <w:rFonts w:eastAsiaTheme="minorEastAsia"/>
@@ -4420,7 +4320,7 @@
         </w:rPr>
         <w:t xml:space="preserve">. </w:t>
       </w:r>
-      <w:commentRangeEnd w:id="86"/>
+      <w:commentRangeEnd w:id="92"/>
       <w:r>
         <w:rPr>
           <w:rStyle w:val="CommentReference"/>
@@ -4429,7 +4329,7 @@
           <w:sz w:val="24"/>
           <w:szCs w:val="24"/>
         </w:rPr>
-        <w:commentReference w:id="86"/>
+        <w:commentReference w:id="92"/>
       </w:r>
       <w:r>
         <w:rPr>
@@ -4438,9 +4338,9 @@
         </w:rPr>
         <w:t xml:space="preserve">Finally, the </w:t>
       </w:r>
-      <w:commentRangeStart w:id="87"/>
-      <w:commentRangeStart w:id="88"/>
-      <w:del w:id="89" w:author="Clay Cressler" w:date="2026-05-27T16:24:00Z" w16du:dateUtc="2026-05-27T21:24:00Z">
+      <w:commentRangeStart w:id="93"/>
+      <w:commentRangeStart w:id="94"/>
+      <w:del w:id="95" w:author="Clay Cressler" w:date="2026-05-27T16:24:00Z" w16du:dateUtc="2026-05-27T21:24:00Z">
         <w:r>
           <w:rPr>
             <w:rFonts w:eastAsiaTheme="minorEastAsia"/>
@@ -4449,7 +4349,7 @@
           <w:delText xml:space="preserve">parasite </w:delText>
         </w:r>
       </w:del>
-      <w:ins w:id="90" w:author="Clay Cressler" w:date="2026-05-27T16:24:00Z" w16du:dateUtc="2026-05-27T21:24:00Z">
+      <w:ins w:id="96" w:author="Clay Cressler" w:date="2026-05-27T16:24:00Z" w16du:dateUtc="2026-05-27T21:24:00Z">
         <w:r>
           <w:rPr>
             <w:rFonts w:eastAsiaTheme="minorEastAsia"/>
@@ -4460,7 +4360,7 @@
       </w:ins>
       <m:oMath>
         <m:r>
-          <w:ins w:id="91" w:author="Clay Cressler" w:date="2026-05-27T16:24:00Z" w16du:dateUtc="2026-05-27T21:24:00Z">
+          <w:ins w:id="97" w:author="Clay Cressler" w:date="2026-05-27T16:24:00Z" w16du:dateUtc="2026-05-27T21:24:00Z">
             <w:rPr>
               <w:rFonts w:ascii="Cambria Math" w:eastAsiaTheme="minorEastAsia" w:hAnsi="Cambria Math"/>
             </w:rPr>
@@ -4468,32 +4368,16 @@
           </w:ins>
         </m:r>
       </m:oMath>
-      <w:ins w:id="92" w:author="Clay Cressler" w:date="2026-05-27T16:24:00Z" w16du:dateUtc="2026-05-27T21:24:00Z">
+      <w:ins w:id="98" w:author="Clay Cressler" w:date="2026-05-27T16:24:00Z" w16du:dateUtc="2026-05-27T21:24:00Z">
         <w:r>
           <w:rPr>
             <w:rFonts w:eastAsiaTheme="minorEastAsia"/>
             <w:iCs/>
           </w:rPr>
-          <w:t>, also varies among in</w:t>
-        </w:r>
-        <w:proofErr w:type="spellStart"/>
-        <w:r>
-          <w:rPr>
-            <w:rFonts w:eastAsiaTheme="minorEastAsia"/>
-            <w:iCs/>
-          </w:rPr>
-          <w:t>fected</w:t>
-        </w:r>
-        <w:proofErr w:type="spellEnd"/>
-        <w:r>
-          <w:rPr>
-            <w:rFonts w:eastAsiaTheme="minorEastAsia"/>
-            <w:iCs/>
-          </w:rPr>
-          <w:t xml:space="preserve"> individuals</w:t>
-        </w:r>
-      </w:ins>
-      <w:ins w:id="93" w:author="Clay Cressler" w:date="2026-05-27T16:25:00Z" w16du:dateUtc="2026-05-27T21:25:00Z">
+          <w:t>, also varies among infected individuals</w:t>
+        </w:r>
+      </w:ins>
+      <w:ins w:id="99" w:author="Clay Cressler" w:date="2026-05-27T16:25:00Z" w16du:dateUtc="2026-05-27T21:25:00Z">
         <w:r>
           <w:rPr>
             <w:rFonts w:eastAsiaTheme="minorEastAsia"/>
@@ -4502,7 +4386,7 @@
           <w:t>. An individual will</w:t>
         </w:r>
       </w:ins>
-      <w:ins w:id="94" w:author="Clay Cressler" w:date="2026-05-27T16:24:00Z" w16du:dateUtc="2026-05-27T21:24:00Z">
+      <w:ins w:id="100" w:author="Clay Cressler" w:date="2026-05-27T16:24:00Z" w16du:dateUtc="2026-05-27T21:24:00Z">
         <w:r>
           <w:rPr>
             <w:rFonts w:eastAsiaTheme="minorEastAsia"/>
@@ -4518,7 +4402,7 @@
         </w:rPr>
         <w:t>recover</w:t>
       </w:r>
-      <w:del w:id="95" w:author="Clay Cressler" w:date="2026-05-27T16:25:00Z" w16du:dateUtc="2026-05-27T21:25:00Z">
+      <w:del w:id="101" w:author="Clay Cressler" w:date="2026-05-27T16:25:00Z" w16du:dateUtc="2026-05-27T21:25:00Z">
         <w:r>
           <w:rPr>
             <w:rFonts w:eastAsiaTheme="minorEastAsia"/>
@@ -4534,7 +4418,7 @@
         </w:rPr>
         <w:t xml:space="preserve"> </w:t>
       </w:r>
-      <w:commentRangeEnd w:id="87"/>
+      <w:commentRangeEnd w:id="93"/>
       <w:r>
         <w:rPr>
           <w:rStyle w:val="CommentReference"/>
@@ -4543,10 +4427,9 @@
           <w:sz w:val="24"/>
           <w:szCs w:val="24"/>
         </w:rPr>
-        <w:lastRenderedPageBreak/>
-        <w:commentReference w:id="87"/>
-      </w:r>
-      <w:commentRangeEnd w:id="88"/>
+        <w:commentReference w:id="93"/>
+      </w:r>
+      <w:commentRangeEnd w:id="94"/>
       <w:r>
         <w:rPr>
           <w:rStyle w:val="CommentReference"/>
@@ -4555,7 +4438,7 @@
           <w:sz w:val="24"/>
           <w:szCs w:val="24"/>
         </w:rPr>
-        <w:commentReference w:id="88"/>
+        <w:commentReference w:id="94"/>
       </w:r>
       <w:r>
         <w:rPr>
@@ -4568,7 +4451,7 @@
     <w:p>
       <w:pPr>
         <w:rPr>
-          <w:ins w:id="96" w:author="Clay Cressler" w:date="2026-05-27T16:40:00Z" w16du:dateUtc="2026-05-27T21:40:00Z"/>
+          <w:ins w:id="102" w:author="Clay Cressler" w:date="2026-05-27T16:40:00Z" w16du:dateUtc="2026-05-27T21:40:00Z"/>
           <w:rFonts w:eastAsiaTheme="minorEastAsia"/>
           <w:iCs/>
         </w:rPr>
@@ -4577,13 +4460,13 @@
     <w:p>
       <w:pPr>
         <w:rPr>
-          <w:del w:id="97" w:author="Clay Cressler" w:date="2026-05-27T16:39:00Z" w16du:dateUtc="2026-05-27T21:39:00Z"/>
+          <w:del w:id="103" w:author="Clay Cressler" w:date="2026-05-27T16:39:00Z" w16du:dateUtc="2026-05-27T21:39:00Z"/>
           <w:rFonts w:eastAsiaTheme="minorEastAsia"/>
           <w:iCs/>
         </w:rPr>
       </w:pPr>
-      <w:commentRangeStart w:id="98"/>
-      <w:ins w:id="99" w:author="Clay Cressler" w:date="2026-05-27T16:25:00Z" w16du:dateUtc="2026-05-27T21:25:00Z">
+      <w:commentRangeStart w:id="104"/>
+      <w:ins w:id="105" w:author="Clay Cressler" w:date="2026-05-27T16:25:00Z" w16du:dateUtc="2026-05-27T21:25:00Z">
         <w:r>
           <w:rPr>
             <w:rFonts w:eastAsiaTheme="minorEastAsia"/>
@@ -4592,16 +4475,20 @@
           <w:t>Note</w:t>
         </w:r>
       </w:ins>
-      <w:commentRangeEnd w:id="98"/>
-      <w:ins w:id="100" w:author="Clay Cressler" w:date="2026-05-27T17:06:00Z" w16du:dateUtc="2026-05-27T22:06:00Z">
+      <w:commentRangeEnd w:id="104"/>
+      <w:ins w:id="106" w:author="Clay Cressler" w:date="2026-05-27T17:06:00Z" w16du:dateUtc="2026-05-27T22:06:00Z">
         <w:r>
           <w:rPr>
             <w:rStyle w:val="CommentReference"/>
+            <w:rFonts w:eastAsiaTheme="minorEastAsia"/>
+            <w:iCs/>
+            <w:sz w:val="24"/>
+            <w:szCs w:val="24"/>
           </w:rPr>
-          <w:commentReference w:id="98"/>
-        </w:r>
-      </w:ins>
-      <w:ins w:id="101" w:author="Clay Cressler" w:date="2026-05-27T16:25:00Z" w16du:dateUtc="2026-05-27T21:25:00Z">
+          <w:commentReference w:id="104"/>
+        </w:r>
+      </w:ins>
+      <w:ins w:id="107" w:author="Clay Cressler" w:date="2026-05-27T16:25:00Z" w16du:dateUtc="2026-05-27T21:25:00Z">
         <w:r>
           <w:rPr>
             <w:rFonts w:eastAsiaTheme="minorEastAsia"/>
@@ -4612,7 +4499,7 @@
       </w:ins>
       <m:oMath>
         <m:r>
-          <w:ins w:id="102" w:author="Clay Cressler" w:date="2026-05-27T16:27:00Z" w16du:dateUtc="2026-05-27T21:27:00Z">
+          <w:ins w:id="108" w:author="Clay Cressler" w:date="2026-05-27T16:27:00Z" w16du:dateUtc="2026-05-27T21:27:00Z">
             <w:rPr>
               <w:rFonts w:ascii="Cambria Math" w:eastAsiaTheme="minorEastAsia" w:hAnsi="Cambria Math"/>
             </w:rPr>
@@ -4620,7 +4507,7 @@
           </w:ins>
         </m:r>
       </m:oMath>
-      <w:ins w:id="103" w:author="Clay Cressler" w:date="2026-05-27T16:27:00Z" w16du:dateUtc="2026-05-27T21:27:00Z">
+      <w:ins w:id="109" w:author="Clay Cressler" w:date="2026-05-27T16:27:00Z" w16du:dateUtc="2026-05-27T21:27:00Z">
         <w:r>
           <w:rPr>
             <w:rFonts w:eastAsiaTheme="minorEastAsia"/>
@@ -4631,7 +4518,7 @@
       </w:ins>
       <m:oMath>
         <m:r>
-          <w:ins w:id="104" w:author="Clay Cressler" w:date="2026-05-27T16:27:00Z" w16du:dateUtc="2026-05-27T21:27:00Z">
+          <w:ins w:id="110" w:author="Clay Cressler" w:date="2026-05-27T16:27:00Z" w16du:dateUtc="2026-05-27T21:27:00Z">
             <w:rPr>
               <w:rFonts w:ascii="Cambria Math" w:eastAsiaTheme="minorEastAsia" w:hAnsi="Cambria Math"/>
             </w:rPr>
@@ -4639,7 +4526,7 @@
           </w:ins>
         </m:r>
       </m:oMath>
-      <w:ins w:id="105" w:author="Clay Cressler" w:date="2026-05-27T16:27:00Z" w16du:dateUtc="2026-05-27T21:27:00Z">
+      <w:ins w:id="111" w:author="Clay Cressler" w:date="2026-05-27T16:27:00Z" w16du:dateUtc="2026-05-27T21:27:00Z">
         <w:r>
           <w:rPr>
             <w:rFonts w:eastAsiaTheme="minorEastAsia"/>
@@ -4650,7 +4537,7 @@
       </w:ins>
       <m:oMath>
         <m:r>
-          <w:ins w:id="106" w:author="Clay Cressler" w:date="2026-05-27T16:27:00Z" w16du:dateUtc="2026-05-27T21:27:00Z">
+          <w:ins w:id="112" w:author="Clay Cressler" w:date="2026-05-27T16:27:00Z" w16du:dateUtc="2026-05-27T21:27:00Z">
             <w:rPr>
               <w:rFonts w:ascii="Cambria Math" w:eastAsiaTheme="minorEastAsia" w:hAnsi="Cambria Math"/>
             </w:rPr>
@@ -4658,7 +4545,7 @@
           </w:ins>
         </m:r>
       </m:oMath>
-      <w:ins w:id="107" w:author="Clay Cressler" w:date="2026-05-27T16:27:00Z" w16du:dateUtc="2026-05-27T21:27:00Z">
+      <w:ins w:id="113" w:author="Clay Cressler" w:date="2026-05-27T16:27:00Z" w16du:dateUtc="2026-05-27T21:27:00Z">
         <w:r>
           <w:rPr>
             <w:rFonts w:eastAsiaTheme="minorEastAsia"/>
@@ -4667,7 +4554,7 @@
           <w:t xml:space="preserve"> are n</w:t>
         </w:r>
       </w:ins>
-      <w:ins w:id="108" w:author="Clay Cressler" w:date="2026-05-27T16:28:00Z" w16du:dateUtc="2026-05-27T21:28:00Z">
+      <w:ins w:id="114" w:author="Clay Cressler" w:date="2026-05-27T16:28:00Z" w16du:dateUtc="2026-05-27T21:28:00Z">
         <w:r>
           <w:rPr>
             <w:rFonts w:eastAsiaTheme="minorEastAsia"/>
@@ -4678,7 +4565,7 @@
       </w:ins>
       <m:oMath>
         <m:r>
-          <w:ins w:id="109" w:author="Clay Cressler" w:date="2026-05-27T16:28:00Z" w16du:dateUtc="2026-05-27T21:28:00Z">
+          <w:ins w:id="115" w:author="Clay Cressler" w:date="2026-05-27T16:28:00Z" w16du:dateUtc="2026-05-27T21:28:00Z">
             <w:rPr>
               <w:rFonts w:ascii="Cambria Math" w:eastAsiaTheme="minorEastAsia" w:hAnsi="Cambria Math"/>
             </w:rPr>
@@ -4686,7 +4573,7 @@
           </w:ins>
         </m:r>
       </m:oMath>
-      <w:ins w:id="110" w:author="Clay Cressler" w:date="2026-05-27T16:28:00Z" w16du:dateUtc="2026-05-27T21:28:00Z">
+      <w:ins w:id="116" w:author="Clay Cressler" w:date="2026-05-27T16:28:00Z" w16du:dateUtc="2026-05-27T21:28:00Z">
         <w:r>
           <w:rPr>
             <w:rFonts w:eastAsiaTheme="minorEastAsia"/>
@@ -4695,7 +4582,7 @@
           <w:t xml:space="preserve"> because parasite biomass varies </w:t>
         </w:r>
       </w:ins>
-      <w:ins w:id="111" w:author="Clay Cressler" w:date="2026-05-27T16:29:00Z" w16du:dateUtc="2026-05-27T21:29:00Z">
+      <w:ins w:id="117" w:author="Clay Cressler" w:date="2026-05-27T16:29:00Z" w16du:dateUtc="2026-05-27T21:29:00Z">
         <w:r>
           <w:rPr>
             <w:rFonts w:eastAsiaTheme="minorEastAsia"/>
@@ -4704,7 +4591,7 @@
           <w:t xml:space="preserve">across infected individuals). Rather, </w:t>
         </w:r>
       </w:ins>
-      <w:ins w:id="112" w:author="Clay Cressler" w:date="2026-05-27T16:32:00Z" w16du:dateUtc="2026-05-27T21:32:00Z">
+      <w:ins w:id="118" w:author="Clay Cressler" w:date="2026-05-27T16:32:00Z" w16du:dateUtc="2026-05-27T21:32:00Z">
         <w:r>
           <w:rPr>
             <w:rFonts w:eastAsiaTheme="minorEastAsia"/>
@@ -4713,7 +4600,7 @@
           <w:t xml:space="preserve">at each step in our Gillespie algorithm, </w:t>
         </w:r>
       </w:ins>
-      <w:ins w:id="113" w:author="Clay Cressler" w:date="2026-05-27T16:29:00Z" w16du:dateUtc="2026-05-27T21:29:00Z">
+      <w:ins w:id="119" w:author="Clay Cressler" w:date="2026-05-27T16:29:00Z" w16du:dateUtc="2026-05-27T21:29:00Z">
         <w:r>
           <w:rPr>
             <w:rFonts w:eastAsiaTheme="minorEastAsia"/>
@@ -4722,7 +4609,7 @@
           <w:t xml:space="preserve">we compute the rates of each process in the within-host model </w:t>
         </w:r>
       </w:ins>
-      <w:ins w:id="114" w:author="Clay Cressler" w:date="2026-05-27T16:31:00Z" w16du:dateUtc="2026-05-27T21:31:00Z">
+      <w:ins w:id="120" w:author="Clay Cressler" w:date="2026-05-27T16:31:00Z" w16du:dateUtc="2026-05-27T21:31:00Z">
         <w:r>
           <w:rPr>
             <w:rFonts w:eastAsiaTheme="minorEastAsia"/>
@@ -4731,7 +4618,7 @@
           <w:t>(</w:t>
         </w:r>
       </w:ins>
-      <w:ins w:id="115" w:author="Clay Cressler" w:date="2026-05-27T16:32:00Z" w16du:dateUtc="2026-05-27T21:32:00Z">
+      <w:ins w:id="121" w:author="Clay Cressler" w:date="2026-05-27T16:32:00Z" w16du:dateUtc="2026-05-27T21:32:00Z">
         <w:r>
           <w:rPr>
             <w:rFonts w:eastAsiaTheme="minorEastAsia"/>
@@ -4740,7 +4627,7 @@
           <w:t xml:space="preserve">denoted by the underbraces in Eq. 1) </w:t>
         </w:r>
       </w:ins>
-      <w:ins w:id="116" w:author="Clay Cressler" w:date="2026-05-27T16:30:00Z" w16du:dateUtc="2026-05-27T21:30:00Z">
+      <w:ins w:id="122" w:author="Clay Cressler" w:date="2026-05-27T16:30:00Z" w16du:dateUtc="2026-05-27T21:30:00Z">
         <w:r>
           <w:rPr>
             <w:rFonts w:eastAsiaTheme="minorEastAsia"/>
@@ -4749,7 +4636,7 @@
           <w:t>for every infected individual</w:t>
         </w:r>
       </w:ins>
-      <w:ins w:id="117" w:author="Clay Cressler" w:date="2026-05-27T16:32:00Z" w16du:dateUtc="2026-05-27T21:32:00Z">
+      <w:ins w:id="123" w:author="Clay Cressler" w:date="2026-05-27T16:32:00Z" w16du:dateUtc="2026-05-27T21:32:00Z">
         <w:r>
           <w:rPr>
             <w:rFonts w:eastAsiaTheme="minorEastAsia"/>
@@ -4758,7 +4645,7 @@
           <w:t xml:space="preserve"> based on its cu</w:t>
         </w:r>
       </w:ins>
-      <w:ins w:id="118" w:author="Clay Cressler" w:date="2026-05-27T16:35:00Z" w16du:dateUtc="2026-05-27T21:35:00Z">
+      <w:ins w:id="124" w:author="Clay Cressler" w:date="2026-05-27T16:35:00Z" w16du:dateUtc="2026-05-27T21:35:00Z">
         <w:r>
           <w:rPr>
             <w:rFonts w:eastAsiaTheme="minorEastAsia"/>
@@ -4767,7 +4654,7 @@
           <w:t>rrent within-host state</w:t>
         </w:r>
       </w:ins>
-      <w:ins w:id="119" w:author="Clay Cressler" w:date="2026-05-27T16:32:00Z" w16du:dateUtc="2026-05-27T21:32:00Z">
+      <w:ins w:id="125" w:author="Clay Cressler" w:date="2026-05-27T16:32:00Z" w16du:dateUtc="2026-05-27T21:32:00Z">
         <w:r>
           <w:rPr>
             <w:rFonts w:eastAsiaTheme="minorEastAsia"/>
@@ -4776,7 +4663,7 @@
           <w:t xml:space="preserve">; we compute the parasite-induced </w:t>
         </w:r>
       </w:ins>
-      <w:ins w:id="120" w:author="Clay Cressler" w:date="2026-05-27T16:33:00Z" w16du:dateUtc="2026-05-27T21:33:00Z">
+      <w:ins w:id="126" w:author="Clay Cressler" w:date="2026-05-27T16:33:00Z" w16du:dateUtc="2026-05-27T21:33:00Z">
         <w:r>
           <w:rPr>
             <w:rFonts w:eastAsiaTheme="minorEastAsia"/>
@@ -4785,7 +4672,7 @@
           <w:t>mortality rate</w:t>
         </w:r>
       </w:ins>
-      <w:ins w:id="121" w:author="Clay Cressler" w:date="2026-05-27T16:32:00Z" w16du:dateUtc="2026-05-27T21:32:00Z">
+      <w:ins w:id="127" w:author="Clay Cressler" w:date="2026-05-27T16:32:00Z" w16du:dateUtc="2026-05-27T21:32:00Z">
         <w:r>
           <w:rPr>
             <w:rFonts w:eastAsiaTheme="minorEastAsia"/>
@@ -4794,7 +4681,7 @@
           <w:t xml:space="preserve"> for every infected individual based on its current parasite biomass; </w:t>
         </w:r>
       </w:ins>
-      <w:ins w:id="122" w:author="Clay Cressler" w:date="2026-05-27T16:33:00Z" w16du:dateUtc="2026-05-27T21:33:00Z">
+      <w:ins w:id="128" w:author="Clay Cressler" w:date="2026-05-27T16:33:00Z" w16du:dateUtc="2026-05-27T21:33:00Z">
         <w:r>
           <w:rPr>
             <w:rFonts w:eastAsiaTheme="minorEastAsia"/>
@@ -4803,7 +4690,7 @@
           <w:t>we compute the population-level host birth rate; and we compute a population-level contact rate</w:t>
         </w:r>
       </w:ins>
-      <w:ins w:id="123" w:author="Clay Cressler" w:date="2026-05-27T16:34:00Z" w16du:dateUtc="2026-05-27T21:34:00Z">
+      <w:ins w:id="129" w:author="Clay Cressler" w:date="2026-05-27T16:34:00Z" w16du:dateUtc="2026-05-27T21:34:00Z">
         <w:r>
           <w:rPr>
             <w:rFonts w:eastAsiaTheme="minorEastAsia"/>
@@ -4812,7 +4699,7 @@
           <w:t xml:space="preserve">. </w:t>
         </w:r>
       </w:ins>
-      <w:ins w:id="124" w:author="Clay Cressler" w:date="2026-05-27T16:35:00Z" w16du:dateUtc="2026-05-27T21:35:00Z">
+      <w:ins w:id="130" w:author="Clay Cressler" w:date="2026-05-27T16:35:00Z" w16du:dateUtc="2026-05-27T21:35:00Z">
         <w:r>
           <w:rPr>
             <w:rFonts w:eastAsiaTheme="minorEastAsia"/>
@@ -4821,7 +4708,7 @@
           <w:t>The Gille</w:t>
         </w:r>
       </w:ins>
-      <w:ins w:id="125" w:author="Clay Cressler" w:date="2026-05-27T16:36:00Z" w16du:dateUtc="2026-05-27T21:36:00Z">
+      <w:ins w:id="131" w:author="Clay Cressler" w:date="2026-05-27T16:36:00Z" w16du:dateUtc="2026-05-27T21:36:00Z">
         <w:r>
           <w:rPr>
             <w:rFonts w:eastAsiaTheme="minorEastAsia"/>
@@ -4830,7 +4717,7 @@
           <w:t>spie algorithm</w:t>
         </w:r>
       </w:ins>
-      <w:ins w:id="126" w:author="Clay Cressler" w:date="2026-05-27T16:34:00Z" w16du:dateUtc="2026-05-27T21:34:00Z">
+      <w:ins w:id="132" w:author="Clay Cressler" w:date="2026-05-27T16:34:00Z" w16du:dateUtc="2026-05-27T21:34:00Z">
         <w:r>
           <w:rPr>
             <w:rFonts w:eastAsiaTheme="minorEastAsia"/>
@@ -4839,7 +4726,7 @@
           <w:t xml:space="preserve"> then</w:t>
         </w:r>
       </w:ins>
-      <w:ins w:id="127" w:author="Clay Cressler" w:date="2026-05-27T16:36:00Z" w16du:dateUtc="2026-05-27T21:36:00Z">
+      <w:ins w:id="133" w:author="Clay Cressler" w:date="2026-05-27T16:36:00Z" w16du:dateUtc="2026-05-27T21:36:00Z">
         <w:r>
           <w:rPr>
             <w:rFonts w:eastAsiaTheme="minorEastAsia"/>
@@ -4848,7 +4735,7 @@
           <w:t xml:space="preserve"> </w:t>
         </w:r>
       </w:ins>
-      <w:ins w:id="128" w:author="Clay Cressler" w:date="2026-05-27T16:37:00Z" w16du:dateUtc="2026-05-27T21:37:00Z">
+      <w:ins w:id="134" w:author="Clay Cressler" w:date="2026-05-27T16:37:00Z" w16du:dateUtc="2026-05-27T21:37:00Z">
         <w:r>
           <w:rPr>
             <w:rFonts w:eastAsiaTheme="minorEastAsia"/>
@@ -4857,7 +4744,7 @@
           <w:t>updates the time based on the total rate of all possible process</w:t>
         </w:r>
       </w:ins>
-      <w:ins w:id="129" w:author="Clay Cressler" w:date="2026-05-27T16:38:00Z" w16du:dateUtc="2026-05-27T21:38:00Z">
+      <w:ins w:id="135" w:author="Clay Cressler" w:date="2026-05-27T16:38:00Z" w16du:dateUtc="2026-05-27T21:38:00Z">
         <w:r>
           <w:rPr>
             <w:rFonts w:eastAsiaTheme="minorEastAsia"/>
@@ -4866,7 +4753,7 @@
           <w:t xml:space="preserve">es and </w:t>
         </w:r>
       </w:ins>
-      <w:ins w:id="130" w:author="Clay Cressler" w:date="2026-05-27T16:34:00Z" w16du:dateUtc="2026-05-27T21:34:00Z">
+      <w:ins w:id="136" w:author="Clay Cressler" w:date="2026-05-27T16:34:00Z" w16du:dateUtc="2026-05-27T21:34:00Z">
         <w:r>
           <w:rPr>
             <w:rFonts w:eastAsiaTheme="minorEastAsia"/>
@@ -4875,7 +4762,7 @@
           <w:t>stochastically choose</w:t>
         </w:r>
       </w:ins>
-      <w:ins w:id="131" w:author="Clay Cressler" w:date="2026-05-27T16:36:00Z" w16du:dateUtc="2026-05-27T21:36:00Z">
+      <w:ins w:id="137" w:author="Clay Cressler" w:date="2026-05-27T16:36:00Z" w16du:dateUtc="2026-05-27T21:36:00Z">
         <w:r>
           <w:rPr>
             <w:rFonts w:eastAsiaTheme="minorEastAsia"/>
@@ -4884,7 +4771,7 @@
           <w:t>s</w:t>
         </w:r>
       </w:ins>
-      <w:ins w:id="132" w:author="Clay Cressler" w:date="2026-05-27T16:34:00Z" w16du:dateUtc="2026-05-27T21:34:00Z">
+      <w:ins w:id="138" w:author="Clay Cressler" w:date="2026-05-27T16:34:00Z" w16du:dateUtc="2026-05-27T21:34:00Z">
         <w:r>
           <w:rPr>
             <w:rFonts w:eastAsiaTheme="minorEastAsia"/>
@@ -4893,7 +4780,7 @@
           <w:t xml:space="preserve"> which </w:t>
         </w:r>
       </w:ins>
-      <w:ins w:id="133" w:author="Clay Cressler" w:date="2026-05-27T16:38:00Z" w16du:dateUtc="2026-05-27T21:38:00Z">
+      <w:ins w:id="139" w:author="Clay Cressler" w:date="2026-05-27T16:38:00Z" w16du:dateUtc="2026-05-27T21:38:00Z">
         <w:r>
           <w:rPr>
             <w:rFonts w:eastAsiaTheme="minorEastAsia"/>
@@ -4902,7 +4789,7 @@
           <w:t>process</w:t>
         </w:r>
       </w:ins>
-      <w:ins w:id="134" w:author="Clay Cressler" w:date="2026-05-27T16:34:00Z" w16du:dateUtc="2026-05-27T21:34:00Z">
+      <w:ins w:id="140" w:author="Clay Cressler" w:date="2026-05-27T16:34:00Z" w16du:dateUtc="2026-05-27T21:34:00Z">
         <w:r>
           <w:rPr>
             <w:rFonts w:eastAsiaTheme="minorEastAsia"/>
@@ -4911,7 +4798,7 @@
           <w:t xml:space="preserve"> </w:t>
         </w:r>
       </w:ins>
-      <w:ins w:id="135" w:author="Clay Cressler" w:date="2026-05-27T16:35:00Z" w16du:dateUtc="2026-05-27T21:35:00Z">
+      <w:ins w:id="141" w:author="Clay Cressler" w:date="2026-05-27T16:35:00Z" w16du:dateUtc="2026-05-27T21:35:00Z">
         <w:r>
           <w:rPr>
             <w:rFonts w:eastAsiaTheme="minorEastAsia"/>
@@ -4920,7 +4807,7 @@
           <w:t>is occurring</w:t>
         </w:r>
       </w:ins>
-      <w:ins w:id="136" w:author="Clay Cressler" w:date="2026-05-27T16:38:00Z" w16du:dateUtc="2026-05-27T21:38:00Z">
+      <w:ins w:id="142" w:author="Clay Cressler" w:date="2026-05-27T16:38:00Z" w16du:dateUtc="2026-05-27T21:38:00Z">
         <w:r>
           <w:rPr>
             <w:rFonts w:eastAsiaTheme="minorEastAsia"/>
@@ -4929,7 +4816,7 @@
           <w:t xml:space="preserve">. If the chosen process was a change in </w:t>
         </w:r>
       </w:ins>
-      <w:ins w:id="137" w:author="Clay Cressler" w:date="2026-05-27T16:39:00Z" w16du:dateUtc="2026-05-27T21:39:00Z">
+      <w:ins w:id="143" w:author="Clay Cressler" w:date="2026-05-27T16:39:00Z" w16du:dateUtc="2026-05-27T21:39:00Z">
         <w:r>
           <w:rPr>
             <w:rFonts w:eastAsiaTheme="minorEastAsia"/>
@@ -4938,7 +4825,7 @@
           <w:t>a</w:t>
         </w:r>
       </w:ins>
-      <w:ins w:id="138" w:author="Clay Cressler" w:date="2026-05-27T16:38:00Z" w16du:dateUtc="2026-05-27T21:38:00Z">
+      <w:ins w:id="144" w:author="Clay Cressler" w:date="2026-05-27T16:38:00Z" w16du:dateUtc="2026-05-27T21:38:00Z">
         <w:r>
           <w:rPr>
             <w:rFonts w:eastAsiaTheme="minorEastAsia"/>
@@ -4947,36 +4834,20 @@
           <w:t xml:space="preserve"> within-h</w:t>
         </w:r>
       </w:ins>
-      <w:ins w:id="139" w:author="Clay Cressler" w:date="2026-05-27T16:39:00Z" w16du:dateUtc="2026-05-27T21:39:00Z">
+      <w:ins w:id="145" w:author="Clay Cressler" w:date="2026-05-27T16:39:00Z" w16du:dateUtc="2026-05-27T21:39:00Z">
         <w:r>
           <w:rPr>
             <w:rFonts w:eastAsiaTheme="minorEastAsia"/>
             <w:iCs/>
           </w:rPr>
-          <w:t xml:space="preserve">ost </w:t>
-        </w:r>
-        <w:proofErr w:type="spellStart"/>
-        <w:r>
-          <w:rPr>
-            <w:rFonts w:eastAsiaTheme="minorEastAsia"/>
-            <w:iCs/>
-          </w:rPr>
-          <w:t>varible</w:t>
-        </w:r>
-        <w:proofErr w:type="spellEnd"/>
-        <w:r>
-          <w:rPr>
-            <w:rFonts w:eastAsiaTheme="minorEastAsia"/>
-            <w:iCs/>
-          </w:rPr>
-          <w:t xml:space="preserve"> (</w:t>
+          <w:t>ost varible (</w:t>
         </w:r>
       </w:ins>
       <m:oMath>
         <m:sSub>
           <m:sSubPr>
             <m:ctrlPr>
-              <w:ins w:id="140" w:author="Clay Cressler" w:date="2026-05-27T16:39:00Z" w16du:dateUtc="2026-05-27T21:39:00Z">
+              <w:ins w:id="146" w:author="Clay Cressler" w:date="2026-05-27T16:39:00Z" w16du:dateUtc="2026-05-27T21:39:00Z">
                 <w:rPr>
                   <w:rFonts w:ascii="Cambria Math" w:eastAsiaTheme="minorEastAsia" w:hAnsi="Cambria Math"/>
                   <w:i/>
@@ -4987,7 +4858,7 @@
           </m:sSubPr>
           <m:e>
             <m:r>
-              <w:ins w:id="141" w:author="Clay Cressler" w:date="2026-05-27T16:39:00Z" w16du:dateUtc="2026-05-27T21:39:00Z">
+              <w:ins w:id="147" w:author="Clay Cressler" w:date="2026-05-27T16:39:00Z" w16du:dateUtc="2026-05-27T21:39:00Z">
                 <w:rPr>
                   <w:rFonts w:ascii="Cambria Math" w:eastAsiaTheme="minorEastAsia" w:hAnsi="Cambria Math"/>
                 </w:rPr>
@@ -4997,7 +4868,7 @@
           </m:e>
           <m:sub>
             <m:r>
-              <w:ins w:id="142" w:author="Clay Cressler" w:date="2026-05-27T16:39:00Z" w16du:dateUtc="2026-05-27T21:39:00Z">
+              <w:ins w:id="148" w:author="Clay Cressler" w:date="2026-05-27T16:39:00Z" w16du:dateUtc="2026-05-27T21:39:00Z">
                 <w:rPr>
                   <w:rFonts w:ascii="Cambria Math" w:eastAsiaTheme="minorEastAsia" w:hAnsi="Cambria Math"/>
                 </w:rPr>
@@ -5007,7 +4878,7 @@
           </m:sub>
         </m:sSub>
         <m:r>
-          <w:ins w:id="143" w:author="Clay Cressler" w:date="2026-05-27T16:39:00Z" w16du:dateUtc="2026-05-27T21:39:00Z">
+          <w:ins w:id="149" w:author="Clay Cressler" w:date="2026-05-27T16:39:00Z" w16du:dateUtc="2026-05-27T21:39:00Z">
             <w:rPr>
               <w:rFonts w:ascii="Cambria Math" w:eastAsiaTheme="minorEastAsia" w:hAnsi="Cambria Math"/>
             </w:rPr>
@@ -5017,7 +4888,7 @@
         <m:sSub>
           <m:sSubPr>
             <m:ctrlPr>
-              <w:ins w:id="144" w:author="Clay Cressler" w:date="2026-05-27T16:39:00Z" w16du:dateUtc="2026-05-27T21:39:00Z">
+              <w:ins w:id="150" w:author="Clay Cressler" w:date="2026-05-27T16:39:00Z" w16du:dateUtc="2026-05-27T21:39:00Z">
                 <w:rPr>
                   <w:rFonts w:ascii="Cambria Math" w:eastAsiaTheme="minorEastAsia" w:hAnsi="Cambria Math"/>
                   <w:i/>
@@ -5028,7 +4899,7 @@
           </m:sSubPr>
           <m:e>
             <m:r>
-              <w:ins w:id="145" w:author="Clay Cressler" w:date="2026-05-27T16:39:00Z" w16du:dateUtc="2026-05-27T21:39:00Z">
+              <w:ins w:id="151" w:author="Clay Cressler" w:date="2026-05-27T16:39:00Z" w16du:dateUtc="2026-05-27T21:39:00Z">
                 <w:rPr>
                   <w:rFonts w:ascii="Cambria Math" w:eastAsiaTheme="minorEastAsia" w:hAnsi="Cambria Math"/>
                 </w:rPr>
@@ -5038,7 +4909,7 @@
           </m:e>
           <m:sub>
             <m:r>
-              <w:ins w:id="146" w:author="Clay Cressler" w:date="2026-05-27T16:39:00Z" w16du:dateUtc="2026-05-27T21:39:00Z">
+              <w:ins w:id="152" w:author="Clay Cressler" w:date="2026-05-27T16:39:00Z" w16du:dateUtc="2026-05-27T21:39:00Z">
                 <w:rPr>
                   <w:rFonts w:ascii="Cambria Math" w:eastAsiaTheme="minorEastAsia" w:hAnsi="Cambria Math"/>
                 </w:rPr>
@@ -5048,7 +4919,7 @@
           </m:sub>
         </m:sSub>
       </m:oMath>
-      <w:ins w:id="147" w:author="Clay Cressler" w:date="2026-05-27T16:39:00Z" w16du:dateUtc="2026-05-27T21:39:00Z">
+      <w:ins w:id="153" w:author="Clay Cressler" w:date="2026-05-27T16:39:00Z" w16du:dateUtc="2026-05-27T21:39:00Z">
         <w:r>
           <w:rPr>
             <w:rFonts w:eastAsiaTheme="minorEastAsia"/>
@@ -5059,7 +4930,7 @@
       </w:ins>
       <m:oMath>
         <m:r>
-          <w:ins w:id="148" w:author="Clay Cressler" w:date="2026-05-27T16:39:00Z" w16du:dateUtc="2026-05-27T21:39:00Z">
+          <w:ins w:id="154" w:author="Clay Cressler" w:date="2026-05-27T16:39:00Z" w16du:dateUtc="2026-05-27T21:39:00Z">
             <w:rPr>
               <w:rFonts w:ascii="Cambria Math" w:eastAsiaTheme="minorEastAsia" w:hAnsi="Cambria Math"/>
             </w:rPr>
@@ -5067,7 +4938,7 @@
           </w:ins>
         </m:r>
       </m:oMath>
-      <w:ins w:id="149" w:author="Clay Cressler" w:date="2026-05-27T16:39:00Z" w16du:dateUtc="2026-05-27T21:39:00Z">
+      <w:ins w:id="155" w:author="Clay Cressler" w:date="2026-05-27T16:39:00Z" w16du:dateUtc="2026-05-27T21:39:00Z">
         <w:r>
           <w:rPr>
             <w:rFonts w:eastAsiaTheme="minorEastAsia"/>
@@ -5076,7 +4947,7 @@
           <w:t xml:space="preserve">) of an infected host, the algorithm </w:t>
         </w:r>
       </w:ins>
-      <w:ins w:id="150" w:author="Clay Cressler" w:date="2026-05-27T16:35:00Z" w16du:dateUtc="2026-05-27T21:35:00Z">
+      <w:ins w:id="156" w:author="Clay Cressler" w:date="2026-05-27T16:35:00Z" w16du:dateUtc="2026-05-27T21:35:00Z">
         <w:r>
           <w:rPr>
             <w:rFonts w:eastAsiaTheme="minorEastAsia"/>
@@ -5085,7 +4956,7 @@
           <w:t>update</w:t>
         </w:r>
       </w:ins>
-      <w:ins w:id="151" w:author="Clay Cressler" w:date="2026-05-27T16:36:00Z" w16du:dateUtc="2026-05-27T21:36:00Z">
+      <w:ins w:id="157" w:author="Clay Cressler" w:date="2026-05-27T16:36:00Z" w16du:dateUtc="2026-05-27T21:36:00Z">
         <w:r>
           <w:rPr>
             <w:rFonts w:eastAsiaTheme="minorEastAsia"/>
@@ -5094,7 +4965,7 @@
           <w:t>s</w:t>
         </w:r>
       </w:ins>
-      <w:ins w:id="152" w:author="Clay Cressler" w:date="2026-05-27T16:35:00Z" w16du:dateUtc="2026-05-27T21:35:00Z">
+      <w:ins w:id="158" w:author="Clay Cressler" w:date="2026-05-27T16:35:00Z" w16du:dateUtc="2026-05-27T21:35:00Z">
         <w:r>
           <w:rPr>
             <w:rFonts w:eastAsiaTheme="minorEastAsia"/>
@@ -5103,7 +4974,7 @@
           <w:t xml:space="preserve"> </w:t>
         </w:r>
       </w:ins>
-      <w:ins w:id="153" w:author="Clay Cressler" w:date="2026-05-27T16:39:00Z" w16du:dateUtc="2026-05-27T21:39:00Z">
+      <w:ins w:id="159" w:author="Clay Cressler" w:date="2026-05-27T16:39:00Z" w16du:dateUtc="2026-05-27T21:39:00Z">
         <w:r>
           <w:rPr>
             <w:rFonts w:eastAsiaTheme="minorEastAsia"/>
@@ -5112,7 +4983,7 @@
           <w:t>the appropriate variable accordingly. If</w:t>
         </w:r>
       </w:ins>
-      <w:ins w:id="154" w:author="Clay Cressler" w:date="2026-05-27T16:40:00Z" w16du:dateUtc="2026-05-27T21:40:00Z">
+      <w:ins w:id="160" w:author="Clay Cressler" w:date="2026-05-27T16:40:00Z" w16du:dateUtc="2026-05-27T21:40:00Z">
         <w:r>
           <w:rPr>
             <w:rFonts w:eastAsiaTheme="minorEastAsia"/>
@@ -5123,7 +4994,7 @@
       </w:ins>
       <m:oMath>
         <m:r>
-          <w:ins w:id="155" w:author="Clay Cressler" w:date="2026-05-27T16:40:00Z" w16du:dateUtc="2026-05-27T21:40:00Z">
+          <w:ins w:id="161" w:author="Clay Cressler" w:date="2026-05-27T16:40:00Z" w16du:dateUtc="2026-05-27T21:40:00Z">
             <w:rPr>
               <w:rFonts w:ascii="Cambria Math" w:eastAsiaTheme="minorEastAsia" w:hAnsi="Cambria Math"/>
             </w:rPr>
@@ -5131,7 +5002,7 @@
           </w:ins>
         </m:r>
       </m:oMath>
-      <w:ins w:id="156" w:author="Clay Cressler" w:date="2026-05-27T16:40:00Z" w16du:dateUtc="2026-05-27T21:40:00Z">
+      <w:ins w:id="162" w:author="Clay Cressler" w:date="2026-05-27T16:40:00Z" w16du:dateUtc="2026-05-27T21:40:00Z">
         <w:r>
           <w:rPr>
             <w:rFonts w:eastAsiaTheme="minorEastAsia"/>
@@ -5142,7 +5013,7 @@
       </w:ins>
       <m:oMath>
         <m:r>
-          <w:ins w:id="157" w:author="Clay Cressler" w:date="2026-05-27T16:40:00Z" w16du:dateUtc="2026-05-27T21:40:00Z">
+          <w:ins w:id="163" w:author="Clay Cressler" w:date="2026-05-27T16:40:00Z" w16du:dateUtc="2026-05-27T21:40:00Z">
             <w:rPr>
               <w:rFonts w:ascii="Cambria Math" w:eastAsiaTheme="minorEastAsia" w:hAnsi="Cambria Math"/>
             </w:rPr>
@@ -5150,7 +5021,7 @@
           </w:ins>
         </m:r>
       </m:oMath>
-      <w:ins w:id="158" w:author="Clay Cressler" w:date="2026-05-27T16:40:00Z" w16du:dateUtc="2026-05-27T21:40:00Z">
+      <w:ins w:id="164" w:author="Clay Cressler" w:date="2026-05-27T16:40:00Z" w16du:dateUtc="2026-05-27T21:40:00Z">
         <w:r>
           <w:rPr>
             <w:rFonts w:eastAsiaTheme="minorEastAsia"/>
@@ -5161,7 +5032,7 @@
       </w:ins>
       <m:oMath>
         <m:r>
-          <w:ins w:id="159" w:author="Clay Cressler" w:date="2026-05-27T16:40:00Z" w16du:dateUtc="2026-05-27T21:40:00Z">
+          <w:ins w:id="165" w:author="Clay Cressler" w:date="2026-05-27T16:40:00Z" w16du:dateUtc="2026-05-27T21:40:00Z">
             <w:rPr>
               <w:rFonts w:ascii="Cambria Math" w:eastAsiaTheme="minorEastAsia" w:hAnsi="Cambria Math"/>
             </w:rPr>
@@ -5169,7 +5040,7 @@
           </w:ins>
         </m:r>
       </m:oMath>
-      <w:ins w:id="160" w:author="Clay Cressler" w:date="2026-05-27T16:40:00Z" w16du:dateUtc="2026-05-27T21:40:00Z">
+      <w:ins w:id="166" w:author="Clay Cressler" w:date="2026-05-27T16:40:00Z" w16du:dateUtc="2026-05-27T21:40:00Z">
         <w:r>
           <w:rPr>
             <w:rFonts w:eastAsiaTheme="minorEastAsia"/>
@@ -5178,7 +5049,7 @@
           <w:t>)</w:t>
         </w:r>
       </w:ins>
-      <w:ins w:id="161" w:author="Clay Cressler" w:date="2026-05-27T16:41:00Z" w16du:dateUtc="2026-05-27T21:41:00Z">
+      <w:ins w:id="167" w:author="Clay Cressler" w:date="2026-05-27T16:41:00Z" w16du:dateUtc="2026-05-27T21:41:00Z">
         <w:r>
           <w:rPr>
             <w:rFonts w:eastAsiaTheme="minorEastAsia"/>
@@ -5187,7 +5058,7 @@
           <w:t xml:space="preserve"> by one</w:t>
         </w:r>
       </w:ins>
-      <w:ins w:id="162" w:author="Clay Cressler" w:date="2026-05-27T16:40:00Z" w16du:dateUtc="2026-05-27T21:40:00Z">
+      <w:ins w:id="168" w:author="Clay Cressler" w:date="2026-05-27T16:40:00Z" w16du:dateUtc="2026-05-27T21:40:00Z">
         <w:r>
           <w:rPr>
             <w:rFonts w:eastAsiaTheme="minorEastAsia"/>
@@ -5196,7 +5067,7 @@
           <w:t xml:space="preserve">. If the chosen process was </w:t>
         </w:r>
       </w:ins>
-      <w:ins w:id="163" w:author="Clay Cressler" w:date="2026-05-27T16:41:00Z" w16du:dateUtc="2026-05-27T21:41:00Z">
+      <w:ins w:id="169" w:author="Clay Cressler" w:date="2026-05-27T16:41:00Z" w16du:dateUtc="2026-05-27T21:41:00Z">
         <w:r>
           <w:rPr>
             <w:rFonts w:eastAsiaTheme="minorEastAsia"/>
@@ -5205,7 +5076,7 @@
           <w:t xml:space="preserve">parasite-induced mortality, we remove the chosen infected host and decrease the number of infected hosts by one. If the chosen process was a host birth, we increase the number of susceptible hosts by one. Finally, if </w:t>
         </w:r>
       </w:ins>
-      <w:ins w:id="164" w:author="Clay Cressler" w:date="2026-05-27T16:42:00Z" w16du:dateUtc="2026-05-27T21:42:00Z">
+      <w:ins w:id="170" w:author="Clay Cressler" w:date="2026-05-27T16:42:00Z" w16du:dateUtc="2026-05-27T21:42:00Z">
         <w:r>
           <w:rPr>
             <w:rFonts w:eastAsiaTheme="minorEastAsia"/>
@@ -5214,7 +5085,7 @@
           <w:t xml:space="preserve">the chosen process was a contact between a susceptible and infected host, we choose an infected host at random and draw the initial parasite biomass from a Poisson distribution. If the initial parasite biomass is greater than zero, we create a new infected individual with that initial parasite biomass and </w:t>
         </w:r>
       </w:ins>
-      <w:ins w:id="165" w:author="Clay Cressler" w:date="2026-05-27T16:43:00Z" w16du:dateUtc="2026-05-27T21:43:00Z">
+      <w:ins w:id="171" w:author="Clay Cressler" w:date="2026-05-27T16:43:00Z" w16du:dateUtc="2026-05-27T21:43:00Z">
         <w:r>
           <w:rPr>
             <w:rFonts w:eastAsiaTheme="minorEastAsia"/>
@@ -5227,7 +5098,7 @@
         <m:sSub>
           <m:sSubPr>
             <m:ctrlPr>
-              <w:ins w:id="166" w:author="Clay Cressler" w:date="2026-05-27T16:43:00Z" w16du:dateUtc="2026-05-27T21:43:00Z">
+              <w:ins w:id="172" w:author="Clay Cressler" w:date="2026-05-27T16:43:00Z" w16du:dateUtc="2026-05-27T21:43:00Z">
                 <w:rPr>
                   <w:rFonts w:ascii="Cambria Math" w:eastAsiaTheme="minorEastAsia" w:hAnsi="Cambria Math"/>
                   <w:i/>
@@ -5238,7 +5109,7 @@
           </m:sSubPr>
           <m:e>
             <m:r>
-              <w:ins w:id="167" w:author="Clay Cressler" w:date="2026-05-27T16:43:00Z" w16du:dateUtc="2026-05-27T21:43:00Z">
+              <w:ins w:id="173" w:author="Clay Cressler" w:date="2026-05-27T16:43:00Z" w16du:dateUtc="2026-05-27T21:43:00Z">
                 <w:rPr>
                   <w:rFonts w:ascii="Cambria Math" w:eastAsiaTheme="minorEastAsia" w:hAnsi="Cambria Math"/>
                 </w:rPr>
@@ -5248,7 +5119,7 @@
           </m:e>
           <m:sub>
             <m:r>
-              <w:ins w:id="168" w:author="Clay Cressler" w:date="2026-05-27T16:43:00Z" w16du:dateUtc="2026-05-27T21:43:00Z">
+              <w:ins w:id="174" w:author="Clay Cressler" w:date="2026-05-27T16:43:00Z" w16du:dateUtc="2026-05-27T21:43:00Z">
                 <w:rPr>
                   <w:rFonts w:ascii="Cambria Math" w:eastAsiaTheme="minorEastAsia" w:hAnsi="Cambria Math"/>
                 </w:rPr>
@@ -5258,7 +5129,7 @@
           </m:sub>
         </m:sSub>
         <m:r>
-          <w:ins w:id="169" w:author="Clay Cressler" w:date="2026-05-27T16:43:00Z" w16du:dateUtc="2026-05-27T21:43:00Z">
+          <w:ins w:id="175" w:author="Clay Cressler" w:date="2026-05-27T16:43:00Z" w16du:dateUtc="2026-05-27T21:43:00Z">
             <w:rPr>
               <w:rFonts w:ascii="Cambria Math" w:eastAsiaTheme="minorEastAsia" w:hAnsi="Cambria Math"/>
             </w:rPr>
@@ -5268,7 +5139,7 @@
         <m:sSub>
           <m:sSubPr>
             <m:ctrlPr>
-              <w:ins w:id="170" w:author="Clay Cressler" w:date="2026-05-27T16:43:00Z" w16du:dateUtc="2026-05-27T21:43:00Z">
+              <w:ins w:id="176" w:author="Clay Cressler" w:date="2026-05-27T16:43:00Z" w16du:dateUtc="2026-05-27T21:43:00Z">
                 <w:rPr>
                   <w:rFonts w:ascii="Cambria Math" w:eastAsiaTheme="minorEastAsia" w:hAnsi="Cambria Math"/>
                   <w:i/>
@@ -5279,7 +5150,7 @@
           </m:sSubPr>
           <m:e>
             <m:r>
-              <w:ins w:id="171" w:author="Clay Cressler" w:date="2026-05-27T16:43:00Z" w16du:dateUtc="2026-05-27T21:43:00Z">
+              <w:ins w:id="177" w:author="Clay Cressler" w:date="2026-05-27T16:43:00Z" w16du:dateUtc="2026-05-27T21:43:00Z">
                 <w:rPr>
                   <w:rFonts w:ascii="Cambria Math" w:eastAsiaTheme="minorEastAsia" w:hAnsi="Cambria Math"/>
                 </w:rPr>
@@ -5289,7 +5160,7 @@
           </m:e>
           <m:sub>
             <m:r>
-              <w:ins w:id="172" w:author="Clay Cressler" w:date="2026-05-27T16:43:00Z" w16du:dateUtc="2026-05-27T21:43:00Z">
+              <w:ins w:id="178" w:author="Clay Cressler" w:date="2026-05-27T16:43:00Z" w16du:dateUtc="2026-05-27T21:43:00Z">
                 <w:rPr>
                   <w:rFonts w:ascii="Cambria Math" w:eastAsiaTheme="minorEastAsia" w:hAnsi="Cambria Math"/>
                 </w:rPr>
@@ -5299,7 +5170,7 @@
           </m:sub>
         </m:sSub>
       </m:oMath>
-      <w:ins w:id="173" w:author="Clay Cressler" w:date="2026-05-27T16:43:00Z" w16du:dateUtc="2026-05-27T21:43:00Z">
+      <w:ins w:id="179" w:author="Clay Cressler" w:date="2026-05-27T16:43:00Z" w16du:dateUtc="2026-05-27T21:43:00Z">
         <w:r>
           <w:rPr>
             <w:rFonts w:eastAsiaTheme="minorEastAsia"/>
@@ -5308,7 +5179,7 @@
           <w:t xml:space="preserve">) </w:t>
         </w:r>
       </w:ins>
-      <w:ins w:id="174" w:author="Clay Cressler" w:date="2026-05-27T16:44:00Z" w16du:dateUtc="2026-05-27T21:44:00Z">
+      <w:ins w:id="180" w:author="Clay Cressler" w:date="2026-05-27T16:44:00Z" w16du:dateUtc="2026-05-27T21:44:00Z">
         <w:r>
           <w:rPr>
             <w:rFonts w:eastAsiaTheme="minorEastAsia"/>
@@ -5317,7 +5188,7 @@
           <w:t>drawn from a probability distribution</w:t>
         </w:r>
       </w:ins>
-      <w:ins w:id="175" w:author="Clay Cressler" w:date="2026-05-27T16:45:00Z" w16du:dateUtc="2026-05-27T21:45:00Z">
+      <w:ins w:id="181" w:author="Clay Cressler" w:date="2026-05-27T16:45:00Z" w16du:dateUtc="2026-05-27T21:45:00Z">
         <w:r>
           <w:rPr>
             <w:rFonts w:eastAsiaTheme="minorEastAsia"/>
@@ -5326,7 +5197,7 @@
           <w:t xml:space="preserve"> a</w:t>
         </w:r>
       </w:ins>
-      <w:ins w:id="176" w:author="Clay Cressler" w:date="2026-05-27T16:46:00Z" w16du:dateUtc="2026-05-27T21:46:00Z">
+      <w:ins w:id="182" w:author="Clay Cressler" w:date="2026-05-27T16:46:00Z" w16du:dateUtc="2026-05-27T21:46:00Z">
         <w:r>
           <w:rPr>
             <w:rFonts w:eastAsiaTheme="minorEastAsia"/>
@@ -5335,7 +5206,7 @@
           <w:t>s</w:t>
         </w:r>
       </w:ins>
-      <w:ins w:id="177" w:author="Clay Cressler" w:date="2026-05-27T16:44:00Z" w16du:dateUtc="2026-05-27T21:44:00Z">
+      <w:ins w:id="183" w:author="Clay Cressler" w:date="2026-05-27T16:44:00Z" w16du:dateUtc="2026-05-27T21:44:00Z">
         <w:r>
           <w:rPr>
             <w:rFonts w:eastAsiaTheme="minorEastAsia"/>
@@ -5344,7 +5215,7 @@
           <w:t xml:space="preserve"> described below.</w:t>
         </w:r>
       </w:ins>
-      <w:ins w:id="178" w:author="Clay Cressler" w:date="2026-05-27T16:43:00Z" w16du:dateUtc="2026-05-27T21:43:00Z">
+      <w:ins w:id="184" w:author="Clay Cressler" w:date="2026-05-27T16:43:00Z" w16du:dateUtc="2026-05-27T21:43:00Z">
         <w:r>
           <w:rPr>
             <w:rFonts w:eastAsiaTheme="minorEastAsia"/>
@@ -5353,7 +5224,7 @@
           <w:t xml:space="preserve"> </w:t>
         </w:r>
       </w:ins>
-      <w:del w:id="179" w:author="Clay Cressler" w:date="2026-05-27T16:28:00Z" w16du:dateUtc="2026-05-27T21:28:00Z">
+      <w:del w:id="185" w:author="Clay Cressler" w:date="2026-05-27T16:28:00Z" w16du:dateUtc="2026-05-27T21:28:00Z">
         <w:r>
           <w:rPr>
             <w:rFonts w:eastAsiaTheme="minorEastAsia"/>
@@ -5366,7 +5237,7 @@
     <w:p>
       <w:pPr>
         <w:rPr>
-          <w:ins w:id="180" w:author="Clay Cressler" w:date="2026-05-27T16:43:00Z" w16du:dateUtc="2026-05-27T21:43:00Z"/>
+          <w:ins w:id="186" w:author="Clay Cressler" w:date="2026-05-27T16:43:00Z" w16du:dateUtc="2026-05-27T21:43:00Z"/>
           <w:rFonts w:eastAsiaTheme="minorEastAsia"/>
           <w:i/>
         </w:rPr>
@@ -5375,36 +5246,22 @@
     <w:p/>
     <w:p>
       <w:r>
-        <w:t xml:space="preserve">As shown in </w:t>
-      </w:r>
-      <w:proofErr w:type="spellStart"/>
-      <w:r>
-        <w:t>Cressler</w:t>
-      </w:r>
-      <w:proofErr w:type="spellEnd"/>
-      <w:r>
-        <w:t xml:space="preserve"> et al. (2024) and in Fig. 1, the outcome of </w:t>
-      </w:r>
-      <w:del w:id="181" w:author="Clay Cressler" w:date="2026-05-27T16:44:00Z" w16du:dateUtc="2026-05-27T21:44:00Z">
+        <w:t xml:space="preserve">As shown in Cressler et al. (2024) and in Fig. 1, the outcome of </w:t>
+      </w:r>
+      <w:del w:id="187" w:author="Clay Cressler" w:date="2026-05-27T16:44:00Z" w16du:dateUtc="2026-05-27T21:44:00Z">
         <w:r>
           <w:delText xml:space="preserve">this </w:delText>
         </w:r>
       </w:del>
-      <w:ins w:id="182" w:author="Clay Cressler" w:date="2026-05-27T16:44:00Z" w16du:dateUtc="2026-05-27T21:44:00Z">
-        <w:r>
-          <w:t>th</w:t>
-        </w:r>
-        <w:r>
-          <w:t>e</w:t>
-        </w:r>
-        <w:r>
-          <w:t xml:space="preserve"> </w:t>
+      <w:ins w:id="188" w:author="Clay Cressler" w:date="2026-05-27T16:44:00Z" w16du:dateUtc="2026-05-27T21:44:00Z">
+        <w:r>
+          <w:t xml:space="preserve">the </w:t>
         </w:r>
       </w:ins>
       <w:r>
         <w:t xml:space="preserve">within-host interaction </w:t>
       </w:r>
-      <w:ins w:id="183" w:author="Clay Cressler" w:date="2026-05-27T16:44:00Z" w16du:dateUtc="2026-05-27T21:44:00Z">
+      <w:ins w:id="189" w:author="Clay Cressler" w:date="2026-05-27T16:44:00Z" w16du:dateUtc="2026-05-27T21:44:00Z">
         <w:r>
           <w:t xml:space="preserve">described by Eq. 1 </w:t>
         </w:r>
@@ -5412,33 +5269,30 @@
       <w:r>
         <w:t xml:space="preserve">depends critically on both the initial parasite </w:t>
       </w:r>
-      <w:del w:id="184" w:author="Clay Cressler" w:date="2026-05-27T16:44:00Z" w16du:dateUtc="2026-05-27T21:44:00Z">
+      <w:del w:id="190" w:author="Clay Cressler" w:date="2026-05-27T16:44:00Z" w16du:dateUtc="2026-05-27T21:44:00Z">
         <w:r>
           <w:delText xml:space="preserve">dose </w:delText>
         </w:r>
       </w:del>
-      <w:ins w:id="185" w:author="Clay Cressler" w:date="2026-05-27T16:44:00Z" w16du:dateUtc="2026-05-27T21:44:00Z">
-        <w:r>
-          <w:t>biomass</w:t>
-        </w:r>
-        <w:r>
-          <w:t xml:space="preserve"> </w:t>
+      <w:ins w:id="191" w:author="Clay Cressler" w:date="2026-05-27T16:44:00Z" w16du:dateUtc="2026-05-27T21:44:00Z">
+        <w:r>
+          <w:t xml:space="preserve">biomass </w:t>
         </w:r>
       </w:ins>
       <w:r>
         <w:t xml:space="preserve">(resulting from the infection process described above) and the initial immune state. Rather than fixing the initial immune state of every individual upon infection, we assume that it varies stochastically, reflecting that every individual’s immune state upon infection would depend on its history of past exposures to parasitic, commensal, and mutualistic symbionts and thus would vary tremendously from one individual to another. </w:t>
       </w:r>
-      <w:del w:id="186" w:author="Clay Cressler" w:date="2026-05-27T16:46:00Z" w16du:dateUtc="2026-05-27T21:46:00Z">
+      <w:del w:id="192" w:author="Clay Cressler" w:date="2026-05-27T16:46:00Z" w16du:dateUtc="2026-05-27T21:46:00Z">
         <w:r>
           <w:delText>In ou</w:delText>
         </w:r>
       </w:del>
-      <w:ins w:id="187" w:author="Clay Cressler" w:date="2026-05-27T16:46:00Z" w16du:dateUtc="2026-05-27T21:46:00Z">
+      <w:ins w:id="193" w:author="Clay Cressler" w:date="2026-05-27T16:46:00Z" w16du:dateUtc="2026-05-27T21:46:00Z">
         <w:r>
           <w:t>Across different</w:t>
         </w:r>
       </w:ins>
-      <w:del w:id="188" w:author="Clay Cressler" w:date="2026-05-27T16:46:00Z" w16du:dateUtc="2026-05-27T21:46:00Z">
+      <w:del w:id="194" w:author="Clay Cressler" w:date="2026-05-27T16:46:00Z" w16du:dateUtc="2026-05-27T21:46:00Z">
         <w:r>
           <w:delText>r</w:delText>
         </w:r>
@@ -5446,7 +5300,7 @@
       <w:r>
         <w:t xml:space="preserve"> simulation</w:t>
       </w:r>
-      <w:ins w:id="189" w:author="Clay Cressler" w:date="2026-05-27T16:46:00Z" w16du:dateUtc="2026-05-27T21:46:00Z">
+      <w:ins w:id="195" w:author="Clay Cressler" w:date="2026-05-27T16:46:00Z" w16du:dateUtc="2026-05-27T21:46:00Z">
         <w:r>
           <w:t xml:space="preserve"> run</w:t>
         </w:r>
@@ -5454,47 +5308,47 @@
       <w:r>
         <w:t xml:space="preserve">s, we </w:t>
       </w:r>
-      <w:commentRangeStart w:id="190"/>
+      <w:commentRangeStart w:id="196"/>
       <w:r>
         <w:t xml:space="preserve">vary </w:t>
       </w:r>
-      <w:commentRangeEnd w:id="190"/>
-      <w:ins w:id="191" w:author="Clay Cressler" w:date="2026-05-27T16:46:00Z" w16du:dateUtc="2026-05-27T21:46:00Z">
-        <w:r>
-          <w:t xml:space="preserve">the immune landscape the parasite faces by </w:t>
-        </w:r>
-      </w:ins>
-      <w:del w:id="192" w:author="Clay Cressler" w:date="2026-05-27T16:47:00Z" w16du:dateUtc="2026-05-27T21:47:00Z">
+      <w:commentRangeEnd w:id="196"/>
+      <w:del w:id="197" w:author="Clay Cressler" w:date="2026-05-27T16:47:00Z" w16du:dateUtc="2026-05-27T21:47:00Z">
         <w:r>
           <w:rPr>
             <w:rStyle w:val="CommentReference"/>
             <w:sz w:val="24"/>
             <w:szCs w:val="24"/>
           </w:rPr>
-          <w:commentReference w:id="190"/>
+          <w:commentReference w:id="196"/>
         </w:r>
       </w:del>
-      <w:ins w:id="193" w:author="Clay Cressler" w:date="2026-05-27T16:47:00Z" w16du:dateUtc="2026-05-27T21:47:00Z">
+      <w:ins w:id="198" w:author="Clay Cressler" w:date="2026-05-27T16:46:00Z" w16du:dateUtc="2026-05-27T21:46:00Z">
+        <w:r>
+          <w:t xml:space="preserve">the immune landscape the parasite faces by </w:t>
+        </w:r>
+      </w:ins>
+      <w:ins w:id="199" w:author="Clay Cressler" w:date="2026-05-27T16:47:00Z" w16du:dateUtc="2026-05-27T21:47:00Z">
         <w:r>
           <w:t xml:space="preserve">altering the initial Th2 bias of the immune system. </w:t>
         </w:r>
       </w:ins>
-      <w:del w:id="194" w:author="Clay Cressler" w:date="2026-05-27T16:48:00Z" w16du:dateUtc="2026-05-27T21:48:00Z">
+      <w:del w:id="200" w:author="Clay Cressler" w:date="2026-05-27T16:48:00Z" w16du:dateUtc="2026-05-27T21:48:00Z">
         <w:r>
           <w:delText xml:space="preserve">the range of variation in the </w:delText>
         </w:r>
-        <w:commentRangeStart w:id="195"/>
+        <w:commentRangeStart w:id="201"/>
         <w:r>
           <w:delText xml:space="preserve">initial number of Th2 cells </w:delText>
         </w:r>
-        <w:commentRangeEnd w:id="195"/>
+        <w:commentRangeEnd w:id="201"/>
         <w:r>
           <w:rPr>
             <w:rStyle w:val="CommentReference"/>
             <w:sz w:val="24"/>
             <w:szCs w:val="24"/>
           </w:rPr>
-          <w:commentReference w:id="195"/>
+          <w:commentReference w:id="201"/>
         </w:r>
         <w:r>
           <w:delText>and assume that the initial immune state is drawn from a uniform distribution with a specified minimum and maximum</w:delText>
@@ -5503,15 +5357,10 @@
           <w:delText xml:space="preserve">. </w:delText>
         </w:r>
       </w:del>
-      <w:proofErr w:type="gramStart"/>
-      <w:r>
-        <w:t>In particular, we</w:t>
-      </w:r>
-      <w:proofErr w:type="gramEnd"/>
-      <w:r>
-        <w:t xml:space="preserve"> hold the maximum </w:t>
-      </w:r>
-      <w:ins w:id="196" w:author="Clay Cressler" w:date="2026-05-27T16:48:00Z" w16du:dateUtc="2026-05-27T21:48:00Z">
+      <w:r>
+        <w:t xml:space="preserve">In particular, we hold the maximum </w:t>
+      </w:r>
+      <w:ins w:id="202" w:author="Clay Cressler" w:date="2026-05-27T16:48:00Z" w16du:dateUtc="2026-05-27T21:48:00Z">
         <w:r>
           <w:t xml:space="preserve">number of initial Th2 cells </w:t>
         </w:r>
@@ -5519,12 +5368,12 @@
       <w:r>
         <w:t>fixed at 800 and vary the minimum</w:t>
       </w:r>
-      <w:ins w:id="197" w:author="Clay Cressler" w:date="2026-05-27T16:48:00Z" w16du:dateUtc="2026-05-27T21:48:00Z">
+      <w:ins w:id="203" w:author="Clay Cressler" w:date="2026-05-27T16:48:00Z" w16du:dateUtc="2026-05-27T21:48:00Z">
         <w:r>
           <w:t xml:space="preserve"> number of cells; we then draw the initial number of Th2 from a uniform distribut</w:t>
         </w:r>
       </w:ins>
-      <w:ins w:id="198" w:author="Clay Cressler" w:date="2026-05-27T16:49:00Z" w16du:dateUtc="2026-05-27T21:49:00Z">
+      <w:ins w:id="204" w:author="Clay Cressler" w:date="2026-05-27T16:49:00Z" w16du:dateUtc="2026-05-27T21:49:00Z">
         <w:r>
           <w:t>ion</w:t>
         </w:r>
@@ -5532,17 +5381,17 @@
       <w:r>
         <w:t xml:space="preserve">. </w:t>
       </w:r>
-      <w:ins w:id="199" w:author="Clay Cressler" w:date="2026-05-27T16:49:00Z" w16du:dateUtc="2026-05-27T21:49:00Z">
+      <w:ins w:id="205" w:author="Clay Cressler" w:date="2026-05-27T16:49:00Z" w16du:dateUtc="2026-05-27T21:49:00Z">
         <w:r>
           <w:t xml:space="preserve">We also fix </w:t>
         </w:r>
       </w:ins>
-      <w:del w:id="200" w:author="Clay Cressler" w:date="2026-05-27T16:49:00Z" w16du:dateUtc="2026-05-27T21:49:00Z">
+      <w:del w:id="206" w:author="Clay Cressler" w:date="2026-05-27T16:49:00Z" w16du:dateUtc="2026-05-27T21:49:00Z">
         <w:r>
           <w:delText>T</w:delText>
         </w:r>
       </w:del>
-      <w:ins w:id="201" w:author="Clay Cressler" w:date="2026-05-27T16:49:00Z" w16du:dateUtc="2026-05-27T21:49:00Z">
+      <w:ins w:id="207" w:author="Clay Cressler" w:date="2026-05-27T16:49:00Z" w16du:dateUtc="2026-05-27T21:49:00Z">
         <w:r>
           <w:t>t</w:t>
         </w:r>
@@ -5550,9 +5399,13 @@
       <w:r>
         <w:t xml:space="preserve">he total immune cell population </w:t>
       </w:r>
-      <w:del w:id="202" w:author="Clay Cressler" w:date="2026-05-27T16:49:00Z" w16du:dateUtc="2026-05-27T21:49:00Z">
-        <w:r>
-          <w:delText xml:space="preserve">is fixed </w:delText>
+      <w:del w:id="208" w:author="Clay Cressler" w:date="2026-05-27T16:49:00Z" w16du:dateUtc="2026-05-27T21:49:00Z">
+        <w:r>
+          <w:delText xml:space="preserve">is </w:delText>
+        </w:r>
+        <w:r>
+          <w:lastRenderedPageBreak/>
+          <w:delText xml:space="preserve">fixed </w:delText>
         </w:r>
       </w:del>
       <w:r>
@@ -5561,12 +5414,12 @@
       <w:r>
         <w:t xml:space="preserve"> </w:t>
       </w:r>
-      <w:ins w:id="203" w:author="Clay Cressler" w:date="2026-05-27T16:49:00Z" w16du:dateUtc="2026-05-27T21:49:00Z">
+      <w:ins w:id="209" w:author="Clay Cressler" w:date="2026-05-27T16:49:00Z" w16du:dateUtc="2026-05-27T21:49:00Z">
         <w:r>
           <w:t>Thus, when the minimum number of Th2 cells is very small (e.g., 200), the initial immune state is likely to be Th1-biased, whereas when the minimum number of Th2 cells is very large (e.g., 700), the initial immune s</w:t>
         </w:r>
       </w:ins>
-      <w:ins w:id="204" w:author="Clay Cressler" w:date="2026-05-27T16:50:00Z" w16du:dateUtc="2026-05-27T21:50:00Z">
+      <w:ins w:id="210" w:author="Clay Cressler" w:date="2026-05-27T16:50:00Z" w16du:dateUtc="2026-05-27T21:50:00Z">
         <w:r>
           <w:t>tate is Th2-biased.</w:t>
         </w:r>
@@ -5582,16 +5435,16 @@
       <w:r>
         <w:t xml:space="preserve">We start each simulation with a small population of infected individuals, each with a </w:t>
       </w:r>
-      <w:commentRangeStart w:id="205"/>
+      <w:commentRangeStart w:id="211"/>
       <w:r>
         <w:t>per-</w:t>
       </w:r>
-      <w:ins w:id="206" w:author="Clay Cressler" w:date="2026-05-27T16:50:00Z" w16du:dateUtc="2026-05-27T21:50:00Z">
+      <w:ins w:id="212" w:author="Clay Cressler" w:date="2026-05-27T16:50:00Z" w16du:dateUtc="2026-05-27T21:50:00Z">
         <w:r>
           <w:t xml:space="preserve">unit biomass </w:t>
         </w:r>
       </w:ins>
-      <w:del w:id="207" w:author="Clay Cressler" w:date="2026-05-27T16:51:00Z" w16du:dateUtc="2026-05-27T21:51:00Z">
+      <w:del w:id="213" w:author="Clay Cressler" w:date="2026-05-27T16:51:00Z" w16du:dateUtc="2026-05-27T21:51:00Z">
         <w:r>
           <w:delText xml:space="preserve">parasite </w:delText>
         </w:r>
@@ -5599,14 +5452,14 @@
       <w:r>
         <w:t xml:space="preserve">virulence </w:t>
       </w:r>
-      <w:commentRangeEnd w:id="205"/>
+      <w:commentRangeEnd w:id="211"/>
       <w:r>
         <w:rPr>
           <w:rStyle w:val="CommentReference"/>
           <w:sz w:val="24"/>
           <w:szCs w:val="24"/>
         </w:rPr>
-        <w:commentReference w:id="205"/>
+        <w:commentReference w:id="211"/>
       </w:r>
       <w:r>
         <w:t xml:space="preserve">of </w:t>
@@ -5625,7 +5478,7 @@
         </w:rPr>
         <w:t>. When a</w:t>
       </w:r>
-      <w:ins w:id="208" w:author="Clay Cressler" w:date="2026-05-27T16:51:00Z" w16du:dateUtc="2026-05-27T21:51:00Z">
+      <w:ins w:id="214" w:author="Clay Cressler" w:date="2026-05-27T16:51:00Z" w16du:dateUtc="2026-05-27T21:51:00Z">
         <w:r>
           <w:rPr>
             <w:rFonts w:eastAsiaTheme="minorEastAsia"/>
@@ -5639,7 +5492,7 @@
         </w:rPr>
         <w:t xml:space="preserve">n infected </w:t>
       </w:r>
-      <w:ins w:id="209" w:author="Clay Cressler" w:date="2026-05-27T16:52:00Z" w16du:dateUtc="2026-05-27T21:52:00Z">
+      <w:ins w:id="215" w:author="Clay Cressler" w:date="2026-05-27T16:52:00Z" w16du:dateUtc="2026-05-27T21:52:00Z">
         <w:r>
           <w:rPr>
             <w:rFonts w:eastAsiaTheme="minorEastAsia"/>
@@ -5647,7 +5500,7 @@
           <w:t xml:space="preserve">and susceptible </w:t>
         </w:r>
       </w:ins>
-      <w:del w:id="210" w:author="Clay Cressler" w:date="2026-05-27T16:52:00Z" w16du:dateUtc="2026-05-27T21:52:00Z">
+      <w:del w:id="216" w:author="Clay Cressler" w:date="2026-05-27T16:52:00Z" w16du:dateUtc="2026-05-27T21:52:00Z">
         <w:r>
           <w:rPr>
             <w:rFonts w:eastAsiaTheme="minorEastAsia"/>
@@ -5655,7 +5508,7 @@
           <w:delText>host contacts a susceptible host</w:delText>
         </w:r>
       </w:del>
-      <w:ins w:id="211" w:author="Clay Cressler" w:date="2026-05-27T16:52:00Z" w16du:dateUtc="2026-05-27T21:52:00Z">
+      <w:ins w:id="217" w:author="Clay Cressler" w:date="2026-05-27T16:52:00Z" w16du:dateUtc="2026-05-27T21:52:00Z">
         <w:r>
           <w:rPr>
             <w:rFonts w:eastAsiaTheme="minorEastAsia"/>
@@ -5669,7 +5522,7 @@
         </w:rPr>
         <w:t>, the virulence of th</w:t>
       </w:r>
-      <w:ins w:id="212" w:author="Clay Cressler" w:date="2026-05-27T16:52:00Z" w16du:dateUtc="2026-05-27T21:52:00Z">
+      <w:ins w:id="218" w:author="Clay Cressler" w:date="2026-05-27T16:52:00Z" w16du:dateUtc="2026-05-27T21:52:00Z">
         <w:r>
           <w:rPr>
             <w:rFonts w:eastAsiaTheme="minorEastAsia"/>
@@ -5677,7 +5530,7 @@
           <w:t xml:space="preserve">is </w:t>
         </w:r>
       </w:ins>
-      <w:del w:id="213" w:author="Clay Cressler" w:date="2026-05-27T16:52:00Z" w16du:dateUtc="2026-05-27T21:52:00Z">
+      <w:del w:id="219" w:author="Clay Cressler" w:date="2026-05-27T16:52:00Z" w16du:dateUtc="2026-05-27T21:52:00Z">
         <w:r>
           <w:rPr>
             <w:rFonts w:eastAsiaTheme="minorEastAsia"/>
@@ -5689,25 +5542,10 @@
         <w:rPr>
           <w:rFonts w:eastAsiaTheme="minorEastAsia"/>
         </w:rPr>
-        <w:t xml:space="preserve">infection is drawn from a lognormal distribution with mean equal to the virulence of the infecting host and a </w:t>
-      </w:r>
-      <w:r>
-        <w:rPr>
-          <w:rFonts w:eastAsiaTheme="minorEastAsia"/>
-        </w:rPr>
-        <w:lastRenderedPageBreak/>
-        <w:t xml:space="preserve">standard deviation equal to half the mean. With this model of inheritance, virulence evolution </w:t>
-      </w:r>
-      <w:r>
-        <w:t>emerges out of the stochastic processes of infection, death, and recovery (</w:t>
-      </w:r>
-      <w:proofErr w:type="spellStart"/>
-      <w:r>
-        <w:t>Doebeli</w:t>
-      </w:r>
-      <w:proofErr w:type="spellEnd"/>
-      <w:r>
-        <w:t xml:space="preserve"> et al. 2017).</w:t>
+        <w:t xml:space="preserve">infection is drawn from a lognormal distribution with mean equal to the virulence of the infecting host and a standard deviation equal to half the mean. With this model of inheritance, virulence evolution </w:t>
+      </w:r>
+      <w:r>
+        <w:t>emerges out of the stochastic processes of infection, death, and recovery (Doebeli et al. 2017).</w:t>
       </w:r>
     </w:p>
     <w:p/>
@@ -5751,6 +5589,11 @@
       <w:r>
         <w:t xml:space="preserve"> of infection</w:t>
       </w:r>
+      <w:ins w:id="220" w:author="Clay Cressler [2]" w:date="2026-06-08T09:33:00Z" w16du:dateUtc="2026-06-08T14:33:00Z">
+        <w:r>
+          <w:t>, in particular whether an infection is cleared or is chronic,</w:t>
+        </w:r>
+      </w:ins>
       <w:r>
         <w:t xml:space="preserve"> at the within-host level</w:t>
       </w:r>
@@ -5793,16 +5636,16 @@
         </w:rPr>
         <w:t xml:space="preserve"> Fig. 1A shows the results of deterministic simulations of the within-host model (Eq. 1); Fig. 1B shows the results of stochastic simulations of the model using a Gillespie algorithm. For each set of initial conditions, we simulated the stochastic model 100 times and then report the probability of an acute infection. The deterministic model predicts that there are three possible equilibria, depending on the initial number of Th2 cells and the initial parasite dose: a high Th1, low Th2, high parasite equilibrium corresponding to a chronic infection (red); a high Th1, high Th2, low parasite (but non-zero) equilibrium (gray); and a low Th1, high Th2, zero parasite equilibrium corresponding to clearance (black). </w:t>
       </w:r>
-      <w:commentRangeStart w:id="214"/>
-      <w:commentRangeStart w:id="215"/>
-      <w:commentRangeStart w:id="216"/>
+      <w:commentRangeStart w:id="221"/>
+      <w:commentRangeStart w:id="222"/>
+      <w:commentRangeStart w:id="223"/>
       <w:r>
         <w:rPr>
           <w:rFonts w:eastAsiaTheme="minorEastAsia"/>
         </w:rPr>
         <w:t>Stochasticity eliminates the high Th1, high Th2 equilibrium; instead, we see a probabilistic outcome where the probability of clearance varies between 0 and 1 for Th2 between 400-600</w:t>
       </w:r>
-      <w:commentRangeEnd w:id="214"/>
+      <w:commentRangeEnd w:id="221"/>
       <w:r>
         <w:rPr>
           <w:rStyle w:val="CommentReference"/>
@@ -5810,9 +5653,9 @@
           <w:sz w:val="24"/>
           <w:szCs w:val="24"/>
         </w:rPr>
-        <w:commentReference w:id="214"/>
-      </w:r>
-      <w:commentRangeEnd w:id="215"/>
+        <w:commentReference w:id="221"/>
+      </w:r>
+      <w:commentRangeEnd w:id="222"/>
       <w:r>
         <w:rPr>
           <w:rStyle w:val="CommentReference"/>
@@ -5820,9 +5663,9 @@
           <w:sz w:val="24"/>
           <w:szCs w:val="24"/>
         </w:rPr>
-        <w:commentReference w:id="215"/>
-      </w:r>
-      <w:commentRangeEnd w:id="216"/>
+        <w:commentReference w:id="222"/>
+      </w:r>
+      <w:commentRangeEnd w:id="223"/>
       <w:r>
         <w:rPr>
           <w:rStyle w:val="CommentReference"/>
@@ -5830,7 +5673,7 @@
           <w:sz w:val="24"/>
           <w:szCs w:val="24"/>
         </w:rPr>
-        <w:commentReference w:id="216"/>
+        <w:commentReference w:id="223"/>
       </w:r>
       <w:r>
         <w:rPr>
@@ -5848,219 +5691,364 @@
     </w:p>
     <w:p>
       <w:r>
-        <w:t>With this intuition developed, we can consider the epidemiological and evolutionary dynamics that result from different immunological landscapes, specified by varying the minimum Th2 of each infection</w:t>
-      </w:r>
-      <w:commentRangeStart w:id="217"/>
-      <w:r>
-        <w:t>. Fig. 2 shows the epidemiological results</w:t>
-      </w:r>
-      <w:r>
-        <w:t xml:space="preserve">, </w:t>
-      </w:r>
-      <w:commentRangeEnd w:id="217"/>
+        <w:t xml:space="preserve">With this intuition developed, we can consider the epidemiological and evolutionary dynamics that result from different immunological landscapes, specified by varying the minimum Th2 of </w:t>
+      </w:r>
+      <w:ins w:id="224" w:author="Clay Cressler [2]" w:date="2026-05-29T16:41:00Z" w16du:dateUtc="2026-05-29T21:41:00Z">
+        <w:r>
+          <w:t xml:space="preserve">the </w:t>
+        </w:r>
+      </w:ins>
+      <w:ins w:id="225" w:author="Clay Cressler [2]" w:date="2026-05-29T16:42:00Z" w16du:dateUtc="2026-05-29T21:42:00Z">
+        <w:r>
+          <w:t>probability distribution that the initial immune state is drawn from</w:t>
+        </w:r>
+      </w:ins>
+      <w:ins w:id="226" w:author="Clay Cressler [2]" w:date="2026-05-29T16:41:00Z" w16du:dateUtc="2026-05-29T21:41:00Z">
+        <w:r>
+          <w:t xml:space="preserve"> </w:t>
+        </w:r>
+      </w:ins>
+      <w:r>
+        <w:t xml:space="preserve">each </w:t>
+      </w:r>
+      <w:ins w:id="227" w:author="Clay Cressler [2]" w:date="2026-05-29T16:42:00Z" w16du:dateUtc="2026-05-29T21:42:00Z">
+        <w:r>
+          <w:t xml:space="preserve">new </w:t>
+        </w:r>
+      </w:ins>
+      <w:r>
+        <w:t>infection</w:t>
+      </w:r>
+      <w:commentRangeStart w:id="228"/>
+      <w:r>
+        <w:t xml:space="preserve">. Fig. 2 shows the epidemiological </w:t>
+      </w:r>
+      <w:ins w:id="229" w:author="Clay Cressler [2]" w:date="2026-05-29T16:40:00Z" w16du:dateUtc="2026-05-29T21:40:00Z">
+        <w:r>
+          <w:t>dynamics that occur as the parasite is evol</w:t>
+        </w:r>
+      </w:ins>
+      <w:ins w:id="230" w:author="Clay Cressler [2]" w:date="2026-05-29T16:41:00Z" w16du:dateUtc="2026-05-29T21:41:00Z">
+        <w:r>
+          <w:t xml:space="preserve">ving. </w:t>
+        </w:r>
+      </w:ins>
+      <w:del w:id="231" w:author="Clay Cressler [2]" w:date="2026-05-29T16:40:00Z" w16du:dateUtc="2026-05-29T21:40:00Z">
+        <w:r>
+          <w:delText>results</w:delText>
+        </w:r>
+      </w:del>
+      <w:del w:id="232" w:author="Clay Cressler [2]" w:date="2026-05-29T16:41:00Z" w16du:dateUtc="2026-05-29T21:41:00Z">
+        <w:r>
+          <w:delText xml:space="preserve">, </w:delText>
+        </w:r>
+        <w:commentRangeEnd w:id="228"/>
+        <w:r>
+          <w:rPr>
+            <w:rStyle w:val="CommentReference"/>
+            <w:sz w:val="24"/>
+            <w:szCs w:val="24"/>
+            <w:highlight w:val="yellow"/>
+          </w:rPr>
+          <w:commentReference w:id="228"/>
+        </w:r>
+        <w:r>
+          <w:rPr>
+            <w:highlight w:val="yellow"/>
+          </w:rPr>
+          <w:delText>highlighting some particularly interesting.</w:delText>
+        </w:r>
+      </w:del>
+      <w:r>
+        <w:t xml:space="preserve"> In general, we observe a decrease in prevalence as we increase the minimum number of Th2 cells upon infection (main panel), reflecting an </w:t>
+      </w:r>
+      <w:commentRangeStart w:id="233"/>
+      <w:commentRangeStart w:id="234"/>
+      <w:r>
+        <w:t xml:space="preserve">increase in the probability of </w:t>
+      </w:r>
+      <w:del w:id="235" w:author="Clay Cressler [2]" w:date="2026-05-30T14:37:00Z" w16du:dateUtc="2026-05-30T19:37:00Z">
+        <w:r>
+          <w:delText>an acute infection</w:delText>
+        </w:r>
+      </w:del>
+      <w:ins w:id="236" w:author="Clay Cressler [2]" w:date="2026-05-30T14:37:00Z" w16du:dateUtc="2026-05-30T19:37:00Z">
+        <w:r>
+          <w:t>infection clearance</w:t>
+        </w:r>
+      </w:ins>
+      <w:r>
+        <w:t xml:space="preserve"> </w:t>
+      </w:r>
+      <w:commentRangeEnd w:id="233"/>
       <w:r>
         <w:rPr>
           <w:rStyle w:val="CommentReference"/>
           <w:sz w:val="24"/>
           <w:szCs w:val="24"/>
-          <w:highlight w:val="yellow"/>
-        </w:rPr>
-        <w:commentReference w:id="217"/>
-      </w:r>
-      <w:r>
-        <w:rPr>
-          <w:highlight w:val="yellow"/>
-        </w:rPr>
-        <w:t>highlighting some particularly interesting.</w:t>
-      </w:r>
-      <w:r>
-        <w:t xml:space="preserve"> In general, we observe a decrease in prevalence as we increase the minimum number of Th2 cells upon infection (main panel), reflecting an </w:t>
-      </w:r>
-      <w:commentRangeStart w:id="218"/>
-      <w:commentRangeStart w:id="219"/>
-      <w:r>
-        <w:t xml:space="preserve">increase in the probability of an acute infection </w:t>
-      </w:r>
-      <w:commentRangeEnd w:id="218"/>
+        </w:rPr>
+        <w:commentReference w:id="233"/>
+      </w:r>
+      <w:commentRangeEnd w:id="234"/>
       <w:r>
         <w:rPr>
           <w:rStyle w:val="CommentReference"/>
           <w:sz w:val="24"/>
           <w:szCs w:val="24"/>
         </w:rPr>
-        <w:commentReference w:id="218"/>
-      </w:r>
-      <w:commentRangeEnd w:id="219"/>
+        <w:commentReference w:id="234"/>
+      </w:r>
+      <w:r>
+        <w:t>with a higher initial Th2 (Fig. 1</w:t>
+      </w:r>
+      <w:ins w:id="237" w:author="Clay Cressler [2]" w:date="2026-05-30T15:30:00Z" w16du:dateUtc="2026-05-30T20:30:00Z">
+        <w:r>
+          <w:t xml:space="preserve">; Fig. </w:t>
+        </w:r>
+      </w:ins>
+      <w:ins w:id="238" w:author="Clay Cressler [2]" w:date="2026-05-31T16:48:00Z" w16du:dateUtc="2026-05-31T21:48:00Z">
+        <w:r>
+          <w:t>4</w:t>
+        </w:r>
+      </w:ins>
+      <w:ins w:id="239" w:author="Clay Cressler [2]" w:date="2026-05-30T15:30:00Z" w16du:dateUtc="2026-05-30T20:30:00Z">
+        <w:r>
+          <w:t>A</w:t>
+        </w:r>
+      </w:ins>
+      <w:r>
+        <w:t xml:space="preserve">). The blue points and top left panel show the epidemiological dynamics </w:t>
+      </w:r>
+      <w:commentRangeStart w:id="240"/>
+      <w:commentRangeStart w:id="241"/>
+      <w:r>
+        <w:t>when the immune system is very likely to be Th1-biased (minimum Th2=200)</w:t>
+      </w:r>
+      <w:commentRangeEnd w:id="240"/>
       <w:r>
         <w:rPr>
           <w:rStyle w:val="CommentReference"/>
           <w:sz w:val="24"/>
           <w:szCs w:val="24"/>
         </w:rPr>
-        <w:commentReference w:id="219"/>
-      </w:r>
-      <w:r>
-        <w:t xml:space="preserve">with a higher initial Th2 (Fig. 1). The blue points and top left panel show the epidemiological dynamics </w:t>
-      </w:r>
-      <w:commentRangeStart w:id="220"/>
-      <w:r>
-        <w:t>when the immune system is very likely to be Th1-biased (minimum Th2=200)</w:t>
-      </w:r>
-      <w:commentRangeEnd w:id="220"/>
+        <w:commentReference w:id="240"/>
+      </w:r>
+      <w:commentRangeEnd w:id="241"/>
       <w:r>
         <w:rPr>
           <w:rStyle w:val="CommentReference"/>
           <w:sz w:val="24"/>
           <w:szCs w:val="24"/>
         </w:rPr>
-        <w:commentReference w:id="220"/>
+        <w:commentReference w:id="241"/>
       </w:r>
       <w:r>
         <w:t>. We observed no epidemic fadeouts and prevalence is nearly 100%. Conversely, the green points and bottom left panel show the epidemiological dynamics when the immune system is Th2-biased (</w:t>
       </w:r>
-      <w:commentRangeStart w:id="221"/>
+      <w:commentRangeStart w:id="242"/>
       <w:r>
         <w:t>minimum Th2=700</w:t>
       </w:r>
-      <w:commentRangeEnd w:id="221"/>
+      <w:commentRangeEnd w:id="242"/>
       <w:r>
         <w:rPr>
           <w:rStyle w:val="CommentReference"/>
           <w:sz w:val="24"/>
           <w:szCs w:val="24"/>
         </w:rPr>
-        <w:commentReference w:id="221"/>
+        <w:commentReference w:id="242"/>
       </w:r>
       <w:r>
         <w:t xml:space="preserve">). </w:t>
       </w:r>
-      <w:commentRangeStart w:id="222"/>
-      <w:r>
-        <w:t xml:space="preserve">Epidemic fadeouts are </w:t>
-      </w:r>
-      <w:proofErr w:type="gramStart"/>
-      <w:r>
-        <w:t>common</w:t>
-      </w:r>
-      <w:proofErr w:type="gramEnd"/>
-      <w:r>
-        <w:t xml:space="preserve"> and prevalence reaches an approximate steady state around 25%. </w:t>
-      </w:r>
-      <w:commentRangeEnd w:id="222"/>
+      <w:commentRangeStart w:id="243"/>
+      <w:r>
+        <w:t>Epidemic fadeouts are common</w:t>
+      </w:r>
+      <w:ins w:id="244" w:author="Clay Cressler [2]" w:date="2026-05-30T15:31:00Z" w16du:dateUtc="2026-05-30T20:31:00Z">
+        <w:r>
+          <w:t xml:space="preserve">; in those populations where the infection becomes endemic, </w:t>
+        </w:r>
+      </w:ins>
+      <w:del w:id="245" w:author="Clay Cressler [2]" w:date="2026-05-30T15:31:00Z" w16du:dateUtc="2026-05-30T20:31:00Z">
+        <w:r>
+          <w:delText xml:space="preserve"> and </w:delText>
+        </w:r>
+      </w:del>
+      <w:r>
+        <w:t xml:space="preserve">prevalence reaches an approximate steady state around 25%. </w:t>
+      </w:r>
+      <w:commentRangeEnd w:id="243"/>
       <w:r>
         <w:rPr>
           <w:rStyle w:val="CommentReference"/>
           <w:sz w:val="24"/>
           <w:szCs w:val="24"/>
         </w:rPr>
-        <w:commentReference w:id="222"/>
-      </w:r>
-      <w:r>
-        <w:t xml:space="preserve">The orange points and middle left panel show the epidemiological dynamics when there is moderate Th2 bias (minimum Th2=575). Here we observe much more variability in the final prevalence across simulations and it is also clear that we have not yet reached a steady state; this is because the </w:t>
-      </w:r>
-      <w:commentRangeStart w:id="223"/>
-      <w:commentRangeStart w:id="224"/>
+        <w:commentReference w:id="243"/>
+      </w:r>
+      <w:r>
+        <w:t xml:space="preserve">The orange points and middle left panel </w:t>
+      </w:r>
+      <w:r>
+        <w:lastRenderedPageBreak/>
+        <w:t xml:space="preserve">show the epidemiological dynamics when there is moderate Th2 bias (minimum Th2=575). Here we observe much more variability in the final prevalence across simulations and it is also clear that we have not yet reached a steady state; this is because the </w:t>
+      </w:r>
+      <w:commentRangeStart w:id="246"/>
+      <w:commentRangeStart w:id="247"/>
+      <w:commentRangeStart w:id="248"/>
       <w:r>
         <w:t xml:space="preserve">eco-evolutionary dynamics are still occurring </w:t>
       </w:r>
-      <w:commentRangeEnd w:id="223"/>
+      <w:commentRangeEnd w:id="246"/>
       <w:r>
         <w:rPr>
           <w:rStyle w:val="CommentReference"/>
           <w:sz w:val="24"/>
           <w:szCs w:val="24"/>
         </w:rPr>
-        <w:commentReference w:id="223"/>
-      </w:r>
-      <w:commentRangeEnd w:id="224"/>
+        <w:commentReference w:id="246"/>
+      </w:r>
+      <w:commentRangeEnd w:id="247"/>
       <w:r>
         <w:rPr>
           <w:rStyle w:val="CommentReference"/>
           <w:sz w:val="24"/>
           <w:szCs w:val="24"/>
         </w:rPr>
-        <w:commentReference w:id="224"/>
+        <w:commentReference w:id="247"/>
+      </w:r>
+      <w:commentRangeEnd w:id="248"/>
+      <w:r>
+        <w:rPr>
+          <w:rStyle w:val="CommentReference"/>
+          <w:sz w:val="24"/>
+          <w:szCs w:val="24"/>
+        </w:rPr>
+        <w:commentReference w:id="248"/>
       </w:r>
       <w:r>
         <w:t>(Fig. 3).</w:t>
       </w:r>
+      <w:ins w:id="249" w:author="Clay Cressler [2]" w:date="2026-05-31T16:50:00Z" w16du:dateUtc="2026-05-31T21:50:00Z">
+        <w:r>
+          <w:t xml:space="preserve"> At this intermediate Th2 bias, the eco-evolutionary dynamics do not </w:t>
+        </w:r>
+      </w:ins>
+      <w:ins w:id="250" w:author="Clay Cressler [2]" w:date="2026-05-31T16:51:00Z" w16du:dateUtc="2026-05-31T21:51:00Z">
+        <w:r>
+          <w:t>reach a</w:t>
+        </w:r>
+      </w:ins>
+      <w:ins w:id="251" w:author="Clay Cressler [2]" w:date="2026-05-31T16:53:00Z" w16du:dateUtc="2026-05-31T21:53:00Z">
+        <w:r>
+          <w:t xml:space="preserve"> </w:t>
+        </w:r>
+      </w:ins>
+      <w:ins w:id="252" w:author="Clay Cressler [2]" w:date="2026-05-31T16:51:00Z" w16du:dateUtc="2026-05-31T21:51:00Z">
+        <w:r>
+          <w:t>steady state</w:t>
+        </w:r>
+      </w:ins>
+      <w:ins w:id="253" w:author="Clay Cressler [2]" w:date="2026-05-31T16:53:00Z" w16du:dateUtc="2026-05-31T21:53:00Z">
+        <w:r>
+          <w:t>, even after 1</w:t>
+        </w:r>
+      </w:ins>
+      <w:ins w:id="254" w:author="Clay Cressler [2]" w:date="2026-05-31T16:51:00Z" w16du:dateUtc="2026-05-31T21:51:00Z">
+        <w:r>
+          <w:t>500 timesteps and there is considerable variation between stochastic replicate simulations</w:t>
+        </w:r>
+      </w:ins>
+      <w:ins w:id="255" w:author="Clay Cressler [2]" w:date="2026-05-31T16:53:00Z" w16du:dateUtc="2026-05-31T21:53:00Z">
+        <w:r>
+          <w:t xml:space="preserve"> (Supplementary Figure S1)</w:t>
+        </w:r>
+      </w:ins>
+      <w:ins w:id="256" w:author="Clay Cressler [2]" w:date="2026-05-31T16:51:00Z" w16du:dateUtc="2026-05-31T21:51:00Z">
+        <w:r>
+          <w:t>.</w:t>
+        </w:r>
+      </w:ins>
     </w:p>
     <w:p/>
     <w:p>
       <w:r>
         <w:t xml:space="preserve">Evolutionarily, we see that when the immune system is Th1-biased (minimum Th2=200; top left panel of Fig. 3), </w:t>
       </w:r>
-      <w:commentRangeStart w:id="225"/>
+      <w:commentRangeStart w:id="257"/>
       <w:r>
         <w:t>virulence evolves to be very low as chronic infections are very likely</w:t>
       </w:r>
-      <w:commentRangeEnd w:id="225"/>
+      <w:commentRangeEnd w:id="257"/>
       <w:r>
         <w:rPr>
           <w:rStyle w:val="CommentReference"/>
           <w:sz w:val="24"/>
           <w:szCs w:val="24"/>
         </w:rPr>
-        <w:commentReference w:id="225"/>
+        <w:commentReference w:id="257"/>
       </w:r>
       <w:r>
         <w:t xml:space="preserve">. Conversely, when the immune system is Th2-biased (minimum Th2=700; bottom left panel of Fig. 3), virulence evolves to be high as acute infections are very likely. When there is moderate Th2 bias (minimum Th2=575), the evolutionary outcomes are highly variable; overall, most simulations are evolving towards lower virulence, but many have maintained very high virulence throughout the entire simulation run, </w:t>
       </w:r>
-      <w:commentRangeStart w:id="226"/>
-      <w:commentRangeStart w:id="227"/>
-      <w:r>
-        <w:t xml:space="preserve">implying that virulence evolution </w:t>
-      </w:r>
-      <w:r>
-        <w:lastRenderedPageBreak/>
-        <w:t>is much less predictable</w:t>
-      </w:r>
-      <w:commentRangeEnd w:id="226"/>
+      <w:commentRangeStart w:id="258"/>
+      <w:commentRangeStart w:id="259"/>
+      <w:r>
+        <w:t>implying that virulence evolution is much less predictable</w:t>
+      </w:r>
+      <w:commentRangeEnd w:id="258"/>
       <w:r>
         <w:rPr>
           <w:rStyle w:val="CommentReference"/>
           <w:sz w:val="24"/>
           <w:szCs w:val="24"/>
         </w:rPr>
-        <w:commentReference w:id="226"/>
-      </w:r>
-      <w:commentRangeEnd w:id="227"/>
+        <w:commentReference w:id="258"/>
+      </w:r>
+      <w:commentRangeEnd w:id="259"/>
       <w:r>
         <w:rPr>
           <w:rStyle w:val="CommentReference"/>
           <w:sz w:val="24"/>
           <w:szCs w:val="24"/>
         </w:rPr>
-        <w:commentReference w:id="227"/>
-      </w:r>
-      <w:r>
-        <w:t xml:space="preserve">. Overall, as the immune system becomes more Th2-biased and </w:t>
-      </w:r>
-      <w:commentRangeStart w:id="228"/>
+        <w:commentReference w:id="259"/>
+      </w:r>
+      <w:r>
+        <w:t xml:space="preserve">. </w:t>
+      </w:r>
+      <w:ins w:id="260" w:author="Clay Cressler [2]" w:date="2026-05-31T16:58:00Z" w16du:dateUtc="2026-05-31T21:58:00Z">
+        <w:r>
+          <w:t xml:space="preserve">For moderate Th2 bias, this variability can persist for a long time; although most simulations have </w:t>
+        </w:r>
+      </w:ins>
+      <w:ins w:id="261" w:author="Clay Cressler [2]" w:date="2026-05-31T16:59:00Z" w16du:dateUtc="2026-05-31T21:59:00Z">
+        <w:r>
+          <w:t xml:space="preserve">reached low virulence by 1500 timsteps, there are still multiple replicates with higher-than-expected virulence (Supplementary Fig. S1). </w:t>
+        </w:r>
+      </w:ins>
+      <w:r>
+        <w:t xml:space="preserve">Overall, as the immune system becomes more Th2-biased and </w:t>
+      </w:r>
+      <w:commentRangeStart w:id="262"/>
       <w:r>
         <w:t xml:space="preserve">acute infections are </w:t>
       </w:r>
-      <w:del w:id="229" w:author="Andrea L. Graham" w:date="2026-05-21T13:30:00Z" w16du:dateUtc="2026-05-21T17:30:00Z">
-        <w:r>
-          <w:delText xml:space="preserve">less </w:delText>
-        </w:r>
-      </w:del>
-      <w:ins w:id="230" w:author="Andrea L. Graham" w:date="2026-05-21T13:30:00Z" w16du:dateUtc="2026-05-21T17:30:00Z">
-        <w:r>
-          <w:t xml:space="preserve">more </w:t>
-        </w:r>
-      </w:ins>
+      <w:r>
+        <w:t xml:space="preserve">more </w:t>
+      </w:r>
       <w:r>
         <w:t>likely</w:t>
       </w:r>
-      <w:commentRangeEnd w:id="228"/>
+      <w:commentRangeEnd w:id="262"/>
       <w:r>
         <w:rPr>
           <w:rStyle w:val="CommentReference"/>
           <w:sz w:val="24"/>
           <w:szCs w:val="24"/>
         </w:rPr>
-        <w:commentReference w:id="228"/>
+        <w:commentReference w:id="262"/>
       </w:r>
       <w:r>
         <w:t>, parasite virulence evolves to be higher</w:t>
@@ -6074,145 +6062,339 @@
       <w:r>
         <w:t>Figure 4 visualizes how evolution of virulence across different immune landscapes has modified parasite fitness components.</w:t>
       </w:r>
-      <w:r>
-        <w:t xml:space="preserve"> When the initial immune state is likely Th1-biased, parasite evolution reduces the probability of clearance, whereas the probability of </w:t>
-      </w:r>
-      <w:commentRangeStart w:id="231"/>
+      <w:ins w:id="263" w:author="Clay Cressler [2]" w:date="2026-06-08T09:29:00Z" w16du:dateUtc="2026-06-08T14:29:00Z">
+        <w:r>
+          <w:t xml:space="preserve"> We examine only the first 500 timesteps of each simulation to avoid issues with right-censoring of infection duration.</w:t>
+        </w:r>
+      </w:ins>
+      <w:r>
+        <w:t xml:space="preserve"> When the initial immune state is likely Th1-biased</w:t>
+      </w:r>
+      <w:ins w:id="264" w:author="Clay Cressler [2]" w:date="2026-06-01T12:47:00Z" w16du:dateUtc="2026-06-01T17:47:00Z">
+        <w:r>
+          <w:t xml:space="preserve"> (that is, when</w:t>
+        </w:r>
+      </w:ins>
+      <w:ins w:id="265" w:author="Clay Cressler [2]" w:date="2026-06-01T12:48:00Z" w16du:dateUtc="2026-06-01T17:48:00Z">
+        <w:r>
+          <w:t xml:space="preserve"> the initial number of Th2 cells is low)</w:t>
+        </w:r>
+      </w:ins>
+      <w:r>
+        <w:t xml:space="preserve">, parasite evolution reduces the probability of clearance, whereas the probability of </w:t>
+      </w:r>
+      <w:commentRangeStart w:id="266"/>
+      <w:commentRangeStart w:id="267"/>
       <w:r>
         <w:t>clearance remains relatively fixed over eco-evolutionary time when the immune state is likely Th2-biased</w:t>
       </w:r>
-      <w:commentRangeEnd w:id="231"/>
+      <w:commentRangeEnd w:id="266"/>
       <w:r>
         <w:rPr>
           <w:rStyle w:val="CommentReference"/>
           <w:sz w:val="24"/>
           <w:szCs w:val="24"/>
         </w:rPr>
-        <w:commentReference w:id="231"/>
-      </w:r>
-      <w:r>
-        <w:t xml:space="preserve"> (Fig. 4A). Note, however, that even when the </w:t>
-      </w:r>
-      <w:del w:id="232" w:author="Andrea L. Graham" w:date="2026-05-21T13:38:00Z" w16du:dateUtc="2026-05-21T17:38:00Z">
-        <w:r>
-          <w:delText xml:space="preserve">infection </w:delText>
-        </w:r>
-      </w:del>
-      <w:ins w:id="233" w:author="Andrea L. Graham" w:date="2026-05-21T13:38:00Z" w16du:dateUtc="2026-05-21T17:38:00Z">
-        <w:r>
-          <w:t xml:space="preserve">immune system </w:t>
-        </w:r>
-      </w:ins>
-      <w:r>
-        <w:t xml:space="preserve">is strongly </w:t>
-      </w:r>
-      <w:commentRangeStart w:id="234"/>
-      <w:r>
-        <w:t>Th1-biased</w:t>
-      </w:r>
-      <w:commentRangeEnd w:id="234"/>
+        <w:commentReference w:id="266"/>
+      </w:r>
+      <w:commentRangeEnd w:id="267"/>
       <w:r>
         <w:rPr>
           <w:rStyle w:val="CommentReference"/>
           <w:sz w:val="24"/>
           <w:szCs w:val="24"/>
         </w:rPr>
-        <w:commentReference w:id="234"/>
-      </w:r>
-      <w:r>
-        <w:t xml:space="preserve"> the probability of clearance remains positive, indicating that not all infections are chronic. </w:t>
-      </w:r>
-      <w:r>
-        <w:t xml:space="preserve">Unsurprisingly, as clearance probability declines in Th1-biased immune landscapes, infection duration increases. </w:t>
-      </w:r>
-      <w:commentRangeStart w:id="235"/>
-      <w:commentRangeStart w:id="236"/>
+        <w:commentReference w:id="267"/>
+      </w:r>
+      <w:r>
+        <w:t xml:space="preserve"> (</w:t>
+      </w:r>
+      <w:ins w:id="268" w:author="Clay Cressler [2]" w:date="2026-06-01T12:44:00Z" w16du:dateUtc="2026-06-01T17:44:00Z">
+        <w:r>
+          <w:t xml:space="preserve">compare the red lines </w:t>
+        </w:r>
+      </w:ins>
+      <w:ins w:id="269" w:author="Clay Cressler [2]" w:date="2026-06-08T09:28:00Z" w16du:dateUtc="2026-06-08T14:28:00Z">
+        <w:r>
+          <w:t xml:space="preserve">[Th1-biasd] </w:t>
+        </w:r>
+      </w:ins>
+      <w:ins w:id="270" w:author="Clay Cressler [2]" w:date="2026-06-01T12:44:00Z" w16du:dateUtc="2026-06-01T17:44:00Z">
+        <w:r>
+          <w:t>to the blue lines</w:t>
+        </w:r>
+      </w:ins>
+      <w:ins w:id="271" w:author="Clay Cressler [2]" w:date="2026-06-08T09:28:00Z" w16du:dateUtc="2026-06-08T14:28:00Z">
+        <w:r>
+          <w:t xml:space="preserve"> [Th2-biased]</w:t>
+        </w:r>
+      </w:ins>
+      <w:ins w:id="272" w:author="Clay Cressler [2]" w:date="2026-06-01T12:44:00Z" w16du:dateUtc="2026-06-01T17:44:00Z">
+        <w:r>
+          <w:t xml:space="preserve"> in </w:t>
+        </w:r>
+      </w:ins>
+      <w:r>
+        <w:t xml:space="preserve">Fig. 4A). Note, however, that </w:t>
+      </w:r>
+      <w:del w:id="273" w:author="Clay Cressler [2]" w:date="2026-06-01T12:45:00Z" w16du:dateUtc="2026-06-01T17:45:00Z">
+        <w:r>
+          <w:delText xml:space="preserve">even when the </w:delText>
+        </w:r>
+        <w:r>
+          <w:delText xml:space="preserve">immune system </w:delText>
+        </w:r>
+        <w:r>
+          <w:delText xml:space="preserve">is strongly </w:delText>
+        </w:r>
+        <w:commentRangeStart w:id="274"/>
+        <w:r>
+          <w:delText>Th1-biased</w:delText>
+        </w:r>
+        <w:commentRangeEnd w:id="274"/>
+        <w:r>
+          <w:rPr>
+            <w:rStyle w:val="CommentReference"/>
+            <w:sz w:val="24"/>
+            <w:szCs w:val="24"/>
+          </w:rPr>
+          <w:commentReference w:id="274"/>
+        </w:r>
+        <w:r>
+          <w:delText xml:space="preserve"> </w:delText>
+        </w:r>
+      </w:del>
+      <w:r>
+        <w:t>the probability of clearance remains positive, indicating that not all infections are chronic</w:t>
+      </w:r>
+      <w:ins w:id="275" w:author="Clay Cressler [2]" w:date="2026-06-01T12:45:00Z" w16du:dateUtc="2026-06-01T17:45:00Z">
+        <w:r>
+          <w:t xml:space="preserve"> even in the most Th1-biased immune landscapes</w:t>
+        </w:r>
+      </w:ins>
+      <w:r>
+        <w:t xml:space="preserve">. </w:t>
+      </w:r>
+      <w:r>
+        <w:t>Unsurprisingly, as clearance probability declines in Th1-biased immune landscapes, infection duration increases</w:t>
+      </w:r>
+      <w:ins w:id="276" w:author="Clay Cressler [2]" w:date="2026-06-01T12:46:00Z" w16du:dateUtc="2026-06-01T17:46:00Z">
+        <w:r>
+          <w:t xml:space="preserve"> (red lines in Fig. 4B)</w:t>
+        </w:r>
+      </w:ins>
+      <w:r>
+        <w:t xml:space="preserve">. </w:t>
+      </w:r>
+      <w:commentRangeStart w:id="277"/>
+      <w:commentRangeStart w:id="278"/>
       <w:r>
         <w:t>More surprisingly, given the fact that virulence is increasing in Th2-biased landscapes (Fig. 3), infection duration remains relatively constant (</w:t>
       </w:r>
-      <w:commentRangeStart w:id="237"/>
+      <w:ins w:id="279" w:author="Clay Cressler [2]" w:date="2026-06-01T12:46:00Z" w16du:dateUtc="2026-06-01T17:46:00Z">
+        <w:r>
+          <w:t xml:space="preserve">blue lines in </w:t>
+        </w:r>
+      </w:ins>
+      <w:commentRangeStart w:id="280"/>
       <w:r>
         <w:t>Fig. 4B</w:t>
       </w:r>
-      <w:commentRangeEnd w:id="237"/>
+      <w:commentRangeEnd w:id="280"/>
       <w:r>
         <w:rPr>
           <w:rStyle w:val="CommentReference"/>
           <w:sz w:val="24"/>
           <w:szCs w:val="24"/>
         </w:rPr>
-        <w:commentReference w:id="237"/>
-      </w:r>
-      <w:r>
-        <w:t xml:space="preserve">). </w:t>
-      </w:r>
-      <w:commentRangeEnd w:id="235"/>
+        <w:commentReference w:id="280"/>
+      </w:r>
+      <w:r>
+        <w:t>)</w:t>
+      </w:r>
+      <w:ins w:id="281" w:author="Clay Cressler [2]" w:date="2026-06-01T12:46:00Z" w16du:dateUtc="2026-06-01T17:46:00Z">
+        <w:r>
+          <w:t>, a point we return to in the Disc</w:t>
+        </w:r>
+      </w:ins>
+      <w:ins w:id="282" w:author="Clay Cressler [2]" w:date="2026-06-01T12:47:00Z" w16du:dateUtc="2026-06-01T17:47:00Z">
+        <w:r>
+          <w:t>ussion</w:t>
+        </w:r>
+      </w:ins>
+      <w:r>
+        <w:t xml:space="preserve">. </w:t>
+      </w:r>
+      <w:commentRangeEnd w:id="277"/>
       <w:r>
         <w:rPr>
           <w:rStyle w:val="CommentReference"/>
           <w:sz w:val="24"/>
           <w:szCs w:val="24"/>
         </w:rPr>
-        <w:commentReference w:id="235"/>
-      </w:r>
-      <w:commentRangeEnd w:id="236"/>
+        <w:commentReference w:id="277"/>
+      </w:r>
+      <w:commentRangeEnd w:id="278"/>
       <w:r>
         <w:rPr>
           <w:rStyle w:val="CommentReference"/>
           <w:sz w:val="24"/>
           <w:szCs w:val="24"/>
         </w:rPr>
-        <w:commentReference w:id="236"/>
+        <w:commentReference w:id="278"/>
       </w:r>
       <w:r>
         <w:t>Finally, evolution of reduced virulence in Th1-biased landscapes leads to lower peak parasite abundance, whereas evolution of increased virulence in Th2-biased landscapes leads to higher peak parasite abundance (Fig. 4C). Combining the insights from Figs. 2</w:t>
       </w:r>
-      <w:ins w:id="238" w:author="David Chang van Oordt" w:date="2026-05-21T21:28:00Z" w16du:dateUtc="2026-05-22T01:28:00Z">
+      <w:ins w:id="283" w:author="David Chang van Oordt" w:date="2026-05-21T21:28:00Z" w16du:dateUtc="2026-05-22T01:28:00Z">
         <w:r>
           <w:sym w:font="Symbol" w:char="F02D"/>
         </w:r>
       </w:ins>
-      <w:del w:id="239" w:author="David Chang van Oordt" w:date="2026-05-21T21:28:00Z" w16du:dateUtc="2026-05-22T01:28:00Z">
+      <w:del w:id="284" w:author="David Chang van Oordt" w:date="2026-05-21T21:28:00Z" w16du:dateUtc="2026-05-22T01:28:00Z">
         <w:r>
           <w:delText>-</w:delText>
         </w:r>
       </w:del>
       <w:r>
-        <w:t xml:space="preserve">4, we see that Th1-biased immune landscapes lead to the evolution of reduced virulence to reduce clearance probability and increase infection duration, which leads to high prevalence of infection within the host population. </w:t>
-      </w:r>
-      <w:commentRangeStart w:id="240"/>
-      <w:r>
-        <w:t xml:space="preserve">Th2-biased immune landscapes lead to the evolution of increased virulence </w:t>
-      </w:r>
-      <w:commentRangeStart w:id="241"/>
-      <w:r>
-        <w:t>to increase</w:t>
-      </w:r>
-      <w:commentRangeEnd w:id="241"/>
+        <w:t>4, we see that Th1-biased immune landscapes lead to the evolution of reduced virulence</w:t>
+      </w:r>
+      <w:ins w:id="285" w:author="Clay Cressler [2]" w:date="2026-06-08T09:31:00Z" w16du:dateUtc="2026-06-08T14:31:00Z">
+        <w:r>
+          <w:t>, which</w:t>
+        </w:r>
+      </w:ins>
+      <w:del w:id="286" w:author="Clay Cressler [2]" w:date="2026-06-08T09:31:00Z" w16du:dateUtc="2026-06-08T14:31:00Z">
+        <w:r>
+          <w:delText xml:space="preserve"> to</w:delText>
+        </w:r>
+      </w:del>
+      <w:r>
+        <w:t xml:space="preserve"> reduce</w:t>
+      </w:r>
+      <w:ins w:id="287" w:author="Clay Cressler [2]" w:date="2026-06-08T09:31:00Z" w16du:dateUtc="2026-06-08T14:31:00Z">
+        <w:r>
+          <w:t>s</w:t>
+        </w:r>
+      </w:ins>
+      <w:r>
+        <w:t xml:space="preserve"> clearance probability and increase</w:t>
+      </w:r>
+      <w:ins w:id="288" w:author="Clay Cressler [2]" w:date="2026-06-08T09:31:00Z" w16du:dateUtc="2026-06-08T14:31:00Z">
+        <w:r>
+          <w:t>s</w:t>
+        </w:r>
+      </w:ins>
+      <w:r>
+        <w:t xml:space="preserve"> infection duration, </w:t>
+      </w:r>
+      <w:del w:id="289" w:author="Clay Cressler [2]" w:date="2026-06-08T09:31:00Z" w16du:dateUtc="2026-06-08T14:31:00Z">
+        <w:r>
+          <w:delText xml:space="preserve">which </w:delText>
+        </w:r>
+      </w:del>
+      <w:r>
+        <w:t>lead</w:t>
+      </w:r>
+      <w:ins w:id="290" w:author="Clay Cressler [2]" w:date="2026-06-08T09:31:00Z" w16du:dateUtc="2026-06-08T14:31:00Z">
+        <w:r>
+          <w:t>ing</w:t>
+        </w:r>
+      </w:ins>
+      <w:del w:id="291" w:author="Clay Cressler [2]" w:date="2026-06-08T09:31:00Z" w16du:dateUtc="2026-06-08T14:31:00Z">
+        <w:r>
+          <w:delText>s</w:delText>
+        </w:r>
+      </w:del>
+      <w:r>
+        <w:t xml:space="preserve"> to high prevalence of infection within the host population. </w:t>
+      </w:r>
+      <w:commentRangeStart w:id="292"/>
+      <w:r>
+        <w:t>Th2-biased immune landscapes lead to the evolution of increased virulence</w:t>
+      </w:r>
+      <w:ins w:id="293" w:author="Clay Cressler [2]" w:date="2026-06-08T09:31:00Z" w16du:dateUtc="2026-06-08T14:31:00Z">
+        <w:r>
+          <w:t>,</w:t>
+        </w:r>
+      </w:ins>
+      <w:r>
+        <w:t xml:space="preserve"> </w:t>
+      </w:r>
+      <w:commentRangeStart w:id="294"/>
+      <w:del w:id="295" w:author="Clay Cressler [2]" w:date="2026-06-08T09:31:00Z" w16du:dateUtc="2026-06-08T14:31:00Z">
+        <w:r>
+          <w:delText>to</w:delText>
+        </w:r>
+      </w:del>
+      <w:ins w:id="296" w:author="Clay Cressler [2]" w:date="2026-06-08T09:31:00Z" w16du:dateUtc="2026-06-08T14:31:00Z">
+        <w:r>
+          <w:t>which</w:t>
+        </w:r>
+      </w:ins>
+      <w:r>
+        <w:t xml:space="preserve"> increase</w:t>
+      </w:r>
+      <w:commentRangeEnd w:id="294"/>
       <w:r>
         <w:rPr>
           <w:rStyle w:val="CommentReference"/>
           <w:sz w:val="24"/>
           <w:szCs w:val="24"/>
         </w:rPr>
-        <w:commentReference w:id="241"/>
-      </w:r>
-      <w:r>
-        <w:t xml:space="preserve"> peak parasite abundance, thereby increasing transmission, but the high clearance probability leads to low prevalence of infection.</w:t>
-      </w:r>
-      <w:commentRangeEnd w:id="240"/>
+        <w:commentReference w:id="294"/>
+      </w:r>
+      <w:ins w:id="297" w:author="Clay Cressler [2]" w:date="2026-06-08T09:31:00Z" w16du:dateUtc="2026-06-08T14:31:00Z">
+        <w:r>
+          <w:t>s</w:t>
+        </w:r>
+      </w:ins>
+      <w:r>
+        <w:t xml:space="preserve"> peak parasite abundance, thereby increasing transmission, but </w:t>
+      </w:r>
+      <w:ins w:id="298" w:author="Clay Cressler [2]" w:date="2026-06-08T09:31:00Z" w16du:dateUtc="2026-06-08T14:31:00Z">
+        <w:r>
+          <w:t>without reducing</w:t>
+        </w:r>
+      </w:ins>
+      <w:ins w:id="299" w:author="Clay Cressler [2]" w:date="2026-06-08T09:32:00Z" w16du:dateUtc="2026-06-08T14:32:00Z">
+        <w:r>
+          <w:t xml:space="preserve"> </w:t>
+        </w:r>
+      </w:ins>
+      <w:r>
+        <w:t>the high clearance probability</w:t>
+      </w:r>
+      <w:ins w:id="300" w:author="Clay Cressler [2]" w:date="2026-06-08T09:32:00Z" w16du:dateUtc="2026-06-08T14:32:00Z">
+        <w:r>
+          <w:t>,</w:t>
+        </w:r>
+      </w:ins>
+      <w:r>
+        <w:t xml:space="preserve"> </w:t>
+      </w:r>
+      <w:ins w:id="301" w:author="Clay Cressler [2]" w:date="2026-06-08T09:32:00Z" w16du:dateUtc="2026-06-08T14:32:00Z">
+        <w:r>
+          <w:t xml:space="preserve">which </w:t>
+        </w:r>
+      </w:ins>
+      <w:r>
+        <w:t>leads to low prevalence of infection.</w:t>
+      </w:r>
+      <w:commentRangeEnd w:id="292"/>
       <w:r>
         <w:rPr>
           <w:rStyle w:val="CommentReference"/>
           <w:sz w:val="24"/>
           <w:szCs w:val="24"/>
         </w:rPr>
-        <w:commentReference w:id="240"/>
+        <w:commentReference w:id="292"/>
       </w:r>
     </w:p>
     <w:p/>
     <w:p>
       <w:r>
+        <w:lastRenderedPageBreak/>
         <w:t xml:space="preserve">Finally, to </w:t>
       </w:r>
       <w:r>
@@ -6221,30 +6403,22 @@
       <w:r>
         <w:t xml:space="preserve"> that it is the </w:t>
       </w:r>
-      <w:commentRangeStart w:id="242"/>
+      <w:commentRangeStart w:id="302"/>
       <w:r>
         <w:t xml:space="preserve">acute versus chronic infection probability </w:t>
       </w:r>
-      <w:commentRangeEnd w:id="242"/>
+      <w:commentRangeEnd w:id="302"/>
       <w:r>
         <w:rPr>
           <w:rStyle w:val="CommentReference"/>
           <w:sz w:val="24"/>
           <w:szCs w:val="24"/>
         </w:rPr>
-        <w:commentReference w:id="242"/>
+        <w:commentReference w:id="302"/>
       </w:r>
       <w:r>
         <w:t xml:space="preserve">that is driving the evolutionary and epidemiological outcomes, we consider the evolution of virulence in </w:t>
       </w:r>
-      <w:del w:id="243" w:author="David Chang van Oordt" w:date="2026-05-21T21:34:00Z" w16du:dateUtc="2026-05-22T01:34:00Z">
-        <w:r>
-          <w:rPr>
-            <w:highlight w:val="yellow"/>
-          </w:rPr>
-          <w:delText xml:space="preserve">a </w:delText>
-        </w:r>
-      </w:del>
       <w:r>
         <w:rPr>
           <w:highlight w:val="yellow"/>
@@ -6254,18 +6428,18 @@
       <w:r>
         <w:t xml:space="preserve"> greatly simplified </w:t>
       </w:r>
-      <w:commentRangeStart w:id="244"/>
+      <w:commentRangeStart w:id="303"/>
       <w:r>
         <w:t>system</w:t>
       </w:r>
-      <w:commentRangeEnd w:id="244"/>
+      <w:commentRangeEnd w:id="303"/>
       <w:r>
         <w:rPr>
           <w:rStyle w:val="CommentReference"/>
           <w:sz w:val="24"/>
           <w:szCs w:val="24"/>
         </w:rPr>
-        <w:commentReference w:id="244"/>
+        <w:commentReference w:id="303"/>
       </w:r>
       <w:r>
         <w:t xml:space="preserve">: </w:t>
@@ -6536,10 +6710,12 @@
                   </m:e>
                 </m:d>
                 <m:r>
-                  <w:rPr>
-                    <w:rFonts w:ascii="Cambria Math" w:hAnsi="Cambria Math"/>
-                  </w:rPr>
-                  <m:t>S</m:t>
+                  <w:del w:id="304" w:author="Clay Cressler [2]" w:date="2026-06-08T09:39:00Z" w16du:dateUtc="2026-06-08T14:39:00Z">
+                    <w:rPr>
+                      <w:rFonts w:ascii="Cambria Math" w:hAnsi="Cambria Math"/>
+                    </w:rPr>
+                    <m:t>S</m:t>
+                  </w:del>
                 </m:r>
                 <m:d>
                   <m:dPr>
@@ -6615,6 +6791,14 @@
                   </m:e>
                 </m:d>
                 <m:r>
+                  <w:ins w:id="305" w:author="Clay Cressler [2]" w:date="2026-06-08T09:39:00Z" w16du:dateUtc="2026-06-08T14:39:00Z">
+                    <w:rPr>
+                      <w:rFonts w:ascii="Cambria Math" w:hAnsi="Cambria Math"/>
+                    </w:rPr>
+                    <m:t>S</m:t>
+                  </w:ins>
+                </m:r>
+                <m:r>
                   <w:rPr>
                     <w:rFonts w:ascii="Cambria Math" w:hAnsi="Cambria Math"/>
                   </w:rPr>
@@ -6723,7 +6907,21 @@
                   <w:rPr>
                     <w:rFonts w:ascii="Cambria Math" w:hAnsi="Cambria Math"/>
                   </w:rPr>
-                  <m:t>β(v)S(</m:t>
+                  <m:t>β(v)</m:t>
+                </m:r>
+                <m:r>
+                  <w:del w:id="306" w:author="Clay Cressler [2]" w:date="2026-06-08T09:39:00Z" w16du:dateUtc="2026-06-08T14:39:00Z">
+                    <w:rPr>
+                      <w:rFonts w:ascii="Cambria Math" w:hAnsi="Cambria Math"/>
+                    </w:rPr>
+                    <m:t>S</m:t>
+                  </w:del>
+                </m:r>
+                <m:r>
+                  <w:rPr>
+                    <w:rFonts w:ascii="Cambria Math" w:hAnsi="Cambria Math"/>
+                  </w:rPr>
+                  <m:t>(</m:t>
                 </m:r>
                 <m:sSub>
                   <m:sSubPr>
@@ -6790,6 +6988,14 @@
                     <w:rFonts w:ascii="Cambria Math" w:hAnsi="Cambria Math"/>
                   </w:rPr>
                   <m:t>)</m:t>
+                </m:r>
+                <m:r>
+                  <w:ins w:id="307" w:author="Clay Cressler [2]" w:date="2026-06-08T09:39:00Z" w16du:dateUtc="2026-06-08T14:39:00Z">
+                    <w:rPr>
+                      <w:rFonts w:ascii="Cambria Math" w:hAnsi="Cambria Math"/>
+                    </w:rPr>
+                    <m:t>S</m:t>
+                  </w:ins>
                 </m:r>
                 <m:r>
                   <w:rPr>
@@ -6941,10 +7147,12 @@
                   </m:e>
                 </m:d>
                 <m:r>
-                  <w:rPr>
-                    <w:rFonts w:ascii="Cambria Math" w:eastAsiaTheme="minorEastAsia" w:hAnsi="Cambria Math"/>
-                  </w:rPr>
-                  <m:t>S</m:t>
+                  <w:del w:id="308" w:author="Clay Cressler [2]" w:date="2026-06-08T09:39:00Z" w16du:dateUtc="2026-06-08T14:39:00Z">
+                    <w:rPr>
+                      <w:rFonts w:ascii="Cambria Math" w:eastAsiaTheme="minorEastAsia" w:hAnsi="Cambria Math"/>
+                    </w:rPr>
+                    <m:t>S</m:t>
+                  </w:del>
                 </m:r>
                 <m:d>
                   <m:dPr>
@@ -7019,6 +7227,14 @@
                     </m:sSub>
                   </m:e>
                 </m:d>
+                <m:r>
+                  <w:ins w:id="309" w:author="Clay Cressler [2]" w:date="2026-06-08T09:39:00Z" w16du:dateUtc="2026-06-08T14:39:00Z">
+                    <w:rPr>
+                      <w:rFonts w:ascii="Cambria Math" w:eastAsiaTheme="minorEastAsia" w:hAnsi="Cambria Math"/>
+                    </w:rPr>
+                    <m:t>S</m:t>
+                  </w:ins>
+                </m:r>
                 <m:r>
                   <w:rPr>
                     <w:rFonts w:ascii="Cambria Math" w:eastAsiaTheme="minorEastAsia" w:hAnsi="Cambria Math"/>
@@ -7313,7 +7529,21 @@
         <w:rPr>
           <w:rFonts w:eastAsiaTheme="minorEastAsia"/>
         </w:rPr>
-        <w:t xml:space="preserve">Note that this is much simpler than our current system, where virulence influences transmission, recovery, and duration of infection. </w:t>
+        <w:t>Note that this</w:t>
+      </w:r>
+      <w:ins w:id="310" w:author="Clay Cressler [2]" w:date="2026-06-08T09:39:00Z" w16du:dateUtc="2026-06-08T14:39:00Z">
+        <w:r>
+          <w:rPr>
+            <w:rFonts w:eastAsiaTheme="minorEastAsia"/>
+          </w:rPr>
+          <w:t xml:space="preserve"> assumption</w:t>
+        </w:r>
+      </w:ins>
+      <w:r>
+        <w:rPr>
+          <w:rFonts w:eastAsiaTheme="minorEastAsia"/>
+        </w:rPr>
+        <w:t xml:space="preserve"> is much simpler than our current system, where virulence influences transmission, recovery, and duration of infection. </w:t>
       </w:r>
     </w:p>
     <w:p>
@@ -7333,7 +7563,6 @@
         <w:rPr>
           <w:rFonts w:eastAsiaTheme="minorEastAsia"/>
         </w:rPr>
-        <w:lastRenderedPageBreak/>
         <w:t xml:space="preserve">We use an adaptive dynamics analysis to study the evolution of virulence </w:t>
       </w:r>
       <m:oMath>
@@ -7374,78 +7603,64 @@
         <w:rPr>
           <w:rFonts w:eastAsiaTheme="minorEastAsia"/>
         </w:rPr>
-        <w:t>(</w:t>
-      </w:r>
-      <w:proofErr w:type="spellStart"/>
+        <w:t>(Geritz et al. 1997; see details in Supplementary Information).</w:t>
+      </w:r>
       <w:r>
         <w:rPr>
           <w:rFonts w:eastAsiaTheme="minorEastAsia"/>
         </w:rPr>
-        <w:t>Geritz</w:t>
-      </w:r>
-      <w:proofErr w:type="spellEnd"/>
+        <w:t xml:space="preserve"> This captures the key element of our stochastic individual-based simulations</w:t>
+      </w:r>
       <w:r>
         <w:rPr>
           <w:rFonts w:eastAsiaTheme="minorEastAsia"/>
         </w:rPr>
-        <w:t xml:space="preserve"> et al. 1997; see details in Supplementary Information).</w:t>
+        <w:t xml:space="preserve">, that </w:t>
       </w:r>
       <w:r>
         <w:rPr>
           <w:rFonts w:eastAsiaTheme="minorEastAsia"/>
         </w:rPr>
-        <w:t xml:space="preserve"> This captures the key element of our stochastic individual-based simulations</w:t>
+        <w:t xml:space="preserve">variation in initial immune state largely determines </w:t>
       </w:r>
       <w:r>
         <w:rPr>
           <w:rFonts w:eastAsiaTheme="minorEastAsia"/>
         </w:rPr>
-        <w:t xml:space="preserve">, that </w:t>
+        <w:t>the probability that</w:t>
       </w:r>
       <w:r>
         <w:rPr>
           <w:rFonts w:eastAsiaTheme="minorEastAsia"/>
         </w:rPr>
-        <w:t xml:space="preserve">variation in initial immune state largely determines </w:t>
+        <w:t xml:space="preserve"> an infection </w:t>
       </w:r>
       <w:r>
         <w:rPr>
           <w:rFonts w:eastAsiaTheme="minorEastAsia"/>
         </w:rPr>
-        <w:t>the probability that</w:t>
+        <w:t xml:space="preserve">will be </w:t>
       </w:r>
       <w:r>
         <w:rPr>
           <w:rFonts w:eastAsiaTheme="minorEastAsia"/>
         </w:rPr>
-        <w:t xml:space="preserve"> an infection </w:t>
-      </w:r>
+        <w:t xml:space="preserve">acute or chronic. </w:t>
+      </w:r>
+      <w:commentRangeStart w:id="311"/>
       <w:r>
         <w:rPr>
           <w:rFonts w:eastAsiaTheme="minorEastAsia"/>
         </w:rPr>
-        <w:t xml:space="preserve">will be </w:t>
+        <w:t xml:space="preserve">Figure </w:t>
       </w:r>
       <w:r>
         <w:rPr>
           <w:rFonts w:eastAsiaTheme="minorEastAsia"/>
         </w:rPr>
-        <w:t xml:space="preserve">acute or chronic. </w:t>
-      </w:r>
-      <w:commentRangeStart w:id="245"/>
-      <w:r>
-        <w:rPr>
-          <w:rFonts w:eastAsiaTheme="minorEastAsia"/>
-        </w:rPr>
-        <w:t xml:space="preserve">Figure </w:t>
-      </w:r>
-      <w:r>
-        <w:rPr>
-          <w:rFonts w:eastAsiaTheme="minorEastAsia"/>
-        </w:rPr>
         <w:t>5</w:t>
       </w:r>
-      <w:commentRangeEnd w:id="245"/>
+      <w:commentRangeEnd w:id="311"/>
       <w:r>
         <w:rPr>
           <w:rStyle w:val="CommentReference"/>
@@ -7453,7 +7668,7 @@
           <w:sz w:val="24"/>
           <w:szCs w:val="24"/>
         </w:rPr>
-        <w:commentReference w:id="245"/>
+        <w:commentReference w:id="311"/>
       </w:r>
       <w:r>
         <w:rPr>
@@ -7511,21 +7726,7 @@
         <w:rPr>
           <w:rFonts w:eastAsiaTheme="minorEastAsia"/>
         </w:rPr>
-        <w:t xml:space="preserve">. What this figure reveals </w:t>
-      </w:r>
-      <w:proofErr w:type="gramStart"/>
-      <w:r>
-        <w:rPr>
-          <w:rFonts w:eastAsiaTheme="minorEastAsia"/>
-        </w:rPr>
-        <w:t>is</w:t>
-      </w:r>
-      <w:proofErr w:type="gramEnd"/>
-      <w:r>
-        <w:rPr>
-          <w:rFonts w:eastAsiaTheme="minorEastAsia"/>
-        </w:rPr>
-        <w:t xml:space="preserve"> that the ESS virulence declines very quickly as the probability of clearance declines, and then is relatively stable over a wide range of </w:t>
+        <w:t xml:space="preserve">. What this figure reveals is that the ESS virulence declines very quickly as the probability of clearance declines, and then is relatively stable over a wide range of </w:t>
       </w:r>
       <m:oMath>
         <m:r>
@@ -7541,15 +7742,15 @@
         </w:rPr>
         <w:t xml:space="preserve"> values. </w:t>
       </w:r>
-      <w:commentRangeStart w:id="246"/>
-      <w:commentRangeStart w:id="247"/>
+      <w:commentRangeStart w:id="312"/>
+      <w:commentRangeStart w:id="313"/>
       <w:r>
         <w:rPr>
           <w:rFonts w:eastAsiaTheme="minorEastAsia"/>
         </w:rPr>
         <w:t>The implication here is that, if there is even a moderate chance that an infection will become chronic, parasite virulence evolves to be lower to maximize the contribution of chronically infected hosts to parasite fitness.</w:t>
       </w:r>
-      <w:commentRangeEnd w:id="246"/>
+      <w:commentRangeEnd w:id="312"/>
       <w:r>
         <w:rPr>
           <w:rStyle w:val="CommentReference"/>
@@ -7557,9 +7758,9 @@
           <w:sz w:val="24"/>
           <w:szCs w:val="24"/>
         </w:rPr>
-        <w:commentReference w:id="246"/>
-      </w:r>
-      <w:commentRangeEnd w:id="247"/>
+        <w:commentReference w:id="312"/>
+      </w:r>
+      <w:commentRangeEnd w:id="313"/>
       <w:r>
         <w:rPr>
           <w:rStyle w:val="CommentReference"/>
@@ -7567,7 +7768,7 @@
           <w:sz w:val="24"/>
           <w:szCs w:val="24"/>
         </w:rPr>
-        <w:commentReference w:id="247"/>
+        <w:commentReference w:id="313"/>
       </w:r>
     </w:p>
     <w:p>
@@ -7594,51 +7795,61 @@
         <w:t>Discussion</w:t>
       </w:r>
     </w:p>
+    <w:p>
+      <w:r>
+        <w:t>Classic epidemiological theory assumes that recovery rates are fixed, rather than depending on the time since an infection began. It also assumes that every infect</w:t>
+      </w:r>
+      <w:r>
+        <w:t xml:space="preserve">ed individual has an identical recovery rate. </w:t>
+      </w:r>
+      <w:r>
+        <w:t>These assumptions lead to the classic compartmental model of epidemiology that ignores within-host interactions between parasites and the immune system. This modeling framework has been foundational to predicting the epidemiological and evolutionary dynamics of infectious diseases. However, n</w:t>
+      </w:r>
+      <w:r>
+        <w:t xml:space="preserve">either of these assumptions are met by natural infections, where the probability of recovery depends on the time since infection and on the immune system of the infected </w:t>
+      </w:r>
+      <w:r>
+        <w:t xml:space="preserve">individual. Thus it is unclear whether classical predictions from virulence evolution theory will be met when we allow for variation in immunity among individuals and for infection outcomes to depend on the within-host </w:t>
+      </w:r>
+      <w:r>
+        <w:t xml:space="preserve">dynamics of immunity and parasite growth. Here, </w:t>
+      </w:r>
+      <w:r>
+        <w:lastRenderedPageBreak/>
+        <w:t xml:space="preserve">we utilize an individual-based model to nest a simple, mechanistic model of Th1 and Th2 immunity into an epidemiological model. We show that the immunological landscape, that is, the variation in immunity that exists among the host population, shapes both the evolutionary and epidemiological dynamics of parasites. </w:t>
+      </w:r>
+      <w:r>
+        <w:t xml:space="preserve">We show that, when the immunological landscape is Th1-biased, so that chronic infections are more likely, the parasite evolves towards lower virulence, further lowering the probability of clearance and extending infection durations (Fig. </w:t>
+      </w:r>
+      <w:r>
+        <w:t xml:space="preserve">2-4). On the other hand, when the immunological landscape is Th2-biased, so that acute infections are more likely, the parasite evolves towards higher virulence, increasing parasite biomass and transmission rate (Fig. 2-4). </w:t>
+      </w:r>
+    </w:p>
     <w:p/>
     <w:p>
       <w:r>
-        <w:t xml:space="preserve">Our modeling framework naturally relaxes the assumption of classic epidemiological theory that recovery rate is fixed. This assumption has several implications that are difficult to justify biologically. First, it implies that the instantaneous probability of recovery is identical at every timepoint in infection. </w:t>
-      </w:r>
-      <w:proofErr w:type="gramStart"/>
-      <w:r>
-        <w:t>In reality, the</w:t>
-      </w:r>
-      <w:proofErr w:type="gramEnd"/>
-      <w:r>
-        <w:t xml:space="preserve"> probability of recovery changes over the course of infection as either an appropriate adaptive immune response is activated, leading to an increasing probability of clearance with infection duration, or an inappropriate response is activated, leading to a decreasing probability of clearance with infection duration. By allowing the initial immune response to vary among infected individuals, the model accommodates this </w:t>
-      </w:r>
-      <w:proofErr w:type="spellStart"/>
-      <w:r>
-        <w:t>heterogenei</w:t>
-      </w:r>
-      <w:proofErr w:type="spellEnd"/>
+        <w:t xml:space="preserve">These results mirror a simple prediction of classic evolutionary epidemiology: as the clearance rate increases, virulence is expected to increase. However, our novel model lends new insight and nuance to this simple prediction. </w:t>
+      </w:r>
     </w:p>
+    <w:p/>
     <w:p>
-      <w:proofErr w:type="spellStart"/>
+      <w:r>
+        <w:t xml:space="preserve">Finally, a simple epidemiological model that allows both acute and chronic infections shows that, as the probability of a chronic infection increases, virulence drops rapidly </w:t>
+      </w:r>
+      <w:r>
+        <w:t xml:space="preserve"> </w:t>
+      </w:r>
     </w:p>
+    <w:p/>
     <w:p>
       <w:r>
-        <w:t xml:space="preserve">which </w:t>
-      </w:r>
-      <w:proofErr w:type="spellEnd"/>
-      <w:r>
-        <w:t xml:space="preserve">implies that infection duration is exponentially distributed with a mean equal to the inverse of the recovery rate. The assumption of a fixed recovery rate also </w:t>
-      </w:r>
-      <w:proofErr w:type="spellStart"/>
-      <w:r>
-        <w:t>impliesmeaning</w:t>
-      </w:r>
-      <w:proofErr w:type="spellEnd"/>
-      <w:r>
-        <w:t xml:space="preserve"> that the instantaneous probability of recovery is constant throughout the course of infection. That assumption leads to </w:t>
-      </w:r>
-      <w:proofErr w:type="gramStart"/>
-      <w:r>
-        <w:t>a number of</w:t>
-      </w:r>
-      <w:proofErr w:type="gramEnd"/>
-      <w:r>
-        <w:t xml:space="preserve"> While this assumption is rarely met in practice, it can be a reasonable simplification in a heterogeneous population.</w:t>
+        <w:t>Our modeling framework naturally relaxes the assumption of classic epidemiological theory that recovery rate is fixed. This assumption has several implications that are difficult to justify biologically. First, it implies that the instantaneous probability of recovery is identical at every timepoint in infection. In reality, the probability of recovery changes over the course of infection as either an appropriate adaptive immune response is activated, leading to an increasing probability of clearance with infection duration, or an inappropriate response is activated, leading to a decreasing probability of clearance with infection duration. By allowing the initial immune response to vary among infected individuals, the model accommodates this heterogenei</w:t>
+      </w:r>
+    </w:p>
+    <w:p/>
+    <w:p>
+      <w:r>
+        <w:t>which implies that infection duration is exponentially distributed with a mean equal to the inverse of the recovery rate. The assumption of a fixed recovery rate also impliesmeaning that the instantaneous probability of recovery is constant throughout the course of infection. That assumption leads to a number of While this assumption is rarely met in practice, it can be a reasonable simplification in a heterogeneous population.</w:t>
       </w:r>
     </w:p>
     <w:p/>
@@ -7678,17 +7889,15 @@
     <w:p/>
     <w:p/>
     <w:p>
-      <w:commentRangeStart w:id="248"/>
       <w:r>
         <w:rPr>
           <w:noProof/>
         </w:rPr>
-        <w:lastRenderedPageBreak/>
         <w:drawing>
-          <wp:inline distT="0" distB="0" distL="0" distR="0" wp14:anchorId="57D40406" wp14:editId="11543FC3">
-            <wp:extent cx="3737581" cy="5232694"/>
-            <wp:effectExtent l="0" t="0" r="0" b="6350"/>
-            <wp:docPr id="1534583324" name="Picture 1" descr="A screenshot of a graph&#10;&#10;Description automatically generated"/>
+          <wp:inline distT="0" distB="0" distL="0" distR="0" wp14:anchorId="3C7B0039" wp14:editId="3C70B799">
+            <wp:extent cx="4572009" cy="6400813"/>
+            <wp:effectExtent l="0" t="0" r="0" b="0"/>
+            <wp:docPr id="1108292768" name="Picture 3"/>
             <wp:cNvGraphicFramePr>
               <a:graphicFrameLocks xmlns:a="http://schemas.openxmlformats.org/drawingml/2006/main" noChangeAspect="1"/>
             </wp:cNvGraphicFramePr>
@@ -7696,7 +7905,7 @@
               <a:graphicData uri="http://schemas.openxmlformats.org/drawingml/2006/picture">
                 <pic:pic xmlns:pic="http://schemas.openxmlformats.org/drawingml/2006/picture">
                   <pic:nvPicPr>
-                    <pic:cNvPr id="1534583324" name="Picture 1" descr="A screenshot of a graph&#10;&#10;Description automatically generated"/>
+                    <pic:cNvPr id="1108292768" name="Picture 1108292768"/>
                     <pic:cNvPicPr/>
                   </pic:nvPicPr>
                   <pic:blipFill>
@@ -7714,7 +7923,7 @@
                   <pic:spPr>
                     <a:xfrm>
                       <a:off x="0" y="0"/>
-                      <a:ext cx="3750298" cy="5250498"/>
+                      <a:ext cx="4572009" cy="6400813"/>
                     </a:xfrm>
                     <a:prstGeom prst="rect">
                       <a:avLst/>
@@ -7725,15 +7934,6 @@
             </a:graphic>
           </wp:inline>
         </w:drawing>
-      </w:r>
-      <w:commentRangeEnd w:id="248"/>
-      <w:r>
-        <w:rPr>
-          <w:rStyle w:val="CommentReference"/>
-          <w:sz w:val="24"/>
-          <w:szCs w:val="24"/>
-        </w:rPr>
-        <w:commentReference w:id="248"/>
       </w:r>
     </w:p>
     <w:p>
@@ -7854,17 +8054,16 @@
     <w:p/>
     <w:p/>
     <w:p>
-      <w:commentRangeStart w:id="249"/>
       <w:r>
         <w:rPr>
           <w:noProof/>
         </w:rPr>
         <w:lastRenderedPageBreak/>
         <w:drawing>
-          <wp:inline distT="0" distB="0" distL="0" distR="0" wp14:anchorId="3B0DA1BE" wp14:editId="2C11F3BF">
-            <wp:extent cx="5943600" cy="3566160"/>
+          <wp:inline distT="0" distB="0" distL="0" distR="0" wp14:anchorId="2B139D85" wp14:editId="425CCFD4">
+            <wp:extent cx="5486411" cy="3657607"/>
             <wp:effectExtent l="0" t="0" r="0" b="0"/>
-            <wp:docPr id="1990778399" name="Picture 1"/>
+            <wp:docPr id="1850537087" name="Picture 6"/>
             <wp:cNvGraphicFramePr>
               <a:graphicFrameLocks xmlns:a="http://schemas.openxmlformats.org/drawingml/2006/main" noChangeAspect="1"/>
             </wp:cNvGraphicFramePr>
@@ -7872,7 +8071,7 @@
               <a:graphicData uri="http://schemas.openxmlformats.org/drawingml/2006/picture">
                 <pic:pic xmlns:pic="http://schemas.openxmlformats.org/drawingml/2006/picture">
                   <pic:nvPicPr>
-                    <pic:cNvPr id="1990778399" name="Picture 1990778399"/>
+                    <pic:cNvPr id="1850537087" name="Picture 1850537087"/>
                     <pic:cNvPicPr/>
                   </pic:nvPicPr>
                   <pic:blipFill>
@@ -7890,7 +8089,7 @@
                   <pic:spPr>
                     <a:xfrm>
                       <a:off x="0" y="0"/>
-                      <a:ext cx="5943600" cy="3566160"/>
+                      <a:ext cx="5486411" cy="3657607"/>
                     </a:xfrm>
                     <a:prstGeom prst="rect">
                       <a:avLst/>
@@ -7901,15 +8100,6 @@
             </a:graphic>
           </wp:inline>
         </w:drawing>
-      </w:r>
-      <w:commentRangeEnd w:id="249"/>
-      <w:r>
-        <w:rPr>
-          <w:rStyle w:val="CommentReference"/>
-          <w:sz w:val="24"/>
-          <w:szCs w:val="24"/>
-        </w:rPr>
-        <w:commentReference w:id="249"/>
       </w:r>
     </w:p>
     <w:p>
@@ -7972,10 +8162,90 @@
       </w:r>
     </w:p>
     <w:p/>
+    <w:p>
+      <w:pPr>
+        <w:rPr>
+          <w:ins w:id="314" w:author="Clay Cressler [2]" w:date="2026-05-31T16:56:00Z" w16du:dateUtc="2026-05-31T21:56:00Z"/>
+        </w:rPr>
+      </w:pPr>
+    </w:p>
+    <w:p>
+      <w:pPr>
+        <w:rPr>
+          <w:ins w:id="315" w:author="Clay Cressler [2]" w:date="2026-05-31T16:57:00Z" w16du:dateUtc="2026-05-31T21:57:00Z"/>
+        </w:rPr>
+      </w:pPr>
+      <w:ins w:id="316" w:author="Clay Cressler [2]" w:date="2026-05-31T16:57:00Z" w16du:dateUtc="2026-05-31T21:57:00Z">
+        <w:r>
+          <w:rPr>
+            <w:noProof/>
+          </w:rPr>
+          <w:drawing>
+            <wp:inline distT="0" distB="0" distL="0" distR="0" wp14:anchorId="34C9E446" wp14:editId="5B0DD351">
+              <wp:extent cx="5915465" cy="3549279"/>
+              <wp:effectExtent l="0" t="0" r="9525" b="0"/>
+              <wp:docPr id="243947344" name="Picture 1"/>
+              <wp:cNvGraphicFramePr>
+                <a:graphicFrameLocks xmlns:a="http://schemas.openxmlformats.org/drawingml/2006/main" noChangeAspect="1"/>
+              </wp:cNvGraphicFramePr>
+              <a:graphic xmlns:a="http://schemas.openxmlformats.org/drawingml/2006/main">
+                <a:graphicData uri="http://schemas.openxmlformats.org/drawingml/2006/picture">
+                  <pic:pic xmlns:pic="http://schemas.openxmlformats.org/drawingml/2006/picture">
+                    <pic:nvPicPr>
+                      <pic:cNvPr id="243947344" name="Picture 243947344"/>
+                      <pic:cNvPicPr/>
+                    </pic:nvPicPr>
+                    <pic:blipFill>
+                      <a:blip r:embed="rId14" cstate="print">
+                        <a:extLst>
+                          <a:ext uri="{28A0092B-C50C-407E-A947-70E740481C1C}">
+                            <a14:useLocalDpi xmlns:a14="http://schemas.microsoft.com/office/drawing/2010/main" val="0"/>
+                          </a:ext>
+                        </a:extLst>
+                      </a:blip>
+                      <a:stretch>
+                        <a:fillRect/>
+                      </a:stretch>
+                    </pic:blipFill>
+                    <pic:spPr>
+                      <a:xfrm>
+                        <a:off x="0" y="0"/>
+                        <a:ext cx="5925292" cy="3555175"/>
+                      </a:xfrm>
+                      <a:prstGeom prst="rect">
+                        <a:avLst/>
+                      </a:prstGeom>
+                    </pic:spPr>
+                  </pic:pic>
+                </a:graphicData>
+              </a:graphic>
+            </wp:inline>
+          </w:drawing>
+        </w:r>
+      </w:ins>
+    </w:p>
+    <w:p>
+      <w:pPr>
+        <w:rPr>
+          <w:ins w:id="317" w:author="Clay Cressler [2]" w:date="2026-05-31T16:57:00Z" w16du:dateUtc="2026-05-31T21:57:00Z"/>
+        </w:rPr>
+      </w:pPr>
+      <w:ins w:id="318" w:author="Clay Cressler [2]" w:date="2026-05-31T16:57:00Z" w16du:dateUtc="2026-05-31T21:57:00Z">
+        <w:r>
+          <w:t>Supplementary Figure S1.</w:t>
+        </w:r>
+      </w:ins>
+    </w:p>
+    <w:p>
+      <w:pPr>
+        <w:rPr>
+          <w:ins w:id="319" w:author="Clay Cressler [2]" w:date="2026-05-31T16:57:00Z" w16du:dateUtc="2026-05-31T21:57:00Z"/>
+        </w:rPr>
+      </w:pPr>
+    </w:p>
     <w:p/>
     <w:p>
       <w:r>
-        <w:lastRenderedPageBreak/>
         <w:t>Table 1</w:t>
       </w:r>
       <w:r>
@@ -8898,6 +9168,7 @@
                   <w:rPr>
                     <w:rFonts w:ascii="Cambria Math" w:hAnsi="Cambria Math"/>
                   </w:rPr>
+                  <w:lastRenderedPageBreak/>
                   <m:t>r</m:t>
                 </m:r>
               </m:oMath>
@@ -9458,7 +9729,7 @@
 </file>
 
 <file path=word/comments.xml><?xml version="1.0" encoding="utf-8"?>
-<w:comments xmlns:wpc="http://schemas.microsoft.com/office/word/2010/wordprocessingCanvas" xmlns:cx="http://schemas.microsoft.com/office/drawing/2014/chartex" xmlns:cx1="http://schemas.microsoft.com/office/drawing/2015/9/8/chartex" xmlns:cx2="http://schemas.microsoft.com/office/drawing/2015/10/21/chartex" xmlns:cx3="http://schemas.microsoft.com/office/drawing/2016/5/9/chartex" xmlns:cx4="http://schemas.microsoft.com/office/drawing/2016/5/10/chartex" xmlns:cx5="http://schemas.microsoft.com/office/drawing/2016/5/11/chartex" xmlns:cx6="http://schemas.microsoft.com/office/drawing/2016/5/12/chartex" xmlns:cx7="http://schemas.microsoft.com/office/drawing/2016/5/13/chartex" xmlns:cx8="http://schemas.microsoft.com/office/drawing/2016/5/14/chartex" xmlns:mc="http://schemas.openxmlformats.org/markup-compatibility/2006" xmlns:aink="http://schemas.microsoft.com/office/drawing/2016/ink" xmlns:am3d="http://schemas.microsoft.com/office/drawing/2017/model3d" xmlns:o="urn:schemas-microsoft-com:office:office" xmlns:oel="http://schemas.microsoft.com/office/2019/extlst" xmlns:r="http://schemas.openxmlformats.org/officeDocument/2006/relationships" xmlns:m="http://schemas.openxmlformats.org/officeDocument/2006/math" xmlns:v="urn:schemas-microsoft-com:vml" xmlns:wp14="http://schemas.microsoft.com/office/word/2010/wordprocessingDrawing" xmlns:wp="http://schemas.openxmlformats.org/drawingml/2006/wordprocessingDrawing" xmlns:w10="urn:schemas-microsoft-com:office:word" xmlns:w="http://schemas.openxmlformats.org/wordprocessingml/2006/main" xmlns:w14="http://schemas.microsoft.com/office/word/2010/wordml" xmlns:w15="http://schemas.microsoft.com/office/word/2012/wordml" xmlns:w16cex="http://schemas.microsoft.com/office/word/2018/wordml/cex" xmlns:w16cid="http://schemas.microsoft.com/office/word/2016/wordml/cid" xmlns:w16="http://schemas.microsoft.com/office/word/2018/wordml" xmlns:w16du="http://schemas.microsoft.com/office/word/2023/wordml/word16du" xmlns:w16sdtdh="http://schemas.microsoft.com/office/word/2020/wordml/sdtdatahash" xmlns:w16se="http://schemas.microsoft.com/office/word/2015/wordml/symex" xmlns:wpg="http://schemas.microsoft.com/office/word/2010/wordprocessingGroup" xmlns:wpi="http://schemas.microsoft.com/office/word/2010/wordprocessingInk" xmlns:wne="http://schemas.microsoft.com/office/word/2006/wordml" xmlns:wps="http://schemas.microsoft.com/office/word/2010/wordprocessingShape" mc:Ignorable="w14 w15 w16se w16cid w16 w16cex w16sdtdh w16du wp14">
+<w:comments xmlns:wpc="http://schemas.microsoft.com/office/word/2010/wordprocessingCanvas" xmlns:cx="http://schemas.microsoft.com/office/drawing/2014/chartex" xmlns:cx1="http://schemas.microsoft.com/office/drawing/2015/9/8/chartex" xmlns:cx2="http://schemas.microsoft.com/office/drawing/2015/10/21/chartex" xmlns:cx3="http://schemas.microsoft.com/office/drawing/2016/5/9/chartex" xmlns:cx4="http://schemas.microsoft.com/office/drawing/2016/5/10/chartex" xmlns:cx5="http://schemas.microsoft.com/office/drawing/2016/5/11/chartex" xmlns:cx6="http://schemas.microsoft.com/office/drawing/2016/5/12/chartex" xmlns:cx7="http://schemas.microsoft.com/office/drawing/2016/5/13/chartex" xmlns:cx8="http://schemas.microsoft.com/office/drawing/2016/5/14/chartex" xmlns:mc="http://schemas.openxmlformats.org/markup-compatibility/2006" xmlns:aink="http://schemas.microsoft.com/office/drawing/2016/ink" xmlns:am3d="http://schemas.microsoft.com/office/drawing/2017/model3d" xmlns:o="urn:schemas-microsoft-com:office:office" xmlns:oel="http://schemas.microsoft.com/office/2019/extlst" xmlns:r="http://schemas.openxmlformats.org/officeDocument/2006/relationships" xmlns:m="http://schemas.openxmlformats.org/officeDocument/2006/math" xmlns:v="urn:schemas-microsoft-com:vml" xmlns:wp14="http://schemas.microsoft.com/office/word/2010/wordprocessingDrawing" xmlns:wp="http://schemas.openxmlformats.org/drawingml/2006/wordprocessingDrawing" xmlns:w10="urn:schemas-microsoft-com:office:word" xmlns:w="http://schemas.openxmlformats.org/wordprocessingml/2006/main" xmlns:w14="http://schemas.microsoft.com/office/word/2010/wordml" xmlns:w15="http://schemas.microsoft.com/office/word/2012/wordml" xmlns:w16cex="http://schemas.microsoft.com/office/word/2018/wordml/cex" xmlns:w16cid="http://schemas.microsoft.com/office/word/2016/wordml/cid" xmlns:w16="http://schemas.microsoft.com/office/word/2018/wordml" xmlns:w16du="http://schemas.microsoft.com/office/word/2023/wordml/word16du" xmlns:w16sdtdh="http://schemas.microsoft.com/office/word/2020/wordml/sdtdatahash" xmlns:w16sdtfl="http://schemas.microsoft.com/office/word/2024/wordml/sdtformatlock" xmlns:w16se="http://schemas.microsoft.com/office/word/2015/wordml/symex" xmlns:wpg="http://schemas.microsoft.com/office/word/2010/wordprocessingGroup" xmlns:wpi="http://schemas.microsoft.com/office/word/2010/wordprocessingInk" xmlns:wne="http://schemas.microsoft.com/office/word/2006/wordml" xmlns:wps="http://schemas.microsoft.com/office/word/2010/wordprocessingShape" mc:Ignorable="w14 w15 w16se w16cid w16 w16cex w16sdtdh w16sdtfl w16du wp14">
   <w:comment w:id="1" w:author="Daniel Metz" w:date="2026-05-19T12:03:00Z" w:initials="DM">
     <w:p>
       <w:pPr>
@@ -9567,7 +9838,7 @@
       </w:r>
     </w:p>
   </w:comment>
-  <w:comment w:id="33" w:author="Daniel Metz" w:date="2026-05-19T11:51:00Z" w:initials="DM">
+  <w:comment w:id="39" w:author="Daniel Metz" w:date="2026-05-19T11:51:00Z" w:initials="DM">
     <w:p>
       <w:pPr>
         <w:pStyle w:val="CommentText"/>
@@ -9583,7 +9854,7 @@
       </w:r>
     </w:p>
   </w:comment>
-  <w:comment w:id="67" w:author="Daniel Metz" w:date="2026-05-19T11:58:00Z" w:initials="DM">
+  <w:comment w:id="73" w:author="Daniel Metz" w:date="2026-05-19T11:58:00Z" w:initials="DM">
     <w:p>
       <w:pPr>
         <w:pStyle w:val="CommentText"/>
@@ -9602,7 +9873,7 @@
       </w:r>
     </w:p>
   </w:comment>
-  <w:comment w:id="75" w:author="Andrea L. Graham" w:date="2026-05-21T13:08:00Z" w:initials="AG">
+  <w:comment w:id="81" w:author="Andrea L. Graham" w:date="2026-05-21T13:08:00Z" w:initials="AG">
     <w:p>
       <w:pPr>
         <w:pStyle w:val="CommentText"/>
@@ -9621,7 +9892,7 @@
       </w:r>
     </w:p>
   </w:comment>
-  <w:comment w:id="76" w:author="David Chang van Oordt" w:date="2026-05-21T20:17:00Z" w:initials="DCV">
+  <w:comment w:id="82" w:author="David Chang van Oordt" w:date="2026-05-21T20:17:00Z" w:initials="DCV">
     <w:p>
       <w:pPr>
         <w:pStyle w:val="CommentText"/>
@@ -9650,7 +9921,7 @@
       </w:r>
     </w:p>
   </w:comment>
-  <w:comment w:id="79" w:author="Daniel Metz" w:date="2026-05-19T11:53:00Z" w:initials="DM">
+  <w:comment w:id="85" w:author="Daniel Metz" w:date="2026-05-19T11:53:00Z" w:initials="DM">
     <w:p>
       <w:pPr>
         <w:pStyle w:val="CommentText"/>
@@ -9666,7 +9937,7 @@
       </w:r>
     </w:p>
   </w:comment>
-  <w:comment w:id="86" w:author="Daniel Metz" w:date="2026-05-19T12:32:00Z" w:initials="DM">
+  <w:comment w:id="92" w:author="Daniel Metz" w:date="2026-05-19T12:32:00Z" w:initials="DM">
     <w:p>
       <w:pPr>
         <w:pStyle w:val="CommentText"/>
@@ -9682,7 +9953,7 @@
       </w:r>
     </w:p>
   </w:comment>
-  <w:comment w:id="87" w:author="Daniel Metz" w:date="2026-05-19T11:54:00Z" w:initials="DM">
+  <w:comment w:id="93" w:author="Daniel Metz" w:date="2026-05-19T11:54:00Z" w:initials="DM">
     <w:p>
       <w:pPr>
         <w:pStyle w:val="CommentText"/>
@@ -9701,7 +9972,7 @@
       </w:r>
     </w:p>
   </w:comment>
-  <w:comment w:id="88" w:author="Andrea L. Graham" w:date="2026-05-21T13:11:00Z" w:initials="AG">
+  <w:comment w:id="94" w:author="Andrea L. Graham" w:date="2026-05-21T13:11:00Z" w:initials="AG">
     <w:p>
       <w:pPr>
         <w:pStyle w:val="CommentText"/>
@@ -9717,7 +9988,7 @@
       </w:r>
     </w:p>
   </w:comment>
-  <w:comment w:id="98" w:author="Clay Cressler" w:date="2026-05-27T17:06:00Z" w:initials="CC">
+  <w:comment w:id="104" w:author="Clay Cressler" w:date="2026-05-27T17:06:00Z" w:initials="CC">
     <w:p>
       <w:r>
         <w:rPr>
@@ -9735,7 +10006,7 @@
       </w:r>
     </w:p>
   </w:comment>
-  <w:comment w:id="190" w:author="Andrea L. Graham" w:date="2026-05-21T13:12:00Z" w:initials="AG">
+  <w:comment w:id="196" w:author="Andrea L. Graham" w:date="2026-05-21T13:12:00Z" w:initials="AG">
     <w:p>
       <w:pPr>
         <w:pStyle w:val="CommentText"/>
@@ -9751,7 +10022,7 @@
       </w:r>
     </w:p>
   </w:comment>
-  <w:comment w:id="195" w:author="Daniel Metz" w:date="2026-05-19T12:10:00Z" w:initials="DM">
+  <w:comment w:id="201" w:author="Daniel Metz" w:date="2026-05-19T12:10:00Z" w:initials="DM">
     <w:p>
       <w:pPr>
         <w:pStyle w:val="CommentText"/>
@@ -9776,7 +10047,7 @@
       </w:r>
     </w:p>
   </w:comment>
-  <w:comment w:id="205" w:author="Daniel Metz" w:date="2026-05-19T11:56:00Z" w:initials="DM">
+  <w:comment w:id="211" w:author="Daniel Metz" w:date="2026-05-19T11:56:00Z" w:initials="DM">
     <w:p>
       <w:pPr>
         <w:pStyle w:val="CommentText"/>
@@ -9792,7 +10063,7 @@
       </w:r>
     </w:p>
   </w:comment>
-  <w:comment w:id="214" w:author="Daniel Metz" w:date="2026-05-19T12:19:00Z" w:initials="DM">
+  <w:comment w:id="221" w:author="Daniel Metz" w:date="2026-05-19T12:19:00Z" w:initials="DM">
     <w:p>
       <w:pPr>
         <w:pStyle w:val="CommentText"/>
@@ -9811,7 +10082,7 @@
       </w:r>
     </w:p>
   </w:comment>
-  <w:comment w:id="215" w:author="Andrea L. Graham" w:date="2026-05-21T13:16:00Z" w:initials="AG">
+  <w:comment w:id="222" w:author="Andrea L. Graham" w:date="2026-05-21T13:16:00Z" w:initials="AG">
     <w:p>
       <w:pPr>
         <w:pStyle w:val="CommentText"/>
@@ -9840,7 +10111,7 @@
       </w:r>
     </w:p>
   </w:comment>
-  <w:comment w:id="216" w:author="David Chang van Oordt" w:date="2026-05-21T20:37:00Z" w:initials="DCV">
+  <w:comment w:id="223" w:author="David Chang van Oordt" w:date="2026-05-21T20:37:00Z" w:initials="DCV">
     <w:p>
       <w:pPr>
         <w:pStyle w:val="CommentText"/>
@@ -9856,7 +10127,7 @@
       </w:r>
     </w:p>
   </w:comment>
-  <w:comment w:id="217" w:author="David Chang van Oordt" w:date="2026-05-21T20:41:00Z" w:initials="DCV">
+  <w:comment w:id="228" w:author="David Chang van Oordt" w:date="2026-05-21T20:41:00Z" w:initials="DCV">
     <w:p>
       <w:pPr>
         <w:pStyle w:val="CommentText"/>
@@ -9872,7 +10143,7 @@
       </w:r>
     </w:p>
   </w:comment>
-  <w:comment w:id="218" w:author="Daniel Metz" w:date="2026-05-19T12:25:00Z" w:initials="DM">
+  <w:comment w:id="233" w:author="Daniel Metz" w:date="2026-05-19T12:25:00Z" w:initials="DM">
     <w:p>
       <w:pPr>
         <w:pStyle w:val="CommentText"/>
@@ -9888,7 +10159,7 @@
       </w:r>
     </w:p>
   </w:comment>
-  <w:comment w:id="219" w:author="David Chang van Oordt" w:date="2026-05-21T20:43:00Z" w:initials="DCV">
+  <w:comment w:id="234" w:author="David Chang van Oordt" w:date="2026-05-21T20:43:00Z" w:initials="DCV">
     <w:p>
       <w:pPr>
         <w:pStyle w:val="CommentText"/>
@@ -9904,7 +10175,7 @@
       </w:r>
     </w:p>
   </w:comment>
-  <w:comment w:id="220" w:author="Andrea L. Graham" w:date="2026-05-21T13:20:00Z" w:initials="AG">
+  <w:comment w:id="240" w:author="Andrea L. Graham" w:date="2026-05-21T13:20:00Z" w:initials="AG">
     <w:p>
       <w:pPr>
         <w:pStyle w:val="CommentText"/>
@@ -9932,7 +10203,23 @@
       </w:r>
     </w:p>
   </w:comment>
-  <w:comment w:id="221" w:author="David Chang van Oordt" w:date="2026-05-21T20:49:00Z" w:initials="DCV">
+  <w:comment w:id="241" w:author="Clay Cressler [2]" w:date="2026-05-30T14:40:00Z" w:initials="CC">
+    <w:p>
+      <w:pPr>
+        <w:pStyle w:val="CommentText"/>
+      </w:pPr>
+      <w:r>
+        <w:rPr>
+          <w:rStyle w:val="CommentReference"/>
+        </w:rPr>
+        <w:annotationRef/>
+      </w:r>
+      <w:r>
+        <w:t>Hmm… this is pretty important if it is actually unclear. When the minimum Th2 is very low, almost everyone is Th1-biased upon infection, so it is not that “some fraction of hosts are Th2 deficient” - it’s that *most* hosts are Th2-deficient. I will try to add language to clarify this earlier in the Methods, but please let me know if this was not clear throughout.</w:t>
+      </w:r>
+    </w:p>
+  </w:comment>
+  <w:comment w:id="242" w:author="David Chang van Oordt" w:date="2026-05-21T20:49:00Z" w:initials="DCV">
     <w:p>
       <w:pPr>
         <w:pStyle w:val="CommentText"/>
@@ -9961,7 +10248,7 @@
       </w:r>
     </w:p>
   </w:comment>
-  <w:comment w:id="222" w:author="Daniel Metz" w:date="2026-05-19T12:28:00Z" w:initials="DM">
+  <w:comment w:id="243" w:author="Daniel Metz" w:date="2026-05-19T12:28:00Z" w:initials="DM">
     <w:p>
       <w:pPr>
         <w:pStyle w:val="CommentText"/>
@@ -9977,7 +10264,7 @@
       </w:r>
     </w:p>
   </w:comment>
-  <w:comment w:id="223" w:author="Daniel Metz" w:date="2026-05-19T12:32:00Z" w:initials="DM">
+  <w:comment w:id="246" w:author="Daniel Metz" w:date="2026-05-19T12:32:00Z" w:initials="DM">
     <w:p>
       <w:pPr>
         <w:pStyle w:val="CommentText"/>
@@ -9993,7 +10280,7 @@
       </w:r>
     </w:p>
   </w:comment>
-  <w:comment w:id="224" w:author="David Chang van Oordt" w:date="2026-05-21T20:55:00Z" w:initials="DCV">
+  <w:comment w:id="247" w:author="David Chang van Oordt" w:date="2026-05-21T20:55:00Z" w:initials="DCV">
     <w:p>
       <w:pPr>
         <w:pStyle w:val="CommentText"/>
@@ -10009,7 +10296,7 @@
       </w:r>
     </w:p>
   </w:comment>
-  <w:comment w:id="225" w:author="Andrea L. Graham" w:date="2026-05-21T13:27:00Z" w:initials="AG">
+  <w:comment w:id="248" w:author="Clay Cressler [2]" w:date="2026-05-30T15:35:00Z" w:initials="CC">
     <w:p>
       <w:pPr>
         <w:pStyle w:val="CommentText"/>
@@ -10021,11 +10308,11 @@
         <w:annotationRef/>
       </w:r>
       <w:r>
-        <w:t xml:space="preserve">Ah yes! </w:t>
+        <w:t>Honestly, the timescale is completely arbitrary because the parameter values were not really chosen with any particular system in mind. I realize this troubles me much less than is maybe good!</w:t>
       </w:r>
     </w:p>
   </w:comment>
-  <w:comment w:id="226" w:author="Andrea L. Graham" w:date="2026-05-21T13:35:00Z" w:initials="AG">
+  <w:comment w:id="257" w:author="Andrea L. Graham" w:date="2026-05-21T13:27:00Z" w:initials="AG">
     <w:p>
       <w:pPr>
         <w:pStyle w:val="CommentText"/>
@@ -10037,11 +10324,11 @@
         <w:annotationRef/>
       </w:r>
       <w:r>
-        <w:t>In discussion, I think it will be interesting to unpick why (for ex, subtle immunological differences near within-host “tipping points” leading to disparate outcomes)</w:t>
+        <w:t xml:space="preserve">Ah yes! </w:t>
       </w:r>
     </w:p>
   </w:comment>
-  <w:comment w:id="227" w:author="David Chang van Oordt" w:date="2026-05-21T21:21:00Z" w:initials="DCV">
+  <w:comment w:id="258" w:author="Andrea L. Graham" w:date="2026-05-21T13:35:00Z" w:initials="AG">
     <w:p>
       <w:pPr>
         <w:pStyle w:val="CommentText"/>
@@ -10053,11 +10340,11 @@
         <w:annotationRef/>
       </w:r>
       <w:r>
-        <w:t>It’s probably too much/far to get into, but I wonder if this allows maintaining diversity at the metapopulation level… maybe it is longer term better for the parasite to infect many populations at intermediate levels of Th2ness?</w:t>
+        <w:t>In discussion, I think it will be interesting to unpick why (for ex, subtle immunological differences near within-host “tipping points” leading to disparate outcomes)</w:t>
       </w:r>
     </w:p>
   </w:comment>
-  <w:comment w:id="228" w:author="Andrea L. Graham" w:date="2026-05-21T13:32:00Z" w:initials="AG">
+  <w:comment w:id="259" w:author="David Chang van Oordt" w:date="2026-05-21T21:21:00Z" w:initials="DCV">
     <w:p>
       <w:pPr>
         <w:pStyle w:val="CommentText"/>
@@ -10069,11 +10356,11 @@
         <w:annotationRef/>
       </w:r>
       <w:r>
-        <w:t>You could instead rephrase to “chronic infections are less likely”</w:t>
+        <w:t>It’s probably too much/far to get into, but I wonder if this allows maintaining diversity at the metapopulation level… maybe it is longer term better for the parasite to infect many populations at intermediate levels of Th2ness?</w:t>
       </w:r>
     </w:p>
   </w:comment>
-  <w:comment w:id="231" w:author="David Chang van Oordt" w:date="2026-05-21T21:24:00Z" w:initials="DCV">
+  <w:comment w:id="262" w:author="Andrea L. Graham" w:date="2026-05-21T13:32:00Z" w:initials="AG">
     <w:p>
       <w:pPr>
         <w:pStyle w:val="CommentText"/>
@@ -10085,11 +10372,43 @@
         <w:annotationRef/>
       </w:r>
       <w:r>
-        <w:t>This is really interesting. I’m curious if going any higher than 750 leads to higher probabilities of clearing, of if they all stay stable.</w:t>
+        <w:t>You could instead rephrase to “chronic infections are less likely”</w:t>
       </w:r>
     </w:p>
   </w:comment>
-  <w:comment w:id="234" w:author="Andrea L. Graham" w:date="2026-05-21T13:40:00Z" w:initials="AG">
+  <w:comment w:id="266" w:author="David Chang van Oordt" w:date="2026-05-21T21:24:00Z" w:initials="DCV">
+    <w:p>
+      <w:pPr>
+        <w:pStyle w:val="CommentText"/>
+      </w:pPr>
+      <w:r>
+        <w:rPr>
+          <w:rStyle w:val="CommentReference"/>
+        </w:rPr>
+        <w:annotationRef/>
+      </w:r>
+      <w:r>
+        <w:t>This is really interesting. I’m curious if going any higher than 750 leads to higher probabilities of clearing, of if they all stay stable.</w:t>
+      </w:r>
+    </w:p>
+  </w:comment>
+  <w:comment w:id="267" w:author="Clay Cressler [2]" w:date="2026-06-01T12:43:00Z" w:initials="CC">
+    <w:p>
+      <w:pPr>
+        <w:pStyle w:val="CommentText"/>
+      </w:pPr>
+      <w:r>
+        <w:rPr>
+          <w:rStyle w:val="CommentReference"/>
+        </w:rPr>
+        <w:annotationRef/>
+      </w:r>
+      <w:r>
+        <w:t>I will have to run this later - my guess is that if I pushed the maximum Th2 higher, this would go up. Remember that the maximum possible Th2-ness in these simulations is 800 of the 1200 initial Th cells, whereas the maximum possible Th1-ness is actually 1000 of the 1200 cells.</w:t>
+      </w:r>
+    </w:p>
+  </w:comment>
+  <w:comment w:id="274" w:author="Andrea L. Graham" w:date="2026-05-21T13:40:00Z" w:initials="AG">
     <w:p>
       <w:pPr>
         <w:pStyle w:val="CommentText"/>
@@ -10143,7 +10462,7 @@
       </w:r>
     </w:p>
   </w:comment>
-  <w:comment w:id="237" w:author="Daniel Metz" w:date="2026-05-19T12:46:00Z" w:initials="DM">
+  <w:comment w:id="280" w:author="Daniel Metz" w:date="2026-05-19T12:46:00Z" w:initials="DM">
     <w:p>
       <w:pPr>
         <w:pStyle w:val="CommentText"/>
@@ -10186,7 +10505,7 @@
       </w:r>
     </w:p>
   </w:comment>
-  <w:comment w:id="235" w:author="Daniel Metz" w:date="2026-05-19T12:46:00Z" w:initials="DM">
+  <w:comment w:id="277" w:author="Daniel Metz" w:date="2026-05-19T12:46:00Z" w:initials="DM">
     <w:p>
       <w:pPr>
         <w:pStyle w:val="CommentText"/>
@@ -10202,7 +10521,7 @@
       </w:r>
     </w:p>
   </w:comment>
-  <w:comment w:id="236" w:author="Andrea L. Graham" w:date="2026-05-21T13:42:00Z" w:initials="AG">
+  <w:comment w:id="278" w:author="Andrea L. Graham" w:date="2026-05-21T13:42:00Z" w:initials="AG">
     <w:p>
       <w:pPr>
         <w:pStyle w:val="CommentText"/>
@@ -10218,7 +10537,7 @@
       </w:r>
     </w:p>
   </w:comment>
-  <w:comment w:id="241" w:author="Andrea L. Graham" w:date="2026-05-21T13:50:00Z" w:initials="AG">
+  <w:comment w:id="294" w:author="Andrea L. Graham" w:date="2026-05-21T13:50:00Z" w:initials="AG">
     <w:p>
       <w:pPr>
         <w:pStyle w:val="CommentText"/>
@@ -10259,7 +10578,7 @@
       </w:r>
     </w:p>
   </w:comment>
-  <w:comment w:id="240" w:author="David Chang van Oordt" w:date="2026-05-21T21:34:00Z" w:initials="DCV">
+  <w:comment w:id="292" w:author="David Chang van Oordt" w:date="2026-05-21T21:34:00Z" w:initials="DCV">
     <w:p>
       <w:pPr>
         <w:pStyle w:val="CommentText"/>
@@ -10275,7 +10594,7 @@
       </w:r>
     </w:p>
   </w:comment>
-  <w:comment w:id="242" w:author="David Chang van Oordt" w:date="2026-05-21T21:39:00Z" w:initials="DCV">
+  <w:comment w:id="302" w:author="David Chang van Oordt" w:date="2026-05-21T21:39:00Z" w:initials="DCV">
     <w:p>
       <w:pPr>
         <w:pStyle w:val="CommentText"/>
@@ -10291,7 +10610,7 @@
       </w:r>
     </w:p>
   </w:comment>
-  <w:comment w:id="244" w:author="Daniel Metz" w:date="2026-05-19T13:45:00Z" w:initials="DM">
+  <w:comment w:id="303" w:author="Daniel Metz" w:date="2026-05-19T13:45:00Z" w:initials="DM">
     <w:p>
       <w:pPr>
         <w:pStyle w:val="CommentText"/>
@@ -10307,7 +10626,7 @@
       </w:r>
     </w:p>
   </w:comment>
-  <w:comment w:id="245" w:author="Andrea L. Graham" w:date="2026-05-21T13:53:00Z" w:initials="AG">
+  <w:comment w:id="311" w:author="Andrea L. Graham" w:date="2026-05-21T13:53:00Z" w:initials="AG">
     <w:p>
       <w:pPr>
         <w:pStyle w:val="CommentText"/>
@@ -10323,7 +10642,7 @@
       </w:r>
     </w:p>
   </w:comment>
-  <w:comment w:id="246" w:author="Daniel Metz" w:date="2026-05-19T13:48:00Z" w:initials="DM">
+  <w:comment w:id="312" w:author="Daniel Metz" w:date="2026-05-19T13:48:00Z" w:initials="DM">
     <w:p>
       <w:pPr>
         <w:pStyle w:val="CommentText"/>
@@ -10339,7 +10658,7 @@
       </w:r>
     </w:p>
   </w:comment>
-  <w:comment w:id="247" w:author="Andrea L. Graham" w:date="2026-05-21T13:56:00Z" w:initials="AG">
+  <w:comment w:id="313" w:author="Andrea L. Graham" w:date="2026-05-21T13:56:00Z" w:initials="AG">
     <w:p>
       <w:pPr>
         <w:pStyle w:val="CommentText"/>
@@ -10352,39 +10671,6 @@
       </w:r>
       <w:r>
         <w:t>Yes, and a great one!</w:t>
-      </w:r>
-    </w:p>
-  </w:comment>
-  <w:comment w:id="248" w:author="David Chang van Oordt [2]" w:date="2026-05-21T14:56:00Z" w:initials="DC">
-    <w:p>
-      <w:r>
-        <w:rPr>
-          <w:rStyle w:val="CommentReference"/>
-        </w:rPr>
-        <w:annotationRef/>
-      </w:r>
-      <w:r>
-        <w:rPr>
-          <w:sz w:val="20"/>
-          <w:szCs w:val="20"/>
-        </w:rPr>
-        <w:t>We seemed to have that red line  along the edge of the grey area in the ProcB paper as well and I thought it might've been a resolution issue, but here it shows somewhere beyond the boundary of grey and black. So is there a narrow parameter space were we can expect high Th1 soon before we move into the high Th2 space?</w:t>
-      </w:r>
-    </w:p>
-  </w:comment>
-  <w:comment w:id="249" w:author="David Chang van Oordt" w:date="2026-05-21T21:23:00Z" w:initials="DCV">
-    <w:p>
-      <w:pPr>
-        <w:pStyle w:val="CommentText"/>
-      </w:pPr>
-      <w:r>
-        <w:rPr>
-          <w:rStyle w:val="CommentReference"/>
-        </w:rPr>
-        <w:annotationRef/>
-      </w:r>
-      <w:r>
-        <w:t>Does going higher than 750 get us any closer to full clearance? It’s interesting that everything after 500 stays around 0.6-0.8, but doesn’t go systematically higher.</w:t>
       </w:r>
     </w:p>
   </w:comment>
@@ -10392,7 +10678,7 @@
 </file>
 
 <file path=word/commentsExtended.xml><?xml version="1.0" encoding="utf-8"?>
-<w15:commentsEx xmlns:wpc="http://schemas.microsoft.com/office/word/2010/wordprocessingCanvas" xmlns:cx="http://schemas.microsoft.com/office/drawing/2014/chartex" xmlns:cx1="http://schemas.microsoft.com/office/drawing/2015/9/8/chartex" xmlns:cx2="http://schemas.microsoft.com/office/drawing/2015/10/21/chartex" xmlns:cx3="http://schemas.microsoft.com/office/drawing/2016/5/9/chartex" xmlns:cx4="http://schemas.microsoft.com/office/drawing/2016/5/10/chartex" xmlns:cx5="http://schemas.microsoft.com/office/drawing/2016/5/11/chartex" xmlns:cx6="http://schemas.microsoft.com/office/drawing/2016/5/12/chartex" xmlns:cx7="http://schemas.microsoft.com/office/drawing/2016/5/13/chartex" xmlns:cx8="http://schemas.microsoft.com/office/drawing/2016/5/14/chartex" xmlns:mc="http://schemas.openxmlformats.org/markup-compatibility/2006" xmlns:aink="http://schemas.microsoft.com/office/drawing/2016/ink" xmlns:am3d="http://schemas.microsoft.com/office/drawing/2017/model3d" xmlns:o="urn:schemas-microsoft-com:office:office" xmlns:oel="http://schemas.microsoft.com/office/2019/extlst" xmlns:r="http://schemas.openxmlformats.org/officeDocument/2006/relationships" xmlns:m="http://schemas.openxmlformats.org/officeDocument/2006/math" xmlns:v="urn:schemas-microsoft-com:vml" xmlns:wp14="http://schemas.microsoft.com/office/word/2010/wordprocessingDrawing" xmlns:wp="http://schemas.openxmlformats.org/drawingml/2006/wordprocessingDrawing" xmlns:w10="urn:schemas-microsoft-com:office:word" xmlns:w="http://schemas.openxmlformats.org/wordprocessingml/2006/main" xmlns:w14="http://schemas.microsoft.com/office/word/2010/wordml" xmlns:w15="http://schemas.microsoft.com/office/word/2012/wordml" xmlns:w16cex="http://schemas.microsoft.com/office/word/2018/wordml/cex" xmlns:w16cid="http://schemas.microsoft.com/office/word/2016/wordml/cid" xmlns:w16="http://schemas.microsoft.com/office/word/2018/wordml" xmlns:w16du="http://schemas.microsoft.com/office/word/2023/wordml/word16du" xmlns:w16sdtdh="http://schemas.microsoft.com/office/word/2020/wordml/sdtdatahash" xmlns:w16se="http://schemas.microsoft.com/office/word/2015/wordml/symex" xmlns:wpg="http://schemas.microsoft.com/office/word/2010/wordprocessingGroup" xmlns:wpi="http://schemas.microsoft.com/office/word/2010/wordprocessingInk" xmlns:wne="http://schemas.microsoft.com/office/word/2006/wordml" xmlns:wps="http://schemas.microsoft.com/office/word/2010/wordprocessingShape" mc:Ignorable="w14 w15 w16se w16cid w16 w16cex w16sdtdh w16du wp14">
+<w15:commentsEx xmlns:wpc="http://schemas.microsoft.com/office/word/2010/wordprocessingCanvas" xmlns:cx="http://schemas.microsoft.com/office/drawing/2014/chartex" xmlns:cx1="http://schemas.microsoft.com/office/drawing/2015/9/8/chartex" xmlns:cx2="http://schemas.microsoft.com/office/drawing/2015/10/21/chartex" xmlns:cx3="http://schemas.microsoft.com/office/drawing/2016/5/9/chartex" xmlns:cx4="http://schemas.microsoft.com/office/drawing/2016/5/10/chartex" xmlns:cx5="http://schemas.microsoft.com/office/drawing/2016/5/11/chartex" xmlns:cx6="http://schemas.microsoft.com/office/drawing/2016/5/12/chartex" xmlns:cx7="http://schemas.microsoft.com/office/drawing/2016/5/13/chartex" xmlns:cx8="http://schemas.microsoft.com/office/drawing/2016/5/14/chartex" xmlns:mc="http://schemas.openxmlformats.org/markup-compatibility/2006" xmlns:aink="http://schemas.microsoft.com/office/drawing/2016/ink" xmlns:am3d="http://schemas.microsoft.com/office/drawing/2017/model3d" xmlns:o="urn:schemas-microsoft-com:office:office" xmlns:oel="http://schemas.microsoft.com/office/2019/extlst" xmlns:r="http://schemas.openxmlformats.org/officeDocument/2006/relationships" xmlns:m="http://schemas.openxmlformats.org/officeDocument/2006/math" xmlns:v="urn:schemas-microsoft-com:vml" xmlns:wp14="http://schemas.microsoft.com/office/word/2010/wordprocessingDrawing" xmlns:wp="http://schemas.openxmlformats.org/drawingml/2006/wordprocessingDrawing" xmlns:w10="urn:schemas-microsoft-com:office:word" xmlns:w="http://schemas.openxmlformats.org/wordprocessingml/2006/main" xmlns:w14="http://schemas.microsoft.com/office/word/2010/wordml" xmlns:w15="http://schemas.microsoft.com/office/word/2012/wordml" xmlns:w16cex="http://schemas.microsoft.com/office/word/2018/wordml/cex" xmlns:w16cid="http://schemas.microsoft.com/office/word/2016/wordml/cid" xmlns:w16="http://schemas.microsoft.com/office/word/2018/wordml" xmlns:w16du="http://schemas.microsoft.com/office/word/2023/wordml/word16du" xmlns:w16sdtdh="http://schemas.microsoft.com/office/word/2020/wordml/sdtdatahash" xmlns:w16sdtfl="http://schemas.microsoft.com/office/word/2024/wordml/sdtformatlock" xmlns:w16se="http://schemas.microsoft.com/office/word/2015/wordml/symex" xmlns:wpg="http://schemas.microsoft.com/office/word/2010/wordprocessingGroup" xmlns:wpi="http://schemas.microsoft.com/office/word/2010/wordprocessingInk" xmlns:wne="http://schemas.microsoft.com/office/word/2006/wordml" xmlns:wps="http://schemas.microsoft.com/office/word/2010/wordprocessingShape" mc:Ignorable="w14 w15 w16se w16cid w16 w16cex w16sdtdh w16sdtfl w16du wp14">
   <w15:commentEx w15:paraId="1D5EB874" w15:done="1"/>
   <w15:commentEx w15:paraId="6075C5C0" w15:paraIdParent="1D5EB874" w15:done="1"/>
   <w15:commentEx w15:paraId="270097DF" w15:done="1"/>
@@ -10413,37 +10699,38 @@
   <w15:commentEx w15:paraId="018A0569" w15:done="0"/>
   <w15:commentEx w15:paraId="5ED8B221" w15:paraIdParent="018A0569" w15:done="0"/>
   <w15:commentEx w15:paraId="0F18F1E7" w15:paraIdParent="018A0569" w15:done="0"/>
-  <w15:commentEx w15:paraId="3920EF26" w15:done="0"/>
-  <w15:commentEx w15:paraId="58CA7C28" w15:done="0"/>
-  <w15:commentEx w15:paraId="095AB86D" w15:paraIdParent="58CA7C28" w15:done="0"/>
+  <w15:commentEx w15:paraId="3920EF26" w15:done="1"/>
+  <w15:commentEx w15:paraId="58CA7C28" w15:done="1"/>
+  <w15:commentEx w15:paraId="095AB86D" w15:paraIdParent="58CA7C28" w15:done="1"/>
   <w15:commentEx w15:paraId="40F54149" w15:done="0"/>
+  <w15:commentEx w15:paraId="764C150A" w15:paraIdParent="40F54149" w15:done="0"/>
   <w15:commentEx w15:paraId="66751A9B" w15:done="0"/>
-  <w15:commentEx w15:paraId="2B59FF53" w15:done="0"/>
+  <w15:commentEx w15:paraId="2B59FF53" w15:done="1"/>
   <w15:commentEx w15:paraId="08C045D2" w15:done="0"/>
   <w15:commentEx w15:paraId="57EA5C98" w15:paraIdParent="08C045D2" w15:done="0"/>
+  <w15:commentEx w15:paraId="6F545BAA" w15:paraIdParent="08C045D2" w15:done="0"/>
   <w15:commentEx w15:paraId="1CF19CFD" w15:done="0"/>
   <w15:commentEx w15:paraId="5C1E3416" w15:done="0"/>
   <w15:commentEx w15:paraId="37C56BEA" w15:paraIdParent="5C1E3416" w15:done="0"/>
-  <w15:commentEx w15:paraId="4B40211C" w15:done="0"/>
+  <w15:commentEx w15:paraId="4B40211C" w15:done="1"/>
   <w15:commentEx w15:paraId="1F0B4494" w15:done="0"/>
+  <w15:commentEx w15:paraId="1ACD14B5" w15:paraIdParent="1F0B4494" w15:done="0"/>
   <w15:commentEx w15:paraId="50DE32AE" w15:done="0"/>
-  <w15:commentEx w15:paraId="45978E6F" w15:done="0"/>
+  <w15:commentEx w15:paraId="45978E6F" w15:done="1"/>
   <w15:commentEx w15:paraId="289BDE61" w15:done="0"/>
   <w15:commentEx w15:paraId="447855A4" w15:paraIdParent="289BDE61" w15:done="0"/>
-  <w15:commentEx w15:paraId="06C5B2C5" w15:done="0"/>
+  <w15:commentEx w15:paraId="06C5B2C5" w15:done="1"/>
   <w15:commentEx w15:paraId="7713C463" w15:done="0"/>
-  <w15:commentEx w15:paraId="5814DFFC" w15:done="0"/>
-  <w15:commentEx w15:paraId="196FBD3F" w15:done="0"/>
-  <w15:commentEx w15:paraId="356D49DE" w15:done="0"/>
+  <w15:commentEx w15:paraId="5814DFFC" w15:done="1"/>
+  <w15:commentEx w15:paraId="196FBD3F" w15:done="1"/>
+  <w15:commentEx w15:paraId="356D49DE" w15:done="1"/>
   <w15:commentEx w15:paraId="7BEE0198" w15:done="0"/>
   <w15:commentEx w15:paraId="16581C30" w15:paraIdParent="7BEE0198" w15:done="0"/>
-  <w15:commentEx w15:paraId="244D1859" w15:done="0"/>
-  <w15:commentEx w15:paraId="477F5B0D" w15:done="0"/>
 </w15:commentsEx>
 </file>
 
 <file path=word/commentsExtensible.xml><?xml version="1.0" encoding="utf-8"?>
-<w16cex:commentsExtensible xmlns:wpc="http://schemas.microsoft.com/office/word/2010/wordprocessingCanvas" xmlns:cx="http://schemas.microsoft.com/office/drawing/2014/chartex" xmlns:cx1="http://schemas.microsoft.com/office/drawing/2015/9/8/chartex" xmlns:cx2="http://schemas.microsoft.com/office/drawing/2015/10/21/chartex" xmlns:cx3="http://schemas.microsoft.com/office/drawing/2016/5/9/chartex" xmlns:cx4="http://schemas.microsoft.com/office/drawing/2016/5/10/chartex" xmlns:cx5="http://schemas.microsoft.com/office/drawing/2016/5/11/chartex" xmlns:cx6="http://schemas.microsoft.com/office/drawing/2016/5/12/chartex" xmlns:cx7="http://schemas.microsoft.com/office/drawing/2016/5/13/chartex" xmlns:cx8="http://schemas.microsoft.com/office/drawing/2016/5/14/chartex" xmlns:cr="http://schemas.microsoft.com/office/comments/2020/reactions" xmlns:mc="http://schemas.openxmlformats.org/markup-compatibility/2006" xmlns:aink="http://schemas.microsoft.com/office/drawing/2016/ink" xmlns:am3d="http://schemas.microsoft.com/office/drawing/2017/model3d" xmlns:o="urn:schemas-microsoft-com:office:office" xmlns:oel="http://schemas.microsoft.com/office/2019/extlst" xmlns:r="http://schemas.openxmlformats.org/officeDocument/2006/relationships" xmlns:m="http://schemas.openxmlformats.org/officeDocument/2006/math" xmlns:v="urn:schemas-microsoft-com:vml" xmlns:wp14="http://schemas.microsoft.com/office/word/2010/wordprocessingDrawing" xmlns:wp="http://schemas.openxmlformats.org/drawingml/2006/wordprocessingDrawing" xmlns:w10="urn:schemas-microsoft-com:office:word" xmlns:w="http://schemas.openxmlformats.org/wordprocessingml/2006/main" xmlns:w14="http://schemas.microsoft.com/office/word/2010/wordml" xmlns:w15="http://schemas.microsoft.com/office/word/2012/wordml" xmlns:w16cex="http://schemas.microsoft.com/office/word/2018/wordml/cex" xmlns:w16cid="http://schemas.microsoft.com/office/word/2016/wordml/cid" xmlns:w16="http://schemas.microsoft.com/office/word/2018/wordml" xmlns:w16du="http://schemas.microsoft.com/office/word/2023/wordml/word16du" xmlns:w16sdtdh="http://schemas.microsoft.com/office/word/2020/wordml/sdtdatahash" xmlns:w16se="http://schemas.microsoft.com/office/word/2015/wordml/symex" xmlns:wpg="http://schemas.microsoft.com/office/word/2010/wordprocessingGroup" xmlns:wpi="http://schemas.microsoft.com/office/word/2010/wordprocessingInk" xmlns:wne="http://schemas.microsoft.com/office/word/2006/wordml" xmlns:wps="http://schemas.microsoft.com/office/word/2010/wordprocessingShape" mc:Ignorable="w14 w15 w16se w16cid w16 w16cex w16sdtdh cr w16du wp14">
+<w16cex:commentsExtensible xmlns:wpc="http://schemas.microsoft.com/office/word/2010/wordprocessingCanvas" xmlns:cx="http://schemas.microsoft.com/office/drawing/2014/chartex" xmlns:cx1="http://schemas.microsoft.com/office/drawing/2015/9/8/chartex" xmlns:cx2="http://schemas.microsoft.com/office/drawing/2015/10/21/chartex" xmlns:cx3="http://schemas.microsoft.com/office/drawing/2016/5/9/chartex" xmlns:cx4="http://schemas.microsoft.com/office/drawing/2016/5/10/chartex" xmlns:cx5="http://schemas.microsoft.com/office/drawing/2016/5/11/chartex" xmlns:cx6="http://schemas.microsoft.com/office/drawing/2016/5/12/chartex" xmlns:cx7="http://schemas.microsoft.com/office/drawing/2016/5/13/chartex" xmlns:cx8="http://schemas.microsoft.com/office/drawing/2016/5/14/chartex" xmlns:cr="http://schemas.microsoft.com/office/comments/2020/reactions" xmlns:mc="http://schemas.openxmlformats.org/markup-compatibility/2006" xmlns:aink="http://schemas.microsoft.com/office/drawing/2016/ink" xmlns:am3d="http://schemas.microsoft.com/office/drawing/2017/model3d" xmlns:o="urn:schemas-microsoft-com:office:office" xmlns:oel="http://schemas.microsoft.com/office/2019/extlst" xmlns:r="http://schemas.openxmlformats.org/officeDocument/2006/relationships" xmlns:m="http://schemas.openxmlformats.org/officeDocument/2006/math" xmlns:v="urn:schemas-microsoft-com:vml" xmlns:wp14="http://schemas.microsoft.com/office/word/2010/wordprocessingDrawing" xmlns:wp="http://schemas.openxmlformats.org/drawingml/2006/wordprocessingDrawing" xmlns:w10="urn:schemas-microsoft-com:office:word" xmlns:w="http://schemas.openxmlformats.org/wordprocessingml/2006/main" xmlns:w14="http://schemas.microsoft.com/office/word/2010/wordml" xmlns:w15="http://schemas.microsoft.com/office/word/2012/wordml" xmlns:w16cex="http://schemas.microsoft.com/office/word/2018/wordml/cex" xmlns:w16cid="http://schemas.microsoft.com/office/word/2016/wordml/cid" xmlns:w16="http://schemas.microsoft.com/office/word/2018/wordml" xmlns:w16du="http://schemas.microsoft.com/office/word/2023/wordml/word16du" xmlns:w16sdtdh="http://schemas.microsoft.com/office/word/2020/wordml/sdtdatahash" xmlns:w16sdtfl="http://schemas.microsoft.com/office/word/2024/wordml/sdtformatlock" xmlns:w16se="http://schemas.microsoft.com/office/word/2015/wordml/symex" xmlns:wpg="http://schemas.microsoft.com/office/word/2010/wordprocessingGroup" xmlns:wpi="http://schemas.microsoft.com/office/word/2010/wordprocessingInk" xmlns:wne="http://schemas.microsoft.com/office/word/2006/wordml" xmlns:wps="http://schemas.microsoft.com/office/word/2010/wordprocessingShape" mc:Ignorable="w14 w15 w16se w16cid w16 w16cex w16sdtdh w16sdtfl cr w16du wp14">
   <w16cex:commentExtensible w16cex:durableId="2DB6CFF5" w16cex:dateUtc="2026-05-19T16:03:00Z"/>
   <w16cex:commentExtensible w16cex:durableId="364FBC72" w16cex:dateUtc="2026-05-21T17:05:00Z"/>
   <w16cex:commentExtensible w16cex:durableId="31327310" w16cex:dateUtc="2026-05-21T16:55:00Z"/>
@@ -10468,6 +10755,7 @@
   <w16cex:commentExtensible w16cex:durableId="2DB6D537" w16cex:dateUtc="2026-05-19T16:25:00Z"/>
   <w16cex:commentExtensible w16cex:durableId="06C0FFB3" w16cex:dateUtc="2026-05-22T00:43:00Z"/>
   <w16cex:commentExtensible w16cex:durableId="286BA660" w16cex:dateUtc="2026-05-21T17:20:00Z"/>
+  <w16cex:commentExtensible w16cex:durableId="0C5AC107" w16cex:dateUtc="2026-05-30T19:40:00Z"/>
   <w16cex:commentExtensible w16cex:durableId="1718B6EB" w16cex:dateUtc="2026-05-22T00:49:00Z"/>
   <w16cex:commentExtensible w16cex:durableId="2DB6D5FE" w16cex:dateUtc="2026-05-19T16:28:00Z">
     <w16cex:extLst>
@@ -10484,11 +10772,13 @@
   </w16cex:commentExtensible>
   <w16cex:commentExtensible w16cex:durableId="2DB6D6F7" w16cex:dateUtc="2026-05-19T16:32:00Z"/>
   <w16cex:commentExtensible w16cex:durableId="48A6F642" w16cex:dateUtc="2026-05-22T00:55:00Z"/>
+  <w16cex:commentExtensible w16cex:durableId="716F706E" w16cex:dateUtc="2026-05-30T20:35:00Z"/>
   <w16cex:commentExtensible w16cex:durableId="06FB4D9A" w16cex:dateUtc="2026-05-21T17:27:00Z"/>
   <w16cex:commentExtensible w16cex:durableId="4DE09F3C" w16cex:dateUtc="2026-05-21T17:35:00Z"/>
   <w16cex:commentExtensible w16cex:durableId="24132AF2" w16cex:dateUtc="2026-05-22T01:21:00Z"/>
   <w16cex:commentExtensible w16cex:durableId="1ECC72E3" w16cex:dateUtc="2026-05-21T17:32:00Z"/>
   <w16cex:commentExtensible w16cex:durableId="450F2AF2" w16cex:dateUtc="2026-05-22T01:24:00Z"/>
+  <w16cex:commentExtensible w16cex:durableId="0FF1DC39" w16cex:dateUtc="2026-06-01T17:43:00Z"/>
   <w16cex:commentExtensible w16cex:durableId="1EDEC148" w16cex:dateUtc="2026-05-21T17:40:00Z"/>
   <w16cex:commentExtensible w16cex:durableId="2DB6DA37" w16cex:dateUtc="2026-05-19T16:46:00Z"/>
   <w16cex:commentExtensible w16cex:durableId="2DB6DA0A" w16cex:dateUtc="2026-05-19T16:46:00Z">
@@ -10524,13 +10814,11 @@
     </w16cex:extLst>
   </w16cex:commentExtensible>
   <w16cex:commentExtensible w16cex:durableId="01762AD6" w16cex:dateUtc="2026-05-21T17:56:00Z"/>
-  <w16cex:commentExtensible w16cex:durableId="63A10432" w16cex:dateUtc="2026-05-21T18:56:00Z"/>
-  <w16cex:commentExtensible w16cex:durableId="0C62336F" w16cex:dateUtc="2026-05-22T01:23:00Z"/>
 </w16cex:commentsExtensible>
 </file>
 
 <file path=word/commentsIds.xml><?xml version="1.0" encoding="utf-8"?>
-<w16cid:commentsIds xmlns:wpc="http://schemas.microsoft.com/office/word/2010/wordprocessingCanvas" xmlns:cx="http://schemas.microsoft.com/office/drawing/2014/chartex" xmlns:cx1="http://schemas.microsoft.com/office/drawing/2015/9/8/chartex" xmlns:cx2="http://schemas.microsoft.com/office/drawing/2015/10/21/chartex" xmlns:cx3="http://schemas.microsoft.com/office/drawing/2016/5/9/chartex" xmlns:cx4="http://schemas.microsoft.com/office/drawing/2016/5/10/chartex" xmlns:cx5="http://schemas.microsoft.com/office/drawing/2016/5/11/chartex" xmlns:cx6="http://schemas.microsoft.com/office/drawing/2016/5/12/chartex" xmlns:cx7="http://schemas.microsoft.com/office/drawing/2016/5/13/chartex" xmlns:cx8="http://schemas.microsoft.com/office/drawing/2016/5/14/chartex" xmlns:mc="http://schemas.openxmlformats.org/markup-compatibility/2006" xmlns:aink="http://schemas.microsoft.com/office/drawing/2016/ink" xmlns:am3d="http://schemas.microsoft.com/office/drawing/2017/model3d" xmlns:o="urn:schemas-microsoft-com:office:office" xmlns:oel="http://schemas.microsoft.com/office/2019/extlst" xmlns:r="http://schemas.openxmlformats.org/officeDocument/2006/relationships" xmlns:m="http://schemas.openxmlformats.org/officeDocument/2006/math" xmlns:v="urn:schemas-microsoft-com:vml" xmlns:wp14="http://schemas.microsoft.com/office/word/2010/wordprocessingDrawing" xmlns:wp="http://schemas.openxmlformats.org/drawingml/2006/wordprocessingDrawing" xmlns:w10="urn:schemas-microsoft-com:office:word" xmlns:w="http://schemas.openxmlformats.org/wordprocessingml/2006/main" xmlns:w14="http://schemas.microsoft.com/office/word/2010/wordml" xmlns:w15="http://schemas.microsoft.com/office/word/2012/wordml" xmlns:w16cex="http://schemas.microsoft.com/office/word/2018/wordml/cex" xmlns:w16cid="http://schemas.microsoft.com/office/word/2016/wordml/cid" xmlns:w16="http://schemas.microsoft.com/office/word/2018/wordml" xmlns:w16du="http://schemas.microsoft.com/office/word/2023/wordml/word16du" xmlns:w16sdtdh="http://schemas.microsoft.com/office/word/2020/wordml/sdtdatahash" xmlns:w16se="http://schemas.microsoft.com/office/word/2015/wordml/symex" xmlns:wpg="http://schemas.microsoft.com/office/word/2010/wordprocessingGroup" xmlns:wpi="http://schemas.microsoft.com/office/word/2010/wordprocessingInk" xmlns:wne="http://schemas.microsoft.com/office/word/2006/wordml" xmlns:wps="http://schemas.microsoft.com/office/word/2010/wordprocessingShape" mc:Ignorable="w14 w15 w16se w16cid w16 w16cex w16sdtdh w16du wp14">
+<w16cid:commentsIds xmlns:wpc="http://schemas.microsoft.com/office/word/2010/wordprocessingCanvas" xmlns:cx="http://schemas.microsoft.com/office/drawing/2014/chartex" xmlns:cx1="http://schemas.microsoft.com/office/drawing/2015/9/8/chartex" xmlns:cx2="http://schemas.microsoft.com/office/drawing/2015/10/21/chartex" xmlns:cx3="http://schemas.microsoft.com/office/drawing/2016/5/9/chartex" xmlns:cx4="http://schemas.microsoft.com/office/drawing/2016/5/10/chartex" xmlns:cx5="http://schemas.microsoft.com/office/drawing/2016/5/11/chartex" xmlns:cx6="http://schemas.microsoft.com/office/drawing/2016/5/12/chartex" xmlns:cx7="http://schemas.microsoft.com/office/drawing/2016/5/13/chartex" xmlns:cx8="http://schemas.microsoft.com/office/drawing/2016/5/14/chartex" xmlns:mc="http://schemas.openxmlformats.org/markup-compatibility/2006" xmlns:aink="http://schemas.microsoft.com/office/drawing/2016/ink" xmlns:am3d="http://schemas.microsoft.com/office/drawing/2017/model3d" xmlns:o="urn:schemas-microsoft-com:office:office" xmlns:oel="http://schemas.microsoft.com/office/2019/extlst" xmlns:r="http://schemas.openxmlformats.org/officeDocument/2006/relationships" xmlns:m="http://schemas.openxmlformats.org/officeDocument/2006/math" xmlns:v="urn:schemas-microsoft-com:vml" xmlns:wp14="http://schemas.microsoft.com/office/word/2010/wordprocessingDrawing" xmlns:wp="http://schemas.openxmlformats.org/drawingml/2006/wordprocessingDrawing" xmlns:w10="urn:schemas-microsoft-com:office:word" xmlns:w="http://schemas.openxmlformats.org/wordprocessingml/2006/main" xmlns:w14="http://schemas.microsoft.com/office/word/2010/wordml" xmlns:w15="http://schemas.microsoft.com/office/word/2012/wordml" xmlns:w16cex="http://schemas.microsoft.com/office/word/2018/wordml/cex" xmlns:w16cid="http://schemas.microsoft.com/office/word/2016/wordml/cid" xmlns:w16="http://schemas.microsoft.com/office/word/2018/wordml" xmlns:w16du="http://schemas.microsoft.com/office/word/2023/wordml/word16du" xmlns:w16sdtdh="http://schemas.microsoft.com/office/word/2020/wordml/sdtdatahash" xmlns:w16sdtfl="http://schemas.microsoft.com/office/word/2024/wordml/sdtformatlock" xmlns:w16se="http://schemas.microsoft.com/office/word/2015/wordml/symex" xmlns:wpg="http://schemas.microsoft.com/office/word/2010/wordprocessingGroup" xmlns:wpi="http://schemas.microsoft.com/office/word/2010/wordprocessingInk" xmlns:wne="http://schemas.microsoft.com/office/word/2006/wordml" xmlns:wps="http://schemas.microsoft.com/office/word/2010/wordprocessingShape" mc:Ignorable="w14 w15 w16se w16cid w16 w16cex w16sdtdh w16sdtfl w16du wp14">
   <w16cid:commentId w16cid:paraId="1D5EB874" w16cid:durableId="2DB6CFF5"/>
   <w16cid:commentId w16cid:paraId="6075C5C0" w16cid:durableId="364FBC72"/>
   <w16cid:commentId w16cid:paraId="270097DF" w16cid:durableId="31327310"/>
@@ -10555,15 +10843,18 @@
   <w16cid:commentId w16cid:paraId="58CA7C28" w16cid:durableId="2DB6D537"/>
   <w16cid:commentId w16cid:paraId="095AB86D" w16cid:durableId="06C0FFB3"/>
   <w16cid:commentId w16cid:paraId="40F54149" w16cid:durableId="286BA660"/>
+  <w16cid:commentId w16cid:paraId="764C150A" w16cid:durableId="0C5AC107"/>
   <w16cid:commentId w16cid:paraId="66751A9B" w16cid:durableId="1718B6EB"/>
   <w16cid:commentId w16cid:paraId="2B59FF53" w16cid:durableId="2DB6D5FE"/>
   <w16cid:commentId w16cid:paraId="08C045D2" w16cid:durableId="2DB6D6F7"/>
   <w16cid:commentId w16cid:paraId="57EA5C98" w16cid:durableId="48A6F642"/>
+  <w16cid:commentId w16cid:paraId="6F545BAA" w16cid:durableId="716F706E"/>
   <w16cid:commentId w16cid:paraId="1CF19CFD" w16cid:durableId="06FB4D9A"/>
   <w16cid:commentId w16cid:paraId="5C1E3416" w16cid:durableId="4DE09F3C"/>
   <w16cid:commentId w16cid:paraId="37C56BEA" w16cid:durableId="24132AF2"/>
   <w16cid:commentId w16cid:paraId="4B40211C" w16cid:durableId="1ECC72E3"/>
   <w16cid:commentId w16cid:paraId="1F0B4494" w16cid:durableId="450F2AF2"/>
+  <w16cid:commentId w16cid:paraId="1ACD14B5" w16cid:durableId="0FF1DC39"/>
   <w16cid:commentId w16cid:paraId="50DE32AE" w16cid:durableId="1EDEC148"/>
   <w16cid:commentId w16cid:paraId="45978E6F" w16cid:durableId="2DB6DA37"/>
   <w16cid:commentId w16cid:paraId="289BDE61" w16cid:durableId="2DB6DA0A"/>
@@ -10575,13 +10866,11 @@
   <w16cid:commentId w16cid:paraId="356D49DE" w16cid:durableId="68C49A78"/>
   <w16cid:commentId w16cid:paraId="7BEE0198" w16cid:durableId="2DB6E8AC"/>
   <w16cid:commentId w16cid:paraId="16581C30" w16cid:durableId="01762AD6"/>
-  <w16cid:commentId w16cid:paraId="244D1859" w16cid:durableId="63A10432"/>
-  <w16cid:commentId w16cid:paraId="477F5B0D" w16cid:durableId="0C62336F"/>
 </w16cid:commentsIds>
 </file>
 
 <file path=word/numbering.xml><?xml version="1.0" encoding="utf-8"?>
-<w:numbering xmlns:wpc="http://schemas.microsoft.com/office/word/2010/wordprocessingCanvas" xmlns:cx="http://schemas.microsoft.com/office/drawing/2014/chartex" xmlns:cx1="http://schemas.microsoft.com/office/drawing/2015/9/8/chartex" xmlns:cx2="http://schemas.microsoft.com/office/drawing/2015/10/21/chartex" xmlns:cx3="http://schemas.microsoft.com/office/drawing/2016/5/9/chartex" xmlns:cx4="http://schemas.microsoft.com/office/drawing/2016/5/10/chartex" xmlns:cx5="http://schemas.microsoft.com/office/drawing/2016/5/11/chartex" xmlns:cx6="http://schemas.microsoft.com/office/drawing/2016/5/12/chartex" xmlns:cx7="http://schemas.microsoft.com/office/drawing/2016/5/13/chartex" xmlns:cx8="http://schemas.microsoft.com/office/drawing/2016/5/14/chartex" xmlns:mc="http://schemas.openxmlformats.org/markup-compatibility/2006" xmlns:aink="http://schemas.microsoft.com/office/drawing/2016/ink" xmlns:am3d="http://schemas.microsoft.com/office/drawing/2017/model3d" xmlns:o="urn:schemas-microsoft-com:office:office" xmlns:oel="http://schemas.microsoft.com/office/2019/extlst" xmlns:r="http://schemas.openxmlformats.org/officeDocument/2006/relationships" xmlns:m="http://schemas.openxmlformats.org/officeDocument/2006/math" xmlns:v="urn:schemas-microsoft-com:vml" xmlns:wp14="http://schemas.microsoft.com/office/word/2010/wordprocessingDrawing" xmlns:wp="http://schemas.openxmlformats.org/drawingml/2006/wordprocessingDrawing" xmlns:w10="urn:schemas-microsoft-com:office:word" xmlns:w="http://schemas.openxmlformats.org/wordprocessingml/2006/main" xmlns:w14="http://schemas.microsoft.com/office/word/2010/wordml" xmlns:w15="http://schemas.microsoft.com/office/word/2012/wordml" xmlns:w16cex="http://schemas.microsoft.com/office/word/2018/wordml/cex" xmlns:w16cid="http://schemas.microsoft.com/office/word/2016/wordml/cid" xmlns:w16="http://schemas.microsoft.com/office/word/2018/wordml" xmlns:w16du="http://schemas.microsoft.com/office/word/2023/wordml/word16du" xmlns:w16sdtdh="http://schemas.microsoft.com/office/word/2020/wordml/sdtdatahash" xmlns:w16se="http://schemas.microsoft.com/office/word/2015/wordml/symex" xmlns:wpg="http://schemas.microsoft.com/office/word/2010/wordprocessingGroup" xmlns:wpi="http://schemas.microsoft.com/office/word/2010/wordprocessingInk" xmlns:wne="http://schemas.microsoft.com/office/word/2006/wordml" xmlns:wps="http://schemas.microsoft.com/office/word/2010/wordprocessingShape" mc:Ignorable="w14 w15 w16se w16cid w16 w16cex w16sdtdh w16du wp14">
+<w:numbering xmlns:wpc="http://schemas.microsoft.com/office/word/2010/wordprocessingCanvas" xmlns:cx="http://schemas.microsoft.com/office/drawing/2014/chartex" xmlns:cx1="http://schemas.microsoft.com/office/drawing/2015/9/8/chartex" xmlns:cx2="http://schemas.microsoft.com/office/drawing/2015/10/21/chartex" xmlns:cx3="http://schemas.microsoft.com/office/drawing/2016/5/9/chartex" xmlns:cx4="http://schemas.microsoft.com/office/drawing/2016/5/10/chartex" xmlns:cx5="http://schemas.microsoft.com/office/drawing/2016/5/11/chartex" xmlns:cx6="http://schemas.microsoft.com/office/drawing/2016/5/12/chartex" xmlns:cx7="http://schemas.microsoft.com/office/drawing/2016/5/13/chartex" xmlns:cx8="http://schemas.microsoft.com/office/drawing/2016/5/14/chartex" xmlns:mc="http://schemas.openxmlformats.org/markup-compatibility/2006" xmlns:aink="http://schemas.microsoft.com/office/drawing/2016/ink" xmlns:am3d="http://schemas.microsoft.com/office/drawing/2017/model3d" xmlns:o="urn:schemas-microsoft-com:office:office" xmlns:oel="http://schemas.microsoft.com/office/2019/extlst" xmlns:r="http://schemas.openxmlformats.org/officeDocument/2006/relationships" xmlns:m="http://schemas.openxmlformats.org/officeDocument/2006/math" xmlns:v="urn:schemas-microsoft-com:vml" xmlns:wp14="http://schemas.microsoft.com/office/word/2010/wordprocessingDrawing" xmlns:wp="http://schemas.openxmlformats.org/drawingml/2006/wordprocessingDrawing" xmlns:w10="urn:schemas-microsoft-com:office:word" xmlns:w="http://schemas.openxmlformats.org/wordprocessingml/2006/main" xmlns:w14="http://schemas.microsoft.com/office/word/2010/wordml" xmlns:w15="http://schemas.microsoft.com/office/word/2012/wordml" xmlns:w16cex="http://schemas.microsoft.com/office/word/2018/wordml/cex" xmlns:w16cid="http://schemas.microsoft.com/office/word/2016/wordml/cid" xmlns:w16="http://schemas.microsoft.com/office/word/2018/wordml" xmlns:w16du="http://schemas.microsoft.com/office/word/2023/wordml/word16du" xmlns:w16sdtdh="http://schemas.microsoft.com/office/word/2020/wordml/sdtdatahash" xmlns:w16sdtfl="http://schemas.microsoft.com/office/word/2024/wordml/sdtformatlock" xmlns:w16se="http://schemas.microsoft.com/office/word/2015/wordml/symex" xmlns:wpg="http://schemas.microsoft.com/office/word/2010/wordprocessingGroup" xmlns:wpi="http://schemas.microsoft.com/office/word/2010/wordprocessingInk" xmlns:wne="http://schemas.microsoft.com/office/word/2006/wordml" xmlns:wps="http://schemas.microsoft.com/office/word/2010/wordprocessingShape" mc:Ignorable="w14 w15 w16se w16cid w16 w16cex w16sdtdh w16sdtfl w16du wp14">
   <w:abstractNum w:abstractNumId="0" w15:restartNumberingAfterBreak="0">
     <w:nsid w:val="003F0D20"/>
     <w:multiLevelType w:val="multilevel"/>
@@ -13246,7 +13535,7 @@
 </file>
 
 <file path=word/people.xml><?xml version="1.0" encoding="utf-8"?>
-<w15:people xmlns:wpc="http://schemas.microsoft.com/office/word/2010/wordprocessingCanvas" xmlns:cx="http://schemas.microsoft.com/office/drawing/2014/chartex" xmlns:cx1="http://schemas.microsoft.com/office/drawing/2015/9/8/chartex" xmlns:cx2="http://schemas.microsoft.com/office/drawing/2015/10/21/chartex" xmlns:cx3="http://schemas.microsoft.com/office/drawing/2016/5/9/chartex" xmlns:cx4="http://schemas.microsoft.com/office/drawing/2016/5/10/chartex" xmlns:cx5="http://schemas.microsoft.com/office/drawing/2016/5/11/chartex" xmlns:cx6="http://schemas.microsoft.com/office/drawing/2016/5/12/chartex" xmlns:cx7="http://schemas.microsoft.com/office/drawing/2016/5/13/chartex" xmlns:cx8="http://schemas.microsoft.com/office/drawing/2016/5/14/chartex" xmlns:mc="http://schemas.openxmlformats.org/markup-compatibility/2006" xmlns:aink="http://schemas.microsoft.com/office/drawing/2016/ink" xmlns:am3d="http://schemas.microsoft.com/office/drawing/2017/model3d" xmlns:o="urn:schemas-microsoft-com:office:office" xmlns:oel="http://schemas.microsoft.com/office/2019/extlst" xmlns:r="http://schemas.openxmlformats.org/officeDocument/2006/relationships" xmlns:m="http://schemas.openxmlformats.org/officeDocument/2006/math" xmlns:v="urn:schemas-microsoft-com:vml" xmlns:wp14="http://schemas.microsoft.com/office/word/2010/wordprocessingDrawing" xmlns:wp="http://schemas.openxmlformats.org/drawingml/2006/wordprocessingDrawing" xmlns:w10="urn:schemas-microsoft-com:office:word" xmlns:w="http://schemas.openxmlformats.org/wordprocessingml/2006/main" xmlns:w14="http://schemas.microsoft.com/office/word/2010/wordml" xmlns:w15="http://schemas.microsoft.com/office/word/2012/wordml" xmlns:w16cex="http://schemas.microsoft.com/office/word/2018/wordml/cex" xmlns:w16cid="http://schemas.microsoft.com/office/word/2016/wordml/cid" xmlns:w16="http://schemas.microsoft.com/office/word/2018/wordml" xmlns:w16du="http://schemas.microsoft.com/office/word/2023/wordml/word16du" xmlns:w16sdtdh="http://schemas.microsoft.com/office/word/2020/wordml/sdtdatahash" xmlns:w16se="http://schemas.microsoft.com/office/word/2015/wordml/symex" xmlns:wpg="http://schemas.microsoft.com/office/word/2010/wordprocessingGroup" xmlns:wpi="http://schemas.microsoft.com/office/word/2010/wordprocessingInk" xmlns:wne="http://schemas.microsoft.com/office/word/2006/wordml" xmlns:wps="http://schemas.microsoft.com/office/word/2010/wordprocessingShape" mc:Ignorable="w14 w15 w16se w16cid w16 w16cex w16sdtdh w16du wp14">
+<w15:people xmlns:wpc="http://schemas.microsoft.com/office/word/2010/wordprocessingCanvas" xmlns:cx="http://schemas.microsoft.com/office/drawing/2014/chartex" xmlns:cx1="http://schemas.microsoft.com/office/drawing/2015/9/8/chartex" xmlns:cx2="http://schemas.microsoft.com/office/drawing/2015/10/21/chartex" xmlns:cx3="http://schemas.microsoft.com/office/drawing/2016/5/9/chartex" xmlns:cx4="http://schemas.microsoft.com/office/drawing/2016/5/10/chartex" xmlns:cx5="http://schemas.microsoft.com/office/drawing/2016/5/11/chartex" xmlns:cx6="http://schemas.microsoft.com/office/drawing/2016/5/12/chartex" xmlns:cx7="http://schemas.microsoft.com/office/drawing/2016/5/13/chartex" xmlns:cx8="http://schemas.microsoft.com/office/drawing/2016/5/14/chartex" xmlns:mc="http://schemas.openxmlformats.org/markup-compatibility/2006" xmlns:aink="http://schemas.microsoft.com/office/drawing/2016/ink" xmlns:am3d="http://schemas.microsoft.com/office/drawing/2017/model3d" xmlns:o="urn:schemas-microsoft-com:office:office" xmlns:oel="http://schemas.microsoft.com/office/2019/extlst" xmlns:r="http://schemas.openxmlformats.org/officeDocument/2006/relationships" xmlns:m="http://schemas.openxmlformats.org/officeDocument/2006/math" xmlns:v="urn:schemas-microsoft-com:vml" xmlns:wp14="http://schemas.microsoft.com/office/word/2010/wordprocessingDrawing" xmlns:wp="http://schemas.openxmlformats.org/drawingml/2006/wordprocessingDrawing" xmlns:w10="urn:schemas-microsoft-com:office:word" xmlns:w="http://schemas.openxmlformats.org/wordprocessingml/2006/main" xmlns:w14="http://schemas.microsoft.com/office/word/2010/wordml" xmlns:w15="http://schemas.microsoft.com/office/word/2012/wordml" xmlns:w16cex="http://schemas.microsoft.com/office/word/2018/wordml/cex" xmlns:w16cid="http://schemas.microsoft.com/office/word/2016/wordml/cid" xmlns:w16="http://schemas.microsoft.com/office/word/2018/wordml" xmlns:w16du="http://schemas.microsoft.com/office/word/2023/wordml/word16du" xmlns:w16sdtdh="http://schemas.microsoft.com/office/word/2020/wordml/sdtdatahash" xmlns:w16sdtfl="http://schemas.microsoft.com/office/word/2024/wordml/sdtformatlock" xmlns:w16se="http://schemas.microsoft.com/office/word/2015/wordml/symex" xmlns:wpg="http://schemas.microsoft.com/office/word/2010/wordprocessingGroup" xmlns:wpi="http://schemas.microsoft.com/office/word/2010/wordprocessingInk" xmlns:wne="http://schemas.microsoft.com/office/word/2006/wordml" xmlns:wps="http://schemas.microsoft.com/office/word/2010/wordprocessingShape" mc:Ignorable="w14 w15 w16se w16cid w16 w16cex w16sdtdh w16sdtfl w16du wp14">
   <w15:person w15:author="Clay Cressler">
     <w15:presenceInfo w15:providerId="AD" w15:userId="S::ccressler2@uofnelincoln.onmicrosoft.com::22b9abb6-95bd-4fd0-985d-ccac894f0805"/>
   </w15:person>
@@ -13259,14 +13548,14 @@
   <w15:person w15:author="David Chang van Oordt">
     <w15:presenceInfo w15:providerId="None" w15:userId="David Chang van Oordt"/>
   </w15:person>
-  <w15:person w15:author="David Chang van Oordt [2]">
-    <w15:presenceInfo w15:providerId="Windows Live" w15:userId="6c3524481dca4f88"/>
+  <w15:person w15:author="Clay Cressler [2]">
+    <w15:presenceInfo w15:providerId="AD" w15:userId="S::60599027@nebraska.edu::e60b9995-0109-4261-a2a3-b2db83cb3f21"/>
   </w15:person>
 </w15:people>
 </file>
 
 <file path=word/styles.xml><?xml version="1.0" encoding="utf-8"?>
-<w:styles xmlns:mc="http://schemas.openxmlformats.org/markup-compatibility/2006" xmlns:r="http://schemas.openxmlformats.org/officeDocument/2006/relationships" xmlns:w="http://schemas.openxmlformats.org/wordprocessingml/2006/main" xmlns:w14="http://schemas.microsoft.com/office/word/2010/wordml" xmlns:w15="http://schemas.microsoft.com/office/word/2012/wordml" xmlns:w16cex="http://schemas.microsoft.com/office/word/2018/wordml/cex" xmlns:w16cid="http://schemas.microsoft.com/office/word/2016/wordml/cid" xmlns:w16="http://schemas.microsoft.com/office/word/2018/wordml" xmlns:w16du="http://schemas.microsoft.com/office/word/2023/wordml/word16du" xmlns:w16sdtdh="http://schemas.microsoft.com/office/word/2020/wordml/sdtdatahash" xmlns:w16se="http://schemas.microsoft.com/office/word/2015/wordml/symex" mc:Ignorable="w14 w15 w16se w16cid w16 w16cex w16sdtdh w16du">
+<w:styles xmlns:mc="http://schemas.openxmlformats.org/markup-compatibility/2006" xmlns:r="http://schemas.openxmlformats.org/officeDocument/2006/relationships" xmlns:w="http://schemas.openxmlformats.org/wordprocessingml/2006/main" xmlns:w14="http://schemas.microsoft.com/office/word/2010/wordml" xmlns:w15="http://schemas.microsoft.com/office/word/2012/wordml" xmlns:w16cex="http://schemas.microsoft.com/office/word/2018/wordml/cex" xmlns:w16cid="http://schemas.microsoft.com/office/word/2016/wordml/cid" xmlns:w16="http://schemas.microsoft.com/office/word/2018/wordml" xmlns:w16du="http://schemas.microsoft.com/office/word/2023/wordml/word16du" xmlns:w16sdtdh="http://schemas.microsoft.com/office/word/2020/wordml/sdtdatahash" xmlns:w16sdtfl="http://schemas.microsoft.com/office/word/2024/wordml/sdtformatlock" xmlns:w16se="http://schemas.microsoft.com/office/word/2015/wordml/symex" mc:Ignorable="w14 w15 w16se w16cid w16 w16cex w16sdtdh w16sdtfl w16du">
   <w:docDefaults>
     <w:rPrDefault>
       <w:rPr>

</xml_diff>

<commit_message>
Updating the simple epidemiological model
</commit_message>
<xml_diff>
--- a/Phil_Trans_MS_v2.docx
+++ b/Phil_Trans_MS_v2.docx
@@ -7674,6 +7674,12 @@
         <w:rPr>
           <w:rFonts w:eastAsiaTheme="minorEastAsia"/>
         </w:rPr>
+        <w:t>A</w:t>
+      </w:r>
+      <w:r>
+        <w:rPr>
+          <w:rFonts w:eastAsiaTheme="minorEastAsia"/>
+        </w:rPr>
         <w:t xml:space="preserve"> shows the ESS </w:t>
       </w:r>
       <w:r>
@@ -7712,7 +7718,27 @@
         <w:rPr>
           <w:rFonts w:eastAsiaTheme="minorEastAsia"/>
         </w:rPr>
-        <w:t xml:space="preserve">, as the probability of clearance increases, for different recovery rates, </w:t>
+        <w:t xml:space="preserve">, as the probability of clearance </w:t>
+      </w:r>
+      <m:oMath>
+        <m:r>
+          <w:rPr>
+            <w:rFonts w:ascii="Cambria Math" w:eastAsiaTheme="minorEastAsia" w:hAnsi="Cambria Math"/>
+          </w:rPr>
+          <m:t>p</m:t>
+        </m:r>
+      </m:oMath>
+      <w:r>
+        <w:rPr>
+          <w:rFonts w:eastAsiaTheme="minorEastAsia"/>
+        </w:rPr>
+        <w:t xml:space="preserve"> </w:t>
+      </w:r>
+      <w:r>
+        <w:rPr>
+          <w:rFonts w:eastAsiaTheme="minorEastAsia"/>
+        </w:rPr>
+        <w:t xml:space="preserve">increases, for different recovery rates, </w:t>
       </w:r>
       <m:oMath>
         <m:r>
@@ -7726,7 +7752,45 @@
         <w:rPr>
           <w:rFonts w:eastAsiaTheme="minorEastAsia"/>
         </w:rPr>
-        <w:t xml:space="preserve">. What this figure reveals is that the ESS virulence declines very quickly as the probability of clearance declines, and then is relatively stable over a wide range of </w:t>
+        <w:t xml:space="preserve">. </w:t>
+      </w:r>
+      <w:r>
+        <w:rPr>
+          <w:rFonts w:eastAsiaTheme="minorEastAsia"/>
+        </w:rPr>
+        <w:t xml:space="preserve">Fig. 5B shows the ESS virulence as the recovery rate increases for </w:t>
+      </w:r>
+      <m:oMath>
+        <m:r>
+          <w:rPr>
+            <w:rFonts w:ascii="Cambria Math" w:eastAsiaTheme="minorEastAsia" w:hAnsi="Cambria Math"/>
+          </w:rPr>
+          <m:t>p</m:t>
+        </m:r>
+        <m:r>
+          <w:rPr>
+            <w:rFonts w:ascii="Cambria Math" w:eastAsiaTheme="minorEastAsia" w:hAnsi="Cambria Math"/>
+          </w:rPr>
+          <m:t>=1</m:t>
+        </m:r>
+      </m:oMath>
+      <w:r>
+        <w:rPr>
+          <w:rFonts w:eastAsiaTheme="minorEastAsia"/>
+        </w:rPr>
+        <w:t xml:space="preserve">. Fig. 5B thus shows the classic virulence evolution prediction for a simple SIS model with a fixed recovery rate. Fig. 5A shows that </w:t>
+      </w:r>
+      <w:r>
+        <w:rPr>
+          <w:rFonts w:eastAsiaTheme="minorEastAsia"/>
+        </w:rPr>
+        <w:t xml:space="preserve">the ESS virulence </w:t>
+      </w:r>
+      <w:r>
+        <w:rPr>
+          <w:rFonts w:eastAsiaTheme="minorEastAsia"/>
+        </w:rPr>
+        <w:t xml:space="preserve">is very low when the probability of an acute infection is low; it remains low for a wide range of </w:t>
       </w:r>
       <m:oMath>
         <m:r>
@@ -7740,8 +7804,100 @@
         <w:rPr>
           <w:rFonts w:eastAsiaTheme="minorEastAsia"/>
         </w:rPr>
-        <w:t xml:space="preserve"> values. </w:t>
-      </w:r>
+        <w:t xml:space="preserve"> values</w:t>
+      </w:r>
+      <w:r>
+        <w:rPr>
+          <w:rFonts w:eastAsiaTheme="minorEastAsia"/>
+        </w:rPr>
+        <w:t xml:space="preserve"> and then accelerates to high virulence when the probability of an acute infection is high</w:t>
+      </w:r>
+      <w:r>
+        <w:rPr>
+          <w:rFonts w:eastAsiaTheme="minorEastAsia"/>
+        </w:rPr>
+        <w:t>.</w:t>
+      </w:r>
+      <w:r>
+        <w:rPr>
+          <w:rFonts w:eastAsiaTheme="minorEastAsia"/>
+        </w:rPr>
+        <w:t xml:space="preserve"> Note that this pattern closely mirrors the pattern observed in Fig. 3, but does not mirror the pattern shown in Fig. 5B. In Fig. 5B, when all infections are acute, increasing the recovery rate causes virulence to increase rapidly. Thus, increasing the probability of an acute infection does not have the same evolutionary effect as increasing the recovery rate.</w:t>
+      </w:r>
+      <w:r>
+        <w:rPr>
+          <w:rFonts w:eastAsiaTheme="minorEastAsia"/>
+        </w:rPr>
+        <w:t xml:space="preserve"> </w:t>
+      </w:r>
+    </w:p>
+    <w:p>
+      <w:pPr>
+        <w:rPr>
+          <w:rFonts w:eastAsiaTheme="minorEastAsia"/>
+        </w:rPr>
+      </w:pPr>
+    </w:p>
+    <w:p>
+      <w:pPr>
+        <w:rPr>
+          <w:rFonts w:eastAsiaTheme="minorEastAsia"/>
+          <w:b/>
+          <w:bCs/>
+        </w:rPr>
+      </w:pPr>
+      <w:r>
+        <w:rPr>
+          <w:rFonts w:eastAsiaTheme="minorEastAsia"/>
+          <w:b/>
+          <w:bCs/>
+        </w:rPr>
+        <w:t>Discussion</w:t>
+      </w:r>
+    </w:p>
+    <w:p>
+      <w:r>
+        <w:t>Classic epidemiological theory assumes that recovery rates are fixed, rather than depending on the time since an infection began. It also assumes that every infect</w:t>
+      </w:r>
+      <w:r>
+        <w:t xml:space="preserve">ed individual has an identical recovery rate. </w:t>
+      </w:r>
+      <w:r>
+        <w:t>These assumptions lead to the classic compartmental model of epidemiology that ignores within-host interactions between parasites and the immune system. This modeling framework has been foundational to predicting the epidemiological and evolutionary dynamics of infectious diseases. However, n</w:t>
+      </w:r>
+      <w:r>
+        <w:t xml:space="preserve">either of these assumptions are met by natural infections, where the probability of </w:t>
+      </w:r>
+      <w:r>
+        <w:lastRenderedPageBreak/>
+        <w:t xml:space="preserve">recovery depends on the time since infection and on the immune system of the infected </w:t>
+      </w:r>
+      <w:r>
+        <w:t xml:space="preserve">individual. Thus it is unclear whether classical predictions from virulence evolution theory will be met when we allow for variation in immunity among individuals and for infection outcomes to depend on the within-host </w:t>
+      </w:r>
+      <w:r>
+        <w:t xml:space="preserve">dynamics of immunity and parasite growth. Here, we utilize an individual-based model to nest a simple, mechanistic model of Th1 and Th2 immunity into an epidemiological model. We show that the immunological landscape, that is, the variation in immunity that exists among the host population, shapes both the evolutionary and epidemiological dynamics of parasites. </w:t>
+      </w:r>
+      <w:r>
+        <w:t xml:space="preserve">We show that, when the immunological landscape is Th1-biased, so that chronic infections are more likely, the parasite evolves towards lower virulence, further lowering the probability of clearance and extending infection durations (Fig. </w:t>
+      </w:r>
+      <w:r>
+        <w:t xml:space="preserve">2-4). On the other hand, when the immunological landscape is Th2-biased, so that acute infections are more likely, the parasite evolves towards higher virulence, increasing parasite biomass and transmission rate (Fig. 2-4). </w:t>
+      </w:r>
+    </w:p>
+    <w:p/>
+    <w:p>
+      <w:r>
+        <w:t xml:space="preserve">These results mirror a simple prediction of classic evolutionary epidemiology: as the clearance rate increases, virulence is expected to increase. However, our novel model lends new insight and nuance to this simple prediction. </w:t>
+      </w:r>
+    </w:p>
+    <w:p/>
+    <w:p>
+      <w:pPr>
+        <w:rPr>
+          <w:rFonts w:eastAsiaTheme="minorEastAsia"/>
+        </w:rPr>
+      </w:pPr>
       <w:commentRangeStart w:id="312"/>
       <w:commentRangeStart w:id="313"/>
       <w:r>
@@ -7771,66 +7927,7 @@
         <w:commentReference w:id="313"/>
       </w:r>
     </w:p>
-    <w:p>
-      <w:pPr>
-        <w:rPr>
-          <w:rFonts w:eastAsiaTheme="minorEastAsia"/>
-        </w:rPr>
-      </w:pPr>
-    </w:p>
-    <w:p>
-      <w:pPr>
-        <w:rPr>
-          <w:rFonts w:eastAsiaTheme="minorEastAsia"/>
-          <w:b/>
-          <w:bCs/>
-        </w:rPr>
-      </w:pPr>
-      <w:r>
-        <w:rPr>
-          <w:rFonts w:eastAsiaTheme="minorEastAsia"/>
-          <w:b/>
-          <w:bCs/>
-        </w:rPr>
-        <w:t>Discussion</w:t>
-      </w:r>
-    </w:p>
-    <w:p>
-      <w:r>
-        <w:t>Classic epidemiological theory assumes that recovery rates are fixed, rather than depending on the time since an infection began. It also assumes that every infect</w:t>
-      </w:r>
-      <w:r>
-        <w:t xml:space="preserve">ed individual has an identical recovery rate. </w:t>
-      </w:r>
-      <w:r>
-        <w:t>These assumptions lead to the classic compartmental model of epidemiology that ignores within-host interactions between parasites and the immune system. This modeling framework has been foundational to predicting the epidemiological and evolutionary dynamics of infectious diseases. However, n</w:t>
-      </w:r>
-      <w:r>
-        <w:t xml:space="preserve">either of these assumptions are met by natural infections, where the probability of recovery depends on the time since infection and on the immune system of the infected </w:t>
-      </w:r>
-      <w:r>
-        <w:t xml:space="preserve">individual. Thus it is unclear whether classical predictions from virulence evolution theory will be met when we allow for variation in immunity among individuals and for infection outcomes to depend on the within-host </w:t>
-      </w:r>
-      <w:r>
-        <w:t xml:space="preserve">dynamics of immunity and parasite growth. Here, </w:t>
-      </w:r>
-      <w:r>
-        <w:lastRenderedPageBreak/>
-        <w:t xml:space="preserve">we utilize an individual-based model to nest a simple, mechanistic model of Th1 and Th2 immunity into an epidemiological model. We show that the immunological landscape, that is, the variation in immunity that exists among the host population, shapes both the evolutionary and epidemiological dynamics of parasites. </w:t>
-      </w:r>
-      <w:r>
-        <w:t xml:space="preserve">We show that, when the immunological landscape is Th1-biased, so that chronic infections are more likely, the parasite evolves towards lower virulence, further lowering the probability of clearance and extending infection durations (Fig. </w:t>
-      </w:r>
-      <w:r>
-        <w:t xml:space="preserve">2-4). On the other hand, when the immunological landscape is Th2-biased, so that acute infections are more likely, the parasite evolves towards higher virulence, increasing parasite biomass and transmission rate (Fig. 2-4). </w:t>
-      </w:r>
-    </w:p>
     <w:p/>
-    <w:p>
-      <w:r>
-        <w:t xml:space="preserve">These results mirror a simple prediction of classic evolutionary epidemiology: as the clearance rate increases, virulence is expected to increase. However, our novel model lends new insight and nuance to this simple prediction. </w:t>
-      </w:r>
-    </w:p>
     <w:p/>
     <w:p>
       <w:r>
@@ -7870,6 +7967,7 @@
         <w:rPr>
           <w:rFonts w:eastAsiaTheme="minorEastAsia"/>
         </w:rPr>
+        <w:lastRenderedPageBreak/>
         <w:t>I have lots of ideas here, but I would love to hear your thoughts independently to see what aspects of these results you found the most interesting</w:t>
       </w:r>
       <w:r>
@@ -7893,6 +7991,7 @@
         <w:rPr>
           <w:noProof/>
         </w:rPr>
+        <w:lastRenderedPageBreak/>
         <w:drawing>
           <wp:inline distT="0" distB="0" distL="0" distR="0" wp14:anchorId="3C7B0039" wp14:editId="3C70B799">
             <wp:extent cx="4572009" cy="6400813"/>
@@ -7939,6 +8038,12 @@
     <w:p>
       <w:r>
         <w:t>Figure 1.</w:t>
+      </w:r>
+      <w:r>
+        <w:t xml:space="preserve"> Outcomes of the deterministic (A) and stochastic (B) version of the within-host model as the initial number of Th2 cells and the initial parasite biomass vary. For the parameter values in Table 1, the deterministic model has three multistable equilibria representing a Th1-biased immune response and a chronic, high biomass parasite</w:t>
+      </w:r>
+      <w:r>
+        <w:t xml:space="preserve"> (red); a Th2-biased immune response and zero parasite biomass (blue); and an immune response with high Th1 and high Th2 and a low, but non-zero, parasite biomass (grey). In the stochastic model, this last equilibrium is not observed and instead the probability of reaching the Th1-biased or Th2-biased equilibrium depends on the initial conditions.</w:t>
       </w:r>
     </w:p>
     <w:p>
@@ -7994,6 +8099,9 @@
       <w:r>
         <w:t>Figure 2.</w:t>
       </w:r>
+      <w:r>
+        <w:t xml:space="preserve"> Eco-evolutionary equilibrium prevalence as the minimum number of Th2 cells upon infection varies. Low minimum Th2 leads to a highly Th1-biased immune landscape, whereas high minimum Th2 leads to a highly Th2-biased immune landscape. The right panel shows that prevalence is high in Th1-biased landscapes, but drops quickly as Th2-bias increases. The left panels show the observed eco-evolutionary dynamics of prevalence in each stochastic replicate (gray lines) and the mean across replicates (solid line) for low (blue), moderate (orange), and high (green) minimum Th2. Red lines show the dynamics of replicates where the epidemic faded out.</w:t>
+      </w:r>
     </w:p>
     <w:p/>
     <w:p/>
@@ -8050,7 +8158,45 @@
       <w:r>
         <w:t>Figure 3.</w:t>
       </w:r>
+      <w:r>
+        <w:t xml:space="preserve"> </w:t>
+      </w:r>
+      <w:r>
+        <w:t xml:space="preserve">Eco-evolutionary </w:t>
+      </w:r>
+      <w:r>
+        <w:t>equilibrium prevalence</w:t>
+      </w:r>
+      <w:r>
+        <w:t xml:space="preserve"> as the minimum number of Th2 cells upon infection varies. The right panel shows that </w:t>
+      </w:r>
+      <w:r>
+        <w:t>virulence</w:t>
+      </w:r>
+      <w:r>
+        <w:t xml:space="preserve"> is </w:t>
+      </w:r>
+      <w:r>
+        <w:t>low</w:t>
+      </w:r>
+      <w:r>
+        <w:t xml:space="preserve"> in Th1-biased landscapes, but </w:t>
+      </w:r>
+      <w:r>
+        <w:t>increases rapidly as</w:t>
+      </w:r>
+      <w:r>
+        <w:t xml:space="preserve"> Th2-bias increases. The left panels show the observed eco-evolutionary dynamics of </w:t>
+      </w:r>
+      <w:r>
+        <w:t>virulence</w:t>
+      </w:r>
+      <w:r>
+        <w:t xml:space="preserve"> in each stochastic replicate (gray lines) and the mean across replicates (solid line) for low (blue), moderate (orange), and high (green) minimum Th2.</w:t>
+      </w:r>
     </w:p>
+    <w:p/>
+    <w:p/>
     <w:p/>
     <w:p/>
     <w:p>
@@ -8106,6 +8252,12 @@
       <w:r>
         <w:t>Figure 4.</w:t>
       </w:r>
+      <w:r>
+        <w:t xml:space="preserve"> Components of parasite fitness as the immune landscape shifts from Th1-biased (red lines; low minimum Th2 cells) to Th2-biased (blue lines; high minimum Th2 cells), for infections starting at different times</w:t>
+      </w:r>
+      <w:r>
+        <w:t>. This shows how parasite virulence evolution is affecting the different components of parasite fitness (clearance probability [A], infection duration [B], and peak parasite biomass [C]).</w:t>
+      </w:r>
     </w:p>
     <w:p/>
     <w:p>
@@ -8113,11 +8265,12 @@
         <w:rPr>
           <w:noProof/>
         </w:rPr>
+        <w:lastRenderedPageBreak/>
         <w:drawing>
-          <wp:inline distT="0" distB="0" distL="0" distR="0" wp14:anchorId="24D0E2DC" wp14:editId="20653361">
-            <wp:extent cx="3657607" cy="3657607"/>
+          <wp:inline distT="0" distB="0" distL="0" distR="0" wp14:anchorId="36444A2D" wp14:editId="1752A5FB">
+            <wp:extent cx="5486411" cy="3657607"/>
             <wp:effectExtent l="0" t="0" r="0" b="0"/>
-            <wp:docPr id="67862041" name="Picture 2"/>
+            <wp:docPr id="1946897876" name="Picture 4"/>
             <wp:cNvGraphicFramePr>
               <a:graphicFrameLocks xmlns:a="http://schemas.openxmlformats.org/drawingml/2006/main" noChangeAspect="1"/>
             </wp:cNvGraphicFramePr>
@@ -8125,7 +8278,7 @@
               <a:graphicData uri="http://schemas.openxmlformats.org/drawingml/2006/picture">
                 <pic:pic xmlns:pic="http://schemas.openxmlformats.org/drawingml/2006/picture">
                   <pic:nvPicPr>
-                    <pic:cNvPr id="67862041" name="Picture 67862041"/>
+                    <pic:cNvPr id="1946897876" name="Picture 1946897876"/>
                     <pic:cNvPicPr/>
                   </pic:nvPicPr>
                   <pic:blipFill>
@@ -8143,7 +8296,7 @@
                   <pic:spPr>
                     <a:xfrm>
                       <a:off x="0" y="0"/>
-                      <a:ext cx="3657607" cy="3657607"/>
+                      <a:ext cx="5486411" cy="3657607"/>
                     </a:xfrm>
                     <a:prstGeom prst="rect">
                       <a:avLst/>
@@ -8156,95 +8309,119 @@
         </w:drawing>
       </w:r>
     </w:p>
+    <w:p/>
     <w:p>
       <w:r>
         <w:t>Figure 5.</w:t>
+      </w:r>
+      <w:r>
+        <w:t xml:space="preserve"> Evolutionarily stable </w:t>
+      </w:r>
+      <w:r>
+        <w:t>virulence strategies</w:t>
+      </w:r>
+      <w:r>
+        <w:t xml:space="preserve"> for</w:t>
+      </w:r>
+      <w:r>
+        <w:t xml:space="preserve"> epidemiological model (3). (A) Evolutionary stable virulence as the probability of clearance, </w:t>
+      </w:r>
+      <m:oMath>
+        <m:r>
+          <w:rPr>
+            <w:rFonts w:ascii="Cambria Math" w:hAnsi="Cambria Math"/>
+          </w:rPr>
+          <m:t>p</m:t>
+        </m:r>
+      </m:oMath>
+      <w:r>
+        <w:t xml:space="preserve">, increases for different values of the recovery rate </w:t>
+      </w:r>
+      <m:oMath>
+        <m:r>
+          <w:rPr>
+            <w:rFonts w:ascii="Cambria Math" w:hAnsi="Cambria Math"/>
+          </w:rPr>
+          <m:t>γ</m:t>
+        </m:r>
+      </m:oMath>
+      <w:r>
+        <w:rPr>
+          <w:rFonts w:eastAsiaTheme="minorEastAsia"/>
+        </w:rPr>
+        <w:t xml:space="preserve">. (B) Evolutionarily stable virulence as the clearance rate increases when the probability of clearance is fixed at </w:t>
+      </w:r>
+      <m:oMath>
+        <m:r>
+          <w:rPr>
+            <w:rFonts w:ascii="Cambria Math" w:eastAsiaTheme="minorEastAsia" w:hAnsi="Cambria Math"/>
+          </w:rPr>
+          <m:t>p=1.</m:t>
+        </m:r>
+      </m:oMath>
+      <w:r>
+        <w:rPr>
+          <w:rFonts w:eastAsiaTheme="minorEastAsia"/>
+        </w:rPr>
+        <w:t xml:space="preserve"> Baseline parameters for epidemiological model (3) are </w:t>
+      </w:r>
+      <m:oMath>
+        <m:r>
+          <w:rPr>
+            <w:rFonts w:ascii="Cambria Math" w:eastAsiaTheme="minorEastAsia" w:hAnsi="Cambria Math"/>
+          </w:rPr>
+          <m:t>h=0.1</m:t>
+        </m:r>
+      </m:oMath>
+      <w:r>
+        <w:rPr>
+          <w:rFonts w:eastAsiaTheme="minorEastAsia"/>
+        </w:rPr>
+        <w:t xml:space="preserve"> and </w:t>
+      </w:r>
+      <m:oMath>
+        <m:r>
+          <w:rPr>
+            <w:rFonts w:ascii="Cambria Math" w:eastAsiaTheme="minorEastAsia" w:hAnsi="Cambria Math"/>
+          </w:rPr>
+          <m:t>μ=3.65×</m:t>
+        </m:r>
+        <m:sSup>
+          <m:sSupPr>
+            <m:ctrlPr>
+              <w:rPr>
+                <w:rFonts w:ascii="Cambria Math" w:eastAsiaTheme="minorEastAsia" w:hAnsi="Cambria Math"/>
+                <w:i/>
+              </w:rPr>
+            </m:ctrlPr>
+          </m:sSupPr>
+          <m:e>
+            <m:r>
+              <w:rPr>
+                <w:rFonts w:ascii="Cambria Math" w:eastAsiaTheme="minorEastAsia" w:hAnsi="Cambria Math"/>
+              </w:rPr>
+              <m:t>10</m:t>
+            </m:r>
+          </m:e>
+          <m:sup>
+            <m:r>
+              <w:rPr>
+                <w:rFonts w:ascii="Cambria Math" w:eastAsiaTheme="minorEastAsia" w:hAnsi="Cambria Math"/>
+              </w:rPr>
+              <m:t>-5</m:t>
+            </m:r>
+          </m:sup>
+        </m:sSup>
+      </m:oMath>
+      <w:r>
+        <w:rPr>
+          <w:rFonts w:eastAsiaTheme="minorEastAsia"/>
+        </w:rPr>
+        <w:t xml:space="preserve"> (see Supplementary Information for more details).</w:t>
       </w:r>
     </w:p>
     <w:p/>
     <w:p>
-      <w:pPr>
-        <w:rPr>
-          <w:ins w:id="314" w:author="Clay Cressler [2]" w:date="2026-05-31T16:56:00Z" w16du:dateUtc="2026-05-31T21:56:00Z"/>
-        </w:rPr>
-      </w:pPr>
-    </w:p>
-    <w:p>
-      <w:pPr>
-        <w:rPr>
-          <w:ins w:id="315" w:author="Clay Cressler [2]" w:date="2026-05-31T16:57:00Z" w16du:dateUtc="2026-05-31T21:57:00Z"/>
-        </w:rPr>
-      </w:pPr>
-      <w:ins w:id="316" w:author="Clay Cressler [2]" w:date="2026-05-31T16:57:00Z" w16du:dateUtc="2026-05-31T21:57:00Z">
-        <w:r>
-          <w:rPr>
-            <w:noProof/>
-          </w:rPr>
-          <w:drawing>
-            <wp:inline distT="0" distB="0" distL="0" distR="0" wp14:anchorId="34C9E446" wp14:editId="5B0DD351">
-              <wp:extent cx="5915465" cy="3549279"/>
-              <wp:effectExtent l="0" t="0" r="9525" b="0"/>
-              <wp:docPr id="243947344" name="Picture 1"/>
-              <wp:cNvGraphicFramePr>
-                <a:graphicFrameLocks xmlns:a="http://schemas.openxmlformats.org/drawingml/2006/main" noChangeAspect="1"/>
-              </wp:cNvGraphicFramePr>
-              <a:graphic xmlns:a="http://schemas.openxmlformats.org/drawingml/2006/main">
-                <a:graphicData uri="http://schemas.openxmlformats.org/drawingml/2006/picture">
-                  <pic:pic xmlns:pic="http://schemas.openxmlformats.org/drawingml/2006/picture">
-                    <pic:nvPicPr>
-                      <pic:cNvPr id="243947344" name="Picture 243947344"/>
-                      <pic:cNvPicPr/>
-                    </pic:nvPicPr>
-                    <pic:blipFill>
-                      <a:blip r:embed="rId14" cstate="print">
-                        <a:extLst>
-                          <a:ext uri="{28A0092B-C50C-407E-A947-70E740481C1C}">
-                            <a14:useLocalDpi xmlns:a14="http://schemas.microsoft.com/office/drawing/2010/main" val="0"/>
-                          </a:ext>
-                        </a:extLst>
-                      </a:blip>
-                      <a:stretch>
-                        <a:fillRect/>
-                      </a:stretch>
-                    </pic:blipFill>
-                    <pic:spPr>
-                      <a:xfrm>
-                        <a:off x="0" y="0"/>
-                        <a:ext cx="5925292" cy="3555175"/>
-                      </a:xfrm>
-                      <a:prstGeom prst="rect">
-                        <a:avLst/>
-                      </a:prstGeom>
-                    </pic:spPr>
-                  </pic:pic>
-                </a:graphicData>
-              </a:graphic>
-            </wp:inline>
-          </w:drawing>
-        </w:r>
-      </w:ins>
-    </w:p>
-    <w:p>
-      <w:pPr>
-        <w:rPr>
-          <w:ins w:id="317" w:author="Clay Cressler [2]" w:date="2026-05-31T16:57:00Z" w16du:dateUtc="2026-05-31T21:57:00Z"/>
-        </w:rPr>
-      </w:pPr>
-      <w:ins w:id="318" w:author="Clay Cressler [2]" w:date="2026-05-31T16:57:00Z" w16du:dateUtc="2026-05-31T21:57:00Z">
-        <w:r>
-          <w:t>Supplementary Figure S1.</w:t>
-        </w:r>
-      </w:ins>
-    </w:p>
-    <w:p>
-      <w:pPr>
-        <w:rPr>
-          <w:ins w:id="319" w:author="Clay Cressler [2]" w:date="2026-05-31T16:57:00Z" w16du:dateUtc="2026-05-31T21:57:00Z"/>
-        </w:rPr>
-      </w:pPr>
-    </w:p>
-    <w:p/>
-    <w:p>
       <w:r>
         <w:t>Table 1</w:t>
       </w:r>
@@ -8252,7 +8429,13 @@
         <w:t>:</w:t>
       </w:r>
       <w:r>
-        <w:t xml:space="preserve"> Model parameters</w:t>
+        <w:t xml:space="preserve"> </w:t>
+      </w:r>
+      <w:r>
+        <w:t>M</w:t>
+      </w:r>
+      <w:r>
+        <w:t>odel parameters</w:t>
       </w:r>
     </w:p>
     <w:tbl>
@@ -9168,7 +9351,6 @@
                   <w:rPr>
                     <w:rFonts w:ascii="Cambria Math" w:hAnsi="Cambria Math"/>
                   </w:rPr>
-                  <w:lastRenderedPageBreak/>
                   <m:t>r</m:t>
                 </m:r>
               </m:oMath>
@@ -9715,8 +9897,4313 @@
       </w:tr>
     </w:tbl>
     <w:p/>
+    <w:p>
+      <w:pPr>
+        <w:rPr>
+          <w:b/>
+          <w:bCs/>
+        </w:rPr>
+      </w:pPr>
+      <w:r>
+        <w:rPr>
+          <w:b/>
+          <w:bCs/>
+        </w:rPr>
+        <w:t>References</w:t>
+      </w:r>
+    </w:p>
     <w:p/>
+    <w:p>
+      <w:pPr>
+        <w:rPr>
+          <w:b/>
+          <w:bCs/>
+        </w:rPr>
+      </w:pPr>
+      <w:r>
+        <w:rPr>
+          <w:b/>
+          <w:bCs/>
+        </w:rPr>
+        <w:t>Online Supplementary Information</w:t>
+      </w:r>
+    </w:p>
+    <w:p>
+      <w:pPr>
+        <w:rPr>
+          <w:b/>
+          <w:bCs/>
+        </w:rPr>
+      </w:pPr>
+    </w:p>
+    <w:p>
+      <w:pPr>
+        <w:rPr>
+          <w:rFonts w:eastAsiaTheme="minorEastAsia"/>
+        </w:rPr>
+      </w:pPr>
+      <w:r>
+        <w:t>To carry out an adaptive dynamics analysis of the simple epidemiological model (equation 3 in the main text), we first expand the model to consider the dynamics of a resident strain of parasite that causes acute (</w:t>
+      </w:r>
+      <m:oMath>
+        <m:sSub>
+          <m:sSubPr>
+            <m:ctrlPr>
+              <w:rPr>
+                <w:rFonts w:ascii="Cambria Math" w:hAnsi="Cambria Math"/>
+                <w:i/>
+              </w:rPr>
+            </m:ctrlPr>
+          </m:sSubPr>
+          <m:e>
+            <m:r>
+              <w:rPr>
+                <w:rFonts w:ascii="Cambria Math" w:hAnsi="Cambria Math"/>
+              </w:rPr>
+              <m:t>I</m:t>
+            </m:r>
+          </m:e>
+          <m:sub>
+            <m:r>
+              <w:rPr>
+                <w:rFonts w:ascii="Cambria Math" w:hAnsi="Cambria Math"/>
+              </w:rPr>
+              <m:t>a,r</m:t>
+            </m:r>
+          </m:sub>
+        </m:sSub>
+      </m:oMath>
+      <w:r>
+        <w:rPr>
+          <w:rFonts w:eastAsiaTheme="minorEastAsia"/>
+        </w:rPr>
+        <w:t>) and chronic (</w:t>
+      </w:r>
+      <m:oMath>
+        <m:sSub>
+          <m:sSubPr>
+            <m:ctrlPr>
+              <w:rPr>
+                <w:rFonts w:ascii="Cambria Math" w:eastAsiaTheme="minorEastAsia" w:hAnsi="Cambria Math"/>
+                <w:i/>
+              </w:rPr>
+            </m:ctrlPr>
+          </m:sSubPr>
+          <m:e>
+            <m:r>
+              <w:rPr>
+                <w:rFonts w:ascii="Cambria Math" w:eastAsiaTheme="minorEastAsia" w:hAnsi="Cambria Math"/>
+              </w:rPr>
+              <m:t>I</m:t>
+            </m:r>
+          </m:e>
+          <m:sub>
+            <m:r>
+              <w:rPr>
+                <w:rFonts w:ascii="Cambria Math" w:eastAsiaTheme="minorEastAsia" w:hAnsi="Cambria Math"/>
+              </w:rPr>
+              <m:t>c,r</m:t>
+            </m:r>
+          </m:sub>
+        </m:sSub>
+      </m:oMath>
+      <w:r>
+        <w:rPr>
+          <w:rFonts w:eastAsiaTheme="minorEastAsia"/>
+        </w:rPr>
+        <w:t>) infections and a mutant strain of parasite that also causes acute (</w:t>
+      </w:r>
+      <m:oMath>
+        <m:sSub>
+          <m:sSubPr>
+            <m:ctrlPr>
+              <w:rPr>
+                <w:rFonts w:ascii="Cambria Math" w:eastAsiaTheme="minorEastAsia" w:hAnsi="Cambria Math"/>
+                <w:i/>
+              </w:rPr>
+            </m:ctrlPr>
+          </m:sSubPr>
+          <m:e>
+            <m:r>
+              <w:rPr>
+                <w:rFonts w:ascii="Cambria Math" w:eastAsiaTheme="minorEastAsia" w:hAnsi="Cambria Math"/>
+              </w:rPr>
+              <m:t>I</m:t>
+            </m:r>
+          </m:e>
+          <m:sub>
+            <m:r>
+              <w:rPr>
+                <w:rFonts w:ascii="Cambria Math" w:eastAsiaTheme="minorEastAsia" w:hAnsi="Cambria Math"/>
+              </w:rPr>
+              <m:t>a,m</m:t>
+            </m:r>
+          </m:sub>
+        </m:sSub>
+      </m:oMath>
+      <w:r>
+        <w:rPr>
+          <w:rFonts w:eastAsiaTheme="minorEastAsia"/>
+        </w:rPr>
+        <w:t>) and chronic (</w:t>
+      </w:r>
+      <m:oMath>
+        <m:sSub>
+          <m:sSubPr>
+            <m:ctrlPr>
+              <w:rPr>
+                <w:rFonts w:ascii="Cambria Math" w:eastAsiaTheme="minorEastAsia" w:hAnsi="Cambria Math"/>
+                <w:i/>
+              </w:rPr>
+            </m:ctrlPr>
+          </m:sSubPr>
+          <m:e>
+            <m:r>
+              <w:rPr>
+                <w:rFonts w:ascii="Cambria Math" w:eastAsiaTheme="minorEastAsia" w:hAnsi="Cambria Math"/>
+              </w:rPr>
+              <m:t>I</m:t>
+            </m:r>
+          </m:e>
+          <m:sub>
+            <m:r>
+              <w:rPr>
+                <w:rFonts w:ascii="Cambria Math" w:eastAsiaTheme="minorEastAsia" w:hAnsi="Cambria Math"/>
+              </w:rPr>
+              <m:t>c,m</m:t>
+            </m:r>
+          </m:sub>
+        </m:sSub>
+      </m:oMath>
+      <w:r>
+        <w:rPr>
+          <w:rFonts w:eastAsiaTheme="minorEastAsia"/>
+        </w:rPr>
+        <w:t>) infections. The two strains differ in virulence</w:t>
+      </w:r>
+      <w:r>
+        <w:rPr>
+          <w:rFonts w:eastAsiaTheme="minorEastAsia"/>
+        </w:rPr>
+        <w:t xml:space="preserve"> (</w:t>
+      </w:r>
+      <m:oMath>
+        <m:sSub>
+          <m:sSubPr>
+            <m:ctrlPr>
+              <w:rPr>
+                <w:rFonts w:ascii="Cambria Math" w:eastAsiaTheme="minorEastAsia" w:hAnsi="Cambria Math"/>
+                <w:i/>
+              </w:rPr>
+            </m:ctrlPr>
+          </m:sSubPr>
+          <m:e>
+            <m:r>
+              <w:rPr>
+                <w:rFonts w:ascii="Cambria Math" w:eastAsiaTheme="minorEastAsia" w:hAnsi="Cambria Math"/>
+              </w:rPr>
+              <m:t>v</m:t>
+            </m:r>
+          </m:e>
+          <m:sub>
+            <m:r>
+              <w:rPr>
+                <w:rFonts w:ascii="Cambria Math" w:eastAsiaTheme="minorEastAsia" w:hAnsi="Cambria Math"/>
+              </w:rPr>
+              <m:t>r</m:t>
+            </m:r>
+          </m:sub>
+        </m:sSub>
+      </m:oMath>
+      <w:r>
+        <w:rPr>
+          <w:rFonts w:eastAsiaTheme="minorEastAsia"/>
+        </w:rPr>
+        <w:t xml:space="preserve"> and </w:t>
+      </w:r>
+      <m:oMath>
+        <m:sSub>
+          <m:sSubPr>
+            <m:ctrlPr>
+              <w:rPr>
+                <w:rFonts w:ascii="Cambria Math" w:eastAsiaTheme="minorEastAsia" w:hAnsi="Cambria Math"/>
+                <w:i/>
+              </w:rPr>
+            </m:ctrlPr>
+          </m:sSubPr>
+          <m:e>
+            <m:r>
+              <w:rPr>
+                <w:rFonts w:ascii="Cambria Math" w:eastAsiaTheme="minorEastAsia" w:hAnsi="Cambria Math"/>
+              </w:rPr>
+              <m:t>v</m:t>
+            </m:r>
+          </m:e>
+          <m:sub>
+            <m:r>
+              <w:rPr>
+                <w:rFonts w:ascii="Cambria Math" w:eastAsiaTheme="minorEastAsia" w:hAnsi="Cambria Math"/>
+              </w:rPr>
+              <m:t>m</m:t>
+            </m:r>
+          </m:sub>
+        </m:sSub>
+      </m:oMath>
+      <w:r>
+        <w:rPr>
+          <w:rFonts w:eastAsiaTheme="minorEastAsia"/>
+        </w:rPr>
+        <w:t>), which alters their transmission rates according to the function</w:t>
+      </w:r>
+    </w:p>
+    <w:p>
+      <w:pPr>
+        <w:rPr>
+          <w:rFonts w:eastAsiaTheme="minorEastAsia"/>
+        </w:rPr>
+      </w:pPr>
+      <m:oMathPara>
+        <m:oMath>
+          <m:r>
+            <w:rPr>
+              <w:rFonts w:ascii="Cambria Math" w:hAnsi="Cambria Math"/>
+            </w:rPr>
+            <m:t>β</m:t>
+          </m:r>
+          <m:d>
+            <m:dPr>
+              <m:ctrlPr>
+                <w:rPr>
+                  <w:rFonts w:ascii="Cambria Math" w:hAnsi="Cambria Math"/>
+                  <w:i/>
+                </w:rPr>
+              </m:ctrlPr>
+            </m:dPr>
+            <m:e>
+              <m:r>
+                <w:rPr>
+                  <w:rFonts w:ascii="Cambria Math" w:hAnsi="Cambria Math"/>
+                </w:rPr>
+                <m:t>v</m:t>
+              </m:r>
+            </m:e>
+          </m:d>
+          <m:r>
+            <w:rPr>
+              <w:rFonts w:ascii="Cambria Math" w:hAnsi="Cambria Math"/>
+            </w:rPr>
+            <m:t>=</m:t>
+          </m:r>
+          <m:f>
+            <m:fPr>
+              <m:ctrlPr>
+                <w:rPr>
+                  <w:rFonts w:ascii="Cambria Math" w:hAnsi="Cambria Math"/>
+                  <w:i/>
+                </w:rPr>
+              </m:ctrlPr>
+            </m:fPr>
+            <m:num>
+              <m:sSub>
+                <m:sSubPr>
+                  <m:ctrlPr>
+                    <w:rPr>
+                      <w:rFonts w:ascii="Cambria Math" w:hAnsi="Cambria Math"/>
+                      <w:i/>
+                    </w:rPr>
+                  </m:ctrlPr>
+                </m:sSubPr>
+                <m:e>
+                  <m:r>
+                    <w:rPr>
+                      <w:rFonts w:ascii="Cambria Math" w:hAnsi="Cambria Math"/>
+                    </w:rPr>
+                    <m:t>β</m:t>
+                  </m:r>
+                </m:e>
+                <m:sub>
+                  <m:r>
+                    <w:rPr>
+                      <w:rFonts w:ascii="Cambria Math" w:hAnsi="Cambria Math"/>
+                    </w:rPr>
+                    <m:t>0</m:t>
+                  </m:r>
+                </m:sub>
+              </m:sSub>
+              <m:r>
+                <w:rPr>
+                  <w:rFonts w:ascii="Cambria Math" w:hAnsi="Cambria Math"/>
+                </w:rPr>
+                <m:t>v</m:t>
+              </m:r>
+            </m:num>
+            <m:den>
+              <m:r>
+                <w:rPr>
+                  <w:rFonts w:ascii="Cambria Math" w:hAnsi="Cambria Math"/>
+                </w:rPr>
+                <m:t>h+v</m:t>
+              </m:r>
+            </m:den>
+          </m:f>
+          <m:r>
+            <w:rPr>
+              <w:rFonts w:ascii="Cambria Math" w:eastAsiaTheme="minorEastAsia" w:hAnsi="Cambria Math"/>
+            </w:rPr>
+            <m:t>.</m:t>
+          </m:r>
+        </m:oMath>
+      </m:oMathPara>
+    </w:p>
+    <w:p>
+      <w:pPr>
+        <w:rPr>
+          <w:rFonts w:eastAsiaTheme="minorEastAsia"/>
+        </w:rPr>
+      </w:pPr>
+    </w:p>
+    <w:p>
+      <w:r>
+        <w:rPr>
+          <w:rFonts w:eastAsiaTheme="minorEastAsia"/>
+        </w:rPr>
+        <w:t xml:space="preserve">Thus the model is </w:t>
+      </w:r>
+    </w:p>
     <w:p/>
+    <w:p>
+      <w:pPr>
+        <w:rPr>
+          <w:rFonts w:eastAsiaTheme="minorEastAsia"/>
+          <w:iCs/>
+        </w:rPr>
+      </w:pPr>
+      <m:oMathPara>
+        <m:oMath>
+          <m:f>
+            <m:fPr>
+              <m:ctrlPr>
+                <w:rPr>
+                  <w:rFonts w:ascii="Cambria Math" w:hAnsi="Cambria Math"/>
+                  <w:i/>
+                  <w:iCs/>
+                </w:rPr>
+              </m:ctrlPr>
+            </m:fPr>
+            <m:num>
+              <m:r>
+                <w:rPr>
+                  <w:rFonts w:ascii="Cambria Math" w:hAnsi="Cambria Math"/>
+                </w:rPr>
+                <m:t>dS</m:t>
+              </m:r>
+            </m:num>
+            <m:den>
+              <m:r>
+                <w:rPr>
+                  <w:rFonts w:ascii="Cambria Math" w:hAnsi="Cambria Math"/>
+                </w:rPr>
+                <m:t>dt</m:t>
+              </m:r>
+            </m:den>
+          </m:f>
+          <m:r>
+            <w:rPr>
+              <w:rFonts w:ascii="Cambria Math" w:hAnsi="Cambria Math"/>
+            </w:rPr>
+            <m:t>=b</m:t>
+          </m:r>
+          <m:d>
+            <m:dPr>
+              <m:ctrlPr>
+                <w:rPr>
+                  <w:rFonts w:ascii="Cambria Math" w:hAnsi="Cambria Math"/>
+                  <w:i/>
+                  <w:iCs/>
+                </w:rPr>
+              </m:ctrlPr>
+            </m:dPr>
+            <m:e>
+              <m:r>
+                <w:rPr>
+                  <w:rFonts w:ascii="Cambria Math" w:hAnsi="Cambria Math"/>
+                </w:rPr>
+                <m:t>S+</m:t>
+              </m:r>
+              <m:sSub>
+                <m:sSubPr>
+                  <m:ctrlPr>
+                    <w:rPr>
+                      <w:rFonts w:ascii="Cambria Math" w:hAnsi="Cambria Math"/>
+                      <w:i/>
+                    </w:rPr>
+                  </m:ctrlPr>
+                </m:sSubPr>
+                <m:e>
+                  <m:r>
+                    <w:rPr>
+                      <w:rFonts w:ascii="Cambria Math" w:hAnsi="Cambria Math"/>
+                    </w:rPr>
+                    <m:t>I</m:t>
+                  </m:r>
+                </m:e>
+                <m:sub>
+                  <m:r>
+                    <w:rPr>
+                      <w:rFonts w:ascii="Cambria Math" w:hAnsi="Cambria Math"/>
+                    </w:rPr>
+                    <m:t>a</m:t>
+                  </m:r>
+                  <m:r>
+                    <w:rPr>
+                      <w:rFonts w:ascii="Cambria Math" w:hAnsi="Cambria Math"/>
+                    </w:rPr>
+                    <m:t>,r</m:t>
+                  </m:r>
+                </m:sub>
+              </m:sSub>
+              <m:r>
+                <w:rPr>
+                  <w:rFonts w:ascii="Cambria Math" w:hAnsi="Cambria Math"/>
+                </w:rPr>
+                <m:t>+</m:t>
+              </m:r>
+              <m:sSub>
+                <m:sSubPr>
+                  <m:ctrlPr>
+                    <w:rPr>
+                      <w:rFonts w:ascii="Cambria Math" w:hAnsi="Cambria Math"/>
+                      <w:i/>
+                    </w:rPr>
+                  </m:ctrlPr>
+                </m:sSubPr>
+                <m:e>
+                  <m:r>
+                    <w:rPr>
+                      <w:rFonts w:ascii="Cambria Math" w:hAnsi="Cambria Math"/>
+                    </w:rPr>
+                    <m:t>I</m:t>
+                  </m:r>
+                </m:e>
+                <m:sub>
+                  <m:r>
+                    <w:rPr>
+                      <w:rFonts w:ascii="Cambria Math" w:hAnsi="Cambria Math"/>
+                    </w:rPr>
+                    <m:t>c</m:t>
+                  </m:r>
+                  <m:r>
+                    <w:rPr>
+                      <w:rFonts w:ascii="Cambria Math" w:hAnsi="Cambria Math"/>
+                    </w:rPr>
+                    <m:t>,r</m:t>
+                  </m:r>
+                </m:sub>
+              </m:sSub>
+              <m:r>
+                <w:rPr>
+                  <w:rFonts w:ascii="Cambria Math" w:hAnsi="Cambria Math"/>
+                </w:rPr>
+                <m:t>+</m:t>
+              </m:r>
+              <m:sSub>
+                <m:sSubPr>
+                  <m:ctrlPr>
+                    <w:rPr>
+                      <w:rFonts w:ascii="Cambria Math" w:hAnsi="Cambria Math"/>
+                      <w:i/>
+                    </w:rPr>
+                  </m:ctrlPr>
+                </m:sSubPr>
+                <m:e>
+                  <m:r>
+                    <w:rPr>
+                      <w:rFonts w:ascii="Cambria Math" w:hAnsi="Cambria Math"/>
+                    </w:rPr>
+                    <m:t>I</m:t>
+                  </m:r>
+                </m:e>
+                <m:sub>
+                  <m:r>
+                    <w:rPr>
+                      <w:rFonts w:ascii="Cambria Math" w:hAnsi="Cambria Math"/>
+                    </w:rPr>
+                    <m:t>a,</m:t>
+                  </m:r>
+                  <m:r>
+                    <w:rPr>
+                      <w:rFonts w:ascii="Cambria Math" w:hAnsi="Cambria Math"/>
+                    </w:rPr>
+                    <m:t>m</m:t>
+                  </m:r>
+                </m:sub>
+              </m:sSub>
+              <m:r>
+                <w:rPr>
+                  <w:rFonts w:ascii="Cambria Math" w:hAnsi="Cambria Math"/>
+                </w:rPr>
+                <m:t>+</m:t>
+              </m:r>
+              <m:sSub>
+                <m:sSubPr>
+                  <m:ctrlPr>
+                    <w:rPr>
+                      <w:rFonts w:ascii="Cambria Math" w:hAnsi="Cambria Math"/>
+                      <w:i/>
+                    </w:rPr>
+                  </m:ctrlPr>
+                </m:sSubPr>
+                <m:e>
+                  <m:r>
+                    <w:rPr>
+                      <w:rFonts w:ascii="Cambria Math" w:hAnsi="Cambria Math"/>
+                    </w:rPr>
+                    <m:t>I</m:t>
+                  </m:r>
+                </m:e>
+                <m:sub>
+                  <m:r>
+                    <w:rPr>
+                      <w:rFonts w:ascii="Cambria Math" w:hAnsi="Cambria Math"/>
+                    </w:rPr>
+                    <m:t>c,</m:t>
+                  </m:r>
+                  <m:r>
+                    <w:rPr>
+                      <w:rFonts w:ascii="Cambria Math" w:hAnsi="Cambria Math"/>
+                    </w:rPr>
+                    <m:t>m</m:t>
+                  </m:r>
+                </m:sub>
+              </m:sSub>
+            </m:e>
+          </m:d>
+          <m:d>
+            <m:dPr>
+              <m:ctrlPr>
+                <w:rPr>
+                  <w:rFonts w:ascii="Cambria Math" w:hAnsi="Cambria Math"/>
+                  <w:i/>
+                  <w:iCs/>
+                </w:rPr>
+              </m:ctrlPr>
+            </m:dPr>
+            <m:e>
+              <m:r>
+                <w:rPr>
+                  <w:rFonts w:ascii="Cambria Math" w:hAnsi="Cambria Math"/>
+                </w:rPr>
+                <m:t>1-</m:t>
+              </m:r>
+              <m:f>
+                <m:fPr>
+                  <m:ctrlPr>
+                    <w:rPr>
+                      <w:rFonts w:ascii="Cambria Math" w:hAnsi="Cambria Math"/>
+                      <w:i/>
+                      <w:iCs/>
+                    </w:rPr>
+                  </m:ctrlPr>
+                </m:fPr>
+                <m:num>
+                  <m:r>
+                    <w:rPr>
+                      <w:rFonts w:ascii="Cambria Math" w:hAnsi="Cambria Math"/>
+                    </w:rPr>
+                    <m:t>S+</m:t>
+                  </m:r>
+                  <m:sSub>
+                    <m:sSubPr>
+                      <m:ctrlPr>
+                        <w:rPr>
+                          <w:rFonts w:ascii="Cambria Math" w:hAnsi="Cambria Math"/>
+                          <w:i/>
+                        </w:rPr>
+                      </m:ctrlPr>
+                    </m:sSubPr>
+                    <m:e>
+                      <m:r>
+                        <w:rPr>
+                          <w:rFonts w:ascii="Cambria Math" w:hAnsi="Cambria Math"/>
+                        </w:rPr>
+                        <m:t>I</m:t>
+                      </m:r>
+                    </m:e>
+                    <m:sub>
+                      <m:r>
+                        <w:rPr>
+                          <w:rFonts w:ascii="Cambria Math" w:hAnsi="Cambria Math"/>
+                        </w:rPr>
+                        <m:t>a,r</m:t>
+                      </m:r>
+                    </m:sub>
+                  </m:sSub>
+                  <m:r>
+                    <w:rPr>
+                      <w:rFonts w:ascii="Cambria Math" w:hAnsi="Cambria Math"/>
+                    </w:rPr>
+                    <m:t>+</m:t>
+                  </m:r>
+                  <m:sSub>
+                    <m:sSubPr>
+                      <m:ctrlPr>
+                        <w:rPr>
+                          <w:rFonts w:ascii="Cambria Math" w:hAnsi="Cambria Math"/>
+                          <w:i/>
+                        </w:rPr>
+                      </m:ctrlPr>
+                    </m:sSubPr>
+                    <m:e>
+                      <m:r>
+                        <w:rPr>
+                          <w:rFonts w:ascii="Cambria Math" w:hAnsi="Cambria Math"/>
+                        </w:rPr>
+                        <m:t>I</m:t>
+                      </m:r>
+                    </m:e>
+                    <m:sub>
+                      <m:r>
+                        <w:rPr>
+                          <w:rFonts w:ascii="Cambria Math" w:hAnsi="Cambria Math"/>
+                        </w:rPr>
+                        <m:t>c,r</m:t>
+                      </m:r>
+                    </m:sub>
+                  </m:sSub>
+                  <m:r>
+                    <w:rPr>
+                      <w:rFonts w:ascii="Cambria Math" w:hAnsi="Cambria Math"/>
+                    </w:rPr>
+                    <m:t>+</m:t>
+                  </m:r>
+                  <m:sSub>
+                    <m:sSubPr>
+                      <m:ctrlPr>
+                        <w:rPr>
+                          <w:rFonts w:ascii="Cambria Math" w:hAnsi="Cambria Math"/>
+                          <w:i/>
+                        </w:rPr>
+                      </m:ctrlPr>
+                    </m:sSubPr>
+                    <m:e>
+                      <m:r>
+                        <w:rPr>
+                          <w:rFonts w:ascii="Cambria Math" w:hAnsi="Cambria Math"/>
+                        </w:rPr>
+                        <m:t>I</m:t>
+                      </m:r>
+                    </m:e>
+                    <m:sub>
+                      <m:r>
+                        <w:rPr>
+                          <w:rFonts w:ascii="Cambria Math" w:hAnsi="Cambria Math"/>
+                        </w:rPr>
+                        <m:t>a,m</m:t>
+                      </m:r>
+                    </m:sub>
+                  </m:sSub>
+                  <m:r>
+                    <w:rPr>
+                      <w:rFonts w:ascii="Cambria Math" w:hAnsi="Cambria Math"/>
+                    </w:rPr>
+                    <m:t>+</m:t>
+                  </m:r>
+                  <m:sSub>
+                    <m:sSubPr>
+                      <m:ctrlPr>
+                        <w:rPr>
+                          <w:rFonts w:ascii="Cambria Math" w:hAnsi="Cambria Math"/>
+                          <w:i/>
+                        </w:rPr>
+                      </m:ctrlPr>
+                    </m:sSubPr>
+                    <m:e>
+                      <m:r>
+                        <w:rPr>
+                          <w:rFonts w:ascii="Cambria Math" w:hAnsi="Cambria Math"/>
+                        </w:rPr>
+                        <m:t>I</m:t>
+                      </m:r>
+                    </m:e>
+                    <m:sub>
+                      <m:r>
+                        <w:rPr>
+                          <w:rFonts w:ascii="Cambria Math" w:hAnsi="Cambria Math"/>
+                        </w:rPr>
+                        <m:t>c,m</m:t>
+                      </m:r>
+                    </m:sub>
+                  </m:sSub>
+                </m:num>
+                <m:den>
+                  <m:r>
+                    <w:rPr>
+                      <w:rFonts w:ascii="Cambria Math" w:hAnsi="Cambria Math"/>
+                    </w:rPr>
+                    <m:t>K</m:t>
+                  </m:r>
+                </m:den>
+              </m:f>
+            </m:e>
+          </m:d>
+          <m:r>
+            <w:rPr>
+              <w:rFonts w:ascii="Cambria Math" w:hAnsi="Cambria Math"/>
+            </w:rPr>
+            <m:t>-μS-β</m:t>
+          </m:r>
+          <m:d>
+            <m:dPr>
+              <m:ctrlPr>
+                <w:rPr>
+                  <w:rFonts w:ascii="Cambria Math" w:hAnsi="Cambria Math"/>
+                  <w:i/>
+                  <w:iCs/>
+                </w:rPr>
+              </m:ctrlPr>
+            </m:dPr>
+            <m:e>
+              <m:sSub>
+                <m:sSubPr>
+                  <m:ctrlPr>
+                    <w:rPr>
+                      <w:rFonts w:ascii="Cambria Math" w:hAnsi="Cambria Math"/>
+                      <w:i/>
+                    </w:rPr>
+                  </m:ctrlPr>
+                </m:sSubPr>
+                <m:e>
+                  <m:r>
+                    <w:rPr>
+                      <w:rFonts w:ascii="Cambria Math" w:hAnsi="Cambria Math"/>
+                    </w:rPr>
+                    <m:t>v</m:t>
+                  </m:r>
+                </m:e>
+                <m:sub>
+                  <m:r>
+                    <w:rPr>
+                      <w:rFonts w:ascii="Cambria Math" w:hAnsi="Cambria Math"/>
+                    </w:rPr>
+                    <m:t>r</m:t>
+                  </m:r>
+                </m:sub>
+              </m:sSub>
+            </m:e>
+          </m:d>
+          <m:d>
+            <m:dPr>
+              <m:ctrlPr>
+                <w:rPr>
+                  <w:rFonts w:ascii="Cambria Math" w:hAnsi="Cambria Math"/>
+                  <w:i/>
+                  <w:iCs/>
+                </w:rPr>
+              </m:ctrlPr>
+            </m:dPr>
+            <m:e>
+              <m:sSub>
+                <m:sSubPr>
+                  <m:ctrlPr>
+                    <w:rPr>
+                      <w:rFonts w:ascii="Cambria Math" w:hAnsi="Cambria Math"/>
+                      <w:i/>
+                    </w:rPr>
+                  </m:ctrlPr>
+                </m:sSubPr>
+                <m:e>
+                  <m:r>
+                    <w:rPr>
+                      <w:rFonts w:ascii="Cambria Math" w:hAnsi="Cambria Math"/>
+                    </w:rPr>
+                    <m:t>I</m:t>
+                  </m:r>
+                </m:e>
+                <m:sub>
+                  <m:r>
+                    <w:rPr>
+                      <w:rFonts w:ascii="Cambria Math" w:hAnsi="Cambria Math"/>
+                    </w:rPr>
+                    <m:t>a,r</m:t>
+                  </m:r>
+                </m:sub>
+              </m:sSub>
+              <m:r>
+                <w:rPr>
+                  <w:rFonts w:ascii="Cambria Math" w:hAnsi="Cambria Math"/>
+                </w:rPr>
+                <m:t>+</m:t>
+              </m:r>
+              <m:sSub>
+                <m:sSubPr>
+                  <m:ctrlPr>
+                    <w:rPr>
+                      <w:rFonts w:ascii="Cambria Math" w:hAnsi="Cambria Math"/>
+                      <w:i/>
+                    </w:rPr>
+                  </m:ctrlPr>
+                </m:sSubPr>
+                <m:e>
+                  <m:r>
+                    <w:rPr>
+                      <w:rFonts w:ascii="Cambria Math" w:hAnsi="Cambria Math"/>
+                    </w:rPr>
+                    <m:t>I</m:t>
+                  </m:r>
+                </m:e>
+                <m:sub>
+                  <m:r>
+                    <w:rPr>
+                      <w:rFonts w:ascii="Cambria Math" w:hAnsi="Cambria Math"/>
+                    </w:rPr>
+                    <m:t>c,r</m:t>
+                  </m:r>
+                </m:sub>
+              </m:sSub>
+            </m:e>
+          </m:d>
+          <m:r>
+            <w:rPr>
+              <w:rFonts w:ascii="Cambria Math" w:hAnsi="Cambria Math"/>
+            </w:rPr>
+            <m:t>S</m:t>
+          </m:r>
+          <m:r>
+            <w:rPr>
+              <w:rFonts w:ascii="Cambria Math" w:hAnsi="Cambria Math"/>
+            </w:rPr>
+            <m:t>-β</m:t>
+          </m:r>
+          <m:d>
+            <m:dPr>
+              <m:ctrlPr>
+                <w:rPr>
+                  <w:rFonts w:ascii="Cambria Math" w:hAnsi="Cambria Math"/>
+                  <w:i/>
+                  <w:iCs/>
+                </w:rPr>
+              </m:ctrlPr>
+            </m:dPr>
+            <m:e>
+              <m:sSub>
+                <m:sSubPr>
+                  <m:ctrlPr>
+                    <w:rPr>
+                      <w:rFonts w:ascii="Cambria Math" w:hAnsi="Cambria Math"/>
+                      <w:i/>
+                    </w:rPr>
+                  </m:ctrlPr>
+                </m:sSubPr>
+                <m:e>
+                  <m:r>
+                    <w:rPr>
+                      <w:rFonts w:ascii="Cambria Math" w:hAnsi="Cambria Math"/>
+                    </w:rPr>
+                    <m:t>v</m:t>
+                  </m:r>
+                </m:e>
+                <m:sub>
+                  <m:r>
+                    <w:rPr>
+                      <w:rFonts w:ascii="Cambria Math" w:hAnsi="Cambria Math"/>
+                    </w:rPr>
+                    <m:t>m</m:t>
+                  </m:r>
+                </m:sub>
+              </m:sSub>
+            </m:e>
+          </m:d>
+          <m:d>
+            <m:dPr>
+              <m:ctrlPr>
+                <w:rPr>
+                  <w:rFonts w:ascii="Cambria Math" w:hAnsi="Cambria Math"/>
+                  <w:i/>
+                  <w:iCs/>
+                </w:rPr>
+              </m:ctrlPr>
+            </m:dPr>
+            <m:e>
+              <m:sSub>
+                <m:sSubPr>
+                  <m:ctrlPr>
+                    <w:rPr>
+                      <w:rFonts w:ascii="Cambria Math" w:hAnsi="Cambria Math"/>
+                      <w:i/>
+                    </w:rPr>
+                  </m:ctrlPr>
+                </m:sSubPr>
+                <m:e>
+                  <m:r>
+                    <w:rPr>
+                      <w:rFonts w:ascii="Cambria Math" w:hAnsi="Cambria Math"/>
+                    </w:rPr>
+                    <m:t>I</m:t>
+                  </m:r>
+                </m:e>
+                <m:sub>
+                  <m:r>
+                    <w:rPr>
+                      <w:rFonts w:ascii="Cambria Math" w:hAnsi="Cambria Math"/>
+                    </w:rPr>
+                    <m:t>a,</m:t>
+                  </m:r>
+                  <m:r>
+                    <w:rPr>
+                      <w:rFonts w:ascii="Cambria Math" w:hAnsi="Cambria Math"/>
+                    </w:rPr>
+                    <m:t>m</m:t>
+                  </m:r>
+                </m:sub>
+              </m:sSub>
+              <m:r>
+                <w:rPr>
+                  <w:rFonts w:ascii="Cambria Math" w:hAnsi="Cambria Math"/>
+                </w:rPr>
+                <m:t>+</m:t>
+              </m:r>
+              <m:sSub>
+                <m:sSubPr>
+                  <m:ctrlPr>
+                    <w:rPr>
+                      <w:rFonts w:ascii="Cambria Math" w:hAnsi="Cambria Math"/>
+                      <w:i/>
+                    </w:rPr>
+                  </m:ctrlPr>
+                </m:sSubPr>
+                <m:e>
+                  <m:r>
+                    <w:rPr>
+                      <w:rFonts w:ascii="Cambria Math" w:hAnsi="Cambria Math"/>
+                    </w:rPr>
+                    <m:t>I</m:t>
+                  </m:r>
+                </m:e>
+                <m:sub>
+                  <m:r>
+                    <w:rPr>
+                      <w:rFonts w:ascii="Cambria Math" w:hAnsi="Cambria Math"/>
+                    </w:rPr>
+                    <m:t>c,</m:t>
+                  </m:r>
+                  <m:r>
+                    <w:rPr>
+                      <w:rFonts w:ascii="Cambria Math" w:hAnsi="Cambria Math"/>
+                    </w:rPr>
+                    <m:t>m</m:t>
+                  </m:r>
+                </m:sub>
+              </m:sSub>
+            </m:e>
+          </m:d>
+          <m:r>
+            <w:rPr>
+              <w:rFonts w:ascii="Cambria Math" w:hAnsi="Cambria Math"/>
+            </w:rPr>
+            <m:t>S+γ</m:t>
+          </m:r>
+          <m:r>
+            <w:rPr>
+              <w:rFonts w:ascii="Cambria Math" w:hAnsi="Cambria Math"/>
+            </w:rPr>
+            <m:t>(</m:t>
+          </m:r>
+          <m:sSub>
+            <m:sSubPr>
+              <m:ctrlPr>
+                <w:rPr>
+                  <w:rFonts w:ascii="Cambria Math" w:hAnsi="Cambria Math"/>
+                  <w:i/>
+                  <w:iCs/>
+                </w:rPr>
+              </m:ctrlPr>
+            </m:sSubPr>
+            <m:e>
+              <m:r>
+                <w:rPr>
+                  <w:rFonts w:ascii="Cambria Math" w:hAnsi="Cambria Math"/>
+                </w:rPr>
+                <m:t>I</m:t>
+              </m:r>
+            </m:e>
+            <m:sub>
+              <m:r>
+                <w:rPr>
+                  <w:rFonts w:ascii="Cambria Math" w:hAnsi="Cambria Math"/>
+                </w:rPr>
+                <m:t>a</m:t>
+              </m:r>
+              <m:r>
+                <w:rPr>
+                  <w:rFonts w:ascii="Cambria Math" w:hAnsi="Cambria Math"/>
+                </w:rPr>
+                <m:t>,r</m:t>
+              </m:r>
+            </m:sub>
+          </m:sSub>
+          <m:r>
+            <w:rPr>
+              <w:rFonts w:ascii="Cambria Math" w:hAnsi="Cambria Math"/>
+            </w:rPr>
+            <m:t>+</m:t>
+          </m:r>
+          <m:sSub>
+            <m:sSubPr>
+              <m:ctrlPr>
+                <w:rPr>
+                  <w:rFonts w:ascii="Cambria Math" w:hAnsi="Cambria Math"/>
+                  <w:i/>
+                  <w:iCs/>
+                </w:rPr>
+              </m:ctrlPr>
+            </m:sSubPr>
+            <m:e>
+              <m:r>
+                <w:rPr>
+                  <w:rFonts w:ascii="Cambria Math" w:hAnsi="Cambria Math"/>
+                </w:rPr>
+                <m:t>I</m:t>
+              </m:r>
+            </m:e>
+            <m:sub>
+              <m:r>
+                <w:rPr>
+                  <w:rFonts w:ascii="Cambria Math" w:hAnsi="Cambria Math"/>
+                </w:rPr>
+                <m:t>a,m</m:t>
+              </m:r>
+            </m:sub>
+          </m:sSub>
+          <m:r>
+            <w:rPr>
+              <w:rFonts w:ascii="Cambria Math" w:hAnsi="Cambria Math"/>
+            </w:rPr>
+            <m:t>)</m:t>
+          </m:r>
+        </m:oMath>
+      </m:oMathPara>
+    </w:p>
+    <w:p>
+      <w:pPr>
+        <w:rPr>
+          <w:rFonts w:eastAsiaTheme="minorEastAsia"/>
+          <w:iCs/>
+        </w:rPr>
+      </w:pPr>
+      <m:oMathPara>
+        <m:oMath>
+          <m:f>
+            <m:fPr>
+              <m:ctrlPr>
+                <w:rPr>
+                  <w:rFonts w:ascii="Cambria Math" w:eastAsiaTheme="minorEastAsia" w:hAnsi="Cambria Math"/>
+                  <w:i/>
+                  <w:iCs/>
+                </w:rPr>
+              </m:ctrlPr>
+            </m:fPr>
+            <m:num>
+              <m:r>
+                <w:rPr>
+                  <w:rFonts w:ascii="Cambria Math" w:eastAsiaTheme="minorEastAsia" w:hAnsi="Cambria Math"/>
+                </w:rPr>
+                <m:t>d</m:t>
+              </m:r>
+              <m:sSub>
+                <m:sSubPr>
+                  <m:ctrlPr>
+                    <w:rPr>
+                      <w:rFonts w:ascii="Cambria Math" w:eastAsiaTheme="minorEastAsia" w:hAnsi="Cambria Math"/>
+                      <w:i/>
+                      <w:iCs/>
+                    </w:rPr>
+                  </m:ctrlPr>
+                </m:sSubPr>
+                <m:e>
+                  <m:r>
+                    <w:rPr>
+                      <w:rFonts w:ascii="Cambria Math" w:eastAsiaTheme="minorEastAsia" w:hAnsi="Cambria Math"/>
+                    </w:rPr>
+                    <m:t>I</m:t>
+                  </m:r>
+                </m:e>
+                <m:sub>
+                  <m:r>
+                    <w:rPr>
+                      <w:rFonts w:ascii="Cambria Math" w:eastAsiaTheme="minorEastAsia" w:hAnsi="Cambria Math"/>
+                    </w:rPr>
+                    <m:t>a</m:t>
+                  </m:r>
+                  <m:r>
+                    <w:rPr>
+                      <w:rFonts w:ascii="Cambria Math" w:eastAsiaTheme="minorEastAsia" w:hAnsi="Cambria Math"/>
+                    </w:rPr>
+                    <m:t>,r</m:t>
+                  </m:r>
+                </m:sub>
+              </m:sSub>
+            </m:num>
+            <m:den>
+              <m:r>
+                <w:rPr>
+                  <w:rFonts w:ascii="Cambria Math" w:eastAsiaTheme="minorEastAsia" w:hAnsi="Cambria Math"/>
+                </w:rPr>
+                <m:t>dt</m:t>
+              </m:r>
+            </m:den>
+          </m:f>
+          <m:r>
+            <w:rPr>
+              <w:rFonts w:ascii="Cambria Math" w:eastAsiaTheme="minorEastAsia" w:hAnsi="Cambria Math"/>
+            </w:rPr>
+            <m:t>=p</m:t>
+          </m:r>
+          <m:r>
+            <w:rPr>
+              <w:rFonts w:ascii="Cambria Math" w:hAnsi="Cambria Math"/>
+            </w:rPr>
+            <m:t>β</m:t>
+          </m:r>
+          <m:d>
+            <m:dPr>
+              <m:ctrlPr>
+                <w:rPr>
+                  <w:rFonts w:ascii="Cambria Math" w:hAnsi="Cambria Math"/>
+                  <w:i/>
+                  <w:iCs/>
+                </w:rPr>
+              </m:ctrlPr>
+            </m:dPr>
+            <m:e>
+              <m:sSub>
+                <m:sSubPr>
+                  <m:ctrlPr>
+                    <w:rPr>
+                      <w:rFonts w:ascii="Cambria Math" w:hAnsi="Cambria Math"/>
+                      <w:i/>
+                    </w:rPr>
+                  </m:ctrlPr>
+                </m:sSubPr>
+                <m:e>
+                  <m:r>
+                    <w:rPr>
+                      <w:rFonts w:ascii="Cambria Math" w:hAnsi="Cambria Math"/>
+                    </w:rPr>
+                    <m:t>v</m:t>
+                  </m:r>
+                </m:e>
+                <m:sub>
+                  <m:r>
+                    <w:rPr>
+                      <w:rFonts w:ascii="Cambria Math" w:hAnsi="Cambria Math"/>
+                    </w:rPr>
+                    <m:t>r</m:t>
+                  </m:r>
+                </m:sub>
+              </m:sSub>
+            </m:e>
+          </m:d>
+          <m:d>
+            <m:dPr>
+              <m:ctrlPr>
+                <w:rPr>
+                  <w:rFonts w:ascii="Cambria Math" w:hAnsi="Cambria Math"/>
+                  <w:i/>
+                  <w:iCs/>
+                </w:rPr>
+              </m:ctrlPr>
+            </m:dPr>
+            <m:e>
+              <m:sSub>
+                <m:sSubPr>
+                  <m:ctrlPr>
+                    <w:rPr>
+                      <w:rFonts w:ascii="Cambria Math" w:hAnsi="Cambria Math"/>
+                      <w:i/>
+                    </w:rPr>
+                  </m:ctrlPr>
+                </m:sSubPr>
+                <m:e>
+                  <m:r>
+                    <w:rPr>
+                      <w:rFonts w:ascii="Cambria Math" w:hAnsi="Cambria Math"/>
+                    </w:rPr>
+                    <m:t>I</m:t>
+                  </m:r>
+                </m:e>
+                <m:sub>
+                  <m:r>
+                    <w:rPr>
+                      <w:rFonts w:ascii="Cambria Math" w:hAnsi="Cambria Math"/>
+                    </w:rPr>
+                    <m:t>a,r</m:t>
+                  </m:r>
+                </m:sub>
+              </m:sSub>
+              <m:r>
+                <w:rPr>
+                  <w:rFonts w:ascii="Cambria Math" w:hAnsi="Cambria Math"/>
+                </w:rPr>
+                <m:t>+</m:t>
+              </m:r>
+              <m:sSub>
+                <m:sSubPr>
+                  <m:ctrlPr>
+                    <w:rPr>
+                      <w:rFonts w:ascii="Cambria Math" w:hAnsi="Cambria Math"/>
+                      <w:i/>
+                    </w:rPr>
+                  </m:ctrlPr>
+                </m:sSubPr>
+                <m:e>
+                  <m:r>
+                    <w:rPr>
+                      <w:rFonts w:ascii="Cambria Math" w:hAnsi="Cambria Math"/>
+                    </w:rPr>
+                    <m:t>I</m:t>
+                  </m:r>
+                </m:e>
+                <m:sub>
+                  <m:r>
+                    <w:rPr>
+                      <w:rFonts w:ascii="Cambria Math" w:hAnsi="Cambria Math"/>
+                    </w:rPr>
+                    <m:t>c,r</m:t>
+                  </m:r>
+                </m:sub>
+              </m:sSub>
+            </m:e>
+          </m:d>
+          <m:r>
+            <w:rPr>
+              <w:rFonts w:ascii="Cambria Math" w:hAnsi="Cambria Math"/>
+            </w:rPr>
+            <m:t>S</m:t>
+          </m:r>
+          <m:r>
+            <w:rPr>
+              <w:rFonts w:ascii="Cambria Math" w:eastAsiaTheme="minorEastAsia" w:hAnsi="Cambria Math"/>
+            </w:rPr>
+            <m:t>-(</m:t>
+          </m:r>
+          <m:sSub>
+            <m:sSubPr>
+              <m:ctrlPr>
+                <w:rPr>
+                  <w:rFonts w:ascii="Cambria Math" w:eastAsiaTheme="minorEastAsia" w:hAnsi="Cambria Math"/>
+                  <w:i/>
+                </w:rPr>
+              </m:ctrlPr>
+            </m:sSubPr>
+            <m:e>
+              <m:r>
+                <w:rPr>
+                  <w:rFonts w:ascii="Cambria Math" w:eastAsiaTheme="minorEastAsia" w:hAnsi="Cambria Math"/>
+                </w:rPr>
+                <m:t>v</m:t>
+              </m:r>
+            </m:e>
+            <m:sub>
+              <m:r>
+                <w:rPr>
+                  <w:rFonts w:ascii="Cambria Math" w:eastAsiaTheme="minorEastAsia" w:hAnsi="Cambria Math"/>
+                </w:rPr>
+                <m:t>r</m:t>
+              </m:r>
+            </m:sub>
+          </m:sSub>
+          <m:r>
+            <w:rPr>
+              <w:rFonts w:ascii="Cambria Math" w:eastAsiaTheme="minorEastAsia" w:hAnsi="Cambria Math"/>
+            </w:rPr>
+            <m:t>+γ+μ)</m:t>
+          </m:r>
+          <m:sSub>
+            <m:sSubPr>
+              <m:ctrlPr>
+                <w:rPr>
+                  <w:rFonts w:ascii="Cambria Math" w:eastAsiaTheme="minorEastAsia" w:hAnsi="Cambria Math"/>
+                  <w:i/>
+                  <w:iCs/>
+                </w:rPr>
+              </m:ctrlPr>
+            </m:sSubPr>
+            <m:e>
+              <m:r>
+                <w:rPr>
+                  <w:rFonts w:ascii="Cambria Math" w:eastAsiaTheme="minorEastAsia" w:hAnsi="Cambria Math"/>
+                </w:rPr>
+                <m:t>I</m:t>
+              </m:r>
+            </m:e>
+            <m:sub>
+              <m:r>
+                <w:rPr>
+                  <w:rFonts w:ascii="Cambria Math" w:eastAsiaTheme="minorEastAsia" w:hAnsi="Cambria Math"/>
+                </w:rPr>
+                <m:t>a</m:t>
+              </m:r>
+              <m:r>
+                <w:rPr>
+                  <w:rFonts w:ascii="Cambria Math" w:eastAsiaTheme="minorEastAsia" w:hAnsi="Cambria Math"/>
+                </w:rPr>
+                <m:t>,r</m:t>
+              </m:r>
+            </m:sub>
+          </m:sSub>
+        </m:oMath>
+      </m:oMathPara>
+    </w:p>
+    <w:p>
+      <w:pPr>
+        <w:rPr>
+          <w:rFonts w:eastAsiaTheme="minorEastAsia"/>
+          <w:iCs/>
+        </w:rPr>
+      </w:pPr>
+      <m:oMathPara>
+        <m:oMath>
+          <m:f>
+            <m:fPr>
+              <m:ctrlPr>
+                <w:rPr>
+                  <w:rFonts w:ascii="Cambria Math" w:eastAsiaTheme="minorEastAsia" w:hAnsi="Cambria Math"/>
+                  <w:i/>
+                  <w:iCs/>
+                </w:rPr>
+              </m:ctrlPr>
+            </m:fPr>
+            <m:num>
+              <m:r>
+                <w:rPr>
+                  <w:rFonts w:ascii="Cambria Math" w:eastAsiaTheme="minorEastAsia" w:hAnsi="Cambria Math"/>
+                </w:rPr>
+                <m:t>d</m:t>
+              </m:r>
+              <m:sSub>
+                <m:sSubPr>
+                  <m:ctrlPr>
+                    <w:rPr>
+                      <w:rFonts w:ascii="Cambria Math" w:eastAsiaTheme="minorEastAsia" w:hAnsi="Cambria Math"/>
+                      <w:i/>
+                      <w:iCs/>
+                    </w:rPr>
+                  </m:ctrlPr>
+                </m:sSubPr>
+                <m:e>
+                  <m:r>
+                    <w:rPr>
+                      <w:rFonts w:ascii="Cambria Math" w:eastAsiaTheme="minorEastAsia" w:hAnsi="Cambria Math"/>
+                    </w:rPr>
+                    <m:t>I</m:t>
+                  </m:r>
+                </m:e>
+                <m:sub>
+                  <m:r>
+                    <w:rPr>
+                      <w:rFonts w:ascii="Cambria Math" w:eastAsiaTheme="minorEastAsia" w:hAnsi="Cambria Math"/>
+                    </w:rPr>
+                    <m:t>c</m:t>
+                  </m:r>
+                  <m:r>
+                    <w:rPr>
+                      <w:rFonts w:ascii="Cambria Math" w:eastAsiaTheme="minorEastAsia" w:hAnsi="Cambria Math"/>
+                    </w:rPr>
+                    <m:t>,r</m:t>
+                  </m:r>
+                </m:sub>
+              </m:sSub>
+            </m:num>
+            <m:den>
+              <m:r>
+                <w:rPr>
+                  <w:rFonts w:ascii="Cambria Math" w:eastAsiaTheme="minorEastAsia" w:hAnsi="Cambria Math"/>
+                </w:rPr>
+                <m:t>dt</m:t>
+              </m:r>
+            </m:den>
+          </m:f>
+          <m:r>
+            <w:rPr>
+              <w:rFonts w:ascii="Cambria Math" w:eastAsiaTheme="minorEastAsia" w:hAnsi="Cambria Math"/>
+            </w:rPr>
+            <m:t>=</m:t>
+          </m:r>
+          <m:d>
+            <m:dPr>
+              <m:ctrlPr>
+                <w:rPr>
+                  <w:rFonts w:ascii="Cambria Math" w:eastAsiaTheme="minorEastAsia" w:hAnsi="Cambria Math"/>
+                  <w:i/>
+                  <w:iCs/>
+                </w:rPr>
+              </m:ctrlPr>
+            </m:dPr>
+            <m:e>
+              <m:r>
+                <w:rPr>
+                  <w:rFonts w:ascii="Cambria Math" w:eastAsiaTheme="minorEastAsia" w:hAnsi="Cambria Math"/>
+                </w:rPr>
+                <m:t>1-p</m:t>
+              </m:r>
+            </m:e>
+          </m:d>
+          <m:r>
+            <w:rPr>
+              <w:rFonts w:ascii="Cambria Math" w:hAnsi="Cambria Math"/>
+            </w:rPr>
+            <m:t>β</m:t>
+          </m:r>
+          <m:d>
+            <m:dPr>
+              <m:ctrlPr>
+                <w:rPr>
+                  <w:rFonts w:ascii="Cambria Math" w:hAnsi="Cambria Math"/>
+                  <w:i/>
+                  <w:iCs/>
+                </w:rPr>
+              </m:ctrlPr>
+            </m:dPr>
+            <m:e>
+              <m:sSub>
+                <m:sSubPr>
+                  <m:ctrlPr>
+                    <w:rPr>
+                      <w:rFonts w:ascii="Cambria Math" w:hAnsi="Cambria Math"/>
+                      <w:i/>
+                    </w:rPr>
+                  </m:ctrlPr>
+                </m:sSubPr>
+                <m:e>
+                  <m:r>
+                    <w:rPr>
+                      <w:rFonts w:ascii="Cambria Math" w:hAnsi="Cambria Math"/>
+                    </w:rPr>
+                    <m:t>v</m:t>
+                  </m:r>
+                </m:e>
+                <m:sub>
+                  <m:r>
+                    <w:rPr>
+                      <w:rFonts w:ascii="Cambria Math" w:hAnsi="Cambria Math"/>
+                    </w:rPr>
+                    <m:t>r</m:t>
+                  </m:r>
+                </m:sub>
+              </m:sSub>
+            </m:e>
+          </m:d>
+          <m:d>
+            <m:dPr>
+              <m:ctrlPr>
+                <w:rPr>
+                  <w:rFonts w:ascii="Cambria Math" w:hAnsi="Cambria Math"/>
+                  <w:i/>
+                  <w:iCs/>
+                </w:rPr>
+              </m:ctrlPr>
+            </m:dPr>
+            <m:e>
+              <m:sSub>
+                <m:sSubPr>
+                  <m:ctrlPr>
+                    <w:rPr>
+                      <w:rFonts w:ascii="Cambria Math" w:hAnsi="Cambria Math"/>
+                      <w:i/>
+                    </w:rPr>
+                  </m:ctrlPr>
+                </m:sSubPr>
+                <m:e>
+                  <m:r>
+                    <w:rPr>
+                      <w:rFonts w:ascii="Cambria Math" w:hAnsi="Cambria Math"/>
+                    </w:rPr>
+                    <m:t>I</m:t>
+                  </m:r>
+                </m:e>
+                <m:sub>
+                  <m:r>
+                    <w:rPr>
+                      <w:rFonts w:ascii="Cambria Math" w:hAnsi="Cambria Math"/>
+                    </w:rPr>
+                    <m:t>a,r</m:t>
+                  </m:r>
+                </m:sub>
+              </m:sSub>
+              <m:r>
+                <w:rPr>
+                  <w:rFonts w:ascii="Cambria Math" w:hAnsi="Cambria Math"/>
+                </w:rPr>
+                <m:t>+</m:t>
+              </m:r>
+              <m:sSub>
+                <m:sSubPr>
+                  <m:ctrlPr>
+                    <w:rPr>
+                      <w:rFonts w:ascii="Cambria Math" w:hAnsi="Cambria Math"/>
+                      <w:i/>
+                    </w:rPr>
+                  </m:ctrlPr>
+                </m:sSubPr>
+                <m:e>
+                  <m:r>
+                    <w:rPr>
+                      <w:rFonts w:ascii="Cambria Math" w:hAnsi="Cambria Math"/>
+                    </w:rPr>
+                    <m:t>I</m:t>
+                  </m:r>
+                </m:e>
+                <m:sub>
+                  <m:r>
+                    <w:rPr>
+                      <w:rFonts w:ascii="Cambria Math" w:hAnsi="Cambria Math"/>
+                    </w:rPr>
+                    <m:t>c,r</m:t>
+                  </m:r>
+                </m:sub>
+              </m:sSub>
+            </m:e>
+          </m:d>
+          <m:r>
+            <w:rPr>
+              <w:rFonts w:ascii="Cambria Math" w:hAnsi="Cambria Math"/>
+            </w:rPr>
+            <m:t>S</m:t>
+          </m:r>
+          <m:r>
+            <w:rPr>
+              <w:rFonts w:ascii="Cambria Math" w:eastAsiaTheme="minorEastAsia" w:hAnsi="Cambria Math"/>
+            </w:rPr>
+            <m:t>-(</m:t>
+          </m:r>
+          <m:sSub>
+            <m:sSubPr>
+              <m:ctrlPr>
+                <w:rPr>
+                  <w:rFonts w:ascii="Cambria Math" w:eastAsiaTheme="minorEastAsia" w:hAnsi="Cambria Math"/>
+                  <w:i/>
+                </w:rPr>
+              </m:ctrlPr>
+            </m:sSubPr>
+            <m:e>
+              <m:r>
+                <w:rPr>
+                  <w:rFonts w:ascii="Cambria Math" w:eastAsiaTheme="minorEastAsia" w:hAnsi="Cambria Math"/>
+                </w:rPr>
+                <m:t>v</m:t>
+              </m:r>
+            </m:e>
+            <m:sub>
+              <m:r>
+                <w:rPr>
+                  <w:rFonts w:ascii="Cambria Math" w:eastAsiaTheme="minorEastAsia" w:hAnsi="Cambria Math"/>
+                </w:rPr>
+                <m:t>r</m:t>
+              </m:r>
+            </m:sub>
+          </m:sSub>
+          <m:r>
+            <w:rPr>
+              <w:rFonts w:ascii="Cambria Math" w:eastAsiaTheme="minorEastAsia" w:hAnsi="Cambria Math"/>
+            </w:rPr>
+            <m:t>+μ)</m:t>
+          </m:r>
+          <m:sSub>
+            <m:sSubPr>
+              <m:ctrlPr>
+                <w:rPr>
+                  <w:rFonts w:ascii="Cambria Math" w:eastAsiaTheme="minorEastAsia" w:hAnsi="Cambria Math"/>
+                  <w:i/>
+                  <w:iCs/>
+                </w:rPr>
+              </m:ctrlPr>
+            </m:sSubPr>
+            <m:e>
+              <m:r>
+                <w:rPr>
+                  <w:rFonts w:ascii="Cambria Math" w:eastAsiaTheme="minorEastAsia" w:hAnsi="Cambria Math"/>
+                </w:rPr>
+                <m:t>I</m:t>
+              </m:r>
+            </m:e>
+            <m:sub>
+              <m:r>
+                <w:rPr>
+                  <w:rFonts w:ascii="Cambria Math" w:eastAsiaTheme="minorEastAsia" w:hAnsi="Cambria Math"/>
+                </w:rPr>
+                <m:t>c</m:t>
+              </m:r>
+              <m:r>
+                <w:rPr>
+                  <w:rFonts w:ascii="Cambria Math" w:eastAsiaTheme="minorEastAsia" w:hAnsi="Cambria Math"/>
+                </w:rPr>
+                <m:t>,r</m:t>
+              </m:r>
+            </m:sub>
+          </m:sSub>
+        </m:oMath>
+      </m:oMathPara>
+    </w:p>
+    <w:p>
+      <w:pPr>
+        <w:rPr>
+          <w:rFonts w:eastAsiaTheme="minorEastAsia"/>
+          <w:iCs/>
+        </w:rPr>
+      </w:pPr>
+      <m:oMathPara>
+        <m:oMath>
+          <m:f>
+            <m:fPr>
+              <m:ctrlPr>
+                <w:rPr>
+                  <w:rFonts w:ascii="Cambria Math" w:eastAsiaTheme="minorEastAsia" w:hAnsi="Cambria Math"/>
+                  <w:i/>
+                  <w:iCs/>
+                </w:rPr>
+              </m:ctrlPr>
+            </m:fPr>
+            <m:num>
+              <m:r>
+                <w:rPr>
+                  <w:rFonts w:ascii="Cambria Math" w:eastAsiaTheme="minorEastAsia" w:hAnsi="Cambria Math"/>
+                </w:rPr>
+                <m:t>d</m:t>
+              </m:r>
+              <m:sSub>
+                <m:sSubPr>
+                  <m:ctrlPr>
+                    <w:rPr>
+                      <w:rFonts w:ascii="Cambria Math" w:eastAsiaTheme="minorEastAsia" w:hAnsi="Cambria Math"/>
+                      <w:i/>
+                      <w:iCs/>
+                    </w:rPr>
+                  </m:ctrlPr>
+                </m:sSubPr>
+                <m:e>
+                  <m:r>
+                    <w:rPr>
+                      <w:rFonts w:ascii="Cambria Math" w:eastAsiaTheme="minorEastAsia" w:hAnsi="Cambria Math"/>
+                    </w:rPr>
+                    <m:t>I</m:t>
+                  </m:r>
+                </m:e>
+                <m:sub>
+                  <m:r>
+                    <w:rPr>
+                      <w:rFonts w:ascii="Cambria Math" w:eastAsiaTheme="minorEastAsia" w:hAnsi="Cambria Math"/>
+                    </w:rPr>
+                    <m:t>a,</m:t>
+                  </m:r>
+                  <m:r>
+                    <w:rPr>
+                      <w:rFonts w:ascii="Cambria Math" w:eastAsiaTheme="minorEastAsia" w:hAnsi="Cambria Math"/>
+                    </w:rPr>
+                    <m:t>m</m:t>
+                  </m:r>
+                </m:sub>
+              </m:sSub>
+            </m:num>
+            <m:den>
+              <m:r>
+                <w:rPr>
+                  <w:rFonts w:ascii="Cambria Math" w:eastAsiaTheme="minorEastAsia" w:hAnsi="Cambria Math"/>
+                </w:rPr>
+                <m:t>dt</m:t>
+              </m:r>
+            </m:den>
+          </m:f>
+          <m:r>
+            <w:rPr>
+              <w:rFonts w:ascii="Cambria Math" w:eastAsiaTheme="minorEastAsia" w:hAnsi="Cambria Math"/>
+            </w:rPr>
+            <m:t>=p</m:t>
+          </m:r>
+          <m:r>
+            <w:rPr>
+              <w:rFonts w:ascii="Cambria Math" w:hAnsi="Cambria Math"/>
+            </w:rPr>
+            <m:t>β</m:t>
+          </m:r>
+          <m:d>
+            <m:dPr>
+              <m:ctrlPr>
+                <w:rPr>
+                  <w:rFonts w:ascii="Cambria Math" w:hAnsi="Cambria Math"/>
+                  <w:i/>
+                  <w:iCs/>
+                </w:rPr>
+              </m:ctrlPr>
+            </m:dPr>
+            <m:e>
+              <m:sSub>
+                <m:sSubPr>
+                  <m:ctrlPr>
+                    <w:rPr>
+                      <w:rFonts w:ascii="Cambria Math" w:hAnsi="Cambria Math"/>
+                      <w:i/>
+                    </w:rPr>
+                  </m:ctrlPr>
+                </m:sSubPr>
+                <m:e>
+                  <m:r>
+                    <w:rPr>
+                      <w:rFonts w:ascii="Cambria Math" w:hAnsi="Cambria Math"/>
+                    </w:rPr>
+                    <m:t>v</m:t>
+                  </m:r>
+                </m:e>
+                <m:sub>
+                  <m:r>
+                    <w:rPr>
+                      <w:rFonts w:ascii="Cambria Math" w:hAnsi="Cambria Math"/>
+                    </w:rPr>
+                    <m:t>m</m:t>
+                  </m:r>
+                </m:sub>
+              </m:sSub>
+            </m:e>
+          </m:d>
+          <m:d>
+            <m:dPr>
+              <m:ctrlPr>
+                <w:rPr>
+                  <w:rFonts w:ascii="Cambria Math" w:hAnsi="Cambria Math"/>
+                  <w:i/>
+                  <w:iCs/>
+                </w:rPr>
+              </m:ctrlPr>
+            </m:dPr>
+            <m:e>
+              <m:sSub>
+                <m:sSubPr>
+                  <m:ctrlPr>
+                    <w:rPr>
+                      <w:rFonts w:ascii="Cambria Math" w:hAnsi="Cambria Math"/>
+                      <w:i/>
+                    </w:rPr>
+                  </m:ctrlPr>
+                </m:sSubPr>
+                <m:e>
+                  <m:r>
+                    <w:rPr>
+                      <w:rFonts w:ascii="Cambria Math" w:hAnsi="Cambria Math"/>
+                    </w:rPr>
+                    <m:t>I</m:t>
+                  </m:r>
+                </m:e>
+                <m:sub>
+                  <m:r>
+                    <w:rPr>
+                      <w:rFonts w:ascii="Cambria Math" w:hAnsi="Cambria Math"/>
+                    </w:rPr>
+                    <m:t>a,</m:t>
+                  </m:r>
+                  <m:r>
+                    <w:rPr>
+                      <w:rFonts w:ascii="Cambria Math" w:hAnsi="Cambria Math"/>
+                    </w:rPr>
+                    <m:t>m</m:t>
+                  </m:r>
+                </m:sub>
+              </m:sSub>
+              <m:r>
+                <w:rPr>
+                  <w:rFonts w:ascii="Cambria Math" w:hAnsi="Cambria Math"/>
+                </w:rPr>
+                <m:t>+</m:t>
+              </m:r>
+              <m:sSub>
+                <m:sSubPr>
+                  <m:ctrlPr>
+                    <w:rPr>
+                      <w:rFonts w:ascii="Cambria Math" w:hAnsi="Cambria Math"/>
+                      <w:i/>
+                    </w:rPr>
+                  </m:ctrlPr>
+                </m:sSubPr>
+                <m:e>
+                  <m:r>
+                    <w:rPr>
+                      <w:rFonts w:ascii="Cambria Math" w:hAnsi="Cambria Math"/>
+                    </w:rPr>
+                    <m:t>I</m:t>
+                  </m:r>
+                </m:e>
+                <m:sub>
+                  <m:r>
+                    <w:rPr>
+                      <w:rFonts w:ascii="Cambria Math" w:hAnsi="Cambria Math"/>
+                    </w:rPr>
+                    <m:t>c,</m:t>
+                  </m:r>
+                  <m:r>
+                    <w:rPr>
+                      <w:rFonts w:ascii="Cambria Math" w:hAnsi="Cambria Math"/>
+                    </w:rPr>
+                    <m:t>m</m:t>
+                  </m:r>
+                </m:sub>
+              </m:sSub>
+            </m:e>
+          </m:d>
+          <m:r>
+            <w:rPr>
+              <w:rFonts w:ascii="Cambria Math" w:hAnsi="Cambria Math"/>
+            </w:rPr>
+            <m:t>S</m:t>
+          </m:r>
+          <m:r>
+            <w:rPr>
+              <w:rFonts w:ascii="Cambria Math" w:eastAsiaTheme="minorEastAsia" w:hAnsi="Cambria Math"/>
+            </w:rPr>
+            <m:t>-(</m:t>
+          </m:r>
+          <m:sSub>
+            <m:sSubPr>
+              <m:ctrlPr>
+                <w:rPr>
+                  <w:rFonts w:ascii="Cambria Math" w:eastAsiaTheme="minorEastAsia" w:hAnsi="Cambria Math"/>
+                  <w:i/>
+                </w:rPr>
+              </m:ctrlPr>
+            </m:sSubPr>
+            <m:e>
+              <m:r>
+                <w:rPr>
+                  <w:rFonts w:ascii="Cambria Math" w:eastAsiaTheme="minorEastAsia" w:hAnsi="Cambria Math"/>
+                </w:rPr>
+                <m:t>v</m:t>
+              </m:r>
+            </m:e>
+            <m:sub>
+              <m:r>
+                <w:rPr>
+                  <w:rFonts w:ascii="Cambria Math" w:eastAsiaTheme="minorEastAsia" w:hAnsi="Cambria Math"/>
+                </w:rPr>
+                <m:t>m</m:t>
+              </m:r>
+            </m:sub>
+          </m:sSub>
+          <m:r>
+            <w:rPr>
+              <w:rFonts w:ascii="Cambria Math" w:eastAsiaTheme="minorEastAsia" w:hAnsi="Cambria Math"/>
+            </w:rPr>
+            <m:t>+γ+μ)</m:t>
+          </m:r>
+          <m:sSub>
+            <m:sSubPr>
+              <m:ctrlPr>
+                <w:rPr>
+                  <w:rFonts w:ascii="Cambria Math" w:eastAsiaTheme="minorEastAsia" w:hAnsi="Cambria Math"/>
+                  <w:i/>
+                  <w:iCs/>
+                </w:rPr>
+              </m:ctrlPr>
+            </m:sSubPr>
+            <m:e>
+              <m:r>
+                <w:rPr>
+                  <w:rFonts w:ascii="Cambria Math" w:eastAsiaTheme="minorEastAsia" w:hAnsi="Cambria Math"/>
+                </w:rPr>
+                <m:t>I</m:t>
+              </m:r>
+            </m:e>
+            <m:sub>
+              <m:r>
+                <w:rPr>
+                  <w:rFonts w:ascii="Cambria Math" w:eastAsiaTheme="minorEastAsia" w:hAnsi="Cambria Math"/>
+                </w:rPr>
+                <m:t>a,</m:t>
+              </m:r>
+              <m:r>
+                <w:rPr>
+                  <w:rFonts w:ascii="Cambria Math" w:eastAsiaTheme="minorEastAsia" w:hAnsi="Cambria Math"/>
+                </w:rPr>
+                <m:t>m</m:t>
+              </m:r>
+            </m:sub>
+          </m:sSub>
+        </m:oMath>
+      </m:oMathPara>
+    </w:p>
+    <w:p>
+      <w:pPr>
+        <w:rPr>
+          <w:rFonts w:eastAsiaTheme="minorEastAsia"/>
+          <w:iCs/>
+        </w:rPr>
+      </w:pPr>
+      <m:oMathPara>
+        <m:oMath>
+          <m:f>
+            <m:fPr>
+              <m:ctrlPr>
+                <w:rPr>
+                  <w:rFonts w:ascii="Cambria Math" w:eastAsiaTheme="minorEastAsia" w:hAnsi="Cambria Math"/>
+                  <w:i/>
+                  <w:iCs/>
+                </w:rPr>
+              </m:ctrlPr>
+            </m:fPr>
+            <m:num>
+              <m:r>
+                <w:rPr>
+                  <w:rFonts w:ascii="Cambria Math" w:eastAsiaTheme="minorEastAsia" w:hAnsi="Cambria Math"/>
+                </w:rPr>
+                <m:t>d</m:t>
+              </m:r>
+              <m:sSub>
+                <m:sSubPr>
+                  <m:ctrlPr>
+                    <w:rPr>
+                      <w:rFonts w:ascii="Cambria Math" w:eastAsiaTheme="minorEastAsia" w:hAnsi="Cambria Math"/>
+                      <w:i/>
+                      <w:iCs/>
+                    </w:rPr>
+                  </m:ctrlPr>
+                </m:sSubPr>
+                <m:e>
+                  <m:r>
+                    <w:rPr>
+                      <w:rFonts w:ascii="Cambria Math" w:eastAsiaTheme="minorEastAsia" w:hAnsi="Cambria Math"/>
+                    </w:rPr>
+                    <m:t>I</m:t>
+                  </m:r>
+                </m:e>
+                <m:sub>
+                  <m:r>
+                    <w:rPr>
+                      <w:rFonts w:ascii="Cambria Math" w:eastAsiaTheme="minorEastAsia" w:hAnsi="Cambria Math"/>
+                    </w:rPr>
+                    <m:t>c,</m:t>
+                  </m:r>
+                  <m:r>
+                    <w:rPr>
+                      <w:rFonts w:ascii="Cambria Math" w:eastAsiaTheme="minorEastAsia" w:hAnsi="Cambria Math"/>
+                    </w:rPr>
+                    <m:t>m</m:t>
+                  </m:r>
+                </m:sub>
+              </m:sSub>
+            </m:num>
+            <m:den>
+              <m:r>
+                <w:rPr>
+                  <w:rFonts w:ascii="Cambria Math" w:eastAsiaTheme="minorEastAsia" w:hAnsi="Cambria Math"/>
+                </w:rPr>
+                <m:t>dt</m:t>
+              </m:r>
+            </m:den>
+          </m:f>
+          <m:r>
+            <w:rPr>
+              <w:rFonts w:ascii="Cambria Math" w:eastAsiaTheme="minorEastAsia" w:hAnsi="Cambria Math"/>
+            </w:rPr>
+            <m:t>=</m:t>
+          </m:r>
+          <m:d>
+            <m:dPr>
+              <m:ctrlPr>
+                <w:rPr>
+                  <w:rFonts w:ascii="Cambria Math" w:eastAsiaTheme="minorEastAsia" w:hAnsi="Cambria Math"/>
+                  <w:i/>
+                  <w:iCs/>
+                </w:rPr>
+              </m:ctrlPr>
+            </m:dPr>
+            <m:e>
+              <m:r>
+                <w:rPr>
+                  <w:rFonts w:ascii="Cambria Math" w:eastAsiaTheme="minorEastAsia" w:hAnsi="Cambria Math"/>
+                </w:rPr>
+                <m:t>1-p</m:t>
+              </m:r>
+            </m:e>
+          </m:d>
+          <m:r>
+            <w:rPr>
+              <w:rFonts w:ascii="Cambria Math" w:hAnsi="Cambria Math"/>
+            </w:rPr>
+            <m:t>β</m:t>
+          </m:r>
+          <m:d>
+            <m:dPr>
+              <m:ctrlPr>
+                <w:rPr>
+                  <w:rFonts w:ascii="Cambria Math" w:hAnsi="Cambria Math"/>
+                  <w:i/>
+                  <w:iCs/>
+                </w:rPr>
+              </m:ctrlPr>
+            </m:dPr>
+            <m:e>
+              <m:sSub>
+                <m:sSubPr>
+                  <m:ctrlPr>
+                    <w:rPr>
+                      <w:rFonts w:ascii="Cambria Math" w:hAnsi="Cambria Math"/>
+                      <w:i/>
+                    </w:rPr>
+                  </m:ctrlPr>
+                </m:sSubPr>
+                <m:e>
+                  <m:r>
+                    <w:rPr>
+                      <w:rFonts w:ascii="Cambria Math" w:hAnsi="Cambria Math"/>
+                    </w:rPr>
+                    <m:t>v</m:t>
+                  </m:r>
+                </m:e>
+                <m:sub>
+                  <m:r>
+                    <w:rPr>
+                      <w:rFonts w:ascii="Cambria Math" w:hAnsi="Cambria Math"/>
+                    </w:rPr>
+                    <m:t>m</m:t>
+                  </m:r>
+                </m:sub>
+              </m:sSub>
+            </m:e>
+          </m:d>
+          <m:d>
+            <m:dPr>
+              <m:ctrlPr>
+                <w:rPr>
+                  <w:rFonts w:ascii="Cambria Math" w:hAnsi="Cambria Math"/>
+                  <w:i/>
+                  <w:iCs/>
+                </w:rPr>
+              </m:ctrlPr>
+            </m:dPr>
+            <m:e>
+              <m:sSub>
+                <m:sSubPr>
+                  <m:ctrlPr>
+                    <w:rPr>
+                      <w:rFonts w:ascii="Cambria Math" w:hAnsi="Cambria Math"/>
+                      <w:i/>
+                    </w:rPr>
+                  </m:ctrlPr>
+                </m:sSubPr>
+                <m:e>
+                  <m:r>
+                    <w:rPr>
+                      <w:rFonts w:ascii="Cambria Math" w:hAnsi="Cambria Math"/>
+                    </w:rPr>
+                    <m:t>I</m:t>
+                  </m:r>
+                </m:e>
+                <m:sub>
+                  <m:r>
+                    <w:rPr>
+                      <w:rFonts w:ascii="Cambria Math" w:hAnsi="Cambria Math"/>
+                    </w:rPr>
+                    <m:t>a,</m:t>
+                  </m:r>
+                  <m:r>
+                    <w:rPr>
+                      <w:rFonts w:ascii="Cambria Math" w:hAnsi="Cambria Math"/>
+                    </w:rPr>
+                    <m:t>m</m:t>
+                  </m:r>
+                </m:sub>
+              </m:sSub>
+              <m:r>
+                <w:rPr>
+                  <w:rFonts w:ascii="Cambria Math" w:hAnsi="Cambria Math"/>
+                </w:rPr>
+                <m:t>+</m:t>
+              </m:r>
+              <m:sSub>
+                <m:sSubPr>
+                  <m:ctrlPr>
+                    <w:rPr>
+                      <w:rFonts w:ascii="Cambria Math" w:hAnsi="Cambria Math"/>
+                      <w:i/>
+                    </w:rPr>
+                  </m:ctrlPr>
+                </m:sSubPr>
+                <m:e>
+                  <m:r>
+                    <w:rPr>
+                      <w:rFonts w:ascii="Cambria Math" w:hAnsi="Cambria Math"/>
+                    </w:rPr>
+                    <m:t>I</m:t>
+                  </m:r>
+                </m:e>
+                <m:sub>
+                  <m:r>
+                    <w:rPr>
+                      <w:rFonts w:ascii="Cambria Math" w:hAnsi="Cambria Math"/>
+                    </w:rPr>
+                    <m:t>c,</m:t>
+                  </m:r>
+                  <m:r>
+                    <w:rPr>
+                      <w:rFonts w:ascii="Cambria Math" w:hAnsi="Cambria Math"/>
+                    </w:rPr>
+                    <m:t>m</m:t>
+                  </m:r>
+                </m:sub>
+              </m:sSub>
+            </m:e>
+          </m:d>
+          <m:r>
+            <w:rPr>
+              <w:rFonts w:ascii="Cambria Math" w:hAnsi="Cambria Math"/>
+            </w:rPr>
+            <m:t>S</m:t>
+          </m:r>
+          <m:r>
+            <w:rPr>
+              <w:rFonts w:ascii="Cambria Math" w:eastAsiaTheme="minorEastAsia" w:hAnsi="Cambria Math"/>
+            </w:rPr>
+            <m:t>-(</m:t>
+          </m:r>
+          <m:sSub>
+            <m:sSubPr>
+              <m:ctrlPr>
+                <w:rPr>
+                  <w:rFonts w:ascii="Cambria Math" w:eastAsiaTheme="minorEastAsia" w:hAnsi="Cambria Math"/>
+                  <w:i/>
+                </w:rPr>
+              </m:ctrlPr>
+            </m:sSubPr>
+            <m:e>
+              <m:r>
+                <w:rPr>
+                  <w:rFonts w:ascii="Cambria Math" w:eastAsiaTheme="minorEastAsia" w:hAnsi="Cambria Math"/>
+                </w:rPr>
+                <m:t>v</m:t>
+              </m:r>
+            </m:e>
+            <m:sub>
+              <m:r>
+                <w:rPr>
+                  <w:rFonts w:ascii="Cambria Math" w:eastAsiaTheme="minorEastAsia" w:hAnsi="Cambria Math"/>
+                </w:rPr>
+                <m:t>m</m:t>
+              </m:r>
+            </m:sub>
+          </m:sSub>
+          <m:r>
+            <w:rPr>
+              <w:rFonts w:ascii="Cambria Math" w:eastAsiaTheme="minorEastAsia" w:hAnsi="Cambria Math"/>
+            </w:rPr>
+            <m:t>+μ)</m:t>
+          </m:r>
+          <m:sSub>
+            <m:sSubPr>
+              <m:ctrlPr>
+                <w:rPr>
+                  <w:rFonts w:ascii="Cambria Math" w:eastAsiaTheme="minorEastAsia" w:hAnsi="Cambria Math"/>
+                  <w:i/>
+                  <w:iCs/>
+                </w:rPr>
+              </m:ctrlPr>
+            </m:sSubPr>
+            <m:e>
+              <m:r>
+                <w:rPr>
+                  <w:rFonts w:ascii="Cambria Math" w:eastAsiaTheme="minorEastAsia" w:hAnsi="Cambria Math"/>
+                </w:rPr>
+                <m:t>I</m:t>
+              </m:r>
+            </m:e>
+            <m:sub>
+              <m:r>
+                <w:rPr>
+                  <w:rFonts w:ascii="Cambria Math" w:eastAsiaTheme="minorEastAsia" w:hAnsi="Cambria Math"/>
+                </w:rPr>
+                <m:t>c,</m:t>
+              </m:r>
+              <m:r>
+                <w:rPr>
+                  <w:rFonts w:ascii="Cambria Math" w:eastAsiaTheme="minorEastAsia" w:hAnsi="Cambria Math"/>
+                </w:rPr>
+                <m:t>m</m:t>
+              </m:r>
+            </m:sub>
+          </m:sSub>
+        </m:oMath>
+      </m:oMathPara>
+    </w:p>
+    <w:p>
+      <w:pPr>
+        <w:rPr>
+          <w:rFonts w:eastAsiaTheme="minorEastAsia"/>
+          <w:iCs/>
+        </w:rPr>
+      </w:pPr>
+    </w:p>
+    <w:p>
+      <w:pPr>
+        <w:rPr>
+          <w:rFonts w:eastAsiaTheme="minorEastAsia"/>
+          <w:iCs/>
+        </w:rPr>
+      </w:pPr>
+      <w:r>
+        <w:rPr>
+          <w:rFonts w:eastAsiaTheme="minorEastAsia"/>
+          <w:iCs/>
+        </w:rPr>
+        <w:t>Following a classic adaptive analysis approach, whether a mutant strain can invade and displace the resident is determined by the stability of the</w:t>
+      </w:r>
+      <w:r>
+        <w:rPr>
+          <w:rFonts w:eastAsiaTheme="minorEastAsia"/>
+          <w:iCs/>
+        </w:rPr>
+        <w:t xml:space="preserve"> mutant-free</w:t>
+      </w:r>
+      <w:r>
+        <w:rPr>
+          <w:rFonts w:eastAsiaTheme="minorEastAsia"/>
+          <w:iCs/>
+        </w:rPr>
+        <w:t xml:space="preserve"> equilibrium</w:t>
+      </w:r>
+      <w:r>
+        <w:rPr>
+          <w:rFonts w:eastAsiaTheme="minorEastAsia"/>
+          <w:iCs/>
+        </w:rPr>
+        <w:t xml:space="preserve"> </w:t>
+      </w:r>
+      <m:oMath>
+        <m:d>
+          <m:dPr>
+            <m:ctrlPr>
+              <w:rPr>
+                <w:rFonts w:ascii="Cambria Math" w:eastAsiaTheme="minorEastAsia" w:hAnsi="Cambria Math"/>
+                <w:i/>
+                <w:iCs/>
+              </w:rPr>
+            </m:ctrlPr>
+          </m:dPr>
+          <m:e>
+            <m:r>
+              <w:rPr>
+                <w:rFonts w:ascii="Cambria Math" w:eastAsiaTheme="minorEastAsia" w:hAnsi="Cambria Math"/>
+              </w:rPr>
+              <m:t>S,</m:t>
+            </m:r>
+            <m:sSub>
+              <m:sSubPr>
+                <m:ctrlPr>
+                  <w:rPr>
+                    <w:rFonts w:ascii="Cambria Math" w:eastAsiaTheme="minorEastAsia" w:hAnsi="Cambria Math"/>
+                    <w:i/>
+                    <w:iCs/>
+                  </w:rPr>
+                </m:ctrlPr>
+              </m:sSubPr>
+              <m:e>
+                <m:r>
+                  <w:rPr>
+                    <w:rFonts w:ascii="Cambria Math" w:eastAsiaTheme="minorEastAsia" w:hAnsi="Cambria Math"/>
+                  </w:rPr>
+                  <m:t>I</m:t>
+                </m:r>
+              </m:e>
+              <m:sub>
+                <m:r>
+                  <w:rPr>
+                    <w:rFonts w:ascii="Cambria Math" w:eastAsiaTheme="minorEastAsia" w:hAnsi="Cambria Math"/>
+                  </w:rPr>
+                  <m:t>a,r</m:t>
+                </m:r>
+              </m:sub>
+            </m:sSub>
+            <m:r>
+              <w:rPr>
+                <w:rFonts w:ascii="Cambria Math" w:eastAsiaTheme="minorEastAsia" w:hAnsi="Cambria Math"/>
+              </w:rPr>
+              <m:t>,</m:t>
+            </m:r>
+            <m:sSub>
+              <m:sSubPr>
+                <m:ctrlPr>
+                  <w:rPr>
+                    <w:rFonts w:ascii="Cambria Math" w:eastAsiaTheme="minorEastAsia" w:hAnsi="Cambria Math"/>
+                    <w:i/>
+                    <w:iCs/>
+                  </w:rPr>
+                </m:ctrlPr>
+              </m:sSubPr>
+              <m:e>
+                <m:r>
+                  <w:rPr>
+                    <w:rFonts w:ascii="Cambria Math" w:eastAsiaTheme="minorEastAsia" w:hAnsi="Cambria Math"/>
+                  </w:rPr>
+                  <m:t>I</m:t>
+                </m:r>
+              </m:e>
+              <m:sub>
+                <m:r>
+                  <w:rPr>
+                    <w:rFonts w:ascii="Cambria Math" w:eastAsiaTheme="minorEastAsia" w:hAnsi="Cambria Math"/>
+                  </w:rPr>
+                  <m:t>c,r</m:t>
+                </m:r>
+              </m:sub>
+            </m:sSub>
+            <m:r>
+              <w:rPr>
+                <w:rFonts w:ascii="Cambria Math" w:eastAsiaTheme="minorEastAsia" w:hAnsi="Cambria Math"/>
+              </w:rPr>
+              <m:t>,</m:t>
+            </m:r>
+            <m:sSub>
+              <m:sSubPr>
+                <m:ctrlPr>
+                  <w:rPr>
+                    <w:rFonts w:ascii="Cambria Math" w:eastAsiaTheme="minorEastAsia" w:hAnsi="Cambria Math"/>
+                    <w:i/>
+                    <w:iCs/>
+                  </w:rPr>
+                </m:ctrlPr>
+              </m:sSubPr>
+              <m:e>
+                <m:r>
+                  <w:rPr>
+                    <w:rFonts w:ascii="Cambria Math" w:eastAsiaTheme="minorEastAsia" w:hAnsi="Cambria Math"/>
+                  </w:rPr>
+                  <m:t>I</m:t>
+                </m:r>
+              </m:e>
+              <m:sub>
+                <m:r>
+                  <w:rPr>
+                    <w:rFonts w:ascii="Cambria Math" w:eastAsiaTheme="minorEastAsia" w:hAnsi="Cambria Math"/>
+                  </w:rPr>
+                  <m:t>a,m</m:t>
+                </m:r>
+              </m:sub>
+            </m:sSub>
+            <m:r>
+              <w:rPr>
+                <w:rFonts w:ascii="Cambria Math" w:eastAsiaTheme="minorEastAsia" w:hAnsi="Cambria Math"/>
+              </w:rPr>
+              <m:t>,</m:t>
+            </m:r>
+            <m:sSub>
+              <m:sSubPr>
+                <m:ctrlPr>
+                  <w:rPr>
+                    <w:rFonts w:ascii="Cambria Math" w:eastAsiaTheme="minorEastAsia" w:hAnsi="Cambria Math"/>
+                    <w:i/>
+                    <w:iCs/>
+                  </w:rPr>
+                </m:ctrlPr>
+              </m:sSubPr>
+              <m:e>
+                <m:r>
+                  <w:rPr>
+                    <w:rFonts w:ascii="Cambria Math" w:eastAsiaTheme="minorEastAsia" w:hAnsi="Cambria Math"/>
+                  </w:rPr>
+                  <m:t>I</m:t>
+                </m:r>
+              </m:e>
+              <m:sub>
+                <m:r>
+                  <w:rPr>
+                    <w:rFonts w:ascii="Cambria Math" w:eastAsiaTheme="minorEastAsia" w:hAnsi="Cambria Math"/>
+                  </w:rPr>
+                  <m:t>c,m</m:t>
+                </m:r>
+              </m:sub>
+            </m:sSub>
+          </m:e>
+        </m:d>
+        <m:r>
+          <w:rPr>
+            <w:rFonts w:ascii="Cambria Math" w:eastAsiaTheme="minorEastAsia" w:hAnsi="Cambria Math"/>
+          </w:rPr>
+          <m:t>=(</m:t>
+        </m:r>
+        <m:acc>
+          <m:accPr>
+            <m:ctrlPr>
+              <w:rPr>
+                <w:rFonts w:ascii="Cambria Math" w:eastAsiaTheme="minorEastAsia" w:hAnsi="Cambria Math"/>
+                <w:i/>
+                <w:iCs/>
+              </w:rPr>
+            </m:ctrlPr>
+          </m:accPr>
+          <m:e>
+            <m:r>
+              <w:rPr>
+                <w:rFonts w:ascii="Cambria Math" w:eastAsiaTheme="minorEastAsia" w:hAnsi="Cambria Math"/>
+              </w:rPr>
+              <m:t>S</m:t>
+            </m:r>
+          </m:e>
+        </m:acc>
+        <m:r>
+          <w:rPr>
+            <w:rFonts w:ascii="Cambria Math" w:eastAsiaTheme="minorEastAsia" w:hAnsi="Cambria Math"/>
+          </w:rPr>
+          <m:t xml:space="preserve">, </m:t>
+        </m:r>
+        <m:acc>
+          <m:accPr>
+            <m:ctrlPr>
+              <w:rPr>
+                <w:rFonts w:ascii="Cambria Math" w:eastAsiaTheme="minorEastAsia" w:hAnsi="Cambria Math"/>
+                <w:i/>
+                <w:iCs/>
+              </w:rPr>
+            </m:ctrlPr>
+          </m:accPr>
+          <m:e>
+            <m:sSub>
+              <m:sSubPr>
+                <m:ctrlPr>
+                  <w:rPr>
+                    <w:rFonts w:ascii="Cambria Math" w:eastAsiaTheme="minorEastAsia" w:hAnsi="Cambria Math"/>
+                    <w:i/>
+                    <w:iCs/>
+                  </w:rPr>
+                </m:ctrlPr>
+              </m:sSubPr>
+              <m:e>
+                <m:r>
+                  <w:rPr>
+                    <w:rFonts w:ascii="Cambria Math" w:eastAsiaTheme="minorEastAsia" w:hAnsi="Cambria Math"/>
+                  </w:rPr>
+                  <m:t>I</m:t>
+                </m:r>
+              </m:e>
+              <m:sub>
+                <m:r>
+                  <w:rPr>
+                    <w:rFonts w:ascii="Cambria Math" w:eastAsiaTheme="minorEastAsia" w:hAnsi="Cambria Math"/>
+                  </w:rPr>
+                  <m:t>a,r</m:t>
+                </m:r>
+              </m:sub>
+            </m:sSub>
+          </m:e>
+        </m:acc>
+        <m:r>
+          <w:rPr>
+            <w:rFonts w:ascii="Cambria Math" w:eastAsiaTheme="minorEastAsia" w:hAnsi="Cambria Math"/>
+          </w:rPr>
+          <m:t xml:space="preserve">, </m:t>
+        </m:r>
+        <m:acc>
+          <m:accPr>
+            <m:ctrlPr>
+              <w:rPr>
+                <w:rFonts w:ascii="Cambria Math" w:eastAsiaTheme="minorEastAsia" w:hAnsi="Cambria Math"/>
+                <w:i/>
+                <w:iCs/>
+              </w:rPr>
+            </m:ctrlPr>
+          </m:accPr>
+          <m:e>
+            <m:sSub>
+              <m:sSubPr>
+                <m:ctrlPr>
+                  <w:rPr>
+                    <w:rFonts w:ascii="Cambria Math" w:eastAsiaTheme="minorEastAsia" w:hAnsi="Cambria Math"/>
+                    <w:i/>
+                    <w:iCs/>
+                  </w:rPr>
+                </m:ctrlPr>
+              </m:sSubPr>
+              <m:e>
+                <m:r>
+                  <w:rPr>
+                    <w:rFonts w:ascii="Cambria Math" w:eastAsiaTheme="minorEastAsia" w:hAnsi="Cambria Math"/>
+                  </w:rPr>
+                  <m:t>I</m:t>
+                </m:r>
+              </m:e>
+              <m:sub>
+                <m:r>
+                  <w:rPr>
+                    <w:rFonts w:ascii="Cambria Math" w:eastAsiaTheme="minorEastAsia" w:hAnsi="Cambria Math"/>
+                  </w:rPr>
+                  <m:t>c</m:t>
+                </m:r>
+                <m:r>
+                  <w:rPr>
+                    <w:rFonts w:ascii="Cambria Math" w:eastAsiaTheme="minorEastAsia" w:hAnsi="Cambria Math"/>
+                  </w:rPr>
+                  <m:t>,r</m:t>
+                </m:r>
+              </m:sub>
+            </m:sSub>
+          </m:e>
+        </m:acc>
+        <m:r>
+          <w:rPr>
+            <w:rFonts w:ascii="Cambria Math" w:eastAsiaTheme="minorEastAsia" w:hAnsi="Cambria Math"/>
+          </w:rPr>
+          <m:t>, 0, 0)</m:t>
+        </m:r>
+      </m:oMath>
+      <w:r>
+        <w:rPr>
+          <w:rFonts w:eastAsiaTheme="minorEastAsia"/>
+          <w:iCs/>
+        </w:rPr>
+        <w:t>. This is given by the eigenvalues of the Jacobian matrix evaluated at that equilibrium. Given that the resident would attain a stable equilibrium if the resident was not present (that is, if the system of equations did not include the resident at all), then whether the mutant can invade is given by the eigenvalues of the matrix</w:t>
+      </w:r>
+    </w:p>
+    <w:p>
+      <w:pPr>
+        <w:rPr>
+          <w:rFonts w:eastAsiaTheme="minorEastAsia"/>
+          <w:iCs/>
+        </w:rPr>
+      </w:pPr>
+      <m:oMathPara>
+        <m:oMath>
+          <m:d>
+            <m:dPr>
+              <m:ctrlPr>
+                <w:rPr>
+                  <w:rFonts w:ascii="Cambria Math" w:eastAsiaTheme="minorEastAsia" w:hAnsi="Cambria Math"/>
+                  <w:i/>
+                  <w:iCs/>
+                </w:rPr>
+              </m:ctrlPr>
+            </m:dPr>
+            <m:e>
+              <m:m>
+                <m:mPr>
+                  <m:mcs>
+                    <m:mc>
+                      <m:mcPr>
+                        <m:count m:val="2"/>
+                        <m:mcJc m:val="center"/>
+                      </m:mcPr>
+                    </m:mc>
+                  </m:mcs>
+                  <m:ctrlPr>
+                    <w:rPr>
+                      <w:rFonts w:ascii="Cambria Math" w:eastAsiaTheme="minorEastAsia" w:hAnsi="Cambria Math"/>
+                      <w:i/>
+                      <w:iCs/>
+                    </w:rPr>
+                  </m:ctrlPr>
+                </m:mPr>
+                <m:mr>
+                  <m:e>
+                    <m:r>
+                      <w:rPr>
+                        <w:rFonts w:ascii="Cambria Math" w:eastAsiaTheme="minorEastAsia" w:hAnsi="Cambria Math"/>
+                      </w:rPr>
+                      <m:t>pβ</m:t>
+                    </m:r>
+                    <m:d>
+                      <m:dPr>
+                        <m:ctrlPr>
+                          <w:rPr>
+                            <w:rFonts w:ascii="Cambria Math" w:eastAsiaTheme="minorEastAsia" w:hAnsi="Cambria Math"/>
+                            <w:i/>
+                            <w:iCs/>
+                          </w:rPr>
+                        </m:ctrlPr>
+                      </m:dPr>
+                      <m:e>
+                        <m:sSub>
+                          <m:sSubPr>
+                            <m:ctrlPr>
+                              <w:rPr>
+                                <w:rFonts w:ascii="Cambria Math" w:eastAsiaTheme="minorEastAsia" w:hAnsi="Cambria Math"/>
+                                <w:i/>
+                                <w:iCs/>
+                              </w:rPr>
+                            </m:ctrlPr>
+                          </m:sSubPr>
+                          <m:e>
+                            <m:r>
+                              <w:rPr>
+                                <w:rFonts w:ascii="Cambria Math" w:eastAsiaTheme="minorEastAsia" w:hAnsi="Cambria Math"/>
+                              </w:rPr>
+                              <m:t>v</m:t>
+                            </m:r>
+                          </m:e>
+                          <m:sub>
+                            <m:r>
+                              <w:rPr>
+                                <w:rFonts w:ascii="Cambria Math" w:eastAsiaTheme="minorEastAsia" w:hAnsi="Cambria Math"/>
+                              </w:rPr>
+                              <m:t>m</m:t>
+                            </m:r>
+                          </m:sub>
+                        </m:sSub>
+                      </m:e>
+                    </m:d>
+                    <m:acc>
+                      <m:accPr>
+                        <m:ctrlPr>
+                          <w:rPr>
+                            <w:rFonts w:ascii="Cambria Math" w:eastAsiaTheme="minorEastAsia" w:hAnsi="Cambria Math"/>
+                            <w:i/>
+                            <w:iCs/>
+                          </w:rPr>
+                        </m:ctrlPr>
+                      </m:accPr>
+                      <m:e>
+                        <m:r>
+                          <w:rPr>
+                            <w:rFonts w:ascii="Cambria Math" w:eastAsiaTheme="minorEastAsia" w:hAnsi="Cambria Math"/>
+                          </w:rPr>
+                          <m:t>S</m:t>
+                        </m:r>
+                      </m:e>
+                    </m:acc>
+                    <m:r>
+                      <w:rPr>
+                        <w:rFonts w:ascii="Cambria Math" w:eastAsiaTheme="minorEastAsia" w:hAnsi="Cambria Math"/>
+                      </w:rPr>
+                      <m:t>-(</m:t>
+                    </m:r>
+                    <m:sSub>
+                      <m:sSubPr>
+                        <m:ctrlPr>
+                          <w:rPr>
+                            <w:rFonts w:ascii="Cambria Math" w:eastAsiaTheme="minorEastAsia" w:hAnsi="Cambria Math"/>
+                            <w:i/>
+                            <w:iCs/>
+                          </w:rPr>
+                        </m:ctrlPr>
+                      </m:sSubPr>
+                      <m:e>
+                        <m:r>
+                          <w:rPr>
+                            <w:rFonts w:ascii="Cambria Math" w:eastAsiaTheme="minorEastAsia" w:hAnsi="Cambria Math"/>
+                          </w:rPr>
+                          <m:t>v</m:t>
+                        </m:r>
+                      </m:e>
+                      <m:sub>
+                        <m:r>
+                          <w:rPr>
+                            <w:rFonts w:ascii="Cambria Math" w:eastAsiaTheme="minorEastAsia" w:hAnsi="Cambria Math"/>
+                          </w:rPr>
+                          <m:t>m</m:t>
+                        </m:r>
+                      </m:sub>
+                    </m:sSub>
+                    <m:r>
+                      <w:rPr>
+                        <w:rFonts w:ascii="Cambria Math" w:eastAsiaTheme="minorEastAsia" w:hAnsi="Cambria Math"/>
+                      </w:rPr>
+                      <m:t>+μ+γ)</m:t>
+                    </m:r>
+                  </m:e>
+                  <m:e>
+                    <m:r>
+                      <w:rPr>
+                        <w:rFonts w:ascii="Cambria Math" w:eastAsiaTheme="minorEastAsia" w:hAnsi="Cambria Math"/>
+                      </w:rPr>
+                      <m:t>pβ</m:t>
+                    </m:r>
+                    <m:d>
+                      <m:dPr>
+                        <m:ctrlPr>
+                          <w:rPr>
+                            <w:rFonts w:ascii="Cambria Math" w:eastAsiaTheme="minorEastAsia" w:hAnsi="Cambria Math"/>
+                            <w:i/>
+                            <w:iCs/>
+                          </w:rPr>
+                        </m:ctrlPr>
+                      </m:dPr>
+                      <m:e>
+                        <m:sSub>
+                          <m:sSubPr>
+                            <m:ctrlPr>
+                              <w:rPr>
+                                <w:rFonts w:ascii="Cambria Math" w:eastAsiaTheme="minorEastAsia" w:hAnsi="Cambria Math"/>
+                                <w:i/>
+                                <w:iCs/>
+                              </w:rPr>
+                            </m:ctrlPr>
+                          </m:sSubPr>
+                          <m:e>
+                            <m:r>
+                              <w:rPr>
+                                <w:rFonts w:ascii="Cambria Math" w:eastAsiaTheme="minorEastAsia" w:hAnsi="Cambria Math"/>
+                              </w:rPr>
+                              <m:t>v</m:t>
+                            </m:r>
+                          </m:e>
+                          <m:sub>
+                            <m:r>
+                              <w:rPr>
+                                <w:rFonts w:ascii="Cambria Math" w:eastAsiaTheme="minorEastAsia" w:hAnsi="Cambria Math"/>
+                              </w:rPr>
+                              <m:t>m</m:t>
+                            </m:r>
+                          </m:sub>
+                        </m:sSub>
+                      </m:e>
+                    </m:d>
+                    <m:acc>
+                      <m:accPr>
+                        <m:ctrlPr>
+                          <w:rPr>
+                            <w:rFonts w:ascii="Cambria Math" w:eastAsiaTheme="minorEastAsia" w:hAnsi="Cambria Math"/>
+                            <w:i/>
+                            <w:iCs/>
+                          </w:rPr>
+                        </m:ctrlPr>
+                      </m:accPr>
+                      <m:e>
+                        <m:r>
+                          <w:rPr>
+                            <w:rFonts w:ascii="Cambria Math" w:eastAsiaTheme="minorEastAsia" w:hAnsi="Cambria Math"/>
+                          </w:rPr>
+                          <m:t>S</m:t>
+                        </m:r>
+                      </m:e>
+                    </m:acc>
+                  </m:e>
+                </m:mr>
+                <m:mr>
+                  <m:e>
+                    <m:r>
+                      <w:rPr>
+                        <w:rFonts w:ascii="Cambria Math" w:eastAsiaTheme="minorEastAsia" w:hAnsi="Cambria Math"/>
+                      </w:rPr>
+                      <m:t>(1-</m:t>
+                    </m:r>
+                    <m:r>
+                      <w:rPr>
+                        <w:rFonts w:ascii="Cambria Math" w:eastAsiaTheme="minorEastAsia" w:hAnsi="Cambria Math"/>
+                      </w:rPr>
+                      <m:t>p</m:t>
+                    </m:r>
+                    <m:r>
+                      <w:rPr>
+                        <w:rFonts w:ascii="Cambria Math" w:eastAsiaTheme="minorEastAsia" w:hAnsi="Cambria Math"/>
+                      </w:rPr>
+                      <m:t>)</m:t>
+                    </m:r>
+                    <m:r>
+                      <w:rPr>
+                        <w:rFonts w:ascii="Cambria Math" w:eastAsiaTheme="minorEastAsia" w:hAnsi="Cambria Math"/>
+                      </w:rPr>
+                      <m:t>β</m:t>
+                    </m:r>
+                    <m:d>
+                      <m:dPr>
+                        <m:ctrlPr>
+                          <w:rPr>
+                            <w:rFonts w:ascii="Cambria Math" w:eastAsiaTheme="minorEastAsia" w:hAnsi="Cambria Math"/>
+                            <w:i/>
+                            <w:iCs/>
+                          </w:rPr>
+                        </m:ctrlPr>
+                      </m:dPr>
+                      <m:e>
+                        <m:sSub>
+                          <m:sSubPr>
+                            <m:ctrlPr>
+                              <w:rPr>
+                                <w:rFonts w:ascii="Cambria Math" w:eastAsiaTheme="minorEastAsia" w:hAnsi="Cambria Math"/>
+                                <w:i/>
+                                <w:iCs/>
+                              </w:rPr>
+                            </m:ctrlPr>
+                          </m:sSubPr>
+                          <m:e>
+                            <m:r>
+                              <w:rPr>
+                                <w:rFonts w:ascii="Cambria Math" w:eastAsiaTheme="minorEastAsia" w:hAnsi="Cambria Math"/>
+                              </w:rPr>
+                              <m:t>v</m:t>
+                            </m:r>
+                          </m:e>
+                          <m:sub>
+                            <m:r>
+                              <w:rPr>
+                                <w:rFonts w:ascii="Cambria Math" w:eastAsiaTheme="minorEastAsia" w:hAnsi="Cambria Math"/>
+                              </w:rPr>
+                              <m:t>m</m:t>
+                            </m:r>
+                          </m:sub>
+                        </m:sSub>
+                      </m:e>
+                    </m:d>
+                    <m:acc>
+                      <m:accPr>
+                        <m:ctrlPr>
+                          <w:rPr>
+                            <w:rFonts w:ascii="Cambria Math" w:eastAsiaTheme="minorEastAsia" w:hAnsi="Cambria Math"/>
+                            <w:i/>
+                            <w:iCs/>
+                          </w:rPr>
+                        </m:ctrlPr>
+                      </m:accPr>
+                      <m:e>
+                        <m:r>
+                          <w:rPr>
+                            <w:rFonts w:ascii="Cambria Math" w:eastAsiaTheme="minorEastAsia" w:hAnsi="Cambria Math"/>
+                          </w:rPr>
+                          <m:t>S</m:t>
+                        </m:r>
+                      </m:e>
+                    </m:acc>
+                  </m:e>
+                  <m:e>
+                    <m:d>
+                      <m:dPr>
+                        <m:ctrlPr>
+                          <w:rPr>
+                            <w:rFonts w:ascii="Cambria Math" w:eastAsiaTheme="minorEastAsia" w:hAnsi="Cambria Math"/>
+                            <w:i/>
+                            <w:iCs/>
+                          </w:rPr>
+                        </m:ctrlPr>
+                      </m:dPr>
+                      <m:e>
+                        <m:r>
+                          <w:rPr>
+                            <w:rFonts w:ascii="Cambria Math" w:eastAsiaTheme="minorEastAsia" w:hAnsi="Cambria Math"/>
+                          </w:rPr>
+                          <m:t>1-p</m:t>
+                        </m:r>
+                      </m:e>
+                    </m:d>
+                    <m:r>
+                      <w:rPr>
+                        <w:rFonts w:ascii="Cambria Math" w:eastAsiaTheme="minorEastAsia" w:hAnsi="Cambria Math"/>
+                      </w:rPr>
+                      <m:t>β</m:t>
+                    </m:r>
+                    <m:d>
+                      <m:dPr>
+                        <m:ctrlPr>
+                          <w:rPr>
+                            <w:rFonts w:ascii="Cambria Math" w:eastAsiaTheme="minorEastAsia" w:hAnsi="Cambria Math"/>
+                            <w:i/>
+                            <w:iCs/>
+                          </w:rPr>
+                        </m:ctrlPr>
+                      </m:dPr>
+                      <m:e>
+                        <m:sSub>
+                          <m:sSubPr>
+                            <m:ctrlPr>
+                              <w:rPr>
+                                <w:rFonts w:ascii="Cambria Math" w:eastAsiaTheme="minorEastAsia" w:hAnsi="Cambria Math"/>
+                                <w:i/>
+                                <w:iCs/>
+                              </w:rPr>
+                            </m:ctrlPr>
+                          </m:sSubPr>
+                          <m:e>
+                            <m:r>
+                              <w:rPr>
+                                <w:rFonts w:ascii="Cambria Math" w:eastAsiaTheme="minorEastAsia" w:hAnsi="Cambria Math"/>
+                              </w:rPr>
+                              <m:t>v</m:t>
+                            </m:r>
+                          </m:e>
+                          <m:sub>
+                            <m:r>
+                              <w:rPr>
+                                <w:rFonts w:ascii="Cambria Math" w:eastAsiaTheme="minorEastAsia" w:hAnsi="Cambria Math"/>
+                              </w:rPr>
+                              <m:t>m</m:t>
+                            </m:r>
+                          </m:sub>
+                        </m:sSub>
+                      </m:e>
+                    </m:d>
+                    <m:acc>
+                      <m:accPr>
+                        <m:ctrlPr>
+                          <w:rPr>
+                            <w:rFonts w:ascii="Cambria Math" w:eastAsiaTheme="minorEastAsia" w:hAnsi="Cambria Math"/>
+                            <w:i/>
+                            <w:iCs/>
+                          </w:rPr>
+                        </m:ctrlPr>
+                      </m:accPr>
+                      <m:e>
+                        <m:r>
+                          <w:rPr>
+                            <w:rFonts w:ascii="Cambria Math" w:eastAsiaTheme="minorEastAsia" w:hAnsi="Cambria Math"/>
+                          </w:rPr>
+                          <m:t>S</m:t>
+                        </m:r>
+                      </m:e>
+                    </m:acc>
+                    <m:r>
+                      <w:rPr>
+                        <w:rFonts w:ascii="Cambria Math" w:eastAsiaTheme="minorEastAsia" w:hAnsi="Cambria Math"/>
+                      </w:rPr>
+                      <m:t>-(</m:t>
+                    </m:r>
+                    <m:sSub>
+                      <m:sSubPr>
+                        <m:ctrlPr>
+                          <w:rPr>
+                            <w:rFonts w:ascii="Cambria Math" w:eastAsiaTheme="minorEastAsia" w:hAnsi="Cambria Math"/>
+                            <w:i/>
+                            <w:iCs/>
+                          </w:rPr>
+                        </m:ctrlPr>
+                      </m:sSubPr>
+                      <m:e>
+                        <m:r>
+                          <w:rPr>
+                            <w:rFonts w:ascii="Cambria Math" w:eastAsiaTheme="minorEastAsia" w:hAnsi="Cambria Math"/>
+                          </w:rPr>
+                          <m:t>v</m:t>
+                        </m:r>
+                      </m:e>
+                      <m:sub>
+                        <m:r>
+                          <w:rPr>
+                            <w:rFonts w:ascii="Cambria Math" w:eastAsiaTheme="minorEastAsia" w:hAnsi="Cambria Math"/>
+                          </w:rPr>
+                          <m:t>m</m:t>
+                        </m:r>
+                      </m:sub>
+                    </m:sSub>
+                    <m:r>
+                      <w:rPr>
+                        <w:rFonts w:ascii="Cambria Math" w:eastAsiaTheme="minorEastAsia" w:hAnsi="Cambria Math"/>
+                      </w:rPr>
+                      <m:t>+μ)</m:t>
+                    </m:r>
+                  </m:e>
+                </m:mr>
+              </m:m>
+            </m:e>
+          </m:d>
+          <m:r>
+            <w:rPr>
+              <w:rFonts w:ascii="Cambria Math" w:eastAsiaTheme="minorEastAsia" w:hAnsi="Cambria Math"/>
+            </w:rPr>
+            <m:t>.</m:t>
+          </m:r>
+        </m:oMath>
+      </m:oMathPara>
+    </w:p>
+    <w:p>
+      <w:pPr>
+        <w:rPr>
+          <w:rFonts w:eastAsiaTheme="minorEastAsia"/>
+          <w:iCs/>
+        </w:rPr>
+      </w:pPr>
+    </w:p>
+    <w:p>
+      <w:pPr>
+        <w:rPr>
+          <w:rFonts w:eastAsiaTheme="minorEastAsia"/>
+          <w:iCs/>
+        </w:rPr>
+      </w:pPr>
+      <w:r>
+        <w:rPr>
+          <w:rFonts w:eastAsiaTheme="minorEastAsia"/>
+          <w:iCs/>
+        </w:rPr>
+        <w:t xml:space="preserve">The eigenvalues of this matrix are difficult to interpret, but </w:t>
+      </w:r>
+      <w:r>
+        <w:rPr>
+          <w:rFonts w:eastAsiaTheme="minorEastAsia"/>
+          <w:iCs/>
+        </w:rPr>
+        <w:t>a more biologically interpretable expression for the invasion criterion can be used by applying the next generation theorem (Hurford et al. 2010) to the above matrix. This leads to the following condition for the mutant to be able to invade:</w:t>
+      </w:r>
+    </w:p>
+    <w:p>
+      <w:pPr>
+        <w:rPr>
+          <w:rFonts w:eastAsiaTheme="minorEastAsia"/>
+          <w:iCs/>
+        </w:rPr>
+      </w:pPr>
+      <m:oMathPara>
+        <m:oMath>
+          <m:f>
+            <m:fPr>
+              <m:ctrlPr>
+                <w:rPr>
+                  <w:rFonts w:ascii="Cambria Math" w:eastAsiaTheme="minorEastAsia" w:hAnsi="Cambria Math"/>
+                  <w:i/>
+                  <w:iCs/>
+                </w:rPr>
+              </m:ctrlPr>
+            </m:fPr>
+            <m:num>
+              <m:r>
+                <w:rPr>
+                  <w:rFonts w:ascii="Cambria Math" w:eastAsiaTheme="minorEastAsia" w:hAnsi="Cambria Math"/>
+                </w:rPr>
+                <m:t>pβ</m:t>
+              </m:r>
+              <m:d>
+                <m:dPr>
+                  <m:ctrlPr>
+                    <w:rPr>
+                      <w:rFonts w:ascii="Cambria Math" w:eastAsiaTheme="minorEastAsia" w:hAnsi="Cambria Math"/>
+                      <w:i/>
+                      <w:iCs/>
+                    </w:rPr>
+                  </m:ctrlPr>
+                </m:dPr>
+                <m:e>
+                  <m:sSub>
+                    <m:sSubPr>
+                      <m:ctrlPr>
+                        <w:rPr>
+                          <w:rFonts w:ascii="Cambria Math" w:eastAsiaTheme="minorEastAsia" w:hAnsi="Cambria Math"/>
+                          <w:i/>
+                          <w:iCs/>
+                        </w:rPr>
+                      </m:ctrlPr>
+                    </m:sSubPr>
+                    <m:e>
+                      <m:r>
+                        <w:rPr>
+                          <w:rFonts w:ascii="Cambria Math" w:eastAsiaTheme="minorEastAsia" w:hAnsi="Cambria Math"/>
+                        </w:rPr>
+                        <m:t>v</m:t>
+                      </m:r>
+                    </m:e>
+                    <m:sub>
+                      <m:r>
+                        <w:rPr>
+                          <w:rFonts w:ascii="Cambria Math" w:eastAsiaTheme="minorEastAsia" w:hAnsi="Cambria Math"/>
+                        </w:rPr>
+                        <m:t>m</m:t>
+                      </m:r>
+                    </m:sub>
+                  </m:sSub>
+                </m:e>
+              </m:d>
+              <m:acc>
+                <m:accPr>
+                  <m:ctrlPr>
+                    <w:rPr>
+                      <w:rFonts w:ascii="Cambria Math" w:eastAsiaTheme="minorEastAsia" w:hAnsi="Cambria Math"/>
+                      <w:i/>
+                      <w:iCs/>
+                    </w:rPr>
+                  </m:ctrlPr>
+                </m:accPr>
+                <m:e>
+                  <m:r>
+                    <w:rPr>
+                      <w:rFonts w:ascii="Cambria Math" w:eastAsiaTheme="minorEastAsia" w:hAnsi="Cambria Math"/>
+                    </w:rPr>
+                    <m:t>S</m:t>
+                  </m:r>
+                </m:e>
+              </m:acc>
+            </m:num>
+            <m:den>
+              <m:sSub>
+                <m:sSubPr>
+                  <m:ctrlPr>
+                    <w:rPr>
+                      <w:rFonts w:ascii="Cambria Math" w:eastAsiaTheme="minorEastAsia" w:hAnsi="Cambria Math"/>
+                      <w:i/>
+                      <w:iCs/>
+                    </w:rPr>
+                  </m:ctrlPr>
+                </m:sSubPr>
+                <m:e>
+                  <m:r>
+                    <w:rPr>
+                      <w:rFonts w:ascii="Cambria Math" w:eastAsiaTheme="minorEastAsia" w:hAnsi="Cambria Math"/>
+                    </w:rPr>
+                    <m:t>v</m:t>
+                  </m:r>
+                </m:e>
+                <m:sub>
+                  <m:r>
+                    <w:rPr>
+                      <w:rFonts w:ascii="Cambria Math" w:eastAsiaTheme="minorEastAsia" w:hAnsi="Cambria Math"/>
+                    </w:rPr>
+                    <m:t>m</m:t>
+                  </m:r>
+                </m:sub>
+              </m:sSub>
+              <m:r>
+                <w:rPr>
+                  <w:rFonts w:ascii="Cambria Math" w:eastAsiaTheme="minorEastAsia" w:hAnsi="Cambria Math"/>
+                </w:rPr>
+                <m:t>+μ+γ</m:t>
+              </m:r>
+            </m:den>
+          </m:f>
+          <m:r>
+            <w:rPr>
+              <w:rFonts w:ascii="Cambria Math" w:eastAsiaTheme="minorEastAsia" w:hAnsi="Cambria Math"/>
+            </w:rPr>
+            <m:t>+</m:t>
+          </m:r>
+          <m:f>
+            <m:fPr>
+              <m:ctrlPr>
+                <w:rPr>
+                  <w:rFonts w:ascii="Cambria Math" w:eastAsiaTheme="minorEastAsia" w:hAnsi="Cambria Math"/>
+                  <w:i/>
+                  <w:iCs/>
+                </w:rPr>
+              </m:ctrlPr>
+            </m:fPr>
+            <m:num>
+              <m:d>
+                <m:dPr>
+                  <m:ctrlPr>
+                    <w:rPr>
+                      <w:rFonts w:ascii="Cambria Math" w:eastAsiaTheme="minorEastAsia" w:hAnsi="Cambria Math"/>
+                      <w:i/>
+                      <w:iCs/>
+                    </w:rPr>
+                  </m:ctrlPr>
+                </m:dPr>
+                <m:e>
+                  <m:r>
+                    <w:rPr>
+                      <w:rFonts w:ascii="Cambria Math" w:eastAsiaTheme="minorEastAsia" w:hAnsi="Cambria Math"/>
+                    </w:rPr>
+                    <m:t>1-p</m:t>
+                  </m:r>
+                </m:e>
+              </m:d>
+              <m:r>
+                <w:rPr>
+                  <w:rFonts w:ascii="Cambria Math" w:eastAsiaTheme="minorEastAsia" w:hAnsi="Cambria Math"/>
+                </w:rPr>
+                <m:t>β</m:t>
+              </m:r>
+              <m:d>
+                <m:dPr>
+                  <m:ctrlPr>
+                    <w:rPr>
+                      <w:rFonts w:ascii="Cambria Math" w:eastAsiaTheme="minorEastAsia" w:hAnsi="Cambria Math"/>
+                      <w:i/>
+                      <w:iCs/>
+                    </w:rPr>
+                  </m:ctrlPr>
+                </m:dPr>
+                <m:e>
+                  <m:sSub>
+                    <m:sSubPr>
+                      <m:ctrlPr>
+                        <w:rPr>
+                          <w:rFonts w:ascii="Cambria Math" w:eastAsiaTheme="minorEastAsia" w:hAnsi="Cambria Math"/>
+                          <w:i/>
+                          <w:iCs/>
+                        </w:rPr>
+                      </m:ctrlPr>
+                    </m:sSubPr>
+                    <m:e>
+                      <m:r>
+                        <w:rPr>
+                          <w:rFonts w:ascii="Cambria Math" w:eastAsiaTheme="minorEastAsia" w:hAnsi="Cambria Math"/>
+                        </w:rPr>
+                        <m:t>v</m:t>
+                      </m:r>
+                    </m:e>
+                    <m:sub>
+                      <m:r>
+                        <w:rPr>
+                          <w:rFonts w:ascii="Cambria Math" w:eastAsiaTheme="minorEastAsia" w:hAnsi="Cambria Math"/>
+                        </w:rPr>
+                        <m:t>m</m:t>
+                      </m:r>
+                    </m:sub>
+                  </m:sSub>
+                </m:e>
+              </m:d>
+              <m:acc>
+                <m:accPr>
+                  <m:ctrlPr>
+                    <w:rPr>
+                      <w:rFonts w:ascii="Cambria Math" w:eastAsiaTheme="minorEastAsia" w:hAnsi="Cambria Math"/>
+                      <w:i/>
+                      <w:iCs/>
+                    </w:rPr>
+                  </m:ctrlPr>
+                </m:accPr>
+                <m:e>
+                  <m:r>
+                    <w:rPr>
+                      <w:rFonts w:ascii="Cambria Math" w:eastAsiaTheme="minorEastAsia" w:hAnsi="Cambria Math"/>
+                    </w:rPr>
+                    <m:t>S</m:t>
+                  </m:r>
+                </m:e>
+              </m:acc>
+            </m:num>
+            <m:den>
+              <m:sSub>
+                <m:sSubPr>
+                  <m:ctrlPr>
+                    <w:rPr>
+                      <w:rFonts w:ascii="Cambria Math" w:eastAsiaTheme="minorEastAsia" w:hAnsi="Cambria Math"/>
+                      <w:i/>
+                      <w:iCs/>
+                    </w:rPr>
+                  </m:ctrlPr>
+                </m:sSubPr>
+                <m:e>
+                  <m:r>
+                    <w:rPr>
+                      <w:rFonts w:ascii="Cambria Math" w:eastAsiaTheme="minorEastAsia" w:hAnsi="Cambria Math"/>
+                    </w:rPr>
+                    <m:t>v</m:t>
+                  </m:r>
+                </m:e>
+                <m:sub>
+                  <m:r>
+                    <w:rPr>
+                      <w:rFonts w:ascii="Cambria Math" w:eastAsiaTheme="minorEastAsia" w:hAnsi="Cambria Math"/>
+                    </w:rPr>
+                    <m:t>m</m:t>
+                  </m:r>
+                </m:sub>
+              </m:sSub>
+              <m:r>
+                <w:rPr>
+                  <w:rFonts w:ascii="Cambria Math" w:eastAsiaTheme="minorEastAsia" w:hAnsi="Cambria Math"/>
+                </w:rPr>
+                <m:t>+μ</m:t>
+              </m:r>
+            </m:den>
+          </m:f>
+          <m:r>
+            <w:rPr>
+              <w:rFonts w:ascii="Cambria Math" w:eastAsiaTheme="minorEastAsia" w:hAnsi="Cambria Math"/>
+            </w:rPr>
+            <m:t>&gt;1,</m:t>
+          </m:r>
+        </m:oMath>
+      </m:oMathPara>
+    </w:p>
+    <w:p>
+      <w:pPr>
+        <w:rPr>
+          <w:rFonts w:eastAsiaTheme="minorEastAsia"/>
+          <w:iCs/>
+        </w:rPr>
+      </w:pPr>
+      <w:r>
+        <w:rPr>
+          <w:rFonts w:eastAsiaTheme="minorEastAsia"/>
+          <w:iCs/>
+        </w:rPr>
+        <w:br/>
+      </w:r>
+      <w:r>
+        <w:rPr>
+          <w:rFonts w:eastAsiaTheme="minorEastAsia"/>
+          <w:iCs/>
+        </w:rPr>
+        <w:t>which can be interpreted as the expected number of new infections caused by an acute infection plus the expected number of new infections caused by a chronic infection. If this quantity is greater than one, then the mutant parasite can spread among the susceptible hosts that are left over by the resident strain (</w:t>
+      </w:r>
+      <m:oMath>
+        <m:acc>
+          <m:accPr>
+            <m:ctrlPr>
+              <w:rPr>
+                <w:rFonts w:ascii="Cambria Math" w:eastAsiaTheme="minorEastAsia" w:hAnsi="Cambria Math"/>
+                <w:i/>
+                <w:iCs/>
+              </w:rPr>
+            </m:ctrlPr>
+          </m:accPr>
+          <m:e>
+            <m:r>
+              <w:rPr>
+                <w:rFonts w:ascii="Cambria Math" w:eastAsiaTheme="minorEastAsia" w:hAnsi="Cambria Math"/>
+              </w:rPr>
+              <m:t>S</m:t>
+            </m:r>
+          </m:e>
+        </m:acc>
+      </m:oMath>
+      <w:r>
+        <w:rPr>
+          <w:rFonts w:eastAsiaTheme="minorEastAsia"/>
+          <w:iCs/>
+        </w:rPr>
+        <w:t>). This means that the mutant is suppressing the number of susceptible hosts below the number where the resident can persist. That is, evolution will lead to the minimization of the number of susceptible (the so-called pessimization principle of adaptive dynamics).</w:t>
+      </w:r>
+    </w:p>
+    <w:p>
+      <w:pPr>
+        <w:rPr>
+          <w:rFonts w:eastAsiaTheme="minorEastAsia"/>
+          <w:iCs/>
+        </w:rPr>
+      </w:pPr>
+    </w:p>
+    <w:p>
+      <w:pPr>
+        <w:rPr>
+          <w:rFonts w:eastAsiaTheme="minorEastAsia"/>
+          <w:iCs/>
+        </w:rPr>
+      </w:pPr>
+      <w:r>
+        <w:rPr>
+          <w:rFonts w:eastAsiaTheme="minorEastAsia"/>
+          <w:iCs/>
+        </w:rPr>
+        <w:t>Potential endpoints of evolution are found by finding the roots of the derivative of the above expression with respect to the evolving trait (</w:t>
+      </w:r>
+      <m:oMath>
+        <m:sSub>
+          <m:sSubPr>
+            <m:ctrlPr>
+              <w:rPr>
+                <w:rFonts w:ascii="Cambria Math" w:eastAsiaTheme="minorEastAsia" w:hAnsi="Cambria Math"/>
+                <w:i/>
+                <w:iCs/>
+              </w:rPr>
+            </m:ctrlPr>
+          </m:sSubPr>
+          <m:e>
+            <m:r>
+              <w:rPr>
+                <w:rFonts w:ascii="Cambria Math" w:eastAsiaTheme="minorEastAsia" w:hAnsi="Cambria Math"/>
+              </w:rPr>
+              <m:t>v</m:t>
+            </m:r>
+          </m:e>
+          <m:sub>
+            <m:r>
+              <w:rPr>
+                <w:rFonts w:ascii="Cambria Math" w:eastAsiaTheme="minorEastAsia" w:hAnsi="Cambria Math"/>
+              </w:rPr>
+              <m:t>m</m:t>
+            </m:r>
+          </m:sub>
+        </m:sSub>
+      </m:oMath>
+      <w:r>
+        <w:rPr>
+          <w:rFonts w:eastAsiaTheme="minorEastAsia"/>
+          <w:iCs/>
+        </w:rPr>
+        <w:t>)</w:t>
+      </w:r>
+      <w:r>
+        <w:rPr>
+          <w:rFonts w:eastAsiaTheme="minorEastAsia"/>
+          <w:iCs/>
+        </w:rPr>
+        <w:t xml:space="preserve">, that is, by solving the following equation for </w:t>
+      </w:r>
+      <m:oMath>
+        <m:sSub>
+          <m:sSubPr>
+            <m:ctrlPr>
+              <w:rPr>
+                <w:rFonts w:ascii="Cambria Math" w:eastAsiaTheme="minorEastAsia" w:hAnsi="Cambria Math"/>
+                <w:i/>
+                <w:iCs/>
+              </w:rPr>
+            </m:ctrlPr>
+          </m:sSubPr>
+          <m:e>
+            <m:r>
+              <w:rPr>
+                <w:rFonts w:ascii="Cambria Math" w:eastAsiaTheme="minorEastAsia" w:hAnsi="Cambria Math"/>
+              </w:rPr>
+              <m:t>v</m:t>
+            </m:r>
+          </m:e>
+          <m:sub>
+            <m:r>
+              <w:rPr>
+                <w:rFonts w:ascii="Cambria Math" w:eastAsiaTheme="minorEastAsia" w:hAnsi="Cambria Math"/>
+              </w:rPr>
+              <m:t>m</m:t>
+            </m:r>
+          </m:sub>
+        </m:sSub>
+        <m:r>
+          <w:rPr>
+            <w:rFonts w:ascii="Cambria Math" w:eastAsiaTheme="minorEastAsia" w:hAnsi="Cambria Math"/>
+          </w:rPr>
+          <m:t>:</m:t>
+        </m:r>
+      </m:oMath>
+    </w:p>
+    <w:p>
+      <w:pPr>
+        <w:rPr>
+          <w:rFonts w:eastAsiaTheme="minorEastAsia"/>
+          <w:iCs/>
+        </w:rPr>
+      </w:pPr>
+      <m:oMathPara>
+        <m:oMath>
+          <m:d>
+            <m:dPr>
+              <m:ctrlPr>
+                <w:rPr>
+                  <w:rFonts w:ascii="Cambria Math" w:eastAsiaTheme="minorEastAsia" w:hAnsi="Cambria Math"/>
+                  <w:iCs/>
+                </w:rPr>
+              </m:ctrlPr>
+            </m:dPr>
+            <m:e>
+              <m:sSub>
+                <m:sSubPr>
+                  <m:ctrlPr>
+                    <w:rPr>
+                      <w:rFonts w:ascii="Cambria Math" w:eastAsiaTheme="minorEastAsia" w:hAnsi="Cambria Math"/>
+                      <w:i/>
+                      <w:iCs/>
+                    </w:rPr>
+                  </m:ctrlPr>
+                </m:sSubPr>
+                <m:e>
+                  <m:r>
+                    <w:rPr>
+                      <w:rFonts w:ascii="Cambria Math" w:eastAsiaTheme="minorEastAsia" w:hAnsi="Cambria Math"/>
+                    </w:rPr>
+                    <m:t>v</m:t>
+                  </m:r>
+                </m:e>
+                <m:sub>
+                  <m:r>
+                    <w:rPr>
+                      <w:rFonts w:ascii="Cambria Math" w:eastAsiaTheme="minorEastAsia" w:hAnsi="Cambria Math"/>
+                    </w:rPr>
+                    <m:t>m</m:t>
+                  </m:r>
+                </m:sub>
+              </m:sSub>
+              <m:r>
+                <w:rPr>
+                  <w:rFonts w:ascii="Cambria Math" w:eastAsiaTheme="minorEastAsia" w:hAnsi="Cambria Math"/>
+                </w:rPr>
+                <m:t>+μ</m:t>
+              </m:r>
+            </m:e>
+          </m:d>
+          <m:d>
+            <m:dPr>
+              <m:ctrlPr>
+                <w:rPr>
+                  <w:rFonts w:ascii="Cambria Math" w:eastAsiaTheme="minorEastAsia" w:hAnsi="Cambria Math"/>
+                  <w:iCs/>
+                </w:rPr>
+              </m:ctrlPr>
+            </m:dPr>
+            <m:e>
+              <m:sSub>
+                <m:sSubPr>
+                  <m:ctrlPr>
+                    <w:rPr>
+                      <w:rFonts w:ascii="Cambria Math" w:eastAsiaTheme="minorEastAsia" w:hAnsi="Cambria Math"/>
+                      <w:i/>
+                      <w:iCs/>
+                    </w:rPr>
+                  </m:ctrlPr>
+                </m:sSubPr>
+                <m:e>
+                  <m:r>
+                    <w:rPr>
+                      <w:rFonts w:ascii="Cambria Math" w:eastAsiaTheme="minorEastAsia" w:hAnsi="Cambria Math"/>
+                    </w:rPr>
+                    <m:t>v</m:t>
+                  </m:r>
+                </m:e>
+                <m:sub>
+                  <m:r>
+                    <w:rPr>
+                      <w:rFonts w:ascii="Cambria Math" w:eastAsiaTheme="minorEastAsia" w:hAnsi="Cambria Math"/>
+                    </w:rPr>
+                    <m:t>m</m:t>
+                  </m:r>
+                </m:sub>
+              </m:sSub>
+              <m:r>
+                <w:rPr>
+                  <w:rFonts w:ascii="Cambria Math" w:eastAsiaTheme="minorEastAsia" w:hAnsi="Cambria Math"/>
+                </w:rPr>
+                <m:t>+γ+μ</m:t>
+              </m:r>
+            </m:e>
+          </m:d>
+          <m:r>
+            <w:rPr>
+              <w:rFonts w:ascii="Cambria Math" w:eastAsiaTheme="minorEastAsia" w:hAnsi="Cambria Math"/>
+            </w:rPr>
+            <m:t>β</m:t>
+          </m:r>
+          <m:d>
+            <m:dPr>
+              <m:ctrlPr>
+                <w:rPr>
+                  <w:rFonts w:ascii="Cambria Math" w:eastAsiaTheme="minorEastAsia" w:hAnsi="Cambria Math"/>
+                  <w:i/>
+                  <w:iCs/>
+                </w:rPr>
+              </m:ctrlPr>
+            </m:dPr>
+            <m:e>
+              <m:sSub>
+                <m:sSubPr>
+                  <m:ctrlPr>
+                    <w:rPr>
+                      <w:rFonts w:ascii="Cambria Math" w:eastAsiaTheme="minorEastAsia" w:hAnsi="Cambria Math"/>
+                      <w:i/>
+                      <w:iCs/>
+                    </w:rPr>
+                  </m:ctrlPr>
+                </m:sSubPr>
+                <m:e>
+                  <m:r>
+                    <w:rPr>
+                      <w:rFonts w:ascii="Cambria Math" w:eastAsiaTheme="minorEastAsia" w:hAnsi="Cambria Math"/>
+                    </w:rPr>
+                    <m:t>v</m:t>
+                  </m:r>
+                </m:e>
+                <m:sub>
+                  <m:r>
+                    <w:rPr>
+                      <w:rFonts w:ascii="Cambria Math" w:eastAsiaTheme="minorEastAsia" w:hAnsi="Cambria Math"/>
+                    </w:rPr>
+                    <m:t>m</m:t>
+                  </m:r>
+                </m:sub>
+              </m:sSub>
+            </m:e>
+          </m:d>
+          <m:r>
+            <w:rPr>
+              <w:rFonts w:ascii="Cambria Math" w:eastAsiaTheme="minorEastAsia" w:hAnsi="Cambria Math"/>
+            </w:rPr>
+            <m:t>-</m:t>
+          </m:r>
+          <m:d>
+            <m:dPr>
+              <m:ctrlPr>
+                <w:rPr>
+                  <w:rFonts w:ascii="Cambria Math" w:eastAsiaTheme="minorEastAsia" w:hAnsi="Cambria Math"/>
+                  <w:iCs/>
+                </w:rPr>
+              </m:ctrlPr>
+            </m:dPr>
+            <m:e>
+              <m:sSub>
+                <m:sSubPr>
+                  <m:ctrlPr>
+                    <w:rPr>
+                      <w:rFonts w:ascii="Cambria Math" w:eastAsiaTheme="minorEastAsia" w:hAnsi="Cambria Math"/>
+                      <w:i/>
+                      <w:iCs/>
+                    </w:rPr>
+                  </m:ctrlPr>
+                </m:sSubPr>
+                <m:e>
+                  <m:r>
+                    <w:rPr>
+                      <w:rFonts w:ascii="Cambria Math" w:eastAsiaTheme="minorEastAsia" w:hAnsi="Cambria Math"/>
+                    </w:rPr>
+                    <m:t>v</m:t>
+                  </m:r>
+                </m:e>
+                <m:sub>
+                  <m:r>
+                    <w:rPr>
+                      <w:rFonts w:ascii="Cambria Math" w:eastAsiaTheme="minorEastAsia" w:hAnsi="Cambria Math"/>
+                    </w:rPr>
+                    <m:t>m</m:t>
+                  </m:r>
+                </m:sub>
+              </m:sSub>
+              <m:r>
+                <w:rPr>
+                  <w:rFonts w:ascii="Cambria Math" w:eastAsiaTheme="minorEastAsia" w:hAnsi="Cambria Math"/>
+                </w:rPr>
+                <m:t>+μ</m:t>
+              </m:r>
+            </m:e>
+          </m:d>
+          <m:d>
+            <m:dPr>
+              <m:ctrlPr>
+                <w:rPr>
+                  <w:rFonts w:ascii="Cambria Math" w:eastAsiaTheme="minorEastAsia" w:hAnsi="Cambria Math"/>
+                  <w:iCs/>
+                </w:rPr>
+              </m:ctrlPr>
+            </m:dPr>
+            <m:e>
+              <m:sSub>
+                <m:sSubPr>
+                  <m:ctrlPr>
+                    <w:rPr>
+                      <w:rFonts w:ascii="Cambria Math" w:eastAsiaTheme="minorEastAsia" w:hAnsi="Cambria Math"/>
+                      <w:i/>
+                      <w:iCs/>
+                    </w:rPr>
+                  </m:ctrlPr>
+                </m:sSubPr>
+                <m:e>
+                  <m:r>
+                    <w:rPr>
+                      <w:rFonts w:ascii="Cambria Math" w:eastAsiaTheme="minorEastAsia" w:hAnsi="Cambria Math"/>
+                    </w:rPr>
+                    <m:t>v</m:t>
+                  </m:r>
+                </m:e>
+                <m:sub>
+                  <m:r>
+                    <w:rPr>
+                      <w:rFonts w:ascii="Cambria Math" w:eastAsiaTheme="minorEastAsia" w:hAnsi="Cambria Math"/>
+                    </w:rPr>
+                    <m:t>m</m:t>
+                  </m:r>
+                </m:sub>
+              </m:sSub>
+              <m:r>
+                <w:rPr>
+                  <w:rFonts w:ascii="Cambria Math" w:eastAsiaTheme="minorEastAsia" w:hAnsi="Cambria Math"/>
+                </w:rPr>
+                <m:t>+</m:t>
+              </m:r>
+              <m:d>
+                <m:dPr>
+                  <m:ctrlPr>
+                    <w:rPr>
+                      <w:rFonts w:ascii="Cambria Math" w:eastAsiaTheme="minorEastAsia" w:hAnsi="Cambria Math"/>
+                      <w:i/>
+                      <w:iCs/>
+                    </w:rPr>
+                  </m:ctrlPr>
+                </m:dPr>
+                <m:e>
+                  <m:r>
+                    <w:rPr>
+                      <w:rFonts w:ascii="Cambria Math" w:eastAsiaTheme="minorEastAsia" w:hAnsi="Cambria Math"/>
+                    </w:rPr>
+                    <m:t>1-p</m:t>
+                  </m:r>
+                </m:e>
+              </m:d>
+              <m:r>
+                <w:rPr>
+                  <w:rFonts w:ascii="Cambria Math" w:eastAsiaTheme="minorEastAsia" w:hAnsi="Cambria Math"/>
+                </w:rPr>
+                <m:t>γ+μ</m:t>
+              </m:r>
+            </m:e>
+          </m:d>
+          <m:r>
+            <w:rPr>
+              <w:rFonts w:ascii="Cambria Math" w:eastAsiaTheme="minorEastAsia" w:hAnsi="Cambria Math"/>
+            </w:rPr>
+            <m:t>β</m:t>
+          </m:r>
+          <m:d>
+            <m:dPr>
+              <m:ctrlPr>
+                <w:rPr>
+                  <w:rFonts w:ascii="Cambria Math" w:eastAsiaTheme="minorEastAsia" w:hAnsi="Cambria Math"/>
+                  <w:i/>
+                  <w:iCs/>
+                </w:rPr>
+              </m:ctrlPr>
+            </m:dPr>
+            <m:e>
+              <m:sSub>
+                <m:sSubPr>
+                  <m:ctrlPr>
+                    <w:rPr>
+                      <w:rFonts w:ascii="Cambria Math" w:eastAsiaTheme="minorEastAsia" w:hAnsi="Cambria Math"/>
+                      <w:i/>
+                      <w:iCs/>
+                    </w:rPr>
+                  </m:ctrlPr>
+                </m:sSubPr>
+                <m:e>
+                  <m:r>
+                    <w:rPr>
+                      <w:rFonts w:ascii="Cambria Math" w:eastAsiaTheme="minorEastAsia" w:hAnsi="Cambria Math"/>
+                    </w:rPr>
+                    <m:t>v</m:t>
+                  </m:r>
+                </m:e>
+                <m:sub>
+                  <m:r>
+                    <w:rPr>
+                      <w:rFonts w:ascii="Cambria Math" w:eastAsiaTheme="minorEastAsia" w:hAnsi="Cambria Math"/>
+                    </w:rPr>
+                    <m:t>m</m:t>
+                  </m:r>
+                </m:sub>
+              </m:sSub>
+            </m:e>
+          </m:d>
+          <m:r>
+            <w:rPr>
+              <w:rFonts w:ascii="Cambria Math" w:eastAsiaTheme="minorEastAsia" w:hAnsi="Cambria Math"/>
+            </w:rPr>
+            <m:t>-</m:t>
+          </m:r>
+          <m:d>
+            <m:dPr>
+              <m:ctrlPr>
+                <w:rPr>
+                  <w:rFonts w:ascii="Cambria Math" w:eastAsiaTheme="minorEastAsia" w:hAnsi="Cambria Math"/>
+                  <w:iCs/>
+                </w:rPr>
+              </m:ctrlPr>
+            </m:dPr>
+            <m:e>
+              <m:sSub>
+                <m:sSubPr>
+                  <m:ctrlPr>
+                    <w:rPr>
+                      <w:rFonts w:ascii="Cambria Math" w:eastAsiaTheme="minorEastAsia" w:hAnsi="Cambria Math"/>
+                      <w:i/>
+                      <w:iCs/>
+                    </w:rPr>
+                  </m:ctrlPr>
+                </m:sSubPr>
+                <m:e>
+                  <m:r>
+                    <w:rPr>
+                      <w:rFonts w:ascii="Cambria Math" w:eastAsiaTheme="minorEastAsia" w:hAnsi="Cambria Math"/>
+                    </w:rPr>
+                    <m:t>v</m:t>
+                  </m:r>
+                </m:e>
+                <m:sub>
+                  <m:r>
+                    <w:rPr>
+                      <w:rFonts w:ascii="Cambria Math" w:eastAsiaTheme="minorEastAsia" w:hAnsi="Cambria Math"/>
+                    </w:rPr>
+                    <m:t>m</m:t>
+                  </m:r>
+                </m:sub>
+              </m:sSub>
+              <m:r>
+                <w:rPr>
+                  <w:rFonts w:ascii="Cambria Math" w:eastAsiaTheme="minorEastAsia" w:hAnsi="Cambria Math"/>
+                </w:rPr>
+                <m:t>+γ+μ</m:t>
+              </m:r>
+            </m:e>
+          </m:d>
+          <m:d>
+            <m:dPr>
+              <m:ctrlPr>
+                <w:rPr>
+                  <w:rFonts w:ascii="Cambria Math" w:eastAsiaTheme="minorEastAsia" w:hAnsi="Cambria Math"/>
+                  <w:iCs/>
+                </w:rPr>
+              </m:ctrlPr>
+            </m:dPr>
+            <m:e>
+              <m:sSub>
+                <m:sSubPr>
+                  <m:ctrlPr>
+                    <w:rPr>
+                      <w:rFonts w:ascii="Cambria Math" w:eastAsiaTheme="minorEastAsia" w:hAnsi="Cambria Math"/>
+                      <w:i/>
+                      <w:iCs/>
+                    </w:rPr>
+                  </m:ctrlPr>
+                </m:sSubPr>
+                <m:e>
+                  <m:r>
+                    <w:rPr>
+                      <w:rFonts w:ascii="Cambria Math" w:eastAsiaTheme="minorEastAsia" w:hAnsi="Cambria Math"/>
+                    </w:rPr>
+                    <m:t>v</m:t>
+                  </m:r>
+                </m:e>
+                <m:sub>
+                  <m:r>
+                    <w:rPr>
+                      <w:rFonts w:ascii="Cambria Math" w:eastAsiaTheme="minorEastAsia" w:hAnsi="Cambria Math"/>
+                    </w:rPr>
+                    <m:t>m</m:t>
+                  </m:r>
+                </m:sub>
+              </m:sSub>
+              <m:r>
+                <w:rPr>
+                  <w:rFonts w:ascii="Cambria Math" w:eastAsiaTheme="minorEastAsia" w:hAnsi="Cambria Math"/>
+                </w:rPr>
+                <m:t>+</m:t>
+              </m:r>
+              <m:d>
+                <m:dPr>
+                  <m:ctrlPr>
+                    <w:rPr>
+                      <w:rFonts w:ascii="Cambria Math" w:eastAsiaTheme="minorEastAsia" w:hAnsi="Cambria Math"/>
+                      <w:i/>
+                      <w:iCs/>
+                    </w:rPr>
+                  </m:ctrlPr>
+                </m:dPr>
+                <m:e>
+                  <m:r>
+                    <w:rPr>
+                      <w:rFonts w:ascii="Cambria Math" w:eastAsiaTheme="minorEastAsia" w:hAnsi="Cambria Math"/>
+                    </w:rPr>
+                    <m:t>1-p</m:t>
+                  </m:r>
+                </m:e>
+              </m:d>
+              <m:r>
+                <w:rPr>
+                  <w:rFonts w:ascii="Cambria Math" w:eastAsiaTheme="minorEastAsia" w:hAnsi="Cambria Math"/>
+                </w:rPr>
+                <m:t>γ+μ</m:t>
+              </m:r>
+            </m:e>
+          </m:d>
+          <m:r>
+            <w:rPr>
+              <w:rFonts w:ascii="Cambria Math" w:eastAsiaTheme="minorEastAsia" w:hAnsi="Cambria Math"/>
+            </w:rPr>
+            <m:t>β</m:t>
+          </m:r>
+          <m:r>
+            <w:rPr>
+              <w:rFonts w:ascii="Cambria Math" w:eastAsiaTheme="minorEastAsia" w:hAnsi="Cambria Math"/>
+            </w:rPr>
+            <m:t>(</m:t>
+          </m:r>
+          <m:sSub>
+            <m:sSubPr>
+              <m:ctrlPr>
+                <w:rPr>
+                  <w:rFonts w:ascii="Cambria Math" w:eastAsiaTheme="minorEastAsia" w:hAnsi="Cambria Math"/>
+                  <w:i/>
+                  <w:iCs/>
+                </w:rPr>
+              </m:ctrlPr>
+            </m:sSubPr>
+            <m:e>
+              <m:r>
+                <w:rPr>
+                  <w:rFonts w:ascii="Cambria Math" w:eastAsiaTheme="minorEastAsia" w:hAnsi="Cambria Math"/>
+                </w:rPr>
+                <m:t>v</m:t>
+              </m:r>
+            </m:e>
+            <m:sub>
+              <m:r>
+                <w:rPr>
+                  <w:rFonts w:ascii="Cambria Math" w:eastAsiaTheme="minorEastAsia" w:hAnsi="Cambria Math"/>
+                </w:rPr>
+                <m:t>m</m:t>
+              </m:r>
+            </m:sub>
+          </m:sSub>
+          <m:r>
+            <w:rPr>
+              <w:rFonts w:ascii="Cambria Math" w:eastAsiaTheme="minorEastAsia" w:hAnsi="Cambria Math"/>
+            </w:rPr>
+            <m:t>)</m:t>
+          </m:r>
+          <m:r>
+            <w:rPr>
+              <w:rFonts w:ascii="Cambria Math" w:eastAsiaTheme="minorEastAsia" w:hAnsi="Cambria Math"/>
+            </w:rPr>
+            <m:t>+</m:t>
+          </m:r>
+          <m:d>
+            <m:dPr>
+              <m:ctrlPr>
+                <w:rPr>
+                  <w:rFonts w:ascii="Cambria Math" w:eastAsiaTheme="minorEastAsia" w:hAnsi="Cambria Math"/>
+                  <w:iCs/>
+                </w:rPr>
+              </m:ctrlPr>
+            </m:dPr>
+            <m:e>
+              <m:sSub>
+                <m:sSubPr>
+                  <m:ctrlPr>
+                    <w:rPr>
+                      <w:rFonts w:ascii="Cambria Math" w:eastAsiaTheme="minorEastAsia" w:hAnsi="Cambria Math"/>
+                      <w:i/>
+                      <w:iCs/>
+                    </w:rPr>
+                  </m:ctrlPr>
+                </m:sSubPr>
+                <m:e>
+                  <m:r>
+                    <w:rPr>
+                      <w:rFonts w:ascii="Cambria Math" w:eastAsiaTheme="minorEastAsia" w:hAnsi="Cambria Math"/>
+                    </w:rPr>
+                    <m:t>v</m:t>
+                  </m:r>
+                </m:e>
+                <m:sub>
+                  <m:r>
+                    <w:rPr>
+                      <w:rFonts w:ascii="Cambria Math" w:eastAsiaTheme="minorEastAsia" w:hAnsi="Cambria Math"/>
+                    </w:rPr>
+                    <m:t>m</m:t>
+                  </m:r>
+                </m:sub>
+              </m:sSub>
+              <m:r>
+                <w:rPr>
+                  <w:rFonts w:ascii="Cambria Math" w:eastAsiaTheme="minorEastAsia" w:hAnsi="Cambria Math"/>
+                </w:rPr>
+                <m:t>+μ</m:t>
+              </m:r>
+            </m:e>
+          </m:d>
+          <m:d>
+            <m:dPr>
+              <m:ctrlPr>
+                <w:rPr>
+                  <w:rFonts w:ascii="Cambria Math" w:eastAsiaTheme="minorEastAsia" w:hAnsi="Cambria Math"/>
+                  <w:iCs/>
+                </w:rPr>
+              </m:ctrlPr>
+            </m:dPr>
+            <m:e>
+              <m:sSub>
+                <m:sSubPr>
+                  <m:ctrlPr>
+                    <w:rPr>
+                      <w:rFonts w:ascii="Cambria Math" w:eastAsiaTheme="minorEastAsia" w:hAnsi="Cambria Math"/>
+                      <w:i/>
+                      <w:iCs/>
+                    </w:rPr>
+                  </m:ctrlPr>
+                </m:sSubPr>
+                <m:e>
+                  <m:r>
+                    <w:rPr>
+                      <w:rFonts w:ascii="Cambria Math" w:eastAsiaTheme="minorEastAsia" w:hAnsi="Cambria Math"/>
+                    </w:rPr>
+                    <m:t>v</m:t>
+                  </m:r>
+                </m:e>
+                <m:sub>
+                  <m:r>
+                    <w:rPr>
+                      <w:rFonts w:ascii="Cambria Math" w:eastAsiaTheme="minorEastAsia" w:hAnsi="Cambria Math"/>
+                    </w:rPr>
+                    <m:t>m</m:t>
+                  </m:r>
+                </m:sub>
+              </m:sSub>
+              <m:r>
+                <w:rPr>
+                  <w:rFonts w:ascii="Cambria Math" w:eastAsiaTheme="minorEastAsia" w:hAnsi="Cambria Math"/>
+                </w:rPr>
+                <m:t>+γ+μ</m:t>
+              </m:r>
+            </m:e>
+          </m:d>
+          <m:d>
+            <m:dPr>
+              <m:ctrlPr>
+                <w:rPr>
+                  <w:rFonts w:ascii="Cambria Math" w:eastAsiaTheme="minorEastAsia" w:hAnsi="Cambria Math"/>
+                  <w:iCs/>
+                </w:rPr>
+              </m:ctrlPr>
+            </m:dPr>
+            <m:e>
+              <m:sSub>
+                <m:sSubPr>
+                  <m:ctrlPr>
+                    <w:rPr>
+                      <w:rFonts w:ascii="Cambria Math" w:eastAsiaTheme="minorEastAsia" w:hAnsi="Cambria Math"/>
+                      <w:i/>
+                      <w:iCs/>
+                    </w:rPr>
+                  </m:ctrlPr>
+                </m:sSubPr>
+                <m:e>
+                  <m:r>
+                    <w:rPr>
+                      <w:rFonts w:ascii="Cambria Math" w:eastAsiaTheme="minorEastAsia" w:hAnsi="Cambria Math"/>
+                    </w:rPr>
+                    <m:t>v</m:t>
+                  </m:r>
+                </m:e>
+                <m:sub>
+                  <m:r>
+                    <w:rPr>
+                      <w:rFonts w:ascii="Cambria Math" w:eastAsiaTheme="minorEastAsia" w:hAnsi="Cambria Math"/>
+                    </w:rPr>
+                    <m:t>m</m:t>
+                  </m:r>
+                </m:sub>
+              </m:sSub>
+              <m:r>
+                <w:rPr>
+                  <w:rFonts w:ascii="Cambria Math" w:eastAsiaTheme="minorEastAsia" w:hAnsi="Cambria Math"/>
+                </w:rPr>
+                <m:t>+</m:t>
+              </m:r>
+              <m:d>
+                <m:dPr>
+                  <m:ctrlPr>
+                    <w:rPr>
+                      <w:rFonts w:ascii="Cambria Math" w:eastAsiaTheme="minorEastAsia" w:hAnsi="Cambria Math"/>
+                      <w:i/>
+                      <w:iCs/>
+                    </w:rPr>
+                  </m:ctrlPr>
+                </m:dPr>
+                <m:e>
+                  <m:r>
+                    <w:rPr>
+                      <w:rFonts w:ascii="Cambria Math" w:eastAsiaTheme="minorEastAsia" w:hAnsi="Cambria Math"/>
+                    </w:rPr>
+                    <m:t>1-p</m:t>
+                  </m:r>
+                </m:e>
+              </m:d>
+              <m:r>
+                <w:rPr>
+                  <w:rFonts w:ascii="Cambria Math" w:eastAsiaTheme="minorEastAsia" w:hAnsi="Cambria Math"/>
+                </w:rPr>
+                <m:t>γ</m:t>
+              </m:r>
+              <m:r>
+                <w:rPr>
+                  <w:rFonts w:ascii="Cambria Math" w:eastAsiaTheme="minorEastAsia" w:hAnsi="Cambria Math"/>
+                </w:rPr>
+                <m:t>+</m:t>
+              </m:r>
+              <m:r>
+                <w:rPr>
+                  <w:rFonts w:ascii="Cambria Math" w:eastAsiaTheme="minorEastAsia" w:hAnsi="Cambria Math"/>
+                </w:rPr>
+                <m:t>μ</m:t>
+              </m:r>
+            </m:e>
+          </m:d>
+          <m:sSup>
+            <m:sSupPr>
+              <m:ctrlPr>
+                <w:rPr>
+                  <w:rFonts w:ascii="Cambria Math" w:eastAsiaTheme="minorEastAsia" w:hAnsi="Cambria Math"/>
+                  <w:iCs/>
+                </w:rPr>
+              </m:ctrlPr>
+            </m:sSupPr>
+            <m:e>
+              <m:r>
+                <w:rPr>
+                  <w:rFonts w:ascii="Cambria Math" w:eastAsiaTheme="minorEastAsia" w:hAnsi="Cambria Math"/>
+                </w:rPr>
+                <m:t>β</m:t>
+              </m:r>
+            </m:e>
+            <m:sup>
+              <m:r>
+                <w:rPr>
+                  <w:rFonts w:ascii="Cambria Math" w:eastAsiaTheme="minorEastAsia" w:hAnsi="Cambria Math"/>
+                </w:rPr>
+                <m:t>'</m:t>
+              </m:r>
+            </m:sup>
+          </m:sSup>
+          <m:d>
+            <m:dPr>
+              <m:ctrlPr>
+                <w:rPr>
+                  <w:rFonts w:ascii="Cambria Math" w:eastAsiaTheme="minorEastAsia" w:hAnsi="Cambria Math"/>
+                  <w:i/>
+                  <w:iCs/>
+                </w:rPr>
+              </m:ctrlPr>
+            </m:dPr>
+            <m:e>
+              <m:sSub>
+                <m:sSubPr>
+                  <m:ctrlPr>
+                    <w:rPr>
+                      <w:rFonts w:ascii="Cambria Math" w:eastAsiaTheme="minorEastAsia" w:hAnsi="Cambria Math"/>
+                      <w:i/>
+                      <w:iCs/>
+                    </w:rPr>
+                  </m:ctrlPr>
+                </m:sSubPr>
+                <m:e>
+                  <m:r>
+                    <w:rPr>
+                      <w:rFonts w:ascii="Cambria Math" w:eastAsiaTheme="minorEastAsia" w:hAnsi="Cambria Math"/>
+                    </w:rPr>
+                    <m:t>v</m:t>
+                  </m:r>
+                </m:e>
+                <m:sub>
+                  <m:r>
+                    <w:rPr>
+                      <w:rFonts w:ascii="Cambria Math" w:eastAsiaTheme="minorEastAsia" w:hAnsi="Cambria Math"/>
+                    </w:rPr>
+                    <m:t>m</m:t>
+                  </m:r>
+                </m:sub>
+              </m:sSub>
+            </m:e>
+          </m:d>
+          <m:r>
+            <w:rPr>
+              <w:rFonts w:ascii="Cambria Math" w:eastAsiaTheme="minorEastAsia" w:hAnsi="Cambria Math"/>
+            </w:rPr>
+            <m:t>=0.</m:t>
+          </m:r>
+        </m:oMath>
+      </m:oMathPara>
+    </w:p>
+    <w:p/>
+    <w:p>
+      <w:r>
+        <w:t xml:space="preserve">As long as </w:t>
+      </w:r>
+      <m:oMath>
+        <m:r>
+          <w:rPr>
+            <w:rFonts w:ascii="Cambria Math" w:hAnsi="Cambria Math"/>
+          </w:rPr>
+          <m:t>β(v)</m:t>
+        </m:r>
+      </m:oMath>
+      <w:r>
+        <w:rPr>
+          <w:rFonts w:eastAsiaTheme="minorEastAsia"/>
+        </w:rPr>
+        <w:t xml:space="preserve"> is an increasing, saturating function of virulence </w:t>
+      </w:r>
+      <m:oMath>
+        <m:r>
+          <w:rPr>
+            <w:rFonts w:ascii="Cambria Math" w:eastAsiaTheme="minorEastAsia" w:hAnsi="Cambria Math"/>
+          </w:rPr>
+          <m:t>v</m:t>
+        </m:r>
+      </m:oMath>
+      <w:r>
+        <w:rPr>
+          <w:rFonts w:eastAsiaTheme="minorEastAsia"/>
+        </w:rPr>
+        <w:t xml:space="preserve">, then any </w:t>
+      </w:r>
+      <m:oMath>
+        <m:sSub>
+          <m:sSubPr>
+            <m:ctrlPr>
+              <w:rPr>
+                <w:rFonts w:ascii="Cambria Math" w:eastAsiaTheme="minorEastAsia" w:hAnsi="Cambria Math"/>
+                <w:i/>
+              </w:rPr>
+            </m:ctrlPr>
+          </m:sSubPr>
+          <m:e>
+            <m:r>
+              <w:rPr>
+                <w:rFonts w:ascii="Cambria Math" w:eastAsiaTheme="minorEastAsia" w:hAnsi="Cambria Math"/>
+              </w:rPr>
+              <m:t>v</m:t>
+            </m:r>
+          </m:e>
+          <m:sub>
+            <m:r>
+              <w:rPr>
+                <w:rFonts w:ascii="Cambria Math" w:eastAsiaTheme="minorEastAsia" w:hAnsi="Cambria Math"/>
+              </w:rPr>
+              <m:t>m</m:t>
+            </m:r>
+          </m:sub>
+        </m:sSub>
+      </m:oMath>
+      <w:r>
+        <w:rPr>
+          <w:rFonts w:eastAsiaTheme="minorEastAsia"/>
+        </w:rPr>
+        <w:t xml:space="preserve"> that satisfies the above equality will be evolutionarily and convergence stable. Fig. 5 in the main text shows the ESS </w:t>
+      </w:r>
+      <m:oMath>
+        <m:sSub>
+          <m:sSubPr>
+            <m:ctrlPr>
+              <w:rPr>
+                <w:rFonts w:ascii="Cambria Math" w:eastAsiaTheme="minorEastAsia" w:hAnsi="Cambria Math"/>
+                <w:i/>
+              </w:rPr>
+            </m:ctrlPr>
+          </m:sSubPr>
+          <m:e>
+            <m:r>
+              <w:rPr>
+                <w:rFonts w:ascii="Cambria Math" w:eastAsiaTheme="minorEastAsia" w:hAnsi="Cambria Math"/>
+              </w:rPr>
+              <m:t>v</m:t>
+            </m:r>
+          </m:e>
+          <m:sub>
+            <m:r>
+              <w:rPr>
+                <w:rFonts w:ascii="Cambria Math" w:eastAsiaTheme="minorEastAsia" w:hAnsi="Cambria Math"/>
+              </w:rPr>
+              <m:t>m</m:t>
+            </m:r>
+          </m:sub>
+        </m:sSub>
+      </m:oMath>
+      <w:r>
+        <w:rPr>
+          <w:rFonts w:eastAsiaTheme="minorEastAsia"/>
+        </w:rPr>
+        <w:t xml:space="preserve"> as the probability of an acute infection </w:t>
+      </w:r>
+      <m:oMath>
+        <m:r>
+          <w:rPr>
+            <w:rFonts w:ascii="Cambria Math" w:eastAsiaTheme="minorEastAsia" w:hAnsi="Cambria Math"/>
+          </w:rPr>
+          <m:t>p</m:t>
+        </m:r>
+      </m:oMath>
+      <w:r>
+        <w:rPr>
+          <w:rFonts w:eastAsiaTheme="minorEastAsia"/>
+        </w:rPr>
+        <w:t xml:space="preserve"> and the recovery rate </w:t>
+      </w:r>
+      <m:oMath>
+        <m:r>
+          <w:rPr>
+            <w:rFonts w:ascii="Cambria Math" w:eastAsiaTheme="minorEastAsia" w:hAnsi="Cambria Math"/>
+          </w:rPr>
+          <m:t>γ</m:t>
+        </m:r>
+      </m:oMath>
+      <w:r>
+        <w:rPr>
+          <w:rFonts w:eastAsiaTheme="minorEastAsia"/>
+        </w:rPr>
+        <w:t xml:space="preserve"> vary. </w:t>
+      </w:r>
+    </w:p>
     <w:p/>
     <w:sectPr>
       <w:pgSz w:w="12240" w:h="15840"/>
@@ -10724,8 +15211,8 @@
   <w15:commentEx w15:paraId="5814DFFC" w15:done="1"/>
   <w15:commentEx w15:paraId="196FBD3F" w15:done="1"/>
   <w15:commentEx w15:paraId="356D49DE" w15:done="1"/>
-  <w15:commentEx w15:paraId="7BEE0198" w15:done="0"/>
-  <w15:commentEx w15:paraId="16581C30" w15:paraIdParent="7BEE0198" w15:done="0"/>
+  <w15:commentEx w15:paraId="663D58A6" w15:done="0"/>
+  <w15:commentEx w15:paraId="5A7ED0CA" w15:paraIdParent="663D58A6" w15:done="0"/>
 </w15:commentsEx>
 </file>
 
@@ -10864,8 +15351,8 @@
   <w16cid:commentId w16cid:paraId="5814DFFC" w16cid:durableId="6E2A1803"/>
   <w16cid:commentId w16cid:paraId="196FBD3F" w16cid:durableId="2DB6E7ED"/>
   <w16cid:commentId w16cid:paraId="356D49DE" w16cid:durableId="68C49A78"/>
-  <w16cid:commentId w16cid:paraId="7BEE0198" w16cid:durableId="2DB6E8AC"/>
-  <w16cid:commentId w16cid:paraId="16581C30" w16cid:durableId="01762AD6"/>
+  <w16cid:commentId w16cid:paraId="663D58A6" w16cid:durableId="2DB6E8AC"/>
+  <w16cid:commentId w16cid:paraId="5A7ED0CA" w16cid:durableId="01762AD6"/>
 </w16cid:commentsIds>
 </file>
 
@@ -14151,7 +18638,6 @@
   <w:style w:type="character" w:default="1" w:styleId="DefaultParagraphFont">
     <w:name w:val="Default Paragraph Font"/>
     <w:uiPriority w:val="1"/>
-    <w:semiHidden/>
     <w:unhideWhenUsed/>
   </w:style>
   <w:style w:type="table" w:default="1" w:styleId="TableNormal">

</xml_diff>

<commit_message>
Updated manuscript with first pass at Discussion
</commit_message>
<xml_diff>
--- a/Phil_Trans_MS_v2.docx
+++ b/Phil_Trans_MS_v2.docx
@@ -7887,71 +7887,169 @@
     </w:p>
     <w:p/>
     <w:p>
-      <w:r>
-        <w:t xml:space="preserve">These results mirror a simple prediction of classic evolutionary epidemiology: as the clearance rate increases, virulence is expected to increase. However, our novel model lends new insight and nuance to this simple prediction. </w:t>
+      <w:pPr>
+        <w:rPr>
+          <w:rFonts w:eastAsiaTheme="minorEastAsia"/>
+        </w:rPr>
+      </w:pPr>
+      <w:r>
+        <w:t xml:space="preserve">These results </w:t>
+      </w:r>
+      <w:r>
+        <w:t xml:space="preserve">seemingly </w:t>
+      </w:r>
+      <w:r>
+        <w:t>mirror a simple prediction of classic evolutionary epidemiology: as the clearance rate increases, virulence is expected to increase</w:t>
+      </w:r>
+      <w:r>
+        <w:t xml:space="preserve"> (Fig. 5B)</w:t>
+      </w:r>
+      <w:r>
+        <w:t xml:space="preserve">. However, our novel model lends new insight and nuance to this simple prediction. </w:t>
+      </w:r>
+      <w:r>
+        <w:t xml:space="preserve">In particular, altering the immune landscape affects the probability of clearance (Fig. 4A) as well as the clearance rate (quantified as the duration of infection; Fig. 4B). The shape of the relationship between ESS virulence and the probability of clearance is very different from the shape of the relationship between ESS virulence and the rate of clearance (compare Fig. 3 and 5A to Fig. 5B). In particular, </w:t>
+      </w:r>
+      <w:commentRangeStart w:id="312"/>
+      <w:commentRangeStart w:id="313"/>
+      <w:r>
+        <w:rPr>
+          <w:rFonts w:eastAsiaTheme="minorEastAsia"/>
+        </w:rPr>
+        <w:t xml:space="preserve">if there is even a moderate chance an infection will become chronic, parasite virulence evolves to be low </w:t>
+      </w:r>
+      <w:r>
+        <w:rPr>
+          <w:rFonts w:eastAsiaTheme="minorEastAsia"/>
+        </w:rPr>
+        <w:t xml:space="preserve">(Fig. 3). This lower virulence further reduces the probability of clearance (Fig. 4A), prolonging infection duration (Fig. 4B) and </w:t>
+      </w:r>
+      <w:r>
+        <w:rPr>
+          <w:rFonts w:eastAsiaTheme="minorEastAsia"/>
+        </w:rPr>
+        <w:t>maximiz</w:t>
+      </w:r>
+      <w:r>
+        <w:rPr>
+          <w:rFonts w:eastAsiaTheme="minorEastAsia"/>
+        </w:rPr>
+        <w:t>ing</w:t>
+      </w:r>
+      <w:r>
+        <w:rPr>
+          <w:rFonts w:eastAsiaTheme="minorEastAsia"/>
+        </w:rPr>
+        <w:t xml:space="preserve"> the contribution of chronically infected hosts to parasite fitness.</w:t>
+      </w:r>
+      <w:commentRangeEnd w:id="312"/>
+      <w:r>
+        <w:rPr>
+          <w:rStyle w:val="CommentReference"/>
+          <w:rFonts w:eastAsiaTheme="minorEastAsia"/>
+          <w:sz w:val="24"/>
+          <w:szCs w:val="24"/>
+        </w:rPr>
+        <w:commentReference w:id="312"/>
+      </w:r>
+      <w:commentRangeEnd w:id="313"/>
+      <w:r>
+        <w:rPr>
+          <w:rStyle w:val="CommentReference"/>
+          <w:rFonts w:eastAsiaTheme="minorEastAsia"/>
+          <w:sz w:val="24"/>
+          <w:szCs w:val="24"/>
+        </w:rPr>
+        <w:commentReference w:id="313"/>
+      </w:r>
+      <w:r>
+        <w:rPr>
+          <w:rFonts w:eastAsiaTheme="minorEastAsia"/>
+        </w:rPr>
+        <w:t xml:space="preserve"> </w:t>
+      </w:r>
+    </w:p>
+    <w:p>
+      <w:pPr>
+        <w:rPr>
+          <w:rFonts w:eastAsiaTheme="minorEastAsia"/>
+        </w:rPr>
+      </w:pPr>
+    </w:p>
+    <w:p>
+      <w:pPr>
+        <w:rPr>
+          <w:rFonts w:eastAsiaTheme="minorEastAsia"/>
+        </w:rPr>
+      </w:pPr>
+      <w:r>
+        <w:rPr>
+          <w:rFonts w:eastAsiaTheme="minorEastAsia"/>
+        </w:rPr>
+        <w:t xml:space="preserve">As the probability of clearance increases, the ESS virulence increases rapidly (Fig. 3 and 5A). This does not actually </w:t>
+      </w:r>
+      <w:r>
+        <w:rPr>
+          <w:rFonts w:eastAsiaTheme="minorEastAsia"/>
+        </w:rPr>
+        <w:t xml:space="preserve">increase the probability of clearance (Fig. 4A) or shorten infection duration (Fig. 4B) because the increased virulence also increases the peak parasite biomass in the host (Fig. 4C), which slows infection clearance and increases transmission, at the cost of increased host mortality. The reduced clearance rate and increased mortality rate approximately balance one another, causing clearance probability and infection duration to remain roughly constant over eco-evolutionary time (Fig. 4A-B). </w:t>
+      </w:r>
+    </w:p>
+    <w:p>
+      <w:pPr>
+        <w:rPr>
+          <w:rFonts w:eastAsiaTheme="minorEastAsia"/>
+        </w:rPr>
+      </w:pPr>
+    </w:p>
+    <w:p>
+      <w:pPr>
+        <w:rPr>
+          <w:rFonts w:eastAsiaTheme="minorEastAsia"/>
+        </w:rPr>
+      </w:pPr>
+      <w:r>
+        <w:rPr>
+          <w:rFonts w:eastAsiaTheme="minorEastAsia"/>
+        </w:rPr>
+        <w:t xml:space="preserve">An additional benefit of using an individual-based modeling approach is that it allows us to examine the transient eco-evolutionary dynamics and to compare stochastic replicate simulations to gain insight into how immune variability impacts the speed and variability of eco-evolutionary trajectories. When the immune landscape is highly Th1-biased (e.g., a minimum Th2 of 200; top left panel of Figs. 2 and 3), all of the simulations quickly evolve towards low virulence and high infection prevalence. When the immune landscape is highly Th2-biased (e.g., a minimum Th2 of 700; bottom left panel of Figs. 2 and 3), the simulations quickly evolve towards high virulence and low infection prevalence, although there is considerably more variability than </w:t>
+      </w:r>
+      <w:r>
+        <w:rPr>
+          <w:rFonts w:eastAsiaTheme="minorEastAsia"/>
+        </w:rPr>
+        <w:t xml:space="preserve">in the Th1-biased case. Conversely, at moderate Th2-bias (e.g., a minimum Th2 of 575; middle left panel of Figs. 2 and 3), there is tremendous </w:t>
+      </w:r>
+      <w:r>
+        <w:rPr>
+          <w:rFonts w:eastAsiaTheme="minorEastAsia"/>
+        </w:rPr>
+        <w:lastRenderedPageBreak/>
+        <w:t>variation between stochastic replicates. Although eventually all of the populations evolve towards low virulence (Fig. S1), by the final timestep in Fig. 3, there are replicates with virulence as high as in the Th2-biased simulations, and replicates with virulence as low as in the Th1-biased simulations. This implies that virulence evolution may be very unpredictable in the short- and even medium-term, a nuance that is missed by simpler equilibrium-based evolutionary analyses like adaptive dynamics.</w:t>
+      </w:r>
+    </w:p>
+    <w:p>
+      <w:pPr>
+        <w:rPr>
+          <w:rFonts w:eastAsiaTheme="minorEastAsia"/>
+        </w:rPr>
+      </w:pPr>
+    </w:p>
+    <w:p>
+      <w:pPr>
+        <w:rPr>
+          <w:rFonts w:eastAsiaTheme="minorEastAsia"/>
+        </w:rPr>
+      </w:pPr>
+      <w:r>
+        <w:rPr>
+          <w:rFonts w:eastAsiaTheme="minorEastAsia"/>
+        </w:rPr>
+        <w:t xml:space="preserve">That the simulations were the most variable at moderate Th2 bias is not surprising given the effect of immune state on the within-host dynamics (Fig. 1). In particular, </w:t>
       </w:r>
     </w:p>
     <w:p/>
     <w:p>
-      <w:pPr>
-        <w:rPr>
-          <w:rFonts w:eastAsiaTheme="minorEastAsia"/>
-        </w:rPr>
-      </w:pPr>
-      <w:commentRangeStart w:id="312"/>
-      <w:commentRangeStart w:id="313"/>
-      <w:r>
-        <w:rPr>
-          <w:rFonts w:eastAsiaTheme="minorEastAsia"/>
-        </w:rPr>
-        <w:t>The implication here is that, if there is even a moderate chance that an infection will become chronic, parasite virulence evolves to be lower to maximize the contribution of chronically infected hosts to parasite fitness.</w:t>
-      </w:r>
-      <w:commentRangeEnd w:id="312"/>
-      <w:r>
-        <w:rPr>
-          <w:rStyle w:val="CommentReference"/>
-          <w:rFonts w:eastAsiaTheme="minorEastAsia"/>
-          <w:sz w:val="24"/>
-          <w:szCs w:val="24"/>
-        </w:rPr>
-        <w:commentReference w:id="312"/>
-      </w:r>
-      <w:commentRangeEnd w:id="313"/>
-      <w:r>
-        <w:rPr>
-          <w:rStyle w:val="CommentReference"/>
-          <w:rFonts w:eastAsiaTheme="minorEastAsia"/>
-          <w:sz w:val="24"/>
-          <w:szCs w:val="24"/>
-        </w:rPr>
-        <w:commentReference w:id="313"/>
-      </w:r>
-    </w:p>
-    <w:p/>
-    <w:p/>
-    <w:p>
-      <w:r>
-        <w:t xml:space="preserve">Finally, a simple epidemiological model that allows both acute and chronic infections shows that, as the probability of a chronic infection increases, virulence drops rapidly </w:t>
-      </w:r>
-      <w:r>
-        <w:t xml:space="preserve"> </w:t>
-      </w:r>
-    </w:p>
-    <w:p/>
-    <w:p>
-      <w:r>
-        <w:t>Our modeling framework naturally relaxes the assumption of classic epidemiological theory that recovery rate is fixed. This assumption has several implications that are difficult to justify biologically. First, it implies that the instantaneous probability of recovery is identical at every timepoint in infection. In reality, the probability of recovery changes over the course of infection as either an appropriate adaptive immune response is activated, leading to an increasing probability of clearance with infection duration, or an inappropriate response is activated, leading to a decreasing probability of clearance with infection duration. By allowing the initial immune response to vary among infected individuals, the model accommodates this heterogenei</w:t>
-      </w:r>
-    </w:p>
-    <w:p/>
-    <w:p>
-      <w:r>
-        <w:t>which implies that infection duration is exponentially distributed with a mean equal to the inverse of the recovery rate. The assumption of a fixed recovery rate also impliesmeaning that the instantaneous probability of recovery is constant throughout the course of infection. That assumption leads to a number of While this assumption is rarely met in practice, it can be a reasonable simplification in a heterogeneous population.</w:t>
-      </w:r>
-    </w:p>
-    <w:p/>
-    <w:p/>
-    <w:p>
       <w:r>
         <w:t xml:space="preserve">Unfortunately, the assumption that recovery  </w:t>
       </w:r>
@@ -7967,7 +8065,6 @@
         <w:rPr>
           <w:rFonts w:eastAsiaTheme="minorEastAsia"/>
         </w:rPr>
-        <w:lastRenderedPageBreak/>
         <w:t>I have lots of ideas here, but I would love to hear your thoughts independently to see what aspects of these results you found the most interesting</w:t>
       </w:r>
       <w:r>

</xml_diff>